<commit_message>
fix: LG step numbering restarts per lab; lab cross-ref corrections
Co-Authored-By: Claude Opus 4.8 (1M context) <noreply@anthropic.com>
</commit_message>
<xml_diff>
--- a/courseware/LG-Human-AI Workforce with Autonomous AI Agents.docx
+++ b/courseware/LG-Human-AI Workforce with Autonomous AI Agents.docx
@@ -751,7 +751,7 @@
         </w:rPr>
         <w:t>Lab 13 — Build a Multi-Agent Workflow</w:t>
         <w:tab/>
-        <w:t>19</w:t>
+        <w:t>18</w:t>
       </w:r>
     </w:p>
     <w:p>
@@ -870,7 +870,7 @@
         </w:rPr>
         <w:t>Lab 18 — Skills</w:t>
         <w:tab/>
-        <w:t>27</w:t>
+        <w:t>26</w:t>
       </w:r>
     </w:p>
     <w:p>
@@ -910,7 +910,7 @@
         </w:rPr>
         <w:t>Lab 20 — Commands</w:t>
         <w:tab/>
-        <w:t>30</w:t>
+        <w:t>29</w:t>
       </w:r>
     </w:p>
     <w:p>
@@ -970,7 +970,7 @@
         </w:rPr>
         <w:t>Lab 23 — Security</w:t>
         <w:tab/>
-        <w:t>36</w:t>
+        <w:t>35</w:t>
       </w:r>
     </w:p>
     <w:p>
@@ -990,7 +990,7 @@
         </w:rPr>
         <w:t>Lab 24 — Multi-Agent Workforce</w:t>
         <w:tab/>
-        <w:t>38</w:t>
+        <w:t>37</w:t>
       </w:r>
     </w:p>
     <w:p>
@@ -1010,7 +1010,7 @@
         </w:rPr>
         <w:t>Lab 25 — Dreaming — Idle Reflection &amp; Self-Improvement</w:t>
         <w:tab/>
-        <w:t>40</w:t>
+        <w:t>39</w:t>
       </w:r>
     </w:p>
     <w:p>
@@ -1049,7 +1049,7 @@
         </w:rPr>
         <w:t>Topic 03 — Paperclip — Running &amp; Governing a Company of AI Agents  (34%)</w:t>
         <w:tab/>
-        <w:t>43</w:t>
+        <w:t>42</w:t>
       </w:r>
     </w:p>
     <w:p>
@@ -1069,7 +1069,7 @@
         </w:rPr>
         <w:t>Lab 27 — Setup Paperclip</w:t>
         <w:tab/>
-        <w:t>43</w:t>
+        <w:t>42</w:t>
       </w:r>
     </w:p>
     <w:p>
@@ -1089,7 +1089,7 @@
         </w:rPr>
         <w:t>Lab 28 — Connect OpenAI Codex to Paperclip</w:t>
         <w:tab/>
-        <w:t>44</w:t>
+        <w:t>43</w:t>
       </w:r>
     </w:p>
     <w:p>
@@ -1109,7 +1109,7 @@
         </w:rPr>
         <w:t>Lab 29 — Configure Paperclip</w:t>
         <w:tab/>
-        <w:t>45</w:t>
+        <w:t>44</w:t>
       </w:r>
     </w:p>
     <w:p>
@@ -1129,7 +1129,7 @@
         </w:rPr>
         <w:t>Lab 30 — Track AI Tasks</w:t>
         <w:tab/>
-        <w:t>46</w:t>
+        <w:t>45</w:t>
       </w:r>
     </w:p>
     <w:p>
@@ -1149,7 +1149,7 @@
         </w:rPr>
         <w:t>Lab 31 — Automate AI Hiring</w:t>
         <w:tab/>
-        <w:t>47</w:t>
+        <w:t>46</w:t>
       </w:r>
     </w:p>
     <w:p>
@@ -1169,7 +1169,7 @@
         </w:rPr>
         <w:t>Lab 32 — Setup AI Agents</w:t>
         <w:tab/>
-        <w:t>48</w:t>
+        <w:t>47</w:t>
       </w:r>
     </w:p>
     <w:p>
@@ -1189,7 +1189,7 @@
         </w:rPr>
         <w:t>Lab 33 — Security</w:t>
         <w:tab/>
-        <w:t>49</w:t>
+        <w:t>48</w:t>
       </w:r>
     </w:p>
     <w:p>
@@ -1209,7 +1209,7 @@
         </w:rPr>
         <w:t>Lab 34 — Assign Task</w:t>
         <w:tab/>
-        <w:t>50</w:t>
+        <w:t>49</w:t>
       </w:r>
     </w:p>
     <w:p>
@@ -1228,7 +1228,7 @@
         </w:rPr>
         <w:t>Wrap-Up — The Agent Build Arc and Governance</w:t>
         <w:tab/>
-        <w:t>51</w:t>
+        <w:t>50</w:t>
       </w:r>
     </w:p>
     <w:p>
@@ -1247,7 +1247,7 @@
         </w:rPr>
         <w:t>Next Steps</w:t>
         <w:tab/>
-        <w:t>52</w:t>
+        <w:t>51</w:t>
       </w:r>
     </w:p>
     <w:p>
@@ -1595,16 +1595,30 @@
     </w:p>
     <w:p>
       <w:pPr>
-        <w:pStyle w:val="ListNumber"/>
-      </w:pPr>
+        <w:spacing w:after="80"/>
+        <w:ind w:left="360"/>
+      </w:pPr>
+      <w:r>
+        <w:rPr>
+          <w:b/>
+        </w:rPr>
+        <w:t xml:space="preserve">1.  </w:t>
+      </w:r>
       <w:r>
         <w:t>Watch the reference video Before touching the terminal, watch the reference video end to end so you know what a healthy install looks like and can spot where the UI differs from these written steps: https://www.youtube.com/watch?v=KtlY6ETPyKo&amp;list=PLmpUb_PWAkDx-VWjh00tVCji794xAa_IX&amp;index=11 (https://www.youtube.com/watch?v=KtlY6ETPyKo&amp;list=PLmpUb_PWAkDx-VWjh00tVCji794xAa_IX&amp;index=11)</w:t>
       </w:r>
     </w:p>
     <w:p>
       <w:pPr>
-        <w:pStyle w:val="ListNumber"/>
-      </w:pPr>
+        <w:spacing w:after="80"/>
+        <w:ind w:left="360"/>
+      </w:pPr>
+      <w:r>
+        <w:rPr>
+          <w:b/>
+        </w:rPr>
+        <w:t xml:space="preserve">2.  </w:t>
+      </w:r>
       <w:r>
         <w:t>Install Hermes (macOS / Linux / WSL2) Run the official one-line installer. It downloads the Hermes binary, places it under your user directory, and wires up the hermes command:</w:t>
       </w:r>
@@ -1621,8 +1635,15 @@
     </w:p>
     <w:p>
       <w:pPr>
-        <w:pStyle w:val="ListNumber"/>
-      </w:pPr>
+        <w:spacing w:after="80"/>
+        <w:ind w:left="360"/>
+      </w:pPr>
+      <w:r>
+        <w:rPr>
+          <w:b/>
+        </w:rPr>
+        <w:t xml:space="preserve">3.  </w:t>
+      </w:r>
       <w:r>
         <w:t>Reload your shell so the hermes command is on PATH The installer adds Hermes to your PATH via your shell profile, but your current terminal session hasn't re-read that file yet. Reload it:</w:t>
       </w:r>
@@ -1639,8 +1660,15 @@
     </w:p>
     <w:p>
       <w:pPr>
-        <w:pStyle w:val="ListNumber"/>
-      </w:pPr>
+        <w:spacing w:after="80"/>
+        <w:ind w:left="360"/>
+      </w:pPr>
+      <w:r>
+        <w:rPr>
+          <w:b/>
+        </w:rPr>
+        <w:t xml:space="preserve">4.  </w:t>
+      </w:r>
       <w:r>
         <w:t>Run the first-time setup wizard Launch the interactive setup wizard and connect Hermes to your Nous Portal account. This is where you sign in, pick defaults, and let Hermes provision a model provider:</w:t>
       </w:r>
@@ -1657,8 +1685,15 @@
     </w:p>
     <w:p>
       <w:pPr>
-        <w:pStyle w:val="ListNumber"/>
-      </w:pPr>
+        <w:spacing w:after="80"/>
+        <w:ind w:left="360"/>
+      </w:pPr>
+      <w:r>
+        <w:rPr>
+          <w:b/>
+        </w:rPr>
+        <w:t xml:space="preserve">5.  </w:t>
+      </w:r>
       <w:r>
         <w:t>Check the install is healthy Run the built-in diagnostic. It checks the binary, config, PATH, provider connectivity, and the local runtime:</w:t>
       </w:r>
@@ -1675,8 +1710,15 @@
     </w:p>
     <w:p>
       <w:pPr>
-        <w:pStyle w:val="ListNumber"/>
-      </w:pPr>
+        <w:spacing w:after="80"/>
+        <w:ind w:left="360"/>
+      </w:pPr>
+      <w:r>
+        <w:rPr>
+          <w:b/>
+        </w:rPr>
+        <w:t xml:space="preserve">6.  </w:t>
+      </w:r>
       <w:r>
         <w:t>Launch the agent and say hello Open the terminal UI (TUI) and start your first conversation with the agent — this is Athena's very first session:</w:t>
       </w:r>
@@ -1767,8 +1809,15 @@
     </w:p>
     <w:p>
       <w:pPr>
-        <w:pStyle w:val="ListNumber"/>
-      </w:pPr>
+        <w:spacing w:after="80"/>
+        <w:ind w:left="360"/>
+      </w:pPr>
+      <w:r>
+        <w:rPr>
+          <w:b/>
+        </w:rPr>
+        <w:t xml:space="preserve">1.  </w:t>
+      </w:r>
       <w:r>
         <w:t>Watch the reference video for this lab</w:t>
       </w:r>
@@ -1785,16 +1834,30 @@
     </w:p>
     <w:p>
       <w:pPr>
-        <w:pStyle w:val="ListNumber"/>
-      </w:pPr>
+        <w:spacing w:after="80"/>
+        <w:ind w:left="360"/>
+      </w:pPr>
+      <w:r>
+        <w:rPr>
+          <w:b/>
+        </w:rPr>
+        <w:t xml:space="preserve">2.  </w:t>
+      </w:r>
       <w:r>
         <w:t>Watch the reference videos Watch both videos above. The primary shows the local deployment; the additional walkthrough covers the Desktop app in more depth. Note any UI screens that differ from the steps below.</w:t>
       </w:r>
     </w:p>
     <w:p>
       <w:pPr>
-        <w:pStyle w:val="ListNumber"/>
-      </w:pPr>
+        <w:spacing w:after="80"/>
+        <w:ind w:left="360"/>
+      </w:pPr>
+      <w:r>
+        <w:rPr>
+          <w:b/>
+        </w:rPr>
+        <w:t xml:space="preserve">3.  </w:t>
+      </w:r>
       <w:r>
         <w:t>Confirm the local install runs (preferred deployment) Verify the CLI runtime you installed in Lab 1 is present and check its version. The local install is the preferred deployment — it keeps the agent runtime on your machine:</w:t>
       </w:r>
@@ -1811,24 +1874,45 @@
     </w:p>
     <w:p>
       <w:pPr>
-        <w:pStyle w:val="ListNumber"/>
-      </w:pPr>
+        <w:spacing w:after="80"/>
+        <w:ind w:left="360"/>
+      </w:pPr>
+      <w:r>
+        <w:rPr>
+          <w:b/>
+        </w:rPr>
+        <w:t xml:space="preserve">4.  </w:t>
+      </w:r>
       <w:r>
         <w:t>Download and install the Hermes Desktop app Download the Desktop app for your OS from the official site and install it like any normal application:</w:t>
       </w:r>
     </w:p>
     <w:p>
       <w:pPr>
-        <w:pStyle w:val="ListNumber"/>
-      </w:pPr>
+        <w:spacing w:after="80"/>
+        <w:ind w:left="360"/>
+      </w:pPr>
+      <w:r>
+        <w:rPr>
+          <w:b/>
+        </w:rPr>
+        <w:t xml:space="preserve">5.  </w:t>
+      </w:r>
       <w:r>
         <w:t>Open the Desktop app and sign in Launch the Hermes Desktop app and sign in with the same Nous Portal account you used for the CLI in Lab 1. Signing in with the same account is what makes the Desktop app and the CLI drive the same agent. &gt; This step is UI-only — there is no terminal command. In the app, choose Sign in with Nous Portal and complete the browser/authentication prompt.</w:t>
       </w:r>
     </w:p>
     <w:p>
       <w:pPr>
-        <w:pStyle w:val="ListNumber"/>
-      </w:pPr>
+        <w:spacing w:after="80"/>
+        <w:ind w:left="360"/>
+      </w:pPr>
+      <w:r>
+        <w:rPr>
+          <w:b/>
+        </w:rPr>
+        <w:t xml:space="preserve">6.  </w:t>
+      </w:r>
       <w:r>
         <w:t>Verify the local gateway is serving The gateway is the local service that both the CLI and Desktop app connect to. Confirm it is up and healthy:</w:t>
       </w:r>
@@ -1845,8 +1929,15 @@
     </w:p>
     <w:p>
       <w:pPr>
-        <w:pStyle w:val="ListNumber"/>
-      </w:pPr>
+        <w:spacing w:after="80"/>
+        <w:ind w:left="360"/>
+      </w:pPr>
+      <w:r>
+        <w:rPr>
+          <w:b/>
+        </w:rPr>
+        <w:t xml:space="preserve">7.  </w:t>
+      </w:r>
       <w:r>
         <w:t>Keep the runtime up to date Update Hermes to the latest release so the CLI and Desktop app stay compatible:</w:t>
       </w:r>
@@ -1937,16 +2028,30 @@
     </w:p>
     <w:p>
       <w:pPr>
-        <w:pStyle w:val="ListNumber"/>
-      </w:pPr>
+        <w:spacing w:after="80"/>
+        <w:ind w:left="360"/>
+      </w:pPr>
+      <w:r>
+        <w:rPr>
+          <w:b/>
+        </w:rPr>
+        <w:t xml:space="preserve">1.  </w:t>
+      </w:r>
       <w:r>
         <w:t>Watch the reference video Watch the video to see how Hermes stores memory across the three layers and how plugins are enabled: https://www.youtube.com/watch?v=ZKZLko9kLm4&amp;list=PLmpUb_PWAkDx-VWjh00tVCji794xAa_IX&amp;index=4 (https://www.youtube.com/watch?v=ZKZLko9kLm4&amp;list=PLmpUb_PWAkDx-VWjh00tVCji794xAa_IX&amp;index=4)</w:t>
       </w:r>
     </w:p>
     <w:p>
       <w:pPr>
-        <w:pStyle w:val="ListNumber"/>
-      </w:pPr>
+        <w:spacing w:after="80"/>
+        <w:ind w:left="360"/>
+      </w:pPr>
+      <w:r>
+        <w:rPr>
+          <w:b/>
+        </w:rPr>
+        <w:t xml:space="preserve">2.  </w:t>
+      </w:r>
       <w:r>
         <w:t>Teach Athena a durable preference Start a session (hermes --tui) and give Athena a clear, memorable instruction that should persist. Explicitly asking it to remember nudges the agent to write the fact into its curated-notes memory layer:</w:t>
       </w:r>
@@ -1963,8 +2068,15 @@
     </w:p>
     <w:p>
       <w:pPr>
-        <w:pStyle w:val="ListNumber"/>
-      </w:pPr>
+        <w:spacing w:after="80"/>
+        <w:ind w:left="360"/>
+      </w:pPr>
+      <w:r>
+        <w:rPr>
+          <w:b/>
+        </w:rPr>
+        <w:t xml:space="preserve">3.  </w:t>
+      </w:r>
       <w:r>
         <w:t>Start a new session and confirm the preference is recalled Resume the conversation in a fresh session. The --continue flag brings back prior context so you can test cross-session recall:</w:t>
       </w:r>
@@ -1981,8 +2093,15 @@
     </w:p>
     <w:p>
       <w:pPr>
-        <w:pStyle w:val="ListNumber"/>
-      </w:pPr>
+        <w:spacing w:after="80"/>
+        <w:ind w:left="360"/>
+      </w:pPr>
+      <w:r>
+        <w:rPr>
+          <w:b/>
+        </w:rPr>
+        <w:t xml:space="preserve">4.  </w:t>
+      </w:r>
       <w:r>
         <w:t>Inspect stored memory / sessions List the stored sessions so you can see the memory Hermes is persisting behind the scenes:</w:t>
       </w:r>
@@ -1999,8 +2118,15 @@
     </w:p>
     <w:p>
       <w:pPr>
-        <w:pStyle w:val="ListNumber"/>
-      </w:pPr>
+        <w:spacing w:after="80"/>
+        <w:ind w:left="360"/>
+      </w:pPr>
+      <w:r>
+        <w:rPr>
+          <w:b/>
+        </w:rPr>
+        <w:t xml:space="preserve">5.  </w:t>
+      </w:r>
       <w:r>
         <w:t>Enable a plugin to extend the agent Enable a plugin to add capability beyond the base agent. Plugins are toggled from the Hermes plugins UI or config:</w:t>
       </w:r>
@@ -2081,16 +2207,30 @@
     </w:p>
     <w:p>
       <w:pPr>
-        <w:pStyle w:val="ListNumber"/>
-      </w:pPr>
+        <w:spacing w:after="80"/>
+        <w:ind w:left="360"/>
+      </w:pPr>
+      <w:r>
+        <w:rPr>
+          <w:b/>
+        </w:rPr>
+        <w:t xml:space="preserve">1.  </w:t>
+      </w:r>
       <w:r>
         <w:t>Watch the reference video See how skills are discovered, installed, and invoked, and what "self-improving" means in practice: https://www.youtube.com/watch?v=L3WdVeMaYZM&amp;list=PLmpUb_PWAkDx-VWjh00tVCji794xAa_IX&amp;index=5 (https://www.youtube.com/watch?v=L3WdVeMaYZM&amp;list=PLmpUb_PWAkDx-VWjh00tVCji794xAa_IX&amp;index=5)</w:t>
       </w:r>
     </w:p>
     <w:p>
       <w:pPr>
-        <w:pStyle w:val="ListNumber"/>
-      </w:pPr>
+        <w:spacing w:after="80"/>
+        <w:ind w:left="360"/>
+      </w:pPr>
+      <w:r>
+        <w:rPr>
+          <w:b/>
+        </w:rPr>
+        <w:t xml:space="preserve">2.  </w:t>
+      </w:r>
       <w:r>
         <w:t>Browse the skills hub Open the skills catalogue to see what's available to install:</w:t>
       </w:r>
@@ -2107,8 +2247,15 @@
     </w:p>
     <w:p>
       <w:pPr>
-        <w:pStyle w:val="ListNumber"/>
-      </w:pPr>
+        <w:spacing w:after="80"/>
+        <w:ind w:left="360"/>
+      </w:pPr>
+      <w:r>
+        <w:rPr>
+          <w:b/>
+        </w:rPr>
+        <w:t xml:space="preserve">3.  </w:t>
+      </w:r>
       <w:r>
         <w:t>Search for a skill by keyword Narrow the catalogue to something useful for a chief-of-staff agent — for example calendar, email, research, or pdf:</w:t>
       </w:r>
@@ -2125,8 +2272,15 @@
     </w:p>
     <w:p>
       <w:pPr>
-        <w:pStyle w:val="ListNumber"/>
-      </w:pPr>
+        <w:spacing w:after="80"/>
+        <w:ind w:left="360"/>
+      </w:pPr>
+      <w:r>
+        <w:rPr>
+          <w:b/>
+        </w:rPr>
+        <w:t xml:space="preserve">4.  </w:t>
+      </w:r>
       <w:r>
         <w:t>Install a skill Install a skill by its full identifier (copy it from the search results). The pattern is owner/skills/name:</w:t>
       </w:r>
@@ -2143,8 +2297,15 @@
     </w:p>
     <w:p>
       <w:pPr>
-        <w:pStyle w:val="ListNumber"/>
-      </w:pPr>
+        <w:spacing w:after="80"/>
+        <w:ind w:left="360"/>
+      </w:pPr>
+      <w:r>
+        <w:rPr>
+          <w:b/>
+        </w:rPr>
+        <w:t xml:space="preserve">5.  </w:t>
+      </w:r>
       <w:r>
         <w:t>Ask the agent to use the new skill and observe self-improvement Open the TUI and ask Athena to perform a task that the new skill enables. Watch it select and run the skill: &gt; This step is conversational — no fixed command. Phrase a request that maps to the skill (e.g. for a summarize skill: "Summarize this article for me: &lt;paste text&gt;"). As the agent uses the skill repeatedly, it refines how it invokes it — that's the self-improvement aspect.</w:t>
       </w:r>
@@ -2225,16 +2386,30 @@
     </w:p>
     <w:p>
       <w:pPr>
-        <w:pStyle w:val="ListNumber"/>
-      </w:pPr>
+        <w:spacing w:after="80"/>
+        <w:ind w:left="360"/>
+      </w:pPr>
+      <w:r>
+        <w:rPr>
+          <w:b/>
+        </w:rPr>
+        <w:t xml:space="preserve">1.  </w:t>
+      </w:r>
       <w:r>
         <w:t>Watch the reference video See how providers are connected and how to switch models on demand: https://www.youtube.com/watch?v=1oaaOWy7wSI&amp;list=PLmpUb_PWAkDx-VWjh00tVCji794xAa_IX&amp;index=6 (https://www.youtube.com/watch?v=1oaaOWy7wSI&amp;list=PLmpUb_PWAkDx-VWjh00tVCji794xAa_IX&amp;index=6)</w:t>
       </w:r>
     </w:p>
     <w:p>
       <w:pPr>
-        <w:pStyle w:val="ListNumber"/>
-      </w:pPr>
+        <w:spacing w:after="80"/>
+        <w:ind w:left="360"/>
+      </w:pPr>
+      <w:r>
+        <w:rPr>
+          <w:b/>
+        </w:rPr>
+        <w:t xml:space="preserve">2.  </w:t>
+      </w:r>
       <w:r>
         <w:t>Open the interactive provider/model picker Launch the interactive picker to see available providers and models and select one:</w:t>
       </w:r>
@@ -2251,8 +2426,15 @@
     </w:p>
     <w:p>
       <w:pPr>
-        <w:pStyle w:val="ListNumber"/>
-      </w:pPr>
+        <w:spacing w:after="80"/>
+        <w:ind w:left="360"/>
+      </w:pPr>
+      <w:r>
+        <w:rPr>
+          <w:b/>
+        </w:rPr>
+        <w:t xml:space="preserve">3.  </w:t>
+      </w:r>
       <w:r>
         <w:t>Set a model explicitly Instead of (or in addition to) the picker, set the active model directly in config:</w:t>
       </w:r>
@@ -2269,8 +2451,15 @@
     </w:p>
     <w:p>
       <w:pPr>
-        <w:pStyle w:val="ListNumber"/>
-      </w:pPr>
+        <w:spacing w:after="80"/>
+        <w:ind w:left="360"/>
+      </w:pPr>
+      <w:r>
+        <w:rPr>
+          <w:b/>
+        </w:rPr>
+        <w:t xml:space="preserve">4.  </w:t>
+      </w:r>
       <w:r>
         <w:t>Add a provider key if using a cloud endpoint If your chosen model runs on a cloud endpoint (e.g. OpenRouter), store the API key in config so Hermes can authenticate:</w:t>
       </w:r>
@@ -2287,8 +2476,15 @@
     </w:p>
     <w:p>
       <w:pPr>
-        <w:pStyle w:val="ListNumber"/>
-      </w:pPr>
+        <w:spacing w:after="80"/>
+        <w:ind w:left="360"/>
+      </w:pPr>
+      <w:r>
+        <w:rPr>
+          <w:b/>
+        </w:rPr>
+        <w:t xml:space="preserve">5.  </w:t>
+      </w:r>
       <w:r>
         <w:t>Confirm the active model meets the ≥64k context rule Reopen the picker to confirm the active model and its context window:</w:t>
       </w:r>
@@ -2379,24 +2575,45 @@
     </w:p>
     <w:p>
       <w:pPr>
-        <w:pStyle w:val="ListNumber"/>
-      </w:pPr>
+        <w:spacing w:after="80"/>
+        <w:ind w:left="360"/>
+      </w:pPr>
+      <w:r>
+        <w:rPr>
+          <w:b/>
+        </w:rPr>
+        <w:t xml:space="preserve">1.  </w:t>
+      </w:r>
       <w:r>
         <w:t>Watch the reference video See how MCP servers are declared in config and how the Tool Gateway tools are called from chat: https://www.youtube.com/watch?v=U140gP-1bEI&amp;list=PLmpUb_PWAkDx-VWjh00tVCji794xAa_IX&amp;index=7 (https://www.youtube.com/watch?v=U140gP-1bEI&amp;list=PLmpUb_PWAkDx-VWjh00tVCji794xAa_IX&amp;index=7)</w:t>
       </w:r>
     </w:p>
     <w:p>
       <w:pPr>
-        <w:pStyle w:val="ListNumber"/>
-      </w:pPr>
+        <w:spacing w:after="80"/>
+        <w:ind w:left="360"/>
+      </w:pPr>
+      <w:r>
+        <w:rPr>
+          <w:b/>
+        </w:rPr>
+        <w:t xml:space="preserve">2.  </w:t>
+      </w:r>
       <w:r>
         <w:t>Open the Hermes config to add an MCP server Edit your Hermes config file and locate (or create) the mcp_servers: section:</w:t>
       </w:r>
     </w:p>
     <w:p>
       <w:pPr>
-        <w:pStyle w:val="ListNumber"/>
-      </w:pPr>
+        <w:spacing w:after="80"/>
+        <w:ind w:left="360"/>
+      </w:pPr>
+      <w:r>
+        <w:rPr>
+          <w:b/>
+        </w:rPr>
+        <w:t xml:space="preserve">3.  </w:t>
+      </w:r>
       <w:r>
         <w:t>Add a GitHub MCP server entry Add an entry that launches the official GitHub MCP server via npx. A typical block looks like this:</w:t>
       </w:r>
@@ -2463,8 +2680,15 @@
     </w:p>
     <w:p>
       <w:pPr>
-        <w:pStyle w:val="ListNumber"/>
-      </w:pPr>
+        <w:spacing w:after="80"/>
+        <w:ind w:left="360"/>
+      </w:pPr>
+      <w:r>
+        <w:rPr>
+          <w:b/>
+        </w:rPr>
+        <w:t xml:space="preserve">4.  </w:t>
+      </w:r>
       <w:r>
         <w:t>Restart so the MCP server is picked up, then verify Restart Hermes (close and reopen the TUI, or restart the gateway) so it reads the new config, then run the diagnostic:</w:t>
       </w:r>
@@ -2481,8 +2705,15 @@
     </w:p>
     <w:p>
       <w:pPr>
-        <w:pStyle w:val="ListNumber"/>
-      </w:pPr>
+        <w:spacing w:after="80"/>
+        <w:ind w:left="360"/>
+      </w:pPr>
+      <w:r>
+        <w:rPr>
+          <w:b/>
+        </w:rPr>
+        <w:t xml:space="preserve">5.  </w:t>
+      </w:r>
       <w:r>
         <w:t>Use a Tool Gateway tool from a chat Open the TUI and ask Athena to use a bundled Tool Gateway capability — web search, image generation, or text-to-speech: &gt; This step is conversational. For example: "Search the web for today's top AI agent news and list 3 headlines," or "Generate an image of a friendly robot assistant." Confirm the agent invokes the tool and returns the result.</w:t>
       </w:r>
@@ -2563,24 +2794,45 @@
     </w:p>
     <w:p>
       <w:pPr>
-        <w:pStyle w:val="ListNumber"/>
-      </w:pPr>
+        <w:spacing w:after="80"/>
+        <w:ind w:left="360"/>
+      </w:pPr>
+      <w:r>
+        <w:rPr>
+          <w:b/>
+        </w:rPr>
+        <w:t xml:space="preserve">1.  </w:t>
+      </w:r>
       <w:r>
         <w:t>Watch the reference video Watch how recurring jobs (crons/automations) are defined and triggered in Hermes. The exact syntax is version-specific, so follow the video closely: https://www.youtube.com/watch?v=grMNnzCv2gY&amp;list=PLmpUb_PWAkDx-VWjh00tVCji794xAa_IX&amp;index=8 (https://www.youtube.com/watch?v=grMNnzCv2gY&amp;list=PLmpUb_PWAkDx-VWjh00tVCji794xAa_IX&amp;index=8)</w:t>
       </w:r>
     </w:p>
     <w:p>
       <w:pPr>
-        <w:pStyle w:val="ListNumber"/>
-      </w:pPr>
+        <w:spacing w:after="80"/>
+        <w:ind w:left="360"/>
+      </w:pPr>
+      <w:r>
+        <w:rPr>
+          <w:b/>
+        </w:rPr>
+        <w:t xml:space="preserve">2.  </w:t>
+      </w:r>
       <w:r>
         <w:t>Define a recurring job (daily 8am briefing) Create a recurring automation in the Hermes automations/crons section — for example a daily 8am briefing:</w:t>
       </w:r>
     </w:p>
     <w:p>
       <w:pPr>
-        <w:pStyle w:val="ListNumber"/>
-      </w:pPr>
+        <w:spacing w:after="80"/>
+        <w:ind w:left="360"/>
+      </w:pPr>
+      <w:r>
+        <w:rPr>
+          <w:b/>
+        </w:rPr>
+        <w:t xml:space="preserve">3.  </w:t>
+      </w:r>
       <w:r>
         <w:t>Confirm the automation is registered Run the diagnostic to confirm Hermes has picked up the new scheduled job:</w:t>
       </w:r>
@@ -2597,16 +2849,30 @@
     </w:p>
     <w:p>
       <w:pPr>
-        <w:pStyle w:val="ListNumber"/>
-      </w:pPr>
+        <w:spacing w:after="80"/>
+        <w:ind w:left="360"/>
+      </w:pPr>
+      <w:r>
+        <w:rPr>
+          <w:b/>
+        </w:rPr>
+        <w:t xml:space="preserve">4.  </w:t>
+      </w:r>
       <w:r>
         <w:t>Trigger the job once to confirm it produces output Manually run the job once (rather than waiting for 8am) to confirm it produces the expected briefing. &gt; This is typically a "run now" action in the automations UI, or a trigger command shown in the docs. Confirm the briefing is generated and delivered to your chosen destination.</w:t>
       </w:r>
     </w:p>
     <w:p>
       <w:pPr>
-        <w:pStyle w:val="ListNumber"/>
-      </w:pPr>
+        <w:spacing w:after="80"/>
+        <w:ind w:left="360"/>
+      </w:pPr>
+      <w:r>
+        <w:rPr>
+          <w:b/>
+        </w:rPr>
+        <w:t xml:space="preserve">5.  </w:t>
+      </w:r>
       <w:r>
         <w:t>Confirm the next scheduled run is queued Check that after the manual run, the next run is still scheduled for its normal time (08:00 tomorrow), so the automation keeps recurring.</w:t>
       </w:r>
@@ -2687,16 +2953,30 @@
     </w:p>
     <w:p>
       <w:pPr>
-        <w:pStyle w:val="ListNumber"/>
-      </w:pPr>
+        <w:spacing w:after="80"/>
+        <w:ind w:left="360"/>
+      </w:pPr>
+      <w:r>
+        <w:rPr>
+          <w:b/>
+        </w:rPr>
+        <w:t xml:space="preserve">1.  </w:t>
+      </w:r>
       <w:r>
         <w:t>Watch the reference video See how a coordinator agent spawns worker subagents on isolated backends and combines their output: https://www.youtube.com/watch?v=KPsMThlFb8Y&amp;list=PLmpUb_PWAkDx-VWjh00tVCji794xAa_IX&amp;index=10 (https://www.youtube.com/watch?v=KPsMThlFb8Y&amp;list=PLmpUb_PWAkDx-VWjh00tVCji794xAa_IX&amp;index=10)</w:t>
       </w:r>
     </w:p>
     <w:p>
       <w:pPr>
-        <w:pStyle w:val="ListNumber"/>
-      </w:pPr>
+        <w:spacing w:after="80"/>
+        <w:ind w:left="360"/>
+      </w:pPr>
+      <w:r>
+        <w:rPr>
+          <w:b/>
+        </w:rPr>
+        <w:t xml:space="preserve">2.  </w:t>
+      </w:r>
       <w:r>
         <w:t>Choose an isolated backend for worker agents Set the terminal backend that worker subagents will run on. docker gives each worker an isolated container:</w:t>
       </w:r>
@@ -2713,24 +2993,45 @@
     </w:p>
     <w:p>
       <w:pPr>
-        <w:pStyle w:val="ListNumber"/>
-      </w:pPr>
+        <w:spacing w:after="80"/>
+        <w:ind w:left="360"/>
+      </w:pPr>
+      <w:r>
+        <w:rPr>
+          <w:b/>
+        </w:rPr>
+        <w:t xml:space="preserve">3.  </w:t>
+      </w:r>
       <w:r>
         <w:t>Ask the coordinator to delegate a multi-part task Open the TUI and give Athena (the coordinator) a task with clearly separable parts so it delegates each to a worker subagent: &gt; Conversational step. For example: "Delegate this: subagent A researches competitor pricing, subagent B drafts a comparison table, subagent C writes a one-paragraph recommendation. Then combine their work." Watch the coordinator spin up workers.</w:t>
       </w:r>
     </w:p>
     <w:p>
       <w:pPr>
-        <w:pStyle w:val="ListNumber"/>
-      </w:pPr>
+        <w:spacing w:after="80"/>
+        <w:ind w:left="360"/>
+      </w:pPr>
+      <w:r>
+        <w:rPr>
+          <w:b/>
+        </w:rPr>
+        <w:t xml:space="preserve">4.  </w:t>
+      </w:r>
       <w:r>
         <w:t>Observe each subagent run in isolation and report back Watch each worker subagent execute on the isolated backend and return its portion of the result. Confirm they run separately (each in its own container/environment when using docker) rather than in the coordinator's session.</w:t>
       </w:r>
     </w:p>
     <w:p>
       <w:pPr>
-        <w:pStyle w:val="ListNumber"/>
-      </w:pPr>
+        <w:spacing w:after="80"/>
+        <w:ind w:left="360"/>
+      </w:pPr>
+      <w:r>
+        <w:rPr>
+          <w:b/>
+        </w:rPr>
+        <w:t xml:space="preserve">5.  </w:t>
+      </w:r>
       <w:r>
         <w:t>Review the coordinator's aggregated result Confirm the coordinator combines the workers' outputs into one coherent deliverable — the research, the table, and the recommendation merged into a single response.</w:t>
       </w:r>
@@ -2811,40 +3112,75 @@
     </w:p>
     <w:p>
       <w:pPr>
-        <w:pStyle w:val="ListNumber"/>
-      </w:pPr>
+        <w:spacing w:after="80"/>
+        <w:ind w:left="360"/>
+      </w:pPr>
+      <w:r>
+        <w:rPr>
+          <w:b/>
+        </w:rPr>
+        <w:t xml:space="preserve">1.  </w:t>
+      </w:r>
       <w:r>
         <w:t>Watch the reference video This lab shares the video with Lab 8. Focus on the portions covering the agent profile and the Kanban board view: https://www.youtube.com/watch?v=KPsMThlFb8Y&amp;list=PLmpUb_PWAkDx-VWjh00tVCji794xAa_IX&amp;index=10 (https://www.youtube.com/watch?v=KPsMThlFb8Y&amp;list=PLmpUb_PWAkDx-VWjh00tVCji794xAa_IX&amp;index=10)</w:t>
       </w:r>
     </w:p>
     <w:p>
       <w:pPr>
-        <w:pStyle w:val="ListNumber"/>
-      </w:pPr>
+        <w:spacing w:after="80"/>
+        <w:ind w:left="360"/>
+      </w:pPr>
+      <w:r>
+        <w:rPr>
+          <w:b/>
+        </w:rPr>
+        <w:t xml:space="preserve">2.  </w:t>
+      </w:r>
       <w:r>
         <w:t>Set up the agent profile (identity, defaults, preferences) Configure Athena's profile — its identity, default model/backend, and behavioural preferences. &gt; Open the profile settings in the Desktop app (or the profile section of ~/.hermes/config.yaml). Set the name to Athena, role to personal chief of staff, and default preferences (concise bulleted output, timezone, working hours). The exact profile fields are version-specific — verify in the video / Hermes docs (https://hermes-agent.nousresearch.com/docs/).</w:t>
       </w:r>
     </w:p>
     <w:p>
       <w:pPr>
-        <w:pStyle w:val="ListNumber"/>
-      </w:pPr>
+        <w:spacing w:after="80"/>
+        <w:ind w:left="360"/>
+      </w:pPr>
+      <w:r>
+        <w:rPr>
+          <w:b/>
+        </w:rPr>
+        <w:t xml:space="preserve">3.  </w:t>
+      </w:r>
       <w:r>
         <w:t>Open the Kanban board view Open the Kanban board that visualizes the agent's tasks. &gt; In the Desktop app, open the Kanban / Tasks view. You should see columns such as Todo, In Progress, and Done.</w:t>
       </w:r>
     </w:p>
     <w:p>
       <w:pPr>
-        <w:pStyle w:val="ListNumber"/>
-      </w:pPr>
+        <w:spacing w:after="80"/>
+        <w:ind w:left="360"/>
+      </w:pPr>
+      <w:r>
+        <w:rPr>
+          <w:b/>
+        </w:rPr>
+        <w:t xml:space="preserve">4.  </w:t>
+      </w:r>
       <w:r>
         <w:t>Assign a task and watch it move todo → in progress → done Give Athena a task and watch the corresponding card move across the board: &gt; Assign a task (e.g. "Draft my weekly team update"). A card appears in Todo, moves to In Progress as the agent works, and lands in Done when finished. This is your live oversight of what the agent is doing.</w:t>
       </w:r>
     </w:p>
     <w:p>
       <w:pPr>
-        <w:pStyle w:val="ListNumber"/>
-      </w:pPr>
+        <w:spacing w:after="80"/>
+        <w:ind w:left="360"/>
+      </w:pPr>
+      <w:r>
+        <w:rPr>
+          <w:b/>
+        </w:rPr>
+        <w:t xml:space="preserve">5.  </w:t>
+      </w:r>
       <w:r>
         <w:t>Use the board to review and accept completed work When a card reaches Done, open it, review the agent's output, and accept (or send it back with feedback). This human-in-the-loop review is the point of the board.</w:t>
       </w:r>
@@ -2925,16 +3261,30 @@
     </w:p>
     <w:p>
       <w:pPr>
-        <w:pStyle w:val="ListNumber"/>
-      </w:pPr>
+        <w:spacing w:after="80"/>
+        <w:ind w:left="360"/>
+      </w:pPr>
+      <w:r>
+        <w:rPr>
+          <w:b/>
+        </w:rPr>
+        <w:t xml:space="preserve">1.  </w:t>
+      </w:r>
       <w:r>
         <w:t>Watch the reference video This lab shares the video with Lab 1. Focus on the sections covering isolation, secrets, and approvals: https://www.youtube.com/watch?v=KtlY6ETPyKo&amp;list=PLmpUb_PWAkDx-VWjh00tVCji794xAa_IX&amp;index=11 (https://www.youtube.com/watch?v=KtlY6ETPyKo&amp;list=PLmpUb_PWAkDx-VWjh00tVCji794xAa_IX&amp;index=11)</w:t>
       </w:r>
     </w:p>
     <w:p>
       <w:pPr>
-        <w:pStyle w:val="ListNumber"/>
-      </w:pPr>
+        <w:spacing w:after="80"/>
+        <w:ind w:left="360"/>
+      </w:pPr>
+      <w:r>
+        <w:rPr>
+          <w:b/>
+        </w:rPr>
+        <w:t xml:space="preserve">2.  </w:t>
+      </w:r>
       <w:r>
         <w:t>Isolate execution in a sandboxed backend Set the terminal backend to a sandboxed container so risky commands never run directly on your host:</w:t>
       </w:r>
@@ -2951,8 +3301,15 @@
     </w:p>
     <w:p>
       <w:pPr>
-        <w:pStyle w:val="ListNumber"/>
-      </w:pPr>
+        <w:spacing w:after="80"/>
+        <w:ind w:left="360"/>
+      </w:pPr>
+      <w:r>
+        <w:rPr>
+          <w:b/>
+        </w:rPr>
+        <w:t xml:space="preserve">3.  </w:t>
+      </w:r>
       <w:r>
         <w:t>Store provider/tool secrets via config rather than plain text Store API keys through the Hermes config mechanism instead of pasting them into prompts or scripts:</w:t>
       </w:r>
@@ -2969,16 +3326,30 @@
     </w:p>
     <w:p>
       <w:pPr>
-        <w:pStyle w:val="ListNumber"/>
-      </w:pPr>
+        <w:spacing w:after="80"/>
+        <w:ind w:left="360"/>
+      </w:pPr>
+      <w:r>
+        <w:rPr>
+          <w:b/>
+        </w:rPr>
+        <w:t xml:space="preserve">4.  </w:t>
+      </w:r>
       <w:r>
         <w:t>Require approval before the agent runs risky actions Enable approval prompts so the agent pauses and asks you before executing sensitive actions (shell commands, file deletions, external posts):</w:t>
       </w:r>
     </w:p>
     <w:p>
       <w:pPr>
-        <w:pStyle w:val="ListNumber"/>
-      </w:pPr>
+        <w:spacing w:after="80"/>
+        <w:ind w:left="360"/>
+      </w:pPr>
+      <w:r>
+        <w:rPr>
+          <w:b/>
+        </w:rPr>
+        <w:t xml:space="preserve">5.  </w:t>
+      </w:r>
       <w:r>
         <w:t>Apply least privilege — grant only the tools/skills the task needs Review the tools, skills, and MCP servers Athena has access to and disable anything not needed for the current work. &gt; Conversational/config step: trim the enabled skills (Lab 4) and MCP servers (Lab 6) to the minimum. Least privilege means the agent can only do what the task actually requires.</w:t>
       </w:r>
@@ -3059,40 +3430,75 @@
     </w:p>
     <w:p>
       <w:pPr>
-        <w:pStyle w:val="ListNumber"/>
-      </w:pPr>
+        <w:spacing w:after="80"/>
+        <w:ind w:left="360"/>
+      </w:pPr>
+      <w:r>
+        <w:rPr>
+          <w:b/>
+        </w:rPr>
+        <w:t xml:space="preserve">1.  </w:t>
+      </w:r>
       <w:r>
         <w:t>Watch the reference video See the full workflow of driving Hyperframe through the agent to produce a video: https://www.youtube.com/watch?v=dcXmUUZvDLE&amp;list=PLmpUb_PWAkDx-VWjh00tVCji794xAa_IX&amp;index=3 (https://www.youtube.com/watch?v=dcXmUUZvDLE&amp;list=PLmpUb_PWAkDx-VWjh00tVCji794xAa_IX&amp;index=3)</w:t>
       </w:r>
     </w:p>
     <w:p>
       <w:pPr>
-        <w:pStyle w:val="ListNumber"/>
-      </w:pPr>
+        <w:spacing w:after="80"/>
+        <w:ind w:left="360"/>
+      </w:pPr>
+      <w:r>
+        <w:rPr>
+          <w:b/>
+        </w:rPr>
+        <w:t xml:space="preserve">2.  </w:t>
+      </w:r>
       <w:r>
         <w:t>Connect / set up the Hyperframe video tool for the agent Wire the Hyperframe tool into Athena so the agent can invoke it. &gt; This may be an MCP server, a skill, or a Tool Gateway integration depending on your build. Add Hyperframe the same way you added tools in Lab 6, supplying any required API key via hermes config set. Verify the exact integration path in the video / Hermes docs (https://hermes-agent.nousresearch.com/docs/).</w:t>
       </w:r>
     </w:p>
     <w:p>
       <w:pPr>
-        <w:pStyle w:val="ListNumber"/>
-      </w:pPr>
+        <w:spacing w:after="80"/>
+        <w:ind w:left="360"/>
+      </w:pPr>
+      <w:r>
+        <w:rPr>
+          <w:b/>
+        </w:rPr>
+        <w:t xml:space="preserve">3.  </w:t>
+      </w:r>
       <w:r>
         <w:t>Brief the agent with a short video concept Give Athena a clear, concise creative brief — topic, style, and length: &gt; Conversational step. For example: "Make a 30-second explainer video introducing 'Athena, my AI chief of staff'. Clean, modern style, upbeat tone, with on-screen captions." A tight brief yields a better first result.</w:t>
       </w:r>
     </w:p>
     <w:p>
       <w:pPr>
-        <w:pStyle w:val="ListNumber"/>
-      </w:pPr>
+        <w:spacing w:after="80"/>
+        <w:ind w:left="360"/>
+      </w:pPr>
+      <w:r>
+        <w:rPr>
+          <w:b/>
+        </w:rPr>
+        <w:t xml:space="preserve">4.  </w:t>
+      </w:r>
       <w:r>
         <w:t>Have the agent generate the video with Hyperframe Ask Athena to generate the video. The agent calls Hyperframe with your brief and waits for the render: &gt; Confirm the agent invokes Hyperframe and reports back with a link/file to the rendered video. Rendering may take a few minutes.</w:t>
       </w:r>
     </w:p>
     <w:p>
       <w:pPr>
-        <w:pStyle w:val="ListNumber"/>
-      </w:pPr>
+        <w:spacing w:after="80"/>
+        <w:ind w:left="360"/>
+      </w:pPr>
+      <w:r>
+        <w:rPr>
+          <w:b/>
+        </w:rPr>
+        <w:t xml:space="preserve">5.  </w:t>
+      </w:r>
       <w:r>
         <w:t>Review the output and refine the brief to regenerate if needed Play the video, then refine the brief (pacing, style, wording) and ask Athena to regenerate. Iterate until it meets your bar.</w:t>
       </w:r>
@@ -3173,32 +3579,60 @@
     </w:p>
     <w:p>
       <w:pPr>
-        <w:pStyle w:val="ListNumber"/>
-      </w:pPr>
+        <w:spacing w:after="80"/>
+        <w:ind w:left="360"/>
+      </w:pPr>
+      <w:r>
+        <w:rPr>
+          <w:b/>
+        </w:rPr>
+        <w:t xml:space="preserve">1.  </w:t>
+      </w:r>
       <w:r>
         <w:t>Watch the reference video See how Hermes renders workflows/activity visually and how to read the output: https://www.youtube.com/watch?v=JX2RYeKugrc&amp;list=PLmpUb_PWAkDxewld5ZYyKifuHxgIbiq2d&amp;index=27 (https://www.youtube.com/watch?v=JX2RYeKugrc&amp;list=PLmpUb_PWAkDxewld5ZYyKifuHxgIbiq2d&amp;index=27)</w:t>
       </w:r>
     </w:p>
     <w:p>
       <w:pPr>
-        <w:pStyle w:val="ListNumber"/>
-      </w:pPr>
+        <w:spacing w:after="80"/>
+        <w:ind w:left="360"/>
+      </w:pPr>
+      <w:r>
+        <w:rPr>
+          <w:b/>
+        </w:rPr>
+        <w:t xml:space="preserve">2.  </w:t>
+      </w:r>
       <w:r>
         <w:t>Open the visualization view for the agent's activity Open the visualization panel that shows Athena's activity. &gt; In the Desktop app, open the Visualization / Activity view. It surfaces the agent's task flow, tool calls, and data. Verify the exact location in the video / Hermes docs (https://hermes-agent.nousresearch.com/docs/).</w:t>
       </w:r>
     </w:p>
     <w:p>
       <w:pPr>
-        <w:pStyle w:val="ListNumber"/>
-      </w:pPr>
+        <w:spacing w:after="80"/>
+        <w:ind w:left="360"/>
+      </w:pPr>
+      <w:r>
+        <w:rPr>
+          <w:b/>
+        </w:rPr>
+        <w:t xml:space="preserve">3.  </w:t>
+      </w:r>
       <w:r>
         <w:t>Generate a visualization of a workflow or dataset Ask Athena to produce a visualization of a workflow or a dataset: &gt; Conversational step. For example: "Visualize the steps you took to produce this morning's briefing," or "Chart my task completion over the last week." The agent generates a diagram/chart of the workflow or data.</w:t>
       </w:r>
     </w:p>
     <w:p>
       <w:pPr>
-        <w:pStyle w:val="ListNumber"/>
-      </w:pPr>
+        <w:spacing w:after="80"/>
+        <w:ind w:left="360"/>
+      </w:pPr>
+      <w:r>
+        <w:rPr>
+          <w:b/>
+        </w:rPr>
+        <w:t xml:space="preserve">4.  </w:t>
+      </w:r>
       <w:r>
         <w:t>Interpret the visualization to understand what the agent did Read the visualization: which steps ran, in what order, which tools/subagents were involved, and where time was spent. Use it to confirm the agent did what you expected.</w:t>
       </w:r>
@@ -3279,40 +3713,75 @@
     </w:p>
     <w:p>
       <w:pPr>
-        <w:pStyle w:val="ListNumber"/>
-      </w:pPr>
+        <w:spacing w:after="80"/>
+        <w:ind w:left="360"/>
+      </w:pPr>
+      <w:r>
+        <w:rPr>
+          <w:b/>
+        </w:rPr>
+        <w:t xml:space="preserve">1.  </w:t>
+      </w:r>
       <w:r>
         <w:t>Watch the reference video See a full multi-agent workflow composed and run end-to-end, with hand-offs between roles: https://www.youtube.com/watch?v=GzlbC75bYtU&amp;list=PLmpUb_PWAkDxewld5ZYyKifuHxgIbiq2d&amp;index=19 (https://www.youtube.com/watch?v=GzlbC75bYtU&amp;list=PLmpUb_PWAkDxewld5ZYyKifuHxgIbiq2d&amp;index=19)</w:t>
       </w:r>
     </w:p>
     <w:p>
       <w:pPr>
-        <w:pStyle w:val="ListNumber"/>
-      </w:pPr>
+        <w:spacing w:after="80"/>
+        <w:ind w:left="360"/>
+      </w:pPr>
+      <w:r>
+        <w:rPr>
+          <w:b/>
+        </w:rPr>
+        <w:t xml:space="preserve">2.  </w:t>
+      </w:r>
       <w:r>
         <w:t>Define the agents and their roles in the workflow Design the workflow by naming each agent and its distinct responsibility. &gt; Conversational/design step. For a chief-of-staff use case, define roles such as: Researcher (gathers facts), Writer (drafts content), Reviewer (checks quality), with Athena as coordinator. Write the roles down before wiring anything.</w:t>
       </w:r>
     </w:p>
     <w:p>
       <w:pPr>
-        <w:pStyle w:val="ListNumber"/>
-      </w:pPr>
+        <w:spacing w:after="80"/>
+        <w:ind w:left="360"/>
+      </w:pPr>
+      <w:r>
+        <w:rPr>
+          <w:b/>
+        </w:rPr>
+        <w:t xml:space="preserve">3.  </w:t>
+      </w:r>
       <w:r>
         <w:t>Connect the agents so outputs hand off between them Wire the agents so each one's output becomes the next one's input (Researcher → Writer → Reviewer). &gt; Use the subagent/delegation mechanism from Lab 8. Instruct Athena that the Researcher's findings feed the Writer, and the Writer's draft feeds the Reviewer. Verify the exact multi-agent wiring in the video / Hermes docs (https://hermes-agent.nousresearch.com/docs/).</w:t>
       </w:r>
     </w:p>
     <w:p>
       <w:pPr>
-        <w:pStyle w:val="ListNumber"/>
-      </w:pPr>
+        <w:spacing w:after="80"/>
+        <w:ind w:left="360"/>
+      </w:pPr>
+      <w:r>
+        <w:rPr>
+          <w:b/>
+        </w:rPr>
+        <w:t xml:space="preserve">4.  </w:t>
+      </w:r>
       <w:r>
         <w:t>Run the workflow end-to-end on a sample goal Give the workflow a real goal and run it start to finish: &gt; For example: "Produce a one-page competitor brief on the top 3 AI agent platforms." Watch Researcher → Writer → Reviewer hand off in sequence and produce the final brief.</w:t>
       </w:r>
     </w:p>
     <w:p>
       <w:pPr>
-        <w:pStyle w:val="ListNumber"/>
-      </w:pPr>
+        <w:spacing w:after="80"/>
+        <w:ind w:left="360"/>
+      </w:pPr>
+      <w:r>
+        <w:rPr>
+          <w:b/>
+        </w:rPr>
+        <w:t xml:space="preserve">5.  </w:t>
+      </w:r>
       <w:r>
         <w:t>Verify each stage completed and the final result is correct Check that every stage ran, each hand-off delivered usable input to the next, and the final output is coherent and correct.</w:t>
       </w:r>
@@ -3393,24 +3862,45 @@
     </w:p>
     <w:p>
       <w:pPr>
-        <w:pStyle w:val="ListNumber"/>
-      </w:pPr>
+        <w:spacing w:after="80"/>
+        <w:ind w:left="360"/>
+      </w:pPr>
+      <w:r>
+        <w:rPr>
+          <w:b/>
+        </w:rPr>
+        <w:t xml:space="preserve">1.  </w:t>
+      </w:r>
       <w:r>
         <w:t>Watch the reference video See how a webhook endpoint is configured for the agent and how an incoming payload triggers it: https://www.youtube.com/watch?v=WNYe5mD4fY8&amp;list=PLmpUb_PWAkDxewld5ZYyKifuHxgIbiq2d&amp;index=31 (https://www.youtube.com/watch?v=WNYe5mD4fY8&amp;list=PLmpUb_PWAkDxewld5ZYyKifuHxgIbiq2d&amp;index=31)</w:t>
       </w:r>
     </w:p>
     <w:p>
       <w:pPr>
-        <w:pStyle w:val="ListNumber"/>
-      </w:pPr>
+        <w:spacing w:after="80"/>
+        <w:ind w:left="360"/>
+      </w:pPr>
+      <w:r>
+        <w:rPr>
+          <w:b/>
+        </w:rPr>
+        <w:t xml:space="preserve">2.  </w:t>
+      </w:r>
       <w:r>
         <w:t>Configure a webhook trigger/endpoint for the agent Set up a webhook endpoint that Athena listens on. &gt; Configure the webhook in the Hermes automation/integration settings (Desktop app or the webhook section of ~/.hermes/config.yaml), mapping an incoming URL to an agent action. The exact config keys and the endpoint URL are version-specific — verify in the video / Hermes docs (https://hermes-agent.nousresearch.com/docs/). Note the endpoint URL served by your local gateway (from hermes gateway status).</w:t>
       </w:r>
     </w:p>
     <w:p>
       <w:pPr>
-        <w:pStyle w:val="ListNumber"/>
-      </w:pPr>
+        <w:spacing w:after="80"/>
+        <w:ind w:left="360"/>
+      </w:pPr>
+      <w:r>
+        <w:rPr>
+          <w:b/>
+        </w:rPr>
+        <w:t xml:space="preserve">3.  </w:t>
+      </w:r>
       <w:r>
         <w:t>Send a test payload to the webhook Send a test HTTP POST to the endpoint to simulate an external event:</w:t>
       </w:r>
@@ -3447,16 +3937,30 @@
     </w:p>
     <w:p>
       <w:pPr>
-        <w:pStyle w:val="ListNumber"/>
-      </w:pPr>
+        <w:spacing w:after="80"/>
+        <w:ind w:left="360"/>
+      </w:pPr>
+      <w:r>
+        <w:rPr>
+          <w:b/>
+        </w:rPr>
+        <w:t xml:space="preserve">4.  </w:t>
+      </w:r>
       <w:r>
         <w:t>Confirm the agent receives the event and responds/acts Check that the incoming payload triggered Athena — e.g. it ran the mapped action (a briefing, a reply, a message to a channel). Confirm the action's output where you expect it (chat, channel, or logs).</w:t>
       </w:r>
     </w:p>
     <w:p>
       <w:pPr>
-        <w:pStyle w:val="ListNumber"/>
-      </w:pPr>
+        <w:spacing w:after="80"/>
+        <w:ind w:left="360"/>
+      </w:pPr>
+      <w:r>
+        <w:rPr>
+          <w:b/>
+        </w:rPr>
+        <w:t xml:space="preserve">5.  </w:t>
+      </w:r>
       <w:r>
         <w:t>Secure the webhook (secret/token, allowlist) Lock the endpoint down so only authorized callers can trigger the agent: &gt; Add a shared secret/token that callers must include (e.g. an Authorization header or a signing secret), and/or an IP allowlist. Re-send the test with and without the secret to confirm unauthorized calls are rejected. Verify the exact security options in the video / docs link above.</w:t>
       </w:r>
@@ -3592,8 +4096,15 @@
     </w:p>
     <w:p>
       <w:pPr>
-        <w:pStyle w:val="ListNumber"/>
-      </w:pPr>
+        <w:spacing w:after="80"/>
+        <w:ind w:left="360"/>
+      </w:pPr>
+      <w:r>
+        <w:rPr>
+          <w:b/>
+        </w:rPr>
+        <w:t xml:space="preserve">1.  </w:t>
+      </w:r>
       <w:r>
         <w:t>Watch the OpenClaw reference playlist</w:t>
       </w:r>
@@ -3610,8 +4121,15 @@
     </w:p>
     <w:p>
       <w:pPr>
-        <w:pStyle w:val="ListNumber"/>
-      </w:pPr>
+        <w:spacing w:after="80"/>
+        <w:ind w:left="360"/>
+      </w:pPr>
+      <w:r>
+        <w:rPr>
+          <w:b/>
+        </w:rPr>
+        <w:t xml:space="preserve">2.  </w:t>
+      </w:r>
       <w:r>
         <w:t>Install Node.js 24 LTS (24 recommended; 22.16+ minimum). OpenClaw runs on Node. Windows — download the Node 24 LTS installer from &lt;https://nodejs.org/&gt; and run the .msi (WSL2 is recommended for stability), then check:</w:t>
       </w:r>
@@ -3638,8 +4156,15 @@
     </w:p>
     <w:p>
       <w:pPr>
-        <w:pStyle w:val="ListNumber"/>
-      </w:pPr>
+        <w:spacing w:after="80"/>
+        <w:ind w:left="360"/>
+      </w:pPr>
+      <w:r>
+        <w:rPr>
+          <w:b/>
+        </w:rPr>
+        <w:t xml:space="preserve">3.  </w:t>
+      </w:r>
       <w:r>
         <w:t>Install OpenClaw — Option A (npm, recommended, cross-platform). After Node is installed:</w:t>
       </w:r>
@@ -3666,8 +4191,15 @@
     </w:p>
     <w:p>
       <w:pPr>
-        <w:pStyle w:val="ListNumber"/>
-      </w:pPr>
+        <w:spacing w:after="80"/>
+        <w:ind w:left="360"/>
+      </w:pPr>
+      <w:r>
+        <w:rPr>
+          <w:b/>
+        </w:rPr>
+        <w:t xml:space="preserve">4.  </w:t>
+      </w:r>
       <w:r>
         <w:t>Install OpenClaw — Option B (installer script, fallback if npm fails). macOS / Linux / WSL2:</w:t>
       </w:r>
@@ -3684,8 +4216,15 @@
     </w:p>
     <w:p>
       <w:pPr>
-        <w:pStyle w:val="ListNumber"/>
-      </w:pPr>
+        <w:spacing w:after="80"/>
+        <w:ind w:left="360"/>
+      </w:pPr>
+      <w:r>
+        <w:rPr>
+          <w:b/>
+        </w:rPr>
+        <w:t xml:space="preserve">5.  </w:t>
+      </w:r>
       <w:r>
         <w:t>Install OpenClaw — Option C (from source, advanced). Requires git and pnpm:</w:t>
       </w:r>
@@ -3742,8 +4281,15 @@
     </w:p>
     <w:p>
       <w:pPr>
-        <w:pStyle w:val="ListNumber"/>
-      </w:pPr>
+        <w:spacing w:after="80"/>
+        <w:ind w:left="360"/>
+      </w:pPr>
+      <w:r>
+        <w:rPr>
+          <w:b/>
+        </w:rPr>
+        <w:t xml:space="preserve">6.  </w:t>
+      </w:r>
       <w:r>
         <w:t>(Optional) Install on a VPS so Nimbus Supplies runs 24/7. The same three-step flow works on any Ubuntu host — a Hostinger KVM VPS or an exe.dev sandbox. SSH in first (ssh root@&lt;your-vps-ip&gt;), then run:</w:t>
       </w:r>
@@ -3848,8 +4394,15 @@
     </w:p>
     <w:p>
       <w:pPr>
-        <w:pStyle w:val="ListNumber"/>
-      </w:pPr>
+        <w:spacing w:after="80"/>
+        <w:ind w:left="360"/>
+      </w:pPr>
+      <w:r>
+        <w:rPr>
+          <w:b/>
+        </w:rPr>
+        <w:t xml:space="preserve">7.  </w:t>
+      </w:r>
       <w:r>
         <w:t>Verify the installation.</w:t>
       </w:r>
@@ -3886,8 +4439,15 @@
     </w:p>
     <w:p>
       <w:pPr>
-        <w:pStyle w:val="ListNumber"/>
-      </w:pPr>
+        <w:spacing w:after="80"/>
+        <w:ind w:left="360"/>
+      </w:pPr>
+      <w:r>
+        <w:rPr>
+          <w:b/>
+        </w:rPr>
+        <w:t xml:space="preserve">8.  </w:t>
+      </w:r>
       <w:r>
         <w:t>Confirm the gateway is running (and set to auto-start). The gateway is the long-running daemon that will host every channel, tool, and cron for Nimbus Supplies:</w:t>
       </w:r>
@@ -3988,8 +4548,15 @@
     </w:p>
     <w:p>
       <w:pPr>
-        <w:pStyle w:val="ListNumber"/>
-      </w:pPr>
+        <w:spacing w:after="80"/>
+        <w:ind w:left="360"/>
+      </w:pPr>
+      <w:r>
+        <w:rPr>
+          <w:b/>
+        </w:rPr>
+        <w:t xml:space="preserve">1.  </w:t>
+      </w:r>
       <w:r>
         <w:t>Watch the OpenClaw reference playlist</w:t>
       </w:r>
@@ -4006,8 +4573,15 @@
     </w:p>
     <w:p>
       <w:pPr>
-        <w:pStyle w:val="ListNumber"/>
-      </w:pPr>
+        <w:spacing w:after="80"/>
+        <w:ind w:left="360"/>
+      </w:pPr>
+      <w:r>
+        <w:rPr>
+          <w:b/>
+        </w:rPr>
+        <w:t xml:space="preserve">2.  </w:t>
+      </w:r>
       <w:r>
         <w:t>See what is available and what is currently selected.</w:t>
       </w:r>
@@ -4034,8 +4608,15 @@
     </w:p>
     <w:p>
       <w:pPr>
-        <w:pStyle w:val="ListNumber"/>
-      </w:pPr>
+        <w:spacing w:after="80"/>
+        <w:ind w:left="360"/>
+      </w:pPr>
+      <w:r>
+        <w:rPr>
+          <w:b/>
+        </w:rPr>
+        <w:t xml:space="preserve">3.  </w:t>
+      </w:r>
       <w:r>
         <w:t>Option A — OpenAI Codex (OAuth, GPT-5.5). OAuth uses the openai-codex provider so you sign in with your ChatGPT Plus / Pro subscription instead of paying per token. Credentials are stored in ~/.openclaw/auth/ (profile at ~/.openclaw/auth-profiles/openai-codex.json); refresh is automatic.</w:t>
       </w:r>
@@ -4052,8 +4633,15 @@
     </w:p>
     <w:p>
       <w:pPr>
-        <w:pStyle w:val="ListNumber"/>
-      </w:pPr>
+        <w:spacing w:after="80"/>
+        <w:ind w:left="360"/>
+      </w:pPr>
+      <w:r>
+        <w:rPr>
+          <w:b/>
+        </w:rPr>
+        <w:t xml:space="preserve">4.  </w:t>
+      </w:r>
       <w:r>
         <w:t>Option B — MiniMax (OAuth, MiniMax-M2.7). Enable the OAuth plugin, restart the gateway, then log in and set it as default:</w:t>
       </w:r>
@@ -4090,8 +4678,15 @@
     </w:p>
     <w:p>
       <w:pPr>
-        <w:pStyle w:val="ListNumber"/>
-      </w:pPr>
+        <w:spacing w:after="80"/>
+        <w:ind w:left="360"/>
+      </w:pPr>
+      <w:r>
+        <w:rPr>
+          <w:b/>
+        </w:rPr>
+        <w:t xml:space="preserve">5.  </w:t>
+      </w:r>
       <w:r>
         <w:t>Option C — Anthropic (API key, Claude Opus 4.7). Get a key from &lt;https://console.anthropic.com/settings/keys&gt;:</w:t>
       </w:r>
@@ -4138,8 +4733,15 @@
     </w:p>
     <w:p>
       <w:pPr>
-        <w:pStyle w:val="ListNumber"/>
-      </w:pPr>
+        <w:spacing w:after="80"/>
+        <w:ind w:left="360"/>
+      </w:pPr>
+      <w:r>
+        <w:rPr>
+          <w:b/>
+        </w:rPr>
+        <w:t xml:space="preserve">6.  </w:t>
+      </w:r>
       <w:r>
         <w:t>Option D — DeepSeek (API key, V4). Get a key from &lt;https://platform.deepseek.com/api_keys&gt;:</w:t>
       </w:r>
@@ -4186,8 +4788,15 @@
     </w:p>
     <w:p>
       <w:pPr>
-        <w:pStyle w:val="ListNumber"/>
-      </w:pPr>
+        <w:spacing w:after="80"/>
+        <w:ind w:left="360"/>
+      </w:pPr>
+      <w:r>
+        <w:rPr>
+          <w:b/>
+        </w:rPr>
+        <w:t xml:space="preserve">7.  </w:t>
+      </w:r>
       <w:r>
         <w:t>Option E — OpenRouter (API key, routes to Claude Opus 4.7). Get a key from &lt;https://openrouter.ai/keys&gt;:</w:t>
       </w:r>
@@ -4234,8 +4843,15 @@
     </w:p>
     <w:p>
       <w:pPr>
-        <w:pStyle w:val="ListNumber"/>
-      </w:pPr>
+        <w:spacing w:after="80"/>
+        <w:ind w:left="360"/>
+      </w:pPr>
+      <w:r>
+        <w:rPr>
+          <w:b/>
+        </w:rPr>
+        <w:t xml:space="preserve">8.  </w:t>
+      </w:r>
       <w:r>
         <w:t>Persist API keys so they survive reboots. For the API-key providers, add the export line to your shell profile (~/.zshrc on macOS, ~/.bashrc on Linux). OAuth tokens are persisted automatically in ~/.openclaw/auth/ and do not need this.</w:t>
       </w:r>
@@ -4262,8 +4878,15 @@
     </w:p>
     <w:p>
       <w:pPr>
-        <w:pStyle w:val="ListNumber"/>
-      </w:pPr>
+        <w:spacing w:after="80"/>
+        <w:ind w:left="360"/>
+      </w:pPr>
+      <w:r>
+        <w:rPr>
+          <w:b/>
+        </w:rPr>
+        <w:t xml:space="preserve">9.  </w:t>
+      </w:r>
       <w:r>
         <w:t>Switch models and confirm the active one. You can hot-swap the global default at any time:</w:t>
       </w:r>
@@ -4300,8 +4923,15 @@
     </w:p>
     <w:p>
       <w:pPr>
-        <w:pStyle w:val="ListNumber"/>
-      </w:pPr>
+        <w:spacing w:after="80"/>
+        <w:ind w:left="360"/>
+      </w:pPr>
+      <w:r>
+        <w:rPr>
+          <w:b/>
+        </w:rPr>
+        <w:t xml:space="preserve">10.  </w:t>
+      </w:r>
       <w:r>
         <w:t>Give the agent a Nimbus Supplies smoke test. With any model active, from the CLI chat (openclaw) ask: &gt; You are the back-office assistant for Nimbus Supplies, a small office-supplies reseller. In two sentences, introduce yourself to a customer. A sensible reply confirms the model is wired up.</w:t>
       </w:r>
@@ -4382,8 +5012,15 @@
     </w:p>
     <w:p>
       <w:pPr>
-        <w:pStyle w:val="ListNumber"/>
-      </w:pPr>
+        <w:spacing w:after="80"/>
+        <w:ind w:left="360"/>
+      </w:pPr>
+      <w:r>
+        <w:rPr>
+          <w:b/>
+        </w:rPr>
+        <w:t xml:space="preserve">1.  </w:t>
+      </w:r>
       <w:r>
         <w:t>Watch the OpenClaw reference playlist</w:t>
       </w:r>
@@ -4400,16 +5037,30 @@
     </w:p>
     <w:p>
       <w:pPr>
-        <w:pStyle w:val="ListNumber"/>
-      </w:pPr>
+        <w:spacing w:after="80"/>
+        <w:ind w:left="360"/>
+      </w:pPr>
+      <w:r>
+        <w:rPr>
+          <w:b/>
+        </w:rPr>
+        <w:t xml:space="preserve">2.  </w:t>
+      </w:r>
       <w:r>
         <w:t>Create a Telegram bot with BotFather. 1. Open Telegram and search for @BotFather. 2. Send /newbot. 3. Enter a display name (e.g. Nimbus Supplies Assistant). 4. Enter a username — must be unique and end in _bot (e.g. nimbus_supplies_bot). 5. BotFather replies with an HTTP API token like 123456789:ABC-DEF1234ghIkl-zyx57W2v1u123ew11. Copy it.</w:t>
       </w:r>
     </w:p>
     <w:p>
       <w:pPr>
-        <w:pStyle w:val="ListNumber"/>
-      </w:pPr>
+        <w:spacing w:after="80"/>
+        <w:ind w:left="360"/>
+      </w:pPr>
+      <w:r>
+        <w:rPr>
+          <w:b/>
+        </w:rPr>
+        <w:t xml:space="preserve">3.  </w:t>
+      </w:r>
       <w:r>
         <w:t>Register and start the Telegram channel.</w:t>
       </w:r>
@@ -4436,16 +5087,30 @@
     </w:p>
     <w:p>
       <w:pPr>
-        <w:pStyle w:val="ListNumber"/>
-      </w:pPr>
+        <w:spacing w:after="80"/>
+        <w:ind w:left="360"/>
+      </w:pPr>
+      <w:r>
+        <w:rPr>
+          <w:b/>
+        </w:rPr>
+        <w:t xml:space="preserve">4.  </w:t>
+      </w:r>
       <w:r>
         <w:t>Test Telegram. In Telegram, search for your bot's username and send: &gt; Hi, do you supply recycled A4 paper for Nimbus Supplies? The agent should reply using the model you connected in Lab 16.</w:t>
       </w:r>
     </w:p>
     <w:p>
       <w:pPr>
-        <w:pStyle w:val="ListNumber"/>
-      </w:pPr>
+        <w:spacing w:after="80"/>
+        <w:ind w:left="360"/>
+      </w:pPr>
+      <w:r>
+        <w:rPr>
+          <w:b/>
+        </w:rPr>
+        <w:t xml:space="preserve">5.  </w:t>
+      </w:r>
       <w:r>
         <w:t>Add and start the WhatsApp channel.</w:t>
       </w:r>
@@ -4472,16 +5137,30 @@
     </w:p>
     <w:p>
       <w:pPr>
-        <w:pStyle w:val="ListNumber"/>
-      </w:pPr>
+        <w:spacing w:after="80"/>
+        <w:ind w:left="360"/>
+      </w:pPr>
+      <w:r>
+        <w:rPr>
+          <w:b/>
+        </w:rPr>
+        <w:t xml:space="preserve">6.  </w:t>
+      </w:r>
       <w:r>
         <w:t>Pair WhatsApp by scanning the QR. On your phone: WhatsApp → Settings → Linked Devices → Link a Device, then scan the QR code shown in the terminal. Wait for whatsapp: connected in the OpenClaw log. &gt; WhatsApp keeps a stateful session on disk at ~/.openclaw/whatsapp/. Do not delete that folder unless you intend to re-pair.</w:t>
       </w:r>
     </w:p>
     <w:p>
       <w:pPr>
-        <w:pStyle w:val="ListNumber"/>
-      </w:pPr>
+        <w:spacing w:after="80"/>
+        <w:ind w:left="360"/>
+      </w:pPr>
+      <w:r>
+        <w:rPr>
+          <w:b/>
+        </w:rPr>
+        <w:t xml:space="preserve">7.  </w:t>
+      </w:r>
       <w:r>
         <w:t>Confirm both channels are running at the same time. One gateway hosts many channels — the same Nimbus Supplies agent now answers on both.</w:t>
       </w:r>
@@ -4508,8 +5187,15 @@
     </w:p>
     <w:p>
       <w:pPr>
-        <w:pStyle w:val="ListNumber"/>
-      </w:pPr>
+        <w:spacing w:after="80"/>
+        <w:ind w:left="360"/>
+      </w:pPr>
+      <w:r>
+        <w:rPr>
+          <w:b/>
+        </w:rPr>
+        <w:t xml:space="preserve">8.  </w:t>
+      </w:r>
       <w:r>
         <w:t>Inspect and manage a channel. Useful day-to-day commands:</w:t>
       </w:r>
@@ -4610,8 +5296,15 @@
     </w:p>
     <w:p>
       <w:pPr>
-        <w:pStyle w:val="ListNumber"/>
-      </w:pPr>
+        <w:spacing w:after="80"/>
+        <w:ind w:left="360"/>
+      </w:pPr>
+      <w:r>
+        <w:rPr>
+          <w:b/>
+        </w:rPr>
+        <w:t xml:space="preserve">1.  </w:t>
+      </w:r>
       <w:r>
         <w:t>Watch the OpenClaw reference playlist</w:t>
       </w:r>
@@ -4628,8 +5321,15 @@
     </w:p>
     <w:p>
       <w:pPr>
-        <w:pStyle w:val="ListNumber"/>
-      </w:pPr>
+        <w:spacing w:after="80"/>
+        <w:ind w:left="360"/>
+      </w:pPr>
+      <w:r>
+        <w:rPr>
+          <w:b/>
+        </w:rPr>
+        <w:t xml:space="preserve">2.  </w:t>
+      </w:r>
       <w:r>
         <w:t>List the skills currently installed.</w:t>
       </w:r>
@@ -4646,8 +5346,15 @@
     </w:p>
     <w:p>
       <w:pPr>
-        <w:pStyle w:val="ListNumber"/>
-      </w:pPr>
+        <w:spacing w:after="80"/>
+        <w:ind w:left="360"/>
+      </w:pPr>
+      <w:r>
+        <w:rPr>
+          <w:b/>
+        </w:rPr>
+        <w:t xml:space="preserve">3.  </w:t>
+      </w:r>
       <w:r>
         <w:t>Install a few useful skills from the registry. Skills come from &lt;https://skills.sh/&gt;:</w:t>
       </w:r>
@@ -4674,8 +5381,15 @@
     </w:p>
     <w:p>
       <w:pPr>
-        <w:pStyle w:val="ListNumber"/>
-      </w:pPr>
+        <w:spacing w:after="80"/>
+        <w:ind w:left="360"/>
+      </w:pPr>
+      <w:r>
+        <w:rPr>
+          <w:b/>
+        </w:rPr>
+        <w:t xml:space="preserve">4.  </w:t>
+      </w:r>
       <w:r>
         <w:t>Invoke a skill from chat. In your Telegram or WhatsApp channel, send:</w:t>
       </w:r>
@@ -4692,8 +5406,15 @@
     </w:p>
     <w:p>
       <w:pPr>
-        <w:pStyle w:val="ListNumber"/>
-      </w:pPr>
+        <w:spacing w:after="80"/>
+        <w:ind w:left="360"/>
+      </w:pPr>
+      <w:r>
+        <w:rPr>
+          <w:b/>
+        </w:rPr>
+        <w:t xml:space="preserve">5.  </w:t>
+      </w:r>
       <w:r>
         <w:t>Remove a skill you do not need (keeps the agent focused and safe):</w:t>
       </w:r>
@@ -4710,8 +5431,15 @@
     </w:p>
     <w:p>
       <w:pPr>
-        <w:pStyle w:val="ListNumber"/>
-      </w:pPr>
+        <w:spacing w:after="80"/>
+        <w:ind w:left="360"/>
+      </w:pPr>
+      <w:r>
+        <w:rPr>
+          <w:b/>
+        </w:rPr>
+        <w:t xml:space="preserve">6.  </w:t>
+      </w:r>
       <w:r>
         <w:t>Refresh the registry index if a skill you expect is missing:</w:t>
       </w:r>
@@ -4728,8 +5456,15 @@
     </w:p>
     <w:p>
       <w:pPr>
-        <w:pStyle w:val="ListNumber"/>
-      </w:pPr>
+        <w:spacing w:after="80"/>
+        <w:ind w:left="360"/>
+      </w:pPr>
+      <w:r>
+        <w:rPr>
+          <w:b/>
+        </w:rPr>
+        <w:t xml:space="preserve">7.  </w:t>
+      </w:r>
       <w:r>
         <w:t>Build a custom Nimbus Supplies skill. Skills live under ~/.openclaw/skills/. Create a folder and a skill definition. (File layout is shown here as a documented example — confirm the exact schema for your version at &lt;https://docs.openclaw.ai/&gt; before relying on advanced fields.)</w:t>
       </w:r>
@@ -4746,8 +5481,15 @@
     </w:p>
     <w:p>
       <w:pPr>
-        <w:pStyle w:val="ListNumber"/>
-      </w:pPr>
+        <w:spacing w:after="80"/>
+        <w:ind w:left="360"/>
+      </w:pPr>
+      <w:r>
+        <w:rPr>
+          <w:b/>
+        </w:rPr>
+        <w:t xml:space="preserve">8.  </w:t>
+      </w:r>
       <w:r>
         <w:t>Register and test the custom skill.</w:t>
       </w:r>
@@ -4848,8 +5590,15 @@
     </w:p>
     <w:p>
       <w:pPr>
-        <w:pStyle w:val="ListNumber"/>
-      </w:pPr>
+        <w:spacing w:after="80"/>
+        <w:ind w:left="360"/>
+      </w:pPr>
+      <w:r>
+        <w:rPr>
+          <w:b/>
+        </w:rPr>
+        <w:t xml:space="preserve">1.  </w:t>
+      </w:r>
       <w:r>
         <w:t>Watch the OpenClaw reference playlist</w:t>
       </w:r>
@@ -4866,8 +5615,15 @@
     </w:p>
     <w:p>
       <w:pPr>
-        <w:pStyle w:val="ListNumber"/>
-      </w:pPr>
+        <w:spacing w:after="80"/>
+        <w:ind w:left="360"/>
+      </w:pPr>
+      <w:r>
+        <w:rPr>
+          <w:b/>
+        </w:rPr>
+        <w:t xml:space="preserve">2.  </w:t>
+      </w:r>
       <w:r>
         <w:t>Inspect the built-in tools first.</w:t>
       </w:r>
@@ -4884,8 +5640,15 @@
     </w:p>
     <w:p>
       <w:pPr>
-        <w:pStyle w:val="ListNumber"/>
-      </w:pPr>
+        <w:spacing w:after="80"/>
+        <w:ind w:left="360"/>
+      </w:pPr>
+      <w:r>
+        <w:rPr>
+          <w:b/>
+        </w:rPr>
+        <w:t xml:space="preserve">3.  </w:t>
+      </w:r>
       <w:r>
         <w:t>Enable Firecrawl. Sign up at &lt;https://www.firecrawl.dev/&gt;, then Dashboard → API Keys → copy the fc-... key:</w:t>
       </w:r>
@@ -4922,16 +5685,30 @@
     </w:p>
     <w:p>
       <w:pPr>
-        <w:pStyle w:val="ListNumber"/>
-      </w:pPr>
+        <w:spacing w:after="80"/>
+        <w:ind w:left="360"/>
+      </w:pPr>
+      <w:r>
+        <w:rPr>
+          <w:b/>
+        </w:rPr>
+        <w:t xml:space="preserve">4.  </w:t>
+      </w:r>
       <w:r>
         <w:t>Smoke-test Firecrawl from chat. In Telegram or WhatsApp: &gt; Use Firecrawl to fetch the products page of a stationery supplier's website and list their A4 paper options with prices in 5 bullets.</w:t>
       </w:r>
     </w:p>
     <w:p>
       <w:pPr>
-        <w:pStyle w:val="ListNumber"/>
-      </w:pPr>
+        <w:spacing w:after="80"/>
+        <w:ind w:left="360"/>
+      </w:pPr>
+      <w:r>
+        <w:rPr>
+          <w:b/>
+        </w:rPr>
+        <w:t xml:space="preserve">5.  </w:t>
+      </w:r>
       <w:r>
         <w:t>Enable AgentMail. Create an inbox at &lt;https://agentmail.to/&gt;, copy the API key and inbox address:</w:t>
       </w:r>
@@ -4988,24 +5765,45 @@
     </w:p>
     <w:p>
       <w:pPr>
-        <w:pStyle w:val="ListNumber"/>
-      </w:pPr>
+        <w:spacing w:after="80"/>
+        <w:ind w:left="360"/>
+      </w:pPr>
+      <w:r>
+        <w:rPr>
+          <w:b/>
+        </w:rPr>
+        <w:t xml:space="preserve">6.  </w:t>
+      </w:r>
       <w:r>
         <w:t>Smoke-test AgentMail. From chat: &gt; Send an email from my AgentMail inbox to &lt;your-personal-email&gt; with subject "Hello from Nimbus Supplies" and a friendly one-paragraph body. Check your inbox, reply to it, then ask: &gt; Check my AgentMail inbox and summarise the latest reply.</w:t>
       </w:r>
     </w:p>
     <w:p>
       <w:pPr>
-        <w:pStyle w:val="ListNumber"/>
-      </w:pPr>
+        <w:spacing w:after="80"/>
+        <w:ind w:left="360"/>
+      </w:pPr>
+      <w:r>
+        <w:rPr>
+          <w:b/>
+        </w:rPr>
+        <w:t xml:space="preserve">7.  </w:t>
+      </w:r>
       <w:r>
         <w:t>Run the real end-to-end task (research → quote → email). From a channel, send one instruction that chains both tools plus the skill from Lab 18: &gt; A customer, Acme Cafe, wants 10 reams of recycled A4 paper and 5 boxes of black pens. Use Firecrawl to check current prices on our supplier's site, then use the nimbus-quote skill to draft an itemised quote, and email it from my AgentMail inbox to orders@acmecafe.example with subject "Your Nimbus Supplies quote".</w:t>
       </w:r>
     </w:p>
     <w:p>
       <w:pPr>
-        <w:pStyle w:val="ListNumber"/>
-      </w:pPr>
+        <w:spacing w:after="80"/>
+        <w:ind w:left="360"/>
+      </w:pPr>
+      <w:r>
+        <w:rPr>
+          <w:b/>
+        </w:rPr>
+        <w:t xml:space="preserve">8.  </w:t>
+      </w:r>
       <w:r>
         <w:t>Scope tools per channel with profiles and allow/deny lists. Public channels should not run shell exec. Apply the safe messaging preset and lock down a public channel:</w:t>
       </w:r>
@@ -5052,8 +5850,15 @@
     </w:p>
     <w:p>
       <w:pPr>
-        <w:pStyle w:val="ListNumber"/>
-      </w:pPr>
+        <w:spacing w:after="80"/>
+        <w:ind w:left="360"/>
+      </w:pPr>
+      <w:r>
+        <w:rPr>
+          <w:b/>
+        </w:rPr>
+        <w:t xml:space="preserve">9.  </w:t>
+      </w:r>
       <w:r>
         <w:t>(Optional) Add one more integration of your choice. Pick one from &lt;https://docs.openclaw.ai/tools&gt; and enable it (exact name/flags per the docs), e.g.:</w:t>
       </w:r>
@@ -5144,8 +5949,15 @@
     </w:p>
     <w:p>
       <w:pPr>
-        <w:pStyle w:val="ListNumber"/>
-      </w:pPr>
+        <w:spacing w:after="80"/>
+        <w:ind w:left="360"/>
+      </w:pPr>
+      <w:r>
+        <w:rPr>
+          <w:b/>
+        </w:rPr>
+        <w:t xml:space="preserve">1.  </w:t>
+      </w:r>
       <w:r>
         <w:t>Watch the OpenClaw reference playlist</w:t>
       </w:r>
@@ -5162,8 +5974,15 @@
     </w:p>
     <w:p>
       <w:pPr>
-        <w:pStyle w:val="ListNumber"/>
-      </w:pPr>
+        <w:spacing w:after="80"/>
+        <w:ind w:left="360"/>
+      </w:pPr>
+      <w:r>
+        <w:rPr>
+          <w:b/>
+        </w:rPr>
+        <w:t xml:space="preserve">2.  </w:t>
+      </w:r>
       <w:r>
         <w:t>openclaw config — read and change settings.</w:t>
       </w:r>
@@ -5210,8 +6029,15 @@
     </w:p>
     <w:p>
       <w:pPr>
-        <w:pStyle w:val="ListNumber"/>
-      </w:pPr>
+        <w:spacing w:after="80"/>
+        <w:ind w:left="360"/>
+      </w:pPr>
+      <w:r>
+        <w:rPr>
+          <w:b/>
+        </w:rPr>
+        <w:t xml:space="preserve">3.  </w:t>
+      </w:r>
       <w:r>
         <w:t>openclaw model — manage the brain.</w:t>
       </w:r>
@@ -5258,8 +6084,15 @@
     </w:p>
     <w:p>
       <w:pPr>
-        <w:pStyle w:val="ListNumber"/>
-      </w:pPr>
+        <w:spacing w:after="80"/>
+        <w:ind w:left="360"/>
+      </w:pPr>
+      <w:r>
+        <w:rPr>
+          <w:b/>
+        </w:rPr>
+        <w:t xml:space="preserve">4.  </w:t>
+      </w:r>
       <w:r>
         <w:t>openclaw doctor — health check (with auto-fix).</w:t>
       </w:r>
@@ -5286,8 +6119,15 @@
     </w:p>
     <w:p>
       <w:pPr>
-        <w:pStyle w:val="ListNumber"/>
-      </w:pPr>
+        <w:spacing w:after="80"/>
+        <w:ind w:left="360"/>
+      </w:pPr>
+      <w:r>
+        <w:rPr>
+          <w:b/>
+        </w:rPr>
+        <w:t xml:space="preserve">5.  </w:t>
+      </w:r>
       <w:r>
         <w:t>openclaw gateway — control the daemon that runs everything.</w:t>
       </w:r>
@@ -5354,8 +6194,15 @@
     </w:p>
     <w:p>
       <w:pPr>
-        <w:pStyle w:val="ListNumber"/>
-      </w:pPr>
+        <w:spacing w:after="80"/>
+        <w:ind w:left="360"/>
+      </w:pPr>
+      <w:r>
+        <w:rPr>
+          <w:b/>
+        </w:rPr>
+        <w:t xml:space="preserve">6.  </w:t>
+      </w:r>
       <w:r>
         <w:t>openclaw channel — manage the front doors.</w:t>
       </w:r>
@@ -5422,8 +6269,15 @@
     </w:p>
     <w:p>
       <w:pPr>
-        <w:pStyle w:val="ListNumber"/>
-      </w:pPr>
+        <w:spacing w:after="80"/>
+        <w:ind w:left="360"/>
+      </w:pPr>
+      <w:r>
+        <w:rPr>
+          <w:b/>
+        </w:rPr>
+        <w:t xml:space="preserve">7.  </w:t>
+      </w:r>
       <w:r>
         <w:t>openclaw tools and openclaw skills — capabilities.</w:t>
       </w:r>
@@ -5499,16 +6353,30 @@
     </w:p>
     <w:p>
       <w:pPr>
-        <w:pStyle w:val="ListNumber"/>
-      </w:pPr>
+        <w:spacing w:after="80"/>
+        <w:ind w:left="360"/>
+      </w:pPr>
+      <w:r>
+        <w:rPr>
+          <w:b/>
+        </w:rPr>
+        <w:t xml:space="preserve">8.  </w:t>
+      </w:r>
       <w:r>
         <w:t>In-chat slash commands. These work inside any channel (Telegram, WhatsApp, CLI chat). Try each from your Nimbus Supplies bot: | Slash Command | Purpose | | --- | --- | | /help | List all available slash commands | | /model &lt;name&gt; | Switch model for this conversation only | | /skill &lt;name&gt; [args] | Run an installed skill (e.g. /skill nimbus-quote "…") | | /tools | List tools the agent may use in this channel | | /clear | Clear the conversation history | | /memory | View / edit the agent's memory for this user | | /whoami | Show your user ID, channel, profile, and current model | | /stop | Cancel the current generation |</w:t>
       </w:r>
     </w:p>
     <w:p>
       <w:pPr>
-        <w:pStyle w:val="ListNumber"/>
-      </w:pPr>
+        <w:spacing w:after="80"/>
+        <w:ind w:left="360"/>
+      </w:pPr>
+      <w:r>
+        <w:rPr>
+          <w:b/>
+        </w:rPr>
+        <w:t xml:space="preserve">9.  </w:t>
+      </w:r>
       <w:r>
         <w:t>Watch it work live. In one terminal, follow the logs; in the channel, send a message and observe the corresponding lines:</w:t>
       </w:r>
@@ -5599,8 +6467,15 @@
     </w:p>
     <w:p>
       <w:pPr>
-        <w:pStyle w:val="ListNumber"/>
-      </w:pPr>
+        <w:spacing w:after="80"/>
+        <w:ind w:left="360"/>
+      </w:pPr>
+      <w:r>
+        <w:rPr>
+          <w:b/>
+        </w:rPr>
+        <w:t xml:space="preserve">1.  </w:t>
+      </w:r>
       <w:r>
         <w:t>Watch the OpenClaw reference playlist</w:t>
       </w:r>
@@ -5617,8 +6492,15 @@
     </w:p>
     <w:p>
       <w:pPr>
-        <w:pStyle w:val="ListNumber"/>
-      </w:pPr>
+        <w:spacing w:after="80"/>
+        <w:ind w:left="360"/>
+      </w:pPr>
+      <w:r>
+        <w:rPr>
+          <w:b/>
+        </w:rPr>
+        <w:t xml:space="preserve">2.  </w:t>
+      </w:r>
       <w:r>
         <w:t>Create the nightly sales-report cron. Cron syntax is &lt;min&gt; &lt;hour&gt; &lt;day&gt; &lt;month&gt; &lt;weekday&gt;.</w:t>
       </w:r>
@@ -5685,8 +6567,15 @@
     </w:p>
     <w:p>
       <w:pPr>
-        <w:pStyle w:val="ListNumber"/>
-      </w:pPr>
+        <w:spacing w:after="80"/>
+        <w:ind w:left="360"/>
+      </w:pPr>
+      <w:r>
+        <w:rPr>
+          <w:b/>
+        </w:rPr>
+        <w:t xml:space="preserve">3.  </w:t>
+      </w:r>
       <w:r>
         <w:t>Create a weekly supplier price-check cron (uses Firecrawl from Lab 19):</w:t>
       </w:r>
@@ -5753,8 +6642,15 @@
     </w:p>
     <w:p>
       <w:pPr>
-        <w:pStyle w:val="ListNumber"/>
-      </w:pPr>
+        <w:spacing w:after="80"/>
+        <w:ind w:left="360"/>
+      </w:pPr>
+      <w:r>
+        <w:rPr>
+          <w:b/>
+        </w:rPr>
+        <w:t xml:space="preserve">4.  </w:t>
+      </w:r>
       <w:r>
         <w:t>List and inspect your crons.</w:t>
       </w:r>
@@ -5791,8 +6687,15 @@
     </w:p>
     <w:p>
       <w:pPr>
-        <w:pStyle w:val="ListNumber"/>
-      </w:pPr>
+        <w:spacing w:after="80"/>
+        <w:ind w:left="360"/>
+      </w:pPr>
+      <w:r>
+        <w:rPr>
+          <w:b/>
+        </w:rPr>
+        <w:t xml:space="preserve">5.  </w:t>
+      </w:r>
       <w:r>
         <w:t>Fire a cron on demand to test it now (ignores the schedule):</w:t>
       </w:r>
@@ -5809,8 +6712,15 @@
     </w:p>
     <w:p>
       <w:pPr>
-        <w:pStyle w:val="ListNumber"/>
-      </w:pPr>
+        <w:spacing w:after="80"/>
+        <w:ind w:left="360"/>
+      </w:pPr>
+      <w:r>
+        <w:rPr>
+          <w:b/>
+        </w:rPr>
+        <w:t xml:space="preserve">6.  </w:t>
+      </w:r>
       <w:r>
         <w:t>Disable / enable / delete crons as your needs change:</w:t>
       </w:r>
@@ -5847,8 +6757,15 @@
     </w:p>
     <w:p>
       <w:pPr>
-        <w:pStyle w:val="ListNumber"/>
-      </w:pPr>
+        <w:spacing w:after="80"/>
+        <w:ind w:left="360"/>
+      </w:pPr>
+      <w:r>
+        <w:rPr>
+          <w:b/>
+        </w:rPr>
+        <w:t xml:space="preserve">7.  </w:t>
+      </w:r>
       <w:r>
         <w:t>Enable the heartbeat. The heartbeat is a periodic self-check that verifies the gateway is alive, the model responds, and channels are connected; on failure the daemon attempts auto-restart and logs the incident.</w:t>
       </w:r>
@@ -5885,8 +6802,15 @@
     </w:p>
     <w:p>
       <w:pPr>
-        <w:pStyle w:val="ListNumber"/>
-      </w:pPr>
+        <w:spacing w:after="80"/>
+        <w:ind w:left="360"/>
+      </w:pPr>
+      <w:r>
+        <w:rPr>
+          <w:b/>
+        </w:rPr>
+        <w:t xml:space="preserve">8.  </w:t>
+      </w:r>
       <w:r>
         <w:t>(Optional) Push a heartbeat ping to an external monitor so you are paged if Nimbus Supplies goes dark (e.g. a free &lt;https://healthchecks.io/&gt; check):</w:t>
       </w:r>
@@ -5923,8 +6847,15 @@
     </w:p>
     <w:p>
       <w:pPr>
-        <w:pStyle w:val="ListNumber"/>
-      </w:pPr>
+        <w:spacing w:after="80"/>
+        <w:ind w:left="360"/>
+      </w:pPr>
+      <w:r>
+        <w:rPr>
+          <w:b/>
+        </w:rPr>
+        <w:t xml:space="preserve">9.  </w:t>
+      </w:r>
       <w:r>
         <w:t>Confirm auto-restart works. Ensure the daemon is installed to auto-start, then simulate a crash:</w:t>
       </w:r>
@@ -6045,8 +6976,15 @@
     </w:p>
     <w:p>
       <w:pPr>
-        <w:pStyle w:val="ListNumber"/>
-      </w:pPr>
+        <w:spacing w:after="80"/>
+        <w:ind w:left="360"/>
+      </w:pPr>
+      <w:r>
+        <w:rPr>
+          <w:b/>
+        </w:rPr>
+        <w:t xml:space="preserve">1.  </w:t>
+      </w:r>
       <w:r>
         <w:t>Watch the OpenClaw reference playlist</w:t>
       </w:r>
@@ -6063,8 +7001,15 @@
     </w:p>
     <w:p>
       <w:pPr>
-        <w:pStyle w:val="ListNumber"/>
-      </w:pPr>
+        <w:spacing w:after="80"/>
+        <w:ind w:left="360"/>
+      </w:pPr>
+      <w:r>
+        <w:rPr>
+          <w:b/>
+        </w:rPr>
+        <w:t xml:space="preserve">2.  </w:t>
+      </w:r>
       <w:r>
         <w:t>See what OpenClaw stores on disk.</w:t>
       </w:r>
@@ -6081,8 +7026,15 @@
     </w:p>
     <w:p>
       <w:pPr>
-        <w:pStyle w:val="ListNumber"/>
-      </w:pPr>
+        <w:spacing w:after="80"/>
+        <w:ind w:left="360"/>
+      </w:pPr>
+      <w:r>
+        <w:rPr>
+          <w:b/>
+        </w:rPr>
+        <w:t xml:space="preserve">3.  </w:t>
+      </w:r>
       <w:r>
         <w:t>Inspect your current memory from chat. In your Telegram or WhatsApp bot:</w:t>
       </w:r>
@@ -6099,8 +7051,15 @@
     </w:p>
     <w:p>
       <w:pPr>
-        <w:pStyle w:val="ListNumber"/>
-      </w:pPr>
+        <w:spacing w:after="80"/>
+        <w:ind w:left="360"/>
+      </w:pPr>
+      <w:r>
+        <w:rPr>
+          <w:b/>
+        </w:rPr>
+        <w:t xml:space="preserve">4.  </w:t>
+      </w:r>
       <w:r>
         <w:t>Teach the agent a durable customer preference. Still in chat, send a plain-language instruction: &gt; Remember this for future chats: our customer Acme Cafe always wants recycled A4 paper (never standard), delivery on Tuesdays only, and quotes addressed to Mei from Acme. Then confirm it was captured:</w:t>
       </w:r>
@@ -6117,8 +7076,15 @@
     </w:p>
     <w:p>
       <w:pPr>
-        <w:pStyle w:val="ListNumber"/>
-      </w:pPr>
+        <w:spacing w:after="80"/>
+        <w:ind w:left="360"/>
+      </w:pPr>
+      <w:r>
+        <w:rPr>
+          <w:b/>
+        </w:rPr>
+        <w:t xml:space="preserve">5.  </w:t>
+      </w:r>
       <w:r>
         <w:t>Clear the conversation to prove it is real memory, not just context.</w:t>
       </w:r>
@@ -6135,16 +7101,30 @@
     </w:p>
     <w:p>
       <w:pPr>
-        <w:pStyle w:val="ListNumber"/>
-      </w:pPr>
+        <w:spacing w:after="80"/>
+        <w:ind w:left="360"/>
+      </w:pPr>
+      <w:r>
+        <w:rPr>
+          <w:b/>
+        </w:rPr>
+        <w:t xml:space="preserve">6.  </w:t>
+      </w:r>
       <w:r>
         <w:t>Recall in a fresh conversation. In the now-cleared chat, ask something that requires the remembered facts: &gt; Draft a quote for Acme Cafe: 10 reams of A4 paper and 5 boxes of black pens. A correct agent should automatically choose recycled A4, note Tuesday delivery, and address the quote to Mei — without you repeating any of it. (This pairs perfectly with the nimbus-quote skill from Lab 18.)</w:t>
       </w:r>
     </w:p>
     <w:p>
       <w:pPr>
-        <w:pStyle w:val="ListNumber"/>
-      </w:pPr>
+        <w:spacing w:after="80"/>
+        <w:ind w:left="360"/>
+      </w:pPr>
+      <w:r>
+        <w:rPr>
+          <w:b/>
+        </w:rPr>
+        <w:t xml:space="preserve">7.  </w:t>
+      </w:r>
       <w:r>
         <w:t>Edit or correct a memory. If a preference changes, update it in natural language and re-check: &gt; Update your memory: Acme Cafe now accepts delivery on Tuesdays or Thursdays.</w:t>
       </w:r>
@@ -6161,8 +7141,15 @@
     </w:p>
     <w:p>
       <w:pPr>
-        <w:pStyle w:val="ListNumber"/>
-      </w:pPr>
+        <w:spacing w:after="80"/>
+        <w:ind w:left="360"/>
+      </w:pPr>
+      <w:r>
+        <w:rPr>
+          <w:b/>
+        </w:rPr>
+        <w:t xml:space="preserve">8.  </w:t>
+      </w:r>
       <w:r>
         <w:t>Back up memory before major changes (memory lives under ~/.openclaw/, so the Lab 15 backup habit applies):</w:t>
       </w:r>
@@ -6263,8 +7250,15 @@
     </w:p>
     <w:p>
       <w:pPr>
-        <w:pStyle w:val="ListNumber"/>
-      </w:pPr>
+        <w:spacing w:after="80"/>
+        <w:ind w:left="360"/>
+      </w:pPr>
+      <w:r>
+        <w:rPr>
+          <w:b/>
+        </w:rPr>
+        <w:t xml:space="preserve">1.  </w:t>
+      </w:r>
       <w:r>
         <w:t>Watch the OpenClaw reference playlist</w:t>
       </w:r>
@@ -6281,8 +7275,15 @@
     </w:p>
     <w:p>
       <w:pPr>
-        <w:pStyle w:val="ListNumber"/>
-      </w:pPr>
+        <w:spacing w:after="80"/>
+        <w:ind w:left="360"/>
+      </w:pPr>
+      <w:r>
+        <w:rPr>
+          <w:b/>
+        </w:rPr>
+        <w:t xml:space="preserve">2.  </w:t>
+      </w:r>
       <w:r>
         <w:t>Secure API keys — never hardcode or commit them. Store keys once as environment variables. macOS / Linux — append to ~/.zshrc or ~/.bashrc:</w:t>
       </w:r>
@@ -6319,8 +7320,15 @@
     </w:p>
     <w:p>
       <w:pPr>
-        <w:pStyle w:val="ListNumber"/>
-      </w:pPr>
+        <w:spacing w:after="80"/>
+        <w:ind w:left="360"/>
+      </w:pPr>
+      <w:r>
+        <w:rPr>
+          <w:b/>
+        </w:rPr>
+        <w:t xml:space="preserve">3.  </w:t>
+      </w:r>
       <w:r>
         <w:t>Restrict who can DM the bot (allowlists). By default anyone who finds your Telegram bot can message it. Lock it to known users:</w:t>
       </w:r>
@@ -6357,8 +7365,15 @@
     </w:p>
     <w:p>
       <w:pPr>
-        <w:pStyle w:val="ListNumber"/>
-      </w:pPr>
+        <w:spacing w:after="80"/>
+        <w:ind w:left="360"/>
+      </w:pPr>
+      <w:r>
+        <w:rPr>
+          <w:b/>
+        </w:rPr>
+        <w:t xml:space="preserve">4.  </w:t>
+      </w:r>
       <w:r>
         <w:t>Apply tool deny lists (least privilege per channel). A customer-facing channel has no business running shell commands or deleting files:</w:t>
       </w:r>
@@ -6405,8 +7420,15 @@
     </w:p>
     <w:p>
       <w:pPr>
-        <w:pStyle w:val="ListNumber"/>
-      </w:pPr>
+        <w:spacing w:after="80"/>
+        <w:ind w:left="360"/>
+      </w:pPr>
+      <w:r>
+        <w:rPr>
+          <w:b/>
+        </w:rPr>
+        <w:t xml:space="preserve">5.  </w:t>
+      </w:r>
       <w:r>
         <w:t>Tighten the code-execution sandbox. The exec / Python tools run sandboxed — cap time, memory, and network:</w:t>
       </w:r>
@@ -6502,8 +7524,15 @@
     </w:p>
     <w:p>
       <w:pPr>
-        <w:pStyle w:val="ListNumber"/>
-      </w:pPr>
+        <w:spacing w:after="80"/>
+        <w:ind w:left="360"/>
+      </w:pPr>
+      <w:r>
+        <w:rPr>
+          <w:b/>
+        </w:rPr>
+        <w:t xml:space="preserve">6.  </w:t>
+      </w:r>
       <w:r>
         <w:t>Review the audit log. Every tool call, model call, and channel event is logged:</w:t>
       </w:r>
@@ -6550,8 +7579,15 @@
     </w:p>
     <w:p>
       <w:pPr>
-        <w:pStyle w:val="ListNumber"/>
-      </w:pPr>
+        <w:spacing w:after="80"/>
+        <w:ind w:left="360"/>
+      </w:pPr>
+      <w:r>
+        <w:rPr>
+          <w:b/>
+        </w:rPr>
+        <w:t xml:space="preserve">7.  </w:t>
+      </w:r>
       <w:r>
         <w:t>Rotate provider keys on a schedule (e.g. every 90 days). 1. Generate a new key in the provider dashboard. 2. Update the environment variable. 3. Restart the gateway: openclaw gateway restart. 4. Confirm openclaw model test still works. 5. Revoke the old key in the provider dashboard.</w:t>
       </w:r>
@@ -6632,8 +7668,15 @@
     </w:p>
     <w:p>
       <w:pPr>
-        <w:pStyle w:val="ListNumber"/>
-      </w:pPr>
+        <w:spacing w:after="80"/>
+        <w:ind w:left="360"/>
+      </w:pPr>
+      <w:r>
+        <w:rPr>
+          <w:b/>
+        </w:rPr>
+        <w:t xml:space="preserve">1.  </w:t>
+      </w:r>
       <w:r>
         <w:t>Watch the OpenClaw multi-agent setup reference video</w:t>
       </w:r>
@@ -6650,8 +7693,15 @@
     </w:p>
     <w:p>
       <w:pPr>
-        <w:pStyle w:val="ListNumber"/>
-      </w:pPr>
+        <w:spacing w:after="80"/>
+        <w:ind w:left="360"/>
+      </w:pPr>
+      <w:r>
+        <w:rPr>
+          <w:b/>
+        </w:rPr>
+        <w:t xml:space="preserve">2.  </w:t>
+      </w:r>
       <w:r>
         <w:t>Create three named agents. Attempt the native multi-agent path first (confirm exact syntax in the docs):</w:t>
       </w:r>
@@ -6698,8 +7748,15 @@
     </w:p>
     <w:p>
       <w:pPr>
-        <w:pStyle w:val="ListNumber"/>
-      </w:pPr>
+        <w:spacing w:after="80"/>
+        <w:ind w:left="360"/>
+      </w:pPr>
+      <w:r>
+        <w:rPr>
+          <w:b/>
+        </w:rPr>
+        <w:t xml:space="preserve">3.  </w:t>
+      </w:r>
       <w:r>
         <w:t>Give each agent least-privilege tools (mirrors Lab 19/23 allow-deny, applied per agent):</w:t>
       </w:r>
@@ -6784,8 +7841,15 @@
     </w:p>
     <w:p>
       <w:pPr>
-        <w:pStyle w:val="ListNumber"/>
-      </w:pPr>
+        <w:spacing w:after="80"/>
+        <w:ind w:left="360"/>
+      </w:pPr>
+      <w:r>
+        <w:rPr>
+          <w:b/>
+        </w:rPr>
+        <w:t xml:space="preserve">4.  </w:t>
+      </w:r>
       <w:r>
         <w:t>Attach channels to the right agents.</w:t>
       </w:r>
@@ -6861,8 +7925,15 @@
     </w:p>
     <w:p>
       <w:pPr>
-        <w:pStyle w:val="ListNumber"/>
-      </w:pPr>
+        <w:spacing w:after="80"/>
+        <w:ind w:left="360"/>
+      </w:pPr>
+      <w:r>
+        <w:rPr>
+          <w:b/>
+        </w:rPr>
+        <w:t xml:space="preserve">5.  </w:t>
+      </w:r>
       <w:r>
         <w:t>Give each agent the right skill/memory. Sales uses nimbus-quote and the customer memory from Lab 22; Research uses nimbus-supplier-brief (Lab 18 exercise). Install/enable as needed:</w:t>
       </w:r>
@@ -6879,8 +7950,15 @@
     </w:p>
     <w:p>
       <w:pPr>
-        <w:pStyle w:val="ListNumber"/>
-      </w:pPr>
+        <w:spacing w:after="80"/>
+        <w:ind w:left="360"/>
+      </w:pPr>
+      <w:r>
+        <w:rPr>
+          <w:b/>
+        </w:rPr>
+        <w:t xml:space="preserve">6.  </w:t>
+      </w:r>
       <w:r>
         <w:t>Wire cooperation between agents. The simplest, robust hand-off uses the tools you already have: - Sales → Ops: when Sales captures an order, it asks Ops (via a shared note file or an AgentMail message) to produce and send the quote. - Ops → Research: when a price is unknown ("TBC"), Ops asks Research to look it up with Firecrawl. - Research → Ops: Research replies with the price; Ops finalises the quote email.</w:t>
       </w:r>
@@ -6947,8 +8025,15 @@
     </w:p>
     <w:p>
       <w:pPr>
-        <w:pStyle w:val="ListNumber"/>
-      </w:pPr>
+        <w:spacing w:after="80"/>
+        <w:ind w:left="360"/>
+      </w:pPr>
+      <w:r>
+        <w:rPr>
+          <w:b/>
+        </w:rPr>
+        <w:t xml:space="preserve">7.  </w:t>
+      </w:r>
       <w:r>
         <w:t>Fallback (fully verified) — run agents as separate profiles/instances. If native multi-agent commands are not in your build, model each agent as its own OpenClaw configuration using only Lab 15–19 primitives: - Sales = your main instance with Telegram/WhatsApp, --profile messaging, deny exec,fs.write (Lab 23). - Research = a second instance pointed at a separate config dir with only Firecrawl/web tools enabled:</w:t>
       </w:r>
@@ -6975,8 +8060,15 @@
     </w:p>
     <w:p>
       <w:pPr>
-        <w:pStyle w:val="ListNumber"/>
-      </w:pPr>
+        <w:spacing w:after="80"/>
+        <w:ind w:left="360"/>
+      </w:pPr>
+      <w:r>
+        <w:rPr>
+          <w:b/>
+        </w:rPr>
+        <w:t xml:space="preserve">8.  </w:t>
+      </w:r>
       <w:r>
         <w:t>Run the end-to-end capstone scenario. From a customer's Telegram, trigger the whole workflow: &gt; Hi Nimbus Supplies — I'm Mei from Acme Cafe. I need 10 reams of recycled A4 paper and 5 boxes of black pens. What's your best price and when can you deliver? Expected chain: 1. Sales greets Mei, recalls Acme's preferences from memory (recycled paper, Tuesday delivery — Lab 22), and captures the order. 2. Sales hands the order to Ops, which starts the nimbus-quote. The pen price is unknown → marked TBC. 3. Ops asks Research to fetch the current pen price via Firecrawl. 4. Research replies with the price; Ops finalises the itemised quote (with GST) and emails it to Acme via AgentMail. 5. That night, the ops-nightly-report cron summarises the day, including Mei's order.</w:t>
       </w:r>
@@ -7057,16 +8149,30 @@
     </w:p>
     <w:p>
       <w:pPr>
-        <w:pStyle w:val="ListNumber"/>
-      </w:pPr>
+        <w:spacing w:after="80"/>
+        <w:ind w:left="360"/>
+      </w:pPr>
+      <w:r>
+        <w:rPr>
+          <w:b/>
+        </w:rPr>
+        <w:t xml:space="preserve">1.  </w:t>
+      </w:r>
       <w:r>
         <w:t>Watch the OpenClaw functions reference video. Open the playlist and watch the segment on the dreaming / idle-reflection feature. Note how the presenter enables it and where the produced insights appear — the on-screen command names are your ground truth for the steps below. https://www.youtube.com/watch?v=q5YFlpVlmkI&amp;list=PLHutrxqbP1BwAQf6dROCLZqK0PLpGu35J (https://www.youtube.com/watch?v=q5YFlpVlmkI&amp;list=PLHutrxqbP1BwAQf6dROCLZqK0PLpGu35J)</w:t>
       </w:r>
     </w:p>
     <w:p>
       <w:pPr>
-        <w:pStyle w:val="ListNumber"/>
-      </w:pPr>
+        <w:spacing w:after="80"/>
+        <w:ind w:left="360"/>
+      </w:pPr>
+      <w:r>
+        <w:rPr>
+          <w:b/>
+        </w:rPr>
+        <w:t xml:space="preserve">2.  </w:t>
+      </w:r>
       <w:r>
         <w:t>Enable the dreaming feature in OpenClaw config. This flips the setting that lets the gateway schedule reflection cycles when the agent is idle:</w:t>
       </w:r>
@@ -7083,8 +8189,15 @@
     </w:p>
     <w:p>
       <w:pPr>
-        <w:pStyle w:val="ListNumber"/>
-      </w:pPr>
+        <w:spacing w:after="80"/>
+        <w:ind w:left="360"/>
+      </w:pPr>
+      <w:r>
+        <w:rPr>
+          <w:b/>
+        </w:rPr>
+        <w:t xml:space="preserve">3.  </w:t>
+      </w:r>
       <w:r>
         <w:t>Let the agent sit idle so a dream cycle runs — or trigger one manually. Rather than wait for a natural idle window, force a cycle now so you can observe it immediately:</w:t>
       </w:r>
@@ -7101,8 +8214,15 @@
     </w:p>
     <w:p>
       <w:pPr>
-        <w:pStyle w:val="ListNumber"/>
-      </w:pPr>
+        <w:spacing w:after="80"/>
+        <w:ind w:left="360"/>
+      </w:pPr>
+      <w:r>
+        <w:rPr>
+          <w:b/>
+        </w:rPr>
+        <w:t xml:space="preserve">4.  </w:t>
+      </w:r>
       <w:r>
         <w:t>Review what the dream produced. List the insights, follow-ups, and skill suggestions the cycle generated:</w:t>
       </w:r>
@@ -7119,8 +8239,15 @@
     </w:p>
     <w:p>
       <w:pPr>
-        <w:pStyle w:val="ListNumber"/>
-      </w:pPr>
+        <w:spacing w:after="80"/>
+        <w:ind w:left="360"/>
+      </w:pPr>
+      <w:r>
+        <w:rPr>
+          <w:b/>
+        </w:rPr>
+        <w:t xml:space="preserve">5.  </w:t>
+      </w:r>
       <w:r>
         <w:t>Accept a useful follow-up the agent proposed. In the dashboard (or via the CLI shown in the video), open one proposal that genuinely helps Nimbus Supplies and approve it. Accepting promotes the proposal into a real action or a saved skill; declining discards it. This human review step keeps you in control of what the agent's downtime actually changes.</w:t>
       </w:r>
@@ -7201,8 +8328,15 @@
     </w:p>
     <w:p>
       <w:pPr>
-        <w:pStyle w:val="ListNumber"/>
-      </w:pPr>
+        <w:spacing w:after="80"/>
+        <w:ind w:left="360"/>
+      </w:pPr>
+      <w:r>
+        <w:rPr>
+          <w:b/>
+        </w:rPr>
+        <w:t xml:space="preserve">1.  </w:t>
+      </w:r>
       <w:r>
         <w:t>Use case A — Google Workspace CLI assistant (reference video)</w:t>
       </w:r>
@@ -7219,40 +8353,75 @@
     </w:p>
     <w:p>
       <w:pPr>
-        <w:pStyle w:val="ListNumber"/>
-      </w:pPr>
+        <w:spacing w:after="80"/>
+        <w:ind w:left="360"/>
+      </w:pPr>
+      <w:r>
+        <w:rPr>
+          <w:b/>
+        </w:rPr>
+        <w:t xml:space="preserve">2.  </w:t>
+      </w:r>
       <w:r>
         <w:t>Watch one of the use-case videos above and study how the presenter composes several functions into one automation — which channel triggers the flow, which skills and tools it calls, and how memory and crons fit in. Good starting points: a Google Workspace CLI assistant (Docs/Sheets/Gmail), a Data Analytics agent, or a Social Media Marketing agent.</w:t>
       </w:r>
     </w:p>
     <w:p>
       <w:pPr>
-        <w:pStyle w:val="ListNumber"/>
-      </w:pPr>
+        <w:spacing w:after="80"/>
+        <w:ind w:left="360"/>
+      </w:pPr>
+      <w:r>
+        <w:rPr>
+          <w:b/>
+        </w:rPr>
+        <w:t xml:space="preserve">3.  </w:t>
+      </w:r>
       <w:r>
         <w:t>Pick a back-office use case. Choose one concrete Nimbus Supplies workflow to implement end-to-end. A strong default is "research a supplier, then email a quote": a customer asks for a price, the agent looks up current supplier pricing, applies a margin, and emails a formatted quote. Other options: customer FAQ Q&amp;A on Telegram, or an automated nightly orders-and-quotes report.</w:t>
       </w:r>
     </w:p>
     <w:p>
       <w:pPr>
-        <w:pStyle w:val="ListNumber"/>
-      </w:pPr>
+        <w:spacing w:after="80"/>
+        <w:ind w:left="360"/>
+      </w:pPr>
+      <w:r>
+        <w:rPr>
+          <w:b/>
+        </w:rPr>
+        <w:t xml:space="preserve">4.  </w:t>
+      </w:r>
       <w:r>
         <w:t>Compose the channels, skills and tools needed for it. Wire the pieces together for your chosen use case. For research-to-quote that means: the customer channel (e.g. Telegram) as the trigger, the skill that formats a quote (e.g. nimbus-quote from Lab 18), a research tool (Firecrawl / web_search) for live pricing, and a delivery tool (AgentMail) to send the email. Confirm the agent has permission to call each one.</w:t>
       </w:r>
     </w:p>
     <w:p>
       <w:pPr>
-        <w:pStyle w:val="ListNumber"/>
-      </w:pPr>
+        <w:spacing w:after="80"/>
+        <w:ind w:left="360"/>
+      </w:pPr>
+      <w:r>
+        <w:rPr>
+          <w:b/>
+        </w:rPr>
+        <w:t xml:space="preserve">5.  </w:t>
+      </w:r>
       <w:r>
         <w:t>Run the automation end-to-end and verify the outcome. Send a real trigger — e.g. message the agent "What's your price for 50 kg of arabica beans?" on the customer channel — and watch the full chain fire: the agent recalls context from memory, runs the price lookup tool, builds the quote with the skill, and delivers it via email. Confirm the actual deliverable (the sent quote email) is correct, not just that the logs look busy.</w:t>
       </w:r>
     </w:p>
     <w:p>
       <w:pPr>
-        <w:pStyle w:val="ListNumber"/>
-      </w:pPr>
+        <w:spacing w:after="80"/>
+        <w:ind w:left="360"/>
+      </w:pPr>
+      <w:r>
+        <w:rPr>
+          <w:b/>
+        </w:rPr>
+        <w:t xml:space="preserve">6.  </w:t>
+      </w:r>
       <w:r>
         <w:t>Schedule it or hand it to the multi-agent team from Lab 24. Make the automation ongoing. Either attach it to a cron (e.g. a nightly consolidation report) so it runs unattended, or delegate the use case to the Sales / Research / Ops agents you built in Lab 24 so the right specialist owns each step. This is what turns a one-off demo into part of an always-on Nimbus Supplies back office.</w:t>
       </w:r>
@@ -7388,24 +8557,45 @@
     </w:p>
     <w:p>
       <w:pPr>
-        <w:pStyle w:val="ListNumber"/>
-      </w:pPr>
+        <w:spacing w:after="80"/>
+        <w:ind w:left="360"/>
+      </w:pPr>
+      <w:r>
+        <w:rPr>
+          <w:b/>
+        </w:rPr>
+        <w:t xml:space="preserve">1.  </w:t>
+      </w:r>
       <w:r>
         <w:t>Watch the Paperclip overview (Explain Paperclip). This introduces the mental model: Paperclip runs an entire company of AI agents (a CEO who hires specialists), and you sit above them as the Board, approving hires and spend. Keep that framing in mind — every later lab maps to a real corporate function. https://www.youtube.com/watch?v=WNYe5mD4fY8&amp;list=PLmpUb_PWAkDxewld5ZYyKifuHxgIbiq2d&amp;index=31 (https://www.youtube.com/watch?v=WNYe5mD4fY8&amp;list=PLmpUb_PWAkDxewld5ZYyKifuHxgIbiq2d&amp;index=31)</w:t>
       </w:r>
     </w:p>
     <w:p>
       <w:pPr>
-        <w:pStyle w:val="ListNumber"/>
-      </w:pPr>
+        <w:spacing w:after="80"/>
+        <w:ind w:left="360"/>
+      </w:pPr>
+      <w:r>
+        <w:rPr>
+          <w:b/>
+        </w:rPr>
+        <w:t xml:space="preserve">2.  </w:t>
+      </w:r>
       <w:r>
         <w:t>Watch the setup reference video for this lab. This is the exact self-hosting walkthrough for the steps below — follow along so the on-screen dashboard matches yours. https://www.youtube.com/watch?v=f2eian-bR_U&amp;list=PLZslvC3k6NibmbMzfuyc3UGXkIC5k6YvC&amp;index=2 (https://www.youtube.com/watch?v=f2eian-bR_U&amp;list=PLZslvC3k6NibmbMzfuyc3UGXkIC5k6YvC&amp;index=2)</w:t>
       </w:r>
     </w:p>
     <w:p>
       <w:pPr>
-        <w:pStyle w:val="ListNumber"/>
-      </w:pPr>
+        <w:spacing w:after="80"/>
+        <w:ind w:left="360"/>
+      </w:pPr>
+      <w:r>
+        <w:rPr>
+          <w:b/>
+        </w:rPr>
+        <w:t xml:space="preserve">3.  </w:t>
+      </w:r>
       <w:r>
         <w:t>Clone the Paperclip repository. This pulls the source and the Docker Compose files you need to run it locally:</w:t>
       </w:r>
@@ -7432,8 +8622,15 @@
     </w:p>
     <w:p>
       <w:pPr>
-        <w:pStyle w:val="ListNumber"/>
-      </w:pPr>
+        <w:spacing w:after="80"/>
+        <w:ind w:left="360"/>
+      </w:pPr>
+      <w:r>
+        <w:rPr>
+          <w:b/>
+        </w:rPr>
+        <w:t xml:space="preserve">4.  </w:t>
+      </w:r>
       <w:r>
         <w:t>Start Paperclip with the quickstart compose file. This builds the image and brings up the full stack (the app plus its embedded PostgreSQL):</w:t>
       </w:r>
@@ -7450,16 +8647,30 @@
     </w:p>
     <w:p>
       <w:pPr>
-        <w:pStyle w:val="ListNumber"/>
-      </w:pPr>
+        <w:spacing w:after="80"/>
+        <w:ind w:left="360"/>
+      </w:pPr>
+      <w:r>
+        <w:rPr>
+          <w:b/>
+        </w:rPr>
+        <w:t xml:space="preserve">5.  </w:t>
+      </w:r>
       <w:r>
         <w:t>Open the dashboard. In your browser, go to:</w:t>
       </w:r>
     </w:p>
     <w:p>
       <w:pPr>
-        <w:pStyle w:val="ListNumber"/>
-      </w:pPr>
+        <w:spacing w:after="80"/>
+        <w:ind w:left="360"/>
+      </w:pPr>
+      <w:r>
+        <w:rPr>
+          <w:b/>
+        </w:rPr>
+        <w:t xml:space="preserve">6.  </w:t>
+      </w:r>
       <w:r>
         <w:t>Create the company with a single goal and a monthly budget. In the dashboard, start a new company. Name it Nimbus Coffee, Inc., give it one clear goal (e.g. "Launch a direct-to-consumer specialty coffee brand and make the first sale"), and set a monthly budget cap (your spend ceiling). Save. This company is the entity the CEO and specialist agents will work inside for every remaining Paperclip lab. &gt; The exact wording of the "Create company" / goal / budget fields is version-specific — verify in the video / docs (&lt;https://docs.paperclip.ing&gt;).</w:t>
       </w:r>
@@ -7540,40 +8751,75 @@
     </w:p>
     <w:p>
       <w:pPr>
-        <w:pStyle w:val="ListNumber"/>
-      </w:pPr>
+        <w:spacing w:after="80"/>
+        <w:ind w:left="360"/>
+      </w:pPr>
+      <w:r>
+        <w:rPr>
+          <w:b/>
+        </w:rPr>
+        <w:t xml:space="preserve">1.  </w:t>
+      </w:r>
       <w:r>
         <w:t>Watch the reference video for this lab. It shows exactly where Paperclip looks for the Codex adapter and what "available" looks like in Settings. https://www.youtube.com/watch?v=gU5BrKo_iHk&amp;list=PLZslvC3k6NibmbMzfuyc3UGXkIC5k6YvC&amp;index=3 (https://www.youtube.com/watch?v=gU5BrKo_iHk&amp;list=PLZslvC3k6NibmbMzfuyc3UGXkIC5k6YvC&amp;index=3)</w:t>
       </w:r>
     </w:p>
     <w:p>
       <w:pPr>
-        <w:pStyle w:val="ListNumber"/>
-      </w:pPr>
+        <w:spacing w:after="80"/>
+        <w:ind w:left="360"/>
+      </w:pPr>
+      <w:r>
+        <w:rPr>
+          <w:b/>
+        </w:rPr>
+        <w:t xml:space="preserve">2.  </w:t>
+      </w:r>
       <w:r>
         <w:t>Install / log in to the OpenAI Codex CLI so Paperclip can detect it. Follow the video's instructions to install the Codex CLI and authenticate (log in or supply your API key). Paperclip detects the adapter by finding this working Codex CLI/credentials on the host — so getting the login right here is the whole ballgame. &gt; The exact install/login command is version-specific — verify in the video / docs (&lt;https://docs.paperclip.ing&gt;).</w:t>
       </w:r>
     </w:p>
     <w:p>
       <w:pPr>
-        <w:pStyle w:val="ListNumber"/>
-      </w:pPr>
+        <w:spacing w:after="80"/>
+        <w:ind w:left="360"/>
+      </w:pPr>
+      <w:r>
+        <w:rPr>
+          <w:b/>
+        </w:rPr>
+        <w:t xml:space="preserve">3.  </w:t>
+      </w:r>
       <w:r>
         <w:t>Open Settings → Agents / Adapters in the dashboard. In Paperclip at http://localhost:3100, go to Settings, then the Agents / Adapters section. This is where Paperclip lists every model engine it can use to power agents.</w:t>
       </w:r>
     </w:p>
     <w:p>
       <w:pPr>
-        <w:pStyle w:val="ListNumber"/>
-      </w:pPr>
+        <w:spacing w:after="80"/>
+        <w:ind w:left="360"/>
+      </w:pPr>
+      <w:r>
+        <w:rPr>
+          <w:b/>
+        </w:rPr>
+        <w:t xml:space="preserve">4.  </w:t>
+      </w:r>
       <w:r>
         <w:t>Confirm the OpenAI Codex adapter shows as "available". Look for the OpenAI Codex entry and check its status reads available (not "not detected" / "unavailable"). Available means Paperclip successfully found and authenticated the Codex CLI and can route agent reasoning through it.</w:t>
       </w:r>
     </w:p>
     <w:p>
       <w:pPr>
-        <w:pStyle w:val="ListNumber"/>
-      </w:pPr>
+        <w:spacing w:after="80"/>
+        <w:ind w:left="360"/>
+      </w:pPr>
+      <w:r>
+        <w:rPr>
+          <w:b/>
+        </w:rPr>
+        <w:t xml:space="preserve">5.  </w:t>
+      </w:r>
       <w:r>
         <w:t>Restart Paperclip if the adapter is not detected. If Codex still shows unavailable after you have logged in, restart the stack so Paperclip re-scans for the adapter:</w:t>
       </w:r>
@@ -7664,32 +8910,60 @@
     </w:p>
     <w:p>
       <w:pPr>
-        <w:pStyle w:val="ListNumber"/>
-      </w:pPr>
+        <w:spacing w:after="80"/>
+        <w:ind w:left="360"/>
+      </w:pPr>
+      <w:r>
+        <w:rPr>
+          <w:b/>
+        </w:rPr>
+        <w:t xml:space="preserve">1.  </w:t>
+      </w:r>
       <w:r>
         <w:t>Watch the reference video for this lab. It walks through the company settings screen — budget cap, workspace connection, and the other company options. https://www.youtube.com/watch?v=WItGcCiQRKw&amp;list=PLZslvC3k6NibmbMzfuyc3UGXkIC5k6YvC&amp;index=4 (https://www.youtube.com/watch?v=WItGcCiQRKw&amp;list=PLZslvC3k6NibmbMzfuyc3UGXkIC5k6YvC&amp;index=4)</w:t>
       </w:r>
     </w:p>
     <w:p>
       <w:pPr>
-        <w:pStyle w:val="ListNumber"/>
-      </w:pPr>
+        <w:spacing w:after="80"/>
+        <w:ind w:left="360"/>
+      </w:pPr>
+      <w:r>
+        <w:rPr>
+          <w:b/>
+        </w:rPr>
+        <w:t xml:space="preserve">2.  </w:t>
+      </w:r>
       <w:r>
         <w:t>Open the company's settings in the dashboard. At http://localhost:3100, open Nimbus Coffee, Inc. and go to its Settings. This is the per-company control panel (distinct from the app-wide Settings you used for adapters in Lab 28).</w:t>
       </w:r>
     </w:p>
     <w:p>
       <w:pPr>
-        <w:pStyle w:val="ListNumber"/>
-      </w:pPr>
+        <w:spacing w:after="80"/>
+        <w:ind w:left="360"/>
+      </w:pPr>
+      <w:r>
+        <w:rPr>
+          <w:b/>
+        </w:rPr>
+        <w:t xml:space="preserve">3.  </w:t>
+      </w:r>
       <w:r>
         <w:t>Set or adjust the monthly budget cap. Enter the maximum the company may spend per month. This cap is the governance rail you will exercise in Lab 33 (an 80% warning and a 100% pause). Set a deliberate figure you are comfortable letting agents spend against. &gt; Field name/units are version-specific — verify in the video / docs (&lt;https://docs.paperclip.ing&gt;).</w:t>
       </w:r>
     </w:p>
     <w:p>
       <w:pPr>
-        <w:pStyle w:val="ListNumber"/>
-      </w:pPr>
+        <w:spacing w:after="80"/>
+        <w:ind w:left="360"/>
+      </w:pPr>
+      <w:r>
+        <w:rPr>
+          <w:b/>
+        </w:rPr>
+        <w:t xml:space="preserve">4.  </w:t>
+      </w:r>
       <w:r>
         <w:t>Connect a workspace folder so agents create real deliverables. First create the folder on your machine:</w:t>
       </w:r>
@@ -7706,8 +8980,15 @@
     </w:p>
     <w:p>
       <w:pPr>
-        <w:pStyle w:val="ListNumber"/>
-      </w:pPr>
+        <w:spacing w:after="80"/>
+        <w:ind w:left="360"/>
+      </w:pPr>
+      <w:r>
+        <w:rPr>
+          <w:b/>
+        </w:rPr>
+        <w:t xml:space="preserve">5.  </w:t>
+      </w:r>
       <w:r>
         <w:t>Save the configuration and confirm it persists. Save the settings, reload the page, and confirm the budget and the connected workspace path are still shown. Persistence matters — it proves the config was written to the database, not just held in the browser.</w:t>
       </w:r>
@@ -7788,40 +9069,75 @@
     </w:p>
     <w:p>
       <w:pPr>
-        <w:pStyle w:val="ListNumber"/>
-      </w:pPr>
+        <w:spacing w:after="80"/>
+        <w:ind w:left="360"/>
+      </w:pPr>
+      <w:r>
+        <w:rPr>
+          <w:b/>
+        </w:rPr>
+        <w:t xml:space="preserve">1.  </w:t>
+      </w:r>
       <w:r>
         <w:t>Watch the reference video for this lab. It shows the task board layout and how tasks flow through the four columns. https://www.youtube.com/watch?v=FrYvRd0KX_I&amp;list=PLZslvC3k6NibmbMzfuyc3UGXkIC5k6YvC&amp;index=5 (https://www.youtube.com/watch?v=FrYvRd0KX_I&amp;list=PLZslvC3k6NibmbMzfuyc3UGXkIC5k6YvC&amp;index=5)</w:t>
       </w:r>
     </w:p>
     <w:p>
       <w:pPr>
-        <w:pStyle w:val="ListNumber"/>
-      </w:pPr>
+        <w:spacing w:after="80"/>
+        <w:ind w:left="360"/>
+      </w:pPr>
+      <w:r>
+        <w:rPr>
+          <w:b/>
+        </w:rPr>
+        <w:t xml:space="preserve">2.  </w:t>
+      </w:r>
       <w:r>
         <w:t>Open the task board for the company. In the dashboard, open Nimbus Coffee, Inc. and go to its task board. You'll see four columns — todo, in_progress, in_review, done — the single source of truth for everything the company is working on.</w:t>
       </w:r>
     </w:p>
     <w:p>
       <w:pPr>
-        <w:pStyle w:val="ListNumber"/>
-      </w:pPr>
+        <w:spacing w:after="80"/>
+        <w:ind w:left="360"/>
+      </w:pPr>
+      <w:r>
+        <w:rPr>
+          <w:b/>
+        </w:rPr>
+        <w:t xml:space="preserve">3.  </w:t>
+      </w:r>
       <w:r>
         <w:t>Create or observe a task in the "todo" column. Either create a task yourself (e.g. "Draft the Nimbus Coffee brand tagline") or watch one the CEO/agents have already queued. A task in todo is committed work that has not started yet.</w:t>
       </w:r>
     </w:p>
     <w:p>
       <w:pPr>
-        <w:pStyle w:val="ListNumber"/>
-      </w:pPr>
+        <w:spacing w:after="80"/>
+        <w:ind w:left="360"/>
+      </w:pPr>
+      <w:r>
+        <w:rPr>
+          <w:b/>
+        </w:rPr>
+        <w:t xml:space="preserve">4.  </w:t>
+      </w:r>
       <w:r>
         <w:t>Watch a task move todo → in_progress → in_review. As an agent picks up the task, it moves to in_progress; when the agent finishes and produces a deliverable, it moves to in_review, waiting for your judgement. Observing this flow is how you supervise a company of agents without micromanaging each action.</w:t>
       </w:r>
     </w:p>
     <w:p>
       <w:pPr>
-        <w:pStyle w:val="ListNumber"/>
-      </w:pPr>
+        <w:spacing w:after="80"/>
+        <w:ind w:left="360"/>
+      </w:pPr>
+      <w:r>
+        <w:rPr>
+          <w:b/>
+        </w:rPr>
+        <w:t xml:space="preserve">5.  </w:t>
+      </w:r>
       <w:r>
         <w:t>Open a shell to review the task activity log. For a deeper view than the UI, open a shell inside the running Paperclip container:</w:t>
       </w:r>
@@ -7912,40 +9228,75 @@
     </w:p>
     <w:p>
       <w:pPr>
-        <w:pStyle w:val="ListNumber"/>
-      </w:pPr>
+        <w:spacing w:after="80"/>
+        <w:ind w:left="360"/>
+      </w:pPr>
+      <w:r>
+        <w:rPr>
+          <w:b/>
+        </w:rPr>
+        <w:t xml:space="preserve">1.  </w:t>
+      </w:r>
       <w:r>
         <w:t>Watch the reference video for this lab. It shows the hiring flow: hiring the CEO, the CEO proposing specialists, and the approval gate you control. https://www.youtube.com/watch?v=tgqcHHxiwfk&amp;list=PLZslvC3k6NibmbMzfuyc3UGXkIC5k6YvC&amp;index=6 (https://www.youtube.com/watch?v=tgqcHHxiwfk&amp;list=PLZslvC3k6NibmbMzfuyc3UGXkIC5k6YvC&amp;index=6)</w:t>
       </w:r>
     </w:p>
     <w:p>
       <w:pPr>
-        <w:pStyle w:val="ListNumber"/>
-      </w:pPr>
+        <w:spacing w:after="80"/>
+        <w:ind w:left="360"/>
+      </w:pPr>
+      <w:r>
+        <w:rPr>
+          <w:b/>
+        </w:rPr>
+        <w:t xml:space="preserve">2.  </w:t>
+      </w:r>
       <w:r>
         <w:t>Hire the CEO agent from the company page. On the Nimbus Coffee, Inc. page, choose to hire the CEO. The CEO is the top agent that reads the company goal and works out what roles the company needs to achieve it.</w:t>
       </w:r>
     </w:p>
     <w:p>
       <w:pPr>
-        <w:pStyle w:val="ListNumber"/>
-      </w:pPr>
+        <w:spacing w:after="80"/>
+        <w:ind w:left="360"/>
+      </w:pPr>
+      <w:r>
+        <w:rPr>
+          <w:b/>
+        </w:rPr>
+        <w:t xml:space="preserve">3.  </w:t>
+      </w:r>
       <w:r>
         <w:t>Approve the CEO hire (you are the Board). The hire pauses at an approval gate. Review it and approve — as the Board, nothing joins the company without your sign-off. This is the core governance pattern: agents propose, humans approve.</w:t>
       </w:r>
     </w:p>
     <w:p>
       <w:pPr>
-        <w:pStyle w:val="ListNumber"/>
-      </w:pPr>
+        <w:spacing w:after="80"/>
+        <w:ind w:left="360"/>
+      </w:pPr>
+      <w:r>
+        <w:rPr>
+          <w:b/>
+        </w:rPr>
+        <w:t xml:space="preserve">4.  </w:t>
+      </w:r>
       <w:r>
         <w:t>Let the CEO propose specialist hires. Once active, the CEO analyses the goal and proposes specialists it needs (for a coffee brand, perhaps a Marketer, an Engineer for the storefront, and an Operations agent). Each proposal explains the role and why it helps reach the goal.</w:t>
       </w:r>
     </w:p>
     <w:p>
       <w:pPr>
-        <w:pStyle w:val="ListNumber"/>
-      </w:pPr>
+        <w:spacing w:after="80"/>
+        <w:ind w:left="360"/>
+      </w:pPr>
+      <w:r>
+        <w:rPr>
+          <w:b/>
+        </w:rPr>
+        <w:t xml:space="preserve">5.  </w:t>
+      </w:r>
       <w:r>
         <w:t>Review and approve each specialist at the approval gate. For every proposed hire, review the role and approve or reject it at the gate. Approve the ones that genuinely serve the Nimbus Coffee goal; reject any that don't. Each approval is recorded as a human decision — an actor_type=user entry in the audit trail you'll inspect in Lab 33.</w:t>
       </w:r>
@@ -8026,40 +9377,75 @@
     </w:p>
     <w:p>
       <w:pPr>
-        <w:pStyle w:val="ListNumber"/>
-      </w:pPr>
+        <w:spacing w:after="80"/>
+        <w:ind w:left="360"/>
+      </w:pPr>
+      <w:r>
+        <w:rPr>
+          <w:b/>
+        </w:rPr>
+        <w:t xml:space="preserve">1.  </w:t>
+      </w:r>
       <w:r>
         <w:t>Watch the reference video for this lab. It shows an agent's configuration screen — mandate, tools, and per-agent budget. https://www.youtube.com/watch?v=JLnGSWK4bJY&amp;list=PLZslvC3k6NibmbMzfuyc3UGXkIC5k6YvC&amp;index=7 (https://www.youtube.com/watch?v=JLnGSWK4bJY&amp;list=PLZslvC3k6NibmbMzfuyc3UGXkIC5k6YvC&amp;index=7)</w:t>
       </w:r>
     </w:p>
     <w:p>
       <w:pPr>
-        <w:pStyle w:val="ListNumber"/>
-      </w:pPr>
+        <w:spacing w:after="80"/>
+        <w:ind w:left="360"/>
+      </w:pPr>
+      <w:r>
+        <w:rPr>
+          <w:b/>
+        </w:rPr>
+        <w:t xml:space="preserve">2.  </w:t>
+      </w:r>
       <w:r>
         <w:t>Open an agent's configuration. On the Nimbus Coffee page, pick one specialist (e.g. the Marketer) and open its configuration. This is where you turn a generic hire into a purpose-built role.</w:t>
       </w:r>
     </w:p>
     <w:p>
       <w:pPr>
-        <w:pStyle w:val="ListNumber"/>
-      </w:pPr>
+        <w:spacing w:after="80"/>
+        <w:ind w:left="360"/>
+      </w:pPr>
+      <w:r>
+        <w:rPr>
+          <w:b/>
+        </w:rPr>
+        <w:t xml:space="preserve">3.  </w:t>
+      </w:r>
       <w:r>
         <w:t>Set the agent's mandate and the tools it may use. Write a crisp mandate — one or two sentences on exactly what this agent is responsible for (e.g. "Own Nimbus Coffee's brand voice and launch marketing copy"). Then grant only the tools it needs (e.g. file-write to the workspace, web research) and withhold the rest. Least privilege here prevents an agent from straying outside its lane. &gt; Tool names and the mandate field are version-specific — verify in the video / docs (&lt;https://docs.paperclip.ing&gt;).</w:t>
       </w:r>
     </w:p>
     <w:p>
       <w:pPr>
-        <w:pStyle w:val="ListNumber"/>
-      </w:pPr>
+        <w:spacing w:after="80"/>
+        <w:ind w:left="360"/>
+      </w:pPr>
+      <w:r>
+        <w:rPr>
+          <w:b/>
+        </w:rPr>
+        <w:t xml:space="preserve">4.  </w:t>
+      </w:r>
       <w:r>
         <w:t>Set a per-agent budget cap. Give this agent its own spend ceiling, carved out of the company budget. Per-agent caps mean one runaway agent can't drain the whole company — a key safety rail you'll exercise in Lab 33.</w:t>
       </w:r>
     </w:p>
     <w:p>
       <w:pPr>
-        <w:pStyle w:val="ListNumber"/>
-      </w:pPr>
+        <w:spacing w:after="80"/>
+        <w:ind w:left="360"/>
+      </w:pPr>
+      <w:r>
+        <w:rPr>
+          <w:b/>
+        </w:rPr>
+        <w:t xml:space="preserve">5.  </w:t>
+      </w:r>
       <w:r>
         <w:t>Save and confirm the agent is ready to receive tasks. Save the configuration, reload, and confirm the mandate, tools, and budget persist and the agent's status shows it is ready for work. Repeat steps 2–5 for each specialist you approved.</w:t>
       </w:r>
@@ -8140,32 +9526,60 @@
     </w:p>
     <w:p>
       <w:pPr>
-        <w:pStyle w:val="ListNumber"/>
-      </w:pPr>
+        <w:spacing w:after="80"/>
+        <w:ind w:left="360"/>
+      </w:pPr>
+      <w:r>
+        <w:rPr>
+          <w:b/>
+        </w:rPr>
+        <w:t xml:space="preserve">1.  </w:t>
+      </w:r>
       <w:r>
         <w:t>Watch the reference video for this lab. It demonstrates the budget rails (80% warning, 100% pause), resuming, and the audit trail. https://www.youtube.com/watch?v=77uTzIqw8SQ&amp;list=PLZslvC3k6NibmbMzfuyc3UGXkIC5k6YvC&amp;index=8 (https://www.youtube.com/watch?v=77uTzIqw8SQ&amp;list=PLZslvC3k6NibmbMzfuyc3UGXkIC5k6YvC&amp;index=8)</w:t>
       </w:r>
     </w:p>
     <w:p>
       <w:pPr>
-        <w:pStyle w:val="ListNumber"/>
-      </w:pPr>
+        <w:spacing w:after="80"/>
+        <w:ind w:left="360"/>
+      </w:pPr>
+      <w:r>
+        <w:rPr>
+          <w:b/>
+        </w:rPr>
+        <w:t xml:space="preserve">2.  </w:t>
+      </w:r>
       <w:r>
         <w:t>Set a company and/or per-agent budget cap. In the company settings (Lab 29) and/or an agent's config (Lab 32), set a deliberately small cap so ongoing agent work will approach it during this lab. This is what lets you observe the safety rails fire instead of waiting days.</w:t>
       </w:r>
     </w:p>
     <w:p>
       <w:pPr>
-        <w:pStyle w:val="ListNumber"/>
-      </w:pPr>
+        <w:spacing w:after="80"/>
+        <w:ind w:left="360"/>
+      </w:pPr>
+      <w:r>
+        <w:rPr>
+          <w:b/>
+        </w:rPr>
+        <w:t xml:space="preserve">3.  </w:t>
+      </w:r>
       <w:r>
         <w:t>Trigger the 80% warning and 100% pause, then resume. Let the agents keep working (assign a task or two). As spend crosses 80% of the cap, Paperclip raises a warning; at 100% it pauses the company/agent so nothing can overspend. Review the pause, then resume (e.g. by raising the cap or explicitly resuming) and confirm work continues. You have now seen both the soft and hard money rails in action.</w:t>
       </w:r>
     </w:p>
     <w:p>
       <w:pPr>
-        <w:pStyle w:val="ListNumber"/>
-      </w:pPr>
+        <w:spacing w:after="80"/>
+        <w:ind w:left="360"/>
+      </w:pPr>
+      <w:r>
+        <w:rPr>
+          <w:b/>
+        </w:rPr>
+        <w:t xml:space="preserve">4.  </w:t>
+      </w:r>
       <w:r>
         <w:t>Audit actions and spend in the embedded PostgreSQL. Connect to Paperclip's database to inspect the ground-truth record:</w:t>
       </w:r>
@@ -8182,8 +9596,15 @@
     </w:p>
     <w:p>
       <w:pPr>
-        <w:pStyle w:val="ListNumber"/>
-      </w:pPr>
+        <w:spacing w:after="80"/>
+        <w:ind w:left="360"/>
+      </w:pPr>
+      <w:r>
+        <w:rPr>
+          <w:b/>
+        </w:rPr>
+        <w:t xml:space="preserve">5.  </w:t>
+      </w:r>
       <w:r>
         <w:t>Separate human vs agent actions with actor_type. Run the audit query to see how much of the company's activity was human decisions versus agent actions:</w:t>
       </w:r>
@@ -8274,24 +9695,45 @@
     </w:p>
     <w:p>
       <w:pPr>
-        <w:pStyle w:val="ListNumber"/>
-      </w:pPr>
+        <w:spacing w:after="80"/>
+        <w:ind w:left="360"/>
+      </w:pPr>
+      <w:r>
+        <w:rPr>
+          <w:b/>
+        </w:rPr>
+        <w:t xml:space="preserve">1.  </w:t>
+      </w:r>
       <w:r>
         <w:t>Watch the reference video for this lab. It shows assigning a task, the agent executing it, and reviewing the deliverable. https://www.youtube.com/watch?v=kAGzMnQ3_Cs&amp;list=PLZslvC3k6NibmbMzfuyc3UGXkIC5k6YvC&amp;index=9 (https://www.youtube.com/watch?v=kAGzMnQ3_Cs&amp;list=PLZslvC3k6NibmbMzfuyc3UGXkIC5k6YvC&amp;index=9)</w:t>
       </w:r>
     </w:p>
     <w:p>
       <w:pPr>
-        <w:pStyle w:val="ListNumber"/>
-      </w:pPr>
+        <w:spacing w:after="80"/>
+        <w:ind w:left="360"/>
+      </w:pPr>
+      <w:r>
+        <w:rPr>
+          <w:b/>
+        </w:rPr>
+        <w:t xml:space="preserve">2.  </w:t>
+      </w:r>
       <w:r>
         <w:t>Assign a task to a specialist agent. On the task board (Lab 30), create a concrete task and assign it to the right specialist — e.g. give the Engineer "Build a one-page Nimbus Coffee landing page in the workspace", or the Marketer "Write the launch tagline and hero copy". Match the task to the mandate you set in Lab 32.</w:t>
       </w:r>
     </w:p>
     <w:p>
       <w:pPr>
-        <w:pStyle w:val="ListNumber"/>
-      </w:pPr>
+        <w:spacing w:after="80"/>
+        <w:ind w:left="360"/>
+      </w:pPr>
+      <w:r>
+        <w:rPr>
+          <w:b/>
+        </w:rPr>
+        <w:t xml:space="preserve">3.  </w:t>
+      </w:r>
       <w:r>
         <w:t>Watch the agent execute and write output to the workspace. The task moves todo → in_progress as the agent works. When it finishes, check that a real file appeared in your workspace:</w:t>
       </w:r>
@@ -8308,16 +9750,30 @@
     </w:p>
     <w:p>
       <w:pPr>
-        <w:pStyle w:val="ListNumber"/>
-      </w:pPr>
+        <w:spacing w:after="80"/>
+        <w:ind w:left="360"/>
+      </w:pPr>
+      <w:r>
+        <w:rPr>
+          <w:b/>
+        </w:rPr>
+        <w:t xml:space="preserve">4.  </w:t>
+      </w:r>
       <w:r>
         <w:t>Review the deliverable in the in_review state. The task is now in in_review, waiting on you. Open the produced file and judge it against the task and the company goal. As the Board, you are the quality gate.</w:t>
       </w:r>
     </w:p>
     <w:p>
       <w:pPr>
-        <w:pStyle w:val="ListNumber"/>
-      </w:pPr>
+        <w:spacing w:after="80"/>
+        <w:ind w:left="360"/>
+      </w:pPr>
+      <w:r>
+        <w:rPr>
+          <w:b/>
+        </w:rPr>
+        <w:t xml:space="preserve">5.  </w:t>
+      </w:r>
       <w:r>
         <w:t>Approve to move it to done, or send it back for revision. If the deliverable is good, approve it — the task moves to done and that slice of the Nimbus Coffee goal is complete. If it falls short, send it back for revision with feedback, and the agent iterates. Either way, you stayed in control end-to-end.</w:t>
       </w:r>

</xml_diff>

<commit_message>
feat: v1.3 — masterclass-style Hermes intro slides + Achievements screenshot
- Dark 'An AI Agent That Learns You' + 'The Bet: Compounding Value' intro slides (Lab 1)
- Live Achievements dashboard screenshot added to the Lab 2 tour
- v1.3 VCR rows in LP+LG; v1.2 archived; README updated

Co-Authored-By: Claude Opus 4.8 (1M context) <noreply@anthropic.com>
</commit_message>
<xml_diff>
--- a/courseware/LG-Human-AI Workforce with Autonomous AI Agents.docx
+++ b/courseware/LG-Human-AI Workforce with Autonomous AI Agents.docx
@@ -179,7 +179,7 @@
           <w:color w:val="1F6FEB"/>
           <w:sz w:val="24"/>
         </w:rPr>
-        <w:t>Version 1.2</w:t>
+        <w:t>Version 1.3</w:t>
       </w:r>
     </w:p>
     <w:p>
@@ -439,6 +439,64 @@
                 <w:sz w:val="19"/>
               </w:rPr>
               <w:t>Per-lab step numbering; YouTube links removed (videos remain in the labs); Hermes install lab expanded with the official install methods.</w:t>
+            </w:r>
+          </w:p>
+        </w:tc>
+        <w:tc>
+          <w:tcPr>
+            <w:tcW w:type="dxa" w:w="2160"/>
+          </w:tcPr>
+          <w:p>
+            <w:r/>
+            <w:r>
+              <w:rPr>
+                <w:sz w:val="19"/>
+              </w:rPr>
+              <w:t>Dr. Alfred Ang</w:t>
+            </w:r>
+          </w:p>
+        </w:tc>
+      </w:tr>
+      <w:tr>
+        <w:tc>
+          <w:tcPr>
+            <w:tcW w:type="dxa" w:w="2160"/>
+          </w:tcPr>
+          <w:p>
+            <w:r/>
+            <w:r>
+              <w:rPr>
+                <w:sz w:val="19"/>
+              </w:rPr>
+              <w:t>1.3</w:t>
+            </w:r>
+          </w:p>
+        </w:tc>
+        <w:tc>
+          <w:tcPr>
+            <w:tcW w:type="dxa" w:w="2160"/>
+          </w:tcPr>
+          <w:p>
+            <w:r/>
+            <w:r>
+              <w:rPr>
+                <w:sz w:val="19"/>
+              </w:rPr>
+              <w:t>14 July 2026</w:t>
+            </w:r>
+          </w:p>
+        </w:tc>
+        <w:tc>
+          <w:tcPr>
+            <w:tcW w:type="dxa" w:w="2160"/>
+          </w:tcPr>
+          <w:p>
+            <w:r/>
+            <w:r>
+              <w:rPr>
+                <w:sz w:val="19"/>
+              </w:rPr>
+              <w:t>Added the masterclass-style Hermes intro slides (What is Hermes; The Bet: Compounding Value) and the live Achievements dashboard screenshot to the deck.</w:t>
             </w:r>
           </w:p>
         </w:tc>

</xml_diff>

<commit_message>
feat: dark masterclass theme applied to the entire deck
Co-Authored-By: Claude Opus 4.8 (1M context) <noreply@anthropic.com>
</commit_message>
<xml_diff>
--- a/courseware/LG-Human-AI Workforce with Autonomous AI Agents.docx
+++ b/courseware/LG-Human-AI Workforce with Autonomous AI Agents.docx
@@ -496,7 +496,7 @@
               <w:rPr>
                 <w:sz w:val="19"/>
               </w:rPr>
-              <w:t>Added the masterclass-style Hermes slides (What is Hermes; The Bet: Compounding Value; platform matrix; Top-10 slash commands) and the live Achievements dashboard screenshot to the deck.</w:t>
+              <w:t>Deck restyled in the dark masterclass theme end-to-end; added the Hermes masterclass slides (What is Hermes; The Bet: Compounding Value; platform matrix; Top-10 slash commands) and the live Achievements dashboard screenshot.</w:t>
             </w:r>
           </w:p>
         </w:tc>
@@ -535,854 +535,12 @@
       </w:r>
     </w:p>
     <w:p>
-      <w:pPr>
-        <w:tabs>
-          <w:tab w:pos="9072" w:val="right" w:leader="dot"/>
-        </w:tabs>
-        <w:spacing w:after="60"/>
-      </w:pPr>
-      <w:r>
-        <w:rPr>
-          <w:rFonts w:ascii="Arial" w:hAnsi="Arial"/>
-          <w:b/>
-          <w:color w:val="333333"/>
-          <w:sz w:val="22"/>
-        </w:rPr>
-        <w:t>Introduction</w:t>
-        <w:tab/>
-        <w:t>5</w:t>
-      </w:r>
-    </w:p>
-    <w:p>
-      <w:pPr>
-        <w:tabs>
-          <w:tab w:pos="9072" w:val="right" w:leader="dot"/>
-        </w:tabs>
-        <w:spacing w:after="60"/>
-      </w:pPr>
-      <w:r>
-        <w:rPr>
-          <w:rFonts w:ascii="Arial" w:hAnsi="Arial"/>
-          <w:b/>
-          <w:color w:val="333333"/>
-          <w:sz w:val="22"/>
-        </w:rPr>
-        <w:t>Course Learning Outcomes</w:t>
-        <w:tab/>
-        <w:t>5</w:t>
-      </w:r>
-    </w:p>
-    <w:p>
-      <w:pPr>
-        <w:tabs>
-          <w:tab w:pos="9072" w:val="right" w:leader="dot"/>
-        </w:tabs>
-        <w:spacing w:after="60"/>
-      </w:pPr>
-      <w:r>
-        <w:rPr>
-          <w:rFonts w:ascii="Arial" w:hAnsi="Arial"/>
-          <w:b/>
-          <w:color w:val="333333"/>
-          <w:sz w:val="22"/>
-        </w:rPr>
-        <w:t>Before You Start — Environment Setup</w:t>
-        <w:tab/>
-        <w:t>5</w:t>
-      </w:r>
-    </w:p>
-    <w:p>
-      <w:pPr>
-        <w:tabs>
-          <w:tab w:pos="9072" w:val="right" w:leader="dot"/>
-        </w:tabs>
-        <w:spacing w:after="60"/>
-      </w:pPr>
-      <w:r>
-        <w:rPr>
-          <w:rFonts w:ascii="Arial" w:hAnsi="Arial"/>
-          <w:b/>
-          <w:color w:val="333333"/>
-          <w:sz w:val="22"/>
-        </w:rPr>
-        <w:t>Topic 01 — Hermes Agent — Your Autonomous Personal Chief-of-Staff  (33%)</w:t>
-        <w:tab/>
-        <w:t>6</w:t>
-      </w:r>
-    </w:p>
-    <w:p>
-      <w:pPr>
-        <w:tabs>
-          <w:tab w:pos="9072" w:val="right" w:leader="dot"/>
-        </w:tabs>
-        <w:spacing w:after="60"/>
-        <w:ind w:left="432"/>
-      </w:pPr>
-      <w:r>
-        <w:rPr>
-          <w:rFonts w:ascii="Arial" w:hAnsi="Arial"/>
-          <w:b w:val="0"/>
-          <w:color w:val="333333"/>
-          <w:sz w:val="21"/>
-        </w:rPr>
-        <w:t>Lab 1 — Install and Setup Hermes</w:t>
-        <w:tab/>
-        <w:t>7</w:t>
-      </w:r>
-    </w:p>
-    <w:p>
-      <w:pPr>
-        <w:tabs>
-          <w:tab w:pos="9072" w:val="right" w:leader="dot"/>
-        </w:tabs>
-        <w:spacing w:after="60"/>
-        <w:ind w:left="432"/>
-      </w:pPr>
-      <w:r>
-        <w:rPr>
-          <w:rFonts w:ascii="Arial" w:hAnsi="Arial"/>
-          <w:b w:val="0"/>
-          <w:color w:val="333333"/>
-          <w:sz w:val="21"/>
-        </w:rPr>
-        <w:t>Lab 2 — Deployment — Local Install &amp; Hermes Desktop App</w:t>
-        <w:tab/>
-        <w:t>8</w:t>
-      </w:r>
-    </w:p>
-    <w:p>
-      <w:pPr>
-        <w:tabs>
-          <w:tab w:pos="9072" w:val="right" w:leader="dot"/>
-        </w:tabs>
-        <w:spacing w:after="60"/>
-        <w:ind w:left="432"/>
-      </w:pPr>
-      <w:r>
-        <w:rPr>
-          <w:rFonts w:ascii="Arial" w:hAnsi="Arial"/>
-          <w:b w:val="0"/>
-          <w:color w:val="333333"/>
-          <w:sz w:val="21"/>
-        </w:rPr>
-        <w:t>Lab 3 — Memory and Plugins</w:t>
-        <w:tab/>
-        <w:t>9</w:t>
-      </w:r>
-    </w:p>
-    <w:p>
-      <w:pPr>
-        <w:tabs>
-          <w:tab w:pos="9072" w:val="right" w:leader="dot"/>
-        </w:tabs>
-        <w:spacing w:after="60"/>
-        <w:ind w:left="432"/>
-      </w:pPr>
-      <w:r>
-        <w:rPr>
-          <w:rFonts w:ascii="Arial" w:hAnsi="Arial"/>
-          <w:b w:val="0"/>
-          <w:color w:val="333333"/>
-          <w:sz w:val="21"/>
-        </w:rPr>
-        <w:t>Lab 4 — Skills</w:t>
-        <w:tab/>
-        <w:t>10</w:t>
-      </w:r>
-    </w:p>
-    <w:p>
-      <w:pPr>
-        <w:tabs>
-          <w:tab w:pos="9072" w:val="right" w:leader="dot"/>
-        </w:tabs>
-        <w:spacing w:after="60"/>
-        <w:ind w:left="432"/>
-      </w:pPr>
-      <w:r>
-        <w:rPr>
-          <w:rFonts w:ascii="Arial" w:hAnsi="Arial"/>
-          <w:b w:val="0"/>
-          <w:color w:val="333333"/>
-          <w:sz w:val="21"/>
-        </w:rPr>
-        <w:t>Lab 5 — Providers &amp; Model</w:t>
-        <w:tab/>
-        <w:t>11</w:t>
-      </w:r>
-    </w:p>
-    <w:p>
-      <w:pPr>
-        <w:tabs>
-          <w:tab w:pos="9072" w:val="right" w:leader="dot"/>
-        </w:tabs>
-        <w:spacing w:after="60"/>
-        <w:ind w:left="432"/>
-      </w:pPr>
-      <w:r>
-        <w:rPr>
-          <w:rFonts w:ascii="Arial" w:hAnsi="Arial"/>
-          <w:b w:val="0"/>
-          <w:color w:val="333333"/>
-          <w:sz w:val="21"/>
-        </w:rPr>
-        <w:t>Lab 6 — MCP and Tools</w:t>
-        <w:tab/>
-        <w:t>11</w:t>
-      </w:r>
-    </w:p>
-    <w:p>
-      <w:pPr>
-        <w:tabs>
-          <w:tab w:pos="9072" w:val="right" w:leader="dot"/>
-        </w:tabs>
-        <w:spacing w:after="60"/>
-        <w:ind w:left="432"/>
-      </w:pPr>
-      <w:r>
-        <w:rPr>
-          <w:rFonts w:ascii="Arial" w:hAnsi="Arial"/>
-          <w:b w:val="0"/>
-          <w:color w:val="333333"/>
-          <w:sz w:val="21"/>
-        </w:rPr>
-        <w:t>Lab 7 — Cron Jobs &amp; Automation</w:t>
-        <w:tab/>
-        <w:t>12</w:t>
-      </w:r>
-    </w:p>
-    <w:p>
-      <w:pPr>
-        <w:tabs>
-          <w:tab w:pos="9072" w:val="right" w:leader="dot"/>
-        </w:tabs>
-        <w:spacing w:after="60"/>
-        <w:ind w:left="432"/>
-      </w:pPr>
-      <w:r>
-        <w:rPr>
-          <w:rFonts w:ascii="Arial" w:hAnsi="Arial"/>
-          <w:b w:val="0"/>
-          <w:color w:val="333333"/>
-          <w:sz w:val="21"/>
-        </w:rPr>
-        <w:t>Lab 8 — Subagents &amp; Delegation</w:t>
-        <w:tab/>
-        <w:t>13</w:t>
-      </w:r>
-    </w:p>
-    <w:p>
-      <w:pPr>
-        <w:tabs>
-          <w:tab w:pos="9072" w:val="right" w:leader="dot"/>
-        </w:tabs>
-        <w:spacing w:after="60"/>
-        <w:ind w:left="432"/>
-      </w:pPr>
-      <w:r>
-        <w:rPr>
-          <w:rFonts w:ascii="Arial" w:hAnsi="Arial"/>
-          <w:b w:val="0"/>
-          <w:color w:val="333333"/>
-          <w:sz w:val="21"/>
-        </w:rPr>
-        <w:t>Lab 9 — Profile and Kanban</w:t>
-        <w:tab/>
-        <w:t>14</w:t>
-      </w:r>
-    </w:p>
-    <w:p>
-      <w:pPr>
-        <w:tabs>
-          <w:tab w:pos="9072" w:val="right" w:leader="dot"/>
-        </w:tabs>
-        <w:spacing w:after="60"/>
-        <w:ind w:left="432"/>
-      </w:pPr>
-      <w:r>
-        <w:rPr>
-          <w:rFonts w:ascii="Arial" w:hAnsi="Arial"/>
-          <w:b w:val="0"/>
-          <w:color w:val="333333"/>
-          <w:sz w:val="21"/>
-        </w:rPr>
-        <w:t>Lab 10 — Security</w:t>
-        <w:tab/>
-        <w:t>15</w:t>
-      </w:r>
-    </w:p>
-    <w:p>
-      <w:pPr>
-        <w:tabs>
-          <w:tab w:pos="9072" w:val="right" w:leader="dot"/>
-        </w:tabs>
-        <w:spacing w:after="60"/>
-        <w:ind w:left="432"/>
-      </w:pPr>
-      <w:r>
-        <w:rPr>
-          <w:rFonts w:ascii="Arial" w:hAnsi="Arial"/>
-          <w:b w:val="0"/>
-          <w:color w:val="333333"/>
-          <w:sz w:val="21"/>
-        </w:rPr>
-        <w:t>Lab 11 — Use Case — Make a Video with Hyperframe</w:t>
-        <w:tab/>
-        <w:t>16</w:t>
-      </w:r>
-    </w:p>
-    <w:p>
-      <w:pPr>
-        <w:tabs>
-          <w:tab w:pos="9072" w:val="right" w:leader="dot"/>
-        </w:tabs>
-        <w:spacing w:after="60"/>
-        <w:ind w:left="432"/>
-      </w:pPr>
-      <w:r>
-        <w:rPr>
-          <w:rFonts w:ascii="Arial" w:hAnsi="Arial"/>
-          <w:b w:val="0"/>
-          <w:color w:val="333333"/>
-          <w:sz w:val="21"/>
-        </w:rPr>
-        <w:t>Lab 12 — Visualization</w:t>
-        <w:tab/>
-        <w:t>17</w:t>
-      </w:r>
-    </w:p>
-    <w:p>
-      <w:pPr>
-        <w:tabs>
-          <w:tab w:pos="9072" w:val="right" w:leader="dot"/>
-        </w:tabs>
-        <w:spacing w:after="60"/>
-        <w:ind w:left="432"/>
-      </w:pPr>
-      <w:r>
-        <w:rPr>
-          <w:rFonts w:ascii="Arial" w:hAnsi="Arial"/>
-          <w:b w:val="0"/>
-          <w:color w:val="333333"/>
-          <w:sz w:val="21"/>
-        </w:rPr>
-        <w:t>Lab 13 — Build a Multi-Agent Workflow</w:t>
-        <w:tab/>
-        <w:t>18</w:t>
-      </w:r>
-    </w:p>
-    <w:p>
-      <w:pPr>
-        <w:tabs>
-          <w:tab w:pos="9072" w:val="right" w:leader="dot"/>
-        </w:tabs>
-        <w:spacing w:after="60"/>
-        <w:ind w:left="432"/>
-      </w:pPr>
-      <w:r>
-        <w:rPr>
-          <w:rFonts w:ascii="Arial" w:hAnsi="Arial"/>
-          <w:b w:val="0"/>
-          <w:color w:val="333333"/>
-          <w:sz w:val="21"/>
-        </w:rPr>
-        <w:t>Lab 14 — Webhook</w:t>
-        <w:tab/>
-        <w:t>18</w:t>
-      </w:r>
-    </w:p>
-    <w:p>
-      <w:pPr>
-        <w:tabs>
-          <w:tab w:pos="9072" w:val="right" w:leader="dot"/>
-        </w:tabs>
-        <w:spacing w:after="60"/>
-      </w:pPr>
-      <w:r>
-        <w:rPr>
-          <w:rFonts w:ascii="Arial" w:hAnsi="Arial"/>
-          <w:b/>
-          <w:color w:val="333333"/>
-          <w:sz w:val="22"/>
-        </w:rPr>
-        <w:t>Topic 02 — OpenClaw — Automating a Business Back-Office  (33%)</w:t>
-        <w:tab/>
-        <w:t>20</w:t>
-      </w:r>
-    </w:p>
-    <w:p>
-      <w:pPr>
-        <w:tabs>
-          <w:tab w:pos="9072" w:val="right" w:leader="dot"/>
-        </w:tabs>
-        <w:spacing w:after="60"/>
-        <w:ind w:left="432"/>
-      </w:pPr>
-      <w:r>
-        <w:rPr>
-          <w:rFonts w:ascii="Arial" w:hAnsi="Arial"/>
-          <w:b w:val="0"/>
-          <w:color w:val="333333"/>
-          <w:sz w:val="21"/>
-        </w:rPr>
-        <w:t>Lab 15 — Install OpenClaw</w:t>
-        <w:tab/>
-        <w:t>20</w:t>
-      </w:r>
-    </w:p>
-    <w:p>
-      <w:pPr>
-        <w:tabs>
-          <w:tab w:pos="9072" w:val="right" w:leader="dot"/>
-        </w:tabs>
-        <w:spacing w:after="60"/>
-        <w:ind w:left="432"/>
-      </w:pPr>
-      <w:r>
-        <w:rPr>
-          <w:rFonts w:ascii="Arial" w:hAnsi="Arial"/>
-          <w:b w:val="0"/>
-          <w:color w:val="333333"/>
-          <w:sz w:val="21"/>
-        </w:rPr>
-        <w:t>Lab 16 — Models &amp; Providers</w:t>
-        <w:tab/>
-        <w:t>22</w:t>
-      </w:r>
-    </w:p>
-    <w:p>
-      <w:pPr>
-        <w:tabs>
-          <w:tab w:pos="9072" w:val="right" w:leader="dot"/>
-        </w:tabs>
-        <w:spacing w:after="60"/>
-        <w:ind w:left="432"/>
-      </w:pPr>
-      <w:r>
-        <w:rPr>
-          <w:rFonts w:ascii="Arial" w:hAnsi="Arial"/>
-          <w:b w:val="0"/>
-          <w:color w:val="333333"/>
-          <w:sz w:val="21"/>
-        </w:rPr>
-        <w:t>Lab 17 — Channels</w:t>
-        <w:tab/>
-        <w:t>24</w:t>
-      </w:r>
-    </w:p>
-    <w:p>
-      <w:pPr>
-        <w:tabs>
-          <w:tab w:pos="9072" w:val="right" w:leader="dot"/>
-        </w:tabs>
-        <w:spacing w:after="60"/>
-        <w:ind w:left="432"/>
-      </w:pPr>
-      <w:r>
-        <w:rPr>
-          <w:rFonts w:ascii="Arial" w:hAnsi="Arial"/>
-          <w:b w:val="0"/>
-          <w:color w:val="333333"/>
-          <w:sz w:val="21"/>
-        </w:rPr>
-        <w:t>Lab 18 — Skills</w:t>
-        <w:tab/>
-        <w:t>25</w:t>
-      </w:r>
-    </w:p>
-    <w:p>
-      <w:pPr>
-        <w:tabs>
-          <w:tab w:pos="9072" w:val="right" w:leader="dot"/>
-        </w:tabs>
-        <w:spacing w:after="60"/>
-        <w:ind w:left="432"/>
-      </w:pPr>
-      <w:r>
-        <w:rPr>
-          <w:rFonts w:ascii="Arial" w:hAnsi="Arial"/>
-          <w:b w:val="0"/>
-          <w:color w:val="333333"/>
-          <w:sz w:val="21"/>
-        </w:rPr>
-        <w:t>Lab 19 — Tools &amp; Integrations</w:t>
-        <w:tab/>
-        <w:t>26</w:t>
-      </w:r>
-    </w:p>
-    <w:p>
-      <w:pPr>
-        <w:tabs>
-          <w:tab w:pos="9072" w:val="right" w:leader="dot"/>
-        </w:tabs>
-        <w:spacing w:after="60"/>
-        <w:ind w:left="432"/>
-      </w:pPr>
-      <w:r>
-        <w:rPr>
-          <w:rFonts w:ascii="Arial" w:hAnsi="Arial"/>
-          <w:b w:val="0"/>
-          <w:color w:val="333333"/>
-          <w:sz w:val="21"/>
-        </w:rPr>
-        <w:t>Lab 20 — Commands</w:t>
-        <w:tab/>
-        <w:t>28</w:t>
-      </w:r>
-    </w:p>
-    <w:p>
-      <w:pPr>
-        <w:tabs>
-          <w:tab w:pos="9072" w:val="right" w:leader="dot"/>
-        </w:tabs>
-        <w:spacing w:after="60"/>
-        <w:ind w:left="432"/>
-      </w:pPr>
-      <w:r>
-        <w:rPr>
-          <w:rFonts w:ascii="Arial" w:hAnsi="Arial"/>
-          <w:b w:val="0"/>
-          <w:color w:val="333333"/>
-          <w:sz w:val="21"/>
-        </w:rPr>
-        <w:t>Lab 21 — Cron Jobs &amp; Heartbeat</w:t>
-        <w:tab/>
-        <w:t>30</w:t>
-      </w:r>
-    </w:p>
-    <w:p>
-      <w:pPr>
-        <w:tabs>
-          <w:tab w:pos="9072" w:val="right" w:leader="dot"/>
-        </w:tabs>
-        <w:spacing w:after="60"/>
-        <w:ind w:left="432"/>
-      </w:pPr>
-      <w:r>
-        <w:rPr>
-          <w:rFonts w:ascii="Arial" w:hAnsi="Arial"/>
-          <w:b w:val="0"/>
-          <w:color w:val="333333"/>
-          <w:sz w:val="21"/>
-        </w:rPr>
-        <w:t>Lab 22 — Memory &amp; Context</w:t>
-        <w:tab/>
-        <w:t>32</w:t>
-      </w:r>
-    </w:p>
-    <w:p>
-      <w:pPr>
-        <w:tabs>
-          <w:tab w:pos="9072" w:val="right" w:leader="dot"/>
-        </w:tabs>
-        <w:spacing w:after="60"/>
-        <w:ind w:left="432"/>
-      </w:pPr>
-      <w:r>
-        <w:rPr>
-          <w:rFonts w:ascii="Arial" w:hAnsi="Arial"/>
-          <w:b w:val="0"/>
-          <w:color w:val="333333"/>
-          <w:sz w:val="21"/>
-        </w:rPr>
-        <w:t>Lab 23 — Security</w:t>
-        <w:tab/>
-        <w:t>33</w:t>
-      </w:r>
-    </w:p>
-    <w:p>
-      <w:pPr>
-        <w:tabs>
-          <w:tab w:pos="9072" w:val="right" w:leader="dot"/>
-        </w:tabs>
-        <w:spacing w:after="60"/>
-        <w:ind w:left="432"/>
-      </w:pPr>
-      <w:r>
-        <w:rPr>
-          <w:rFonts w:ascii="Arial" w:hAnsi="Arial"/>
-          <w:b w:val="0"/>
-          <w:color w:val="333333"/>
-          <w:sz w:val="21"/>
-        </w:rPr>
-        <w:t>Lab 24 — Multi-Agent Workforce</w:t>
-        <w:tab/>
-        <w:t>35</w:t>
-      </w:r>
-    </w:p>
-    <w:p>
-      <w:pPr>
-        <w:tabs>
-          <w:tab w:pos="9072" w:val="right" w:leader="dot"/>
-        </w:tabs>
-        <w:spacing w:after="60"/>
-        <w:ind w:left="432"/>
-      </w:pPr>
-      <w:r>
-        <w:rPr>
-          <w:rFonts w:ascii="Arial" w:hAnsi="Arial"/>
-          <w:b w:val="0"/>
-          <w:color w:val="333333"/>
-          <w:sz w:val="21"/>
-        </w:rPr>
-        <w:t>Lab 25 — Dreaming — Idle Reflection &amp; Self-Improvement</w:t>
-        <w:tab/>
-        <w:t>37</w:t>
-      </w:r>
-    </w:p>
-    <w:p>
-      <w:pPr>
-        <w:tabs>
-          <w:tab w:pos="9072" w:val="right" w:leader="dot"/>
-        </w:tabs>
-        <w:spacing w:after="60"/>
-        <w:ind w:left="432"/>
-      </w:pPr>
-      <w:r>
-        <w:rPr>
-          <w:rFonts w:ascii="Arial" w:hAnsi="Arial"/>
-          <w:b w:val="0"/>
-          <w:color w:val="333333"/>
-          <w:sz w:val="21"/>
-        </w:rPr>
-        <w:t>Lab 26 — Use Cases &amp; Key Functions</w:t>
-        <w:tab/>
-        <w:t>38</w:t>
-      </w:r>
-    </w:p>
-    <w:p>
-      <w:pPr>
-        <w:tabs>
-          <w:tab w:pos="9072" w:val="right" w:leader="dot"/>
-        </w:tabs>
-        <w:spacing w:after="60"/>
-      </w:pPr>
-      <w:r>
-        <w:rPr>
-          <w:rFonts w:ascii="Arial" w:hAnsi="Arial"/>
-          <w:b/>
-          <w:color w:val="333333"/>
-          <w:sz w:val="22"/>
-        </w:rPr>
-        <w:t>Topic 03 — Paperclip — Running &amp; Governing a Company of AI Agents  (34%)</w:t>
-        <w:tab/>
-        <w:t>39</w:t>
-      </w:r>
-    </w:p>
-    <w:p>
-      <w:pPr>
-        <w:tabs>
-          <w:tab w:pos="9072" w:val="right" w:leader="dot"/>
-        </w:tabs>
-        <w:spacing w:after="60"/>
-        <w:ind w:left="432"/>
-      </w:pPr>
-      <w:r>
-        <w:rPr>
-          <w:rFonts w:ascii="Arial" w:hAnsi="Arial"/>
-          <w:b w:val="0"/>
-          <w:color w:val="333333"/>
-          <w:sz w:val="21"/>
-        </w:rPr>
-        <w:t>Lab 27 — Setup Paperclip</w:t>
-        <w:tab/>
-        <w:t>40</w:t>
-      </w:r>
-    </w:p>
-    <w:p>
-      <w:pPr>
-        <w:tabs>
-          <w:tab w:pos="9072" w:val="right" w:leader="dot"/>
-        </w:tabs>
-        <w:spacing w:after="60"/>
-        <w:ind w:left="432"/>
-      </w:pPr>
-      <w:r>
-        <w:rPr>
-          <w:rFonts w:ascii="Arial" w:hAnsi="Arial"/>
-          <w:b w:val="0"/>
-          <w:color w:val="333333"/>
-          <w:sz w:val="21"/>
-        </w:rPr>
-        <w:t>Lab 28 — Connect OpenAI Codex to Paperclip</w:t>
-        <w:tab/>
-        <w:t>41</w:t>
-      </w:r>
-    </w:p>
-    <w:p>
-      <w:pPr>
-        <w:tabs>
-          <w:tab w:pos="9072" w:val="right" w:leader="dot"/>
-        </w:tabs>
-        <w:spacing w:after="60"/>
-        <w:ind w:left="432"/>
-      </w:pPr>
-      <w:r>
-        <w:rPr>
-          <w:rFonts w:ascii="Arial" w:hAnsi="Arial"/>
-          <w:b w:val="0"/>
-          <w:color w:val="333333"/>
-          <w:sz w:val="21"/>
-        </w:rPr>
-        <w:t>Lab 29 — Configure Paperclip</w:t>
-        <w:tab/>
-        <w:t>42</w:t>
-      </w:r>
-    </w:p>
-    <w:p>
-      <w:pPr>
-        <w:tabs>
-          <w:tab w:pos="9072" w:val="right" w:leader="dot"/>
-        </w:tabs>
-        <w:spacing w:after="60"/>
-        <w:ind w:left="432"/>
-      </w:pPr>
-      <w:r>
-        <w:rPr>
-          <w:rFonts w:ascii="Arial" w:hAnsi="Arial"/>
-          <w:b w:val="0"/>
-          <w:color w:val="333333"/>
-          <w:sz w:val="21"/>
-        </w:rPr>
-        <w:t>Lab 30 — Track AI Tasks</w:t>
-        <w:tab/>
-        <w:t>42</w:t>
-      </w:r>
-    </w:p>
-    <w:p>
-      <w:pPr>
-        <w:tabs>
-          <w:tab w:pos="9072" w:val="right" w:leader="dot"/>
-        </w:tabs>
-        <w:spacing w:after="60"/>
-        <w:ind w:left="432"/>
-      </w:pPr>
-      <w:r>
-        <w:rPr>
-          <w:rFonts w:ascii="Arial" w:hAnsi="Arial"/>
-          <w:b w:val="0"/>
-          <w:color w:val="333333"/>
-          <w:sz w:val="21"/>
-        </w:rPr>
-        <w:t>Lab 31 — Automate AI Hiring</w:t>
-        <w:tab/>
-        <w:t>43</w:t>
-      </w:r>
-    </w:p>
-    <w:p>
-      <w:pPr>
-        <w:tabs>
-          <w:tab w:pos="9072" w:val="right" w:leader="dot"/>
-        </w:tabs>
-        <w:spacing w:after="60"/>
-        <w:ind w:left="432"/>
-      </w:pPr>
-      <w:r>
-        <w:rPr>
-          <w:rFonts w:ascii="Arial" w:hAnsi="Arial"/>
-          <w:b w:val="0"/>
-          <w:color w:val="333333"/>
-          <w:sz w:val="21"/>
-        </w:rPr>
-        <w:t>Lab 32 — Setup AI Agents</w:t>
-        <w:tab/>
-        <w:t>44</w:t>
-      </w:r>
-    </w:p>
-    <w:p>
-      <w:pPr>
-        <w:tabs>
-          <w:tab w:pos="9072" w:val="right" w:leader="dot"/>
-        </w:tabs>
-        <w:spacing w:after="60"/>
-        <w:ind w:left="432"/>
-      </w:pPr>
-      <w:r>
-        <w:rPr>
-          <w:rFonts w:ascii="Arial" w:hAnsi="Arial"/>
-          <w:b w:val="0"/>
-          <w:color w:val="333333"/>
-          <w:sz w:val="21"/>
-        </w:rPr>
-        <w:t>Lab 33 — Security</w:t>
-        <w:tab/>
-        <w:t>45</w:t>
-      </w:r>
-    </w:p>
-    <w:p>
-      <w:pPr>
-        <w:tabs>
-          <w:tab w:pos="9072" w:val="right" w:leader="dot"/>
-        </w:tabs>
-        <w:spacing w:after="60"/>
-        <w:ind w:left="432"/>
-      </w:pPr>
-      <w:r>
-        <w:rPr>
-          <w:rFonts w:ascii="Arial" w:hAnsi="Arial"/>
-          <w:b w:val="0"/>
-          <w:color w:val="333333"/>
-          <w:sz w:val="21"/>
-        </w:rPr>
-        <w:t>Lab 34 — Assign Task</w:t>
-        <w:tab/>
-        <w:t>46</w:t>
-      </w:r>
-    </w:p>
-    <w:p>
-      <w:pPr>
-        <w:tabs>
-          <w:tab w:pos="9072" w:val="right" w:leader="dot"/>
-        </w:tabs>
-        <w:spacing w:after="60"/>
-      </w:pPr>
-      <w:r>
-        <w:rPr>
-          <w:rFonts w:ascii="Arial" w:hAnsi="Arial"/>
-          <w:b/>
-          <w:color w:val="333333"/>
-          <w:sz w:val="22"/>
-        </w:rPr>
-        <w:t>Wrap-Up — The Agent Build Arc and Governance</w:t>
-        <w:tab/>
-        <w:t>47</w:t>
-      </w:r>
-    </w:p>
-    <w:p>
-      <w:pPr>
-        <w:tabs>
-          <w:tab w:pos="9072" w:val="right" w:leader="dot"/>
-        </w:tabs>
-        <w:spacing w:after="60"/>
-      </w:pPr>
-      <w:r>
-        <w:rPr>
-          <w:rFonts w:ascii="Arial" w:hAnsi="Arial"/>
-          <w:b/>
-          <w:color w:val="333333"/>
-          <w:sz w:val="22"/>
-        </w:rPr>
-        <w:t>Next Steps</w:t>
-        <w:tab/>
-        <w:t>48</w:t>
-      </w:r>
-    </w:p>
-    <w:p>
-      <w:pPr>
-        <w:tabs>
-          <w:tab w:pos="9072" w:val="right" w:leader="dot"/>
-        </w:tabs>
-        <w:spacing w:after="60"/>
-      </w:pPr>
-      <w:r>
-        <w:rPr>
-          <w:rFonts w:ascii="Arial" w:hAnsi="Arial"/>
-          <w:b/>
-          <w:color w:val="333333"/>
-          <w:sz w:val="22"/>
-        </w:rPr>
-        <w:t>Glossary</w:t>
-        <w:tab/>
-        <w:t>48</w:t>
+      <w:r>
+        <w:fldChar w:fldCharType="begin"/>
+        <w:instrText xml:space="preserve">TOC \o "1-3" \h \z \u</w:instrText>
+        <w:fldChar w:fldCharType="separate"/>
+        <w:t>Right-click and choose “Update Field”, or press F9, to build the table of contents.</w:t>
+        <w:fldChar w:fldCharType="end"/>
       </w:r>
     </w:p>
     <w:p>

</xml_diff>

<commit_message>
feat: Telegram five-step setup slide (masterclass style, with NEVER warning)
Co-Authored-By: Claude Opus 4.8 (1M context) <noreply@anthropic.com>
</commit_message>
<xml_diff>
--- a/courseware/LG-Human-AI Workforce with Autonomous AI Agents.docx
+++ b/courseware/LG-Human-AI Workforce with Autonomous AI Agents.docx
@@ -496,7 +496,7 @@
               <w:rPr>
                 <w:sz w:val="19"/>
               </w:rPr>
-              <w:t>Deck restyled in the dark masterclass theme end-to-end; added the Hermes masterclass slides (What is Hermes; The Bet: Compounding Value; platform matrix; Top-10 slash commands) and the live Achievements dashboard screenshot.</w:t>
+              <w:t>Deck restyled in the dark masterclass theme end-to-end; added the Hermes masterclass slides (What is Hermes; The Bet: Compounding Value; platform matrix; Top-10 slash commands; Telegram setup) and the live Achievements dashboard screenshot.</w:t>
             </w:r>
           </w:p>
         </w:tc>
@@ -535,12 +535,854 @@
       </w:r>
     </w:p>
     <w:p>
-      <w:r>
-        <w:fldChar w:fldCharType="begin"/>
-        <w:instrText xml:space="preserve">TOC \o "1-3" \h \z \u</w:instrText>
-        <w:fldChar w:fldCharType="separate"/>
-        <w:t>Right-click and choose “Update Field”, or press F9, to build the table of contents.</w:t>
-        <w:fldChar w:fldCharType="end"/>
+      <w:pPr>
+        <w:tabs>
+          <w:tab w:pos="9072" w:val="right" w:leader="dot"/>
+        </w:tabs>
+        <w:spacing w:after="60"/>
+      </w:pPr>
+      <w:r>
+        <w:rPr>
+          <w:rFonts w:ascii="Arial" w:hAnsi="Arial"/>
+          <w:b/>
+          <w:color w:val="333333"/>
+          <w:sz w:val="22"/>
+        </w:rPr>
+        <w:t>Introduction</w:t>
+        <w:tab/>
+        <w:t>5</w:t>
+      </w:r>
+    </w:p>
+    <w:p>
+      <w:pPr>
+        <w:tabs>
+          <w:tab w:pos="9072" w:val="right" w:leader="dot"/>
+        </w:tabs>
+        <w:spacing w:after="60"/>
+      </w:pPr>
+      <w:r>
+        <w:rPr>
+          <w:rFonts w:ascii="Arial" w:hAnsi="Arial"/>
+          <w:b/>
+          <w:color w:val="333333"/>
+          <w:sz w:val="22"/>
+        </w:rPr>
+        <w:t>Course Learning Outcomes</w:t>
+        <w:tab/>
+        <w:t>5</w:t>
+      </w:r>
+    </w:p>
+    <w:p>
+      <w:pPr>
+        <w:tabs>
+          <w:tab w:pos="9072" w:val="right" w:leader="dot"/>
+        </w:tabs>
+        <w:spacing w:after="60"/>
+      </w:pPr>
+      <w:r>
+        <w:rPr>
+          <w:rFonts w:ascii="Arial" w:hAnsi="Arial"/>
+          <w:b/>
+          <w:color w:val="333333"/>
+          <w:sz w:val="22"/>
+        </w:rPr>
+        <w:t>Before You Start — Environment Setup</w:t>
+        <w:tab/>
+        <w:t>5</w:t>
+      </w:r>
+    </w:p>
+    <w:p>
+      <w:pPr>
+        <w:tabs>
+          <w:tab w:pos="9072" w:val="right" w:leader="dot"/>
+        </w:tabs>
+        <w:spacing w:after="60"/>
+      </w:pPr>
+      <w:r>
+        <w:rPr>
+          <w:rFonts w:ascii="Arial" w:hAnsi="Arial"/>
+          <w:b/>
+          <w:color w:val="333333"/>
+          <w:sz w:val="22"/>
+        </w:rPr>
+        <w:t>Topic 01 — Hermes Agent — Your Autonomous Personal Chief-of-Staff  (33%)</w:t>
+        <w:tab/>
+        <w:t>6</w:t>
+      </w:r>
+    </w:p>
+    <w:p>
+      <w:pPr>
+        <w:tabs>
+          <w:tab w:pos="9072" w:val="right" w:leader="dot"/>
+        </w:tabs>
+        <w:spacing w:after="60"/>
+        <w:ind w:left="432"/>
+      </w:pPr>
+      <w:r>
+        <w:rPr>
+          <w:rFonts w:ascii="Arial" w:hAnsi="Arial"/>
+          <w:b w:val="0"/>
+          <w:color w:val="333333"/>
+          <w:sz w:val="21"/>
+        </w:rPr>
+        <w:t>Lab 1 — Install and Setup Hermes</w:t>
+        <w:tab/>
+        <w:t>7</w:t>
+      </w:r>
+    </w:p>
+    <w:p>
+      <w:pPr>
+        <w:tabs>
+          <w:tab w:pos="9072" w:val="right" w:leader="dot"/>
+        </w:tabs>
+        <w:spacing w:after="60"/>
+        <w:ind w:left="432"/>
+      </w:pPr>
+      <w:r>
+        <w:rPr>
+          <w:rFonts w:ascii="Arial" w:hAnsi="Arial"/>
+          <w:b w:val="0"/>
+          <w:color w:val="333333"/>
+          <w:sz w:val="21"/>
+        </w:rPr>
+        <w:t>Lab 2 — Deployment — Local Install &amp; Hermes Desktop App</w:t>
+        <w:tab/>
+        <w:t>8</w:t>
+      </w:r>
+    </w:p>
+    <w:p>
+      <w:pPr>
+        <w:tabs>
+          <w:tab w:pos="9072" w:val="right" w:leader="dot"/>
+        </w:tabs>
+        <w:spacing w:after="60"/>
+        <w:ind w:left="432"/>
+      </w:pPr>
+      <w:r>
+        <w:rPr>
+          <w:rFonts w:ascii="Arial" w:hAnsi="Arial"/>
+          <w:b w:val="0"/>
+          <w:color w:val="333333"/>
+          <w:sz w:val="21"/>
+        </w:rPr>
+        <w:t>Lab 3 — Memory and Plugins</w:t>
+        <w:tab/>
+        <w:t>9</w:t>
+      </w:r>
+    </w:p>
+    <w:p>
+      <w:pPr>
+        <w:tabs>
+          <w:tab w:pos="9072" w:val="right" w:leader="dot"/>
+        </w:tabs>
+        <w:spacing w:after="60"/>
+        <w:ind w:left="432"/>
+      </w:pPr>
+      <w:r>
+        <w:rPr>
+          <w:rFonts w:ascii="Arial" w:hAnsi="Arial"/>
+          <w:b w:val="0"/>
+          <w:color w:val="333333"/>
+          <w:sz w:val="21"/>
+        </w:rPr>
+        <w:t>Lab 4 — Skills</w:t>
+        <w:tab/>
+        <w:t>10</w:t>
+      </w:r>
+    </w:p>
+    <w:p>
+      <w:pPr>
+        <w:tabs>
+          <w:tab w:pos="9072" w:val="right" w:leader="dot"/>
+        </w:tabs>
+        <w:spacing w:after="60"/>
+        <w:ind w:left="432"/>
+      </w:pPr>
+      <w:r>
+        <w:rPr>
+          <w:rFonts w:ascii="Arial" w:hAnsi="Arial"/>
+          <w:b w:val="0"/>
+          <w:color w:val="333333"/>
+          <w:sz w:val="21"/>
+        </w:rPr>
+        <w:t>Lab 5 — Providers &amp; Model</w:t>
+        <w:tab/>
+        <w:t>11</w:t>
+      </w:r>
+    </w:p>
+    <w:p>
+      <w:pPr>
+        <w:tabs>
+          <w:tab w:pos="9072" w:val="right" w:leader="dot"/>
+        </w:tabs>
+        <w:spacing w:after="60"/>
+        <w:ind w:left="432"/>
+      </w:pPr>
+      <w:r>
+        <w:rPr>
+          <w:rFonts w:ascii="Arial" w:hAnsi="Arial"/>
+          <w:b w:val="0"/>
+          <w:color w:val="333333"/>
+          <w:sz w:val="21"/>
+        </w:rPr>
+        <w:t>Lab 6 — MCP and Tools</w:t>
+        <w:tab/>
+        <w:t>11</w:t>
+      </w:r>
+    </w:p>
+    <w:p>
+      <w:pPr>
+        <w:tabs>
+          <w:tab w:pos="9072" w:val="right" w:leader="dot"/>
+        </w:tabs>
+        <w:spacing w:after="60"/>
+        <w:ind w:left="432"/>
+      </w:pPr>
+      <w:r>
+        <w:rPr>
+          <w:rFonts w:ascii="Arial" w:hAnsi="Arial"/>
+          <w:b w:val="0"/>
+          <w:color w:val="333333"/>
+          <w:sz w:val="21"/>
+        </w:rPr>
+        <w:t>Lab 7 — Cron Jobs &amp; Automation</w:t>
+        <w:tab/>
+        <w:t>12</w:t>
+      </w:r>
+    </w:p>
+    <w:p>
+      <w:pPr>
+        <w:tabs>
+          <w:tab w:pos="9072" w:val="right" w:leader="dot"/>
+        </w:tabs>
+        <w:spacing w:after="60"/>
+        <w:ind w:left="432"/>
+      </w:pPr>
+      <w:r>
+        <w:rPr>
+          <w:rFonts w:ascii="Arial" w:hAnsi="Arial"/>
+          <w:b w:val="0"/>
+          <w:color w:val="333333"/>
+          <w:sz w:val="21"/>
+        </w:rPr>
+        <w:t>Lab 8 — Subagents &amp; Delegation</w:t>
+        <w:tab/>
+        <w:t>13</w:t>
+      </w:r>
+    </w:p>
+    <w:p>
+      <w:pPr>
+        <w:tabs>
+          <w:tab w:pos="9072" w:val="right" w:leader="dot"/>
+        </w:tabs>
+        <w:spacing w:after="60"/>
+        <w:ind w:left="432"/>
+      </w:pPr>
+      <w:r>
+        <w:rPr>
+          <w:rFonts w:ascii="Arial" w:hAnsi="Arial"/>
+          <w:b w:val="0"/>
+          <w:color w:val="333333"/>
+          <w:sz w:val="21"/>
+        </w:rPr>
+        <w:t>Lab 9 — Profile and Kanban</w:t>
+        <w:tab/>
+        <w:t>14</w:t>
+      </w:r>
+    </w:p>
+    <w:p>
+      <w:pPr>
+        <w:tabs>
+          <w:tab w:pos="9072" w:val="right" w:leader="dot"/>
+        </w:tabs>
+        <w:spacing w:after="60"/>
+        <w:ind w:left="432"/>
+      </w:pPr>
+      <w:r>
+        <w:rPr>
+          <w:rFonts w:ascii="Arial" w:hAnsi="Arial"/>
+          <w:b w:val="0"/>
+          <w:color w:val="333333"/>
+          <w:sz w:val="21"/>
+        </w:rPr>
+        <w:t>Lab 10 — Security</w:t>
+        <w:tab/>
+        <w:t>15</w:t>
+      </w:r>
+    </w:p>
+    <w:p>
+      <w:pPr>
+        <w:tabs>
+          <w:tab w:pos="9072" w:val="right" w:leader="dot"/>
+        </w:tabs>
+        <w:spacing w:after="60"/>
+        <w:ind w:left="432"/>
+      </w:pPr>
+      <w:r>
+        <w:rPr>
+          <w:rFonts w:ascii="Arial" w:hAnsi="Arial"/>
+          <w:b w:val="0"/>
+          <w:color w:val="333333"/>
+          <w:sz w:val="21"/>
+        </w:rPr>
+        <w:t>Lab 11 — Use Case — Make a Video with Hyperframe</w:t>
+        <w:tab/>
+        <w:t>16</w:t>
+      </w:r>
+    </w:p>
+    <w:p>
+      <w:pPr>
+        <w:tabs>
+          <w:tab w:pos="9072" w:val="right" w:leader="dot"/>
+        </w:tabs>
+        <w:spacing w:after="60"/>
+        <w:ind w:left="432"/>
+      </w:pPr>
+      <w:r>
+        <w:rPr>
+          <w:rFonts w:ascii="Arial" w:hAnsi="Arial"/>
+          <w:b w:val="0"/>
+          <w:color w:val="333333"/>
+          <w:sz w:val="21"/>
+        </w:rPr>
+        <w:t>Lab 12 — Visualization</w:t>
+        <w:tab/>
+        <w:t>17</w:t>
+      </w:r>
+    </w:p>
+    <w:p>
+      <w:pPr>
+        <w:tabs>
+          <w:tab w:pos="9072" w:val="right" w:leader="dot"/>
+        </w:tabs>
+        <w:spacing w:after="60"/>
+        <w:ind w:left="432"/>
+      </w:pPr>
+      <w:r>
+        <w:rPr>
+          <w:rFonts w:ascii="Arial" w:hAnsi="Arial"/>
+          <w:b w:val="0"/>
+          <w:color w:val="333333"/>
+          <w:sz w:val="21"/>
+        </w:rPr>
+        <w:t>Lab 13 — Build a Multi-Agent Workflow</w:t>
+        <w:tab/>
+        <w:t>18</w:t>
+      </w:r>
+    </w:p>
+    <w:p>
+      <w:pPr>
+        <w:tabs>
+          <w:tab w:pos="9072" w:val="right" w:leader="dot"/>
+        </w:tabs>
+        <w:spacing w:after="60"/>
+        <w:ind w:left="432"/>
+      </w:pPr>
+      <w:r>
+        <w:rPr>
+          <w:rFonts w:ascii="Arial" w:hAnsi="Arial"/>
+          <w:b w:val="0"/>
+          <w:color w:val="333333"/>
+          <w:sz w:val="21"/>
+        </w:rPr>
+        <w:t>Lab 14 — Webhook</w:t>
+        <w:tab/>
+        <w:t>18</w:t>
+      </w:r>
+    </w:p>
+    <w:p>
+      <w:pPr>
+        <w:tabs>
+          <w:tab w:pos="9072" w:val="right" w:leader="dot"/>
+        </w:tabs>
+        <w:spacing w:after="60"/>
+      </w:pPr>
+      <w:r>
+        <w:rPr>
+          <w:rFonts w:ascii="Arial" w:hAnsi="Arial"/>
+          <w:b/>
+          <w:color w:val="333333"/>
+          <w:sz w:val="22"/>
+        </w:rPr>
+        <w:t>Topic 02 — OpenClaw — Automating a Business Back-Office  (33%)</w:t>
+        <w:tab/>
+        <w:t>20</w:t>
+      </w:r>
+    </w:p>
+    <w:p>
+      <w:pPr>
+        <w:tabs>
+          <w:tab w:pos="9072" w:val="right" w:leader="dot"/>
+        </w:tabs>
+        <w:spacing w:after="60"/>
+        <w:ind w:left="432"/>
+      </w:pPr>
+      <w:r>
+        <w:rPr>
+          <w:rFonts w:ascii="Arial" w:hAnsi="Arial"/>
+          <w:b w:val="0"/>
+          <w:color w:val="333333"/>
+          <w:sz w:val="21"/>
+        </w:rPr>
+        <w:t>Lab 15 — Install OpenClaw</w:t>
+        <w:tab/>
+        <w:t>20</w:t>
+      </w:r>
+    </w:p>
+    <w:p>
+      <w:pPr>
+        <w:tabs>
+          <w:tab w:pos="9072" w:val="right" w:leader="dot"/>
+        </w:tabs>
+        <w:spacing w:after="60"/>
+        <w:ind w:left="432"/>
+      </w:pPr>
+      <w:r>
+        <w:rPr>
+          <w:rFonts w:ascii="Arial" w:hAnsi="Arial"/>
+          <w:b w:val="0"/>
+          <w:color w:val="333333"/>
+          <w:sz w:val="21"/>
+        </w:rPr>
+        <w:t>Lab 16 — Models &amp; Providers</w:t>
+        <w:tab/>
+        <w:t>22</w:t>
+      </w:r>
+    </w:p>
+    <w:p>
+      <w:pPr>
+        <w:tabs>
+          <w:tab w:pos="9072" w:val="right" w:leader="dot"/>
+        </w:tabs>
+        <w:spacing w:after="60"/>
+        <w:ind w:left="432"/>
+      </w:pPr>
+      <w:r>
+        <w:rPr>
+          <w:rFonts w:ascii="Arial" w:hAnsi="Arial"/>
+          <w:b w:val="0"/>
+          <w:color w:val="333333"/>
+          <w:sz w:val="21"/>
+        </w:rPr>
+        <w:t>Lab 17 — Channels</w:t>
+        <w:tab/>
+        <w:t>24</w:t>
+      </w:r>
+    </w:p>
+    <w:p>
+      <w:pPr>
+        <w:tabs>
+          <w:tab w:pos="9072" w:val="right" w:leader="dot"/>
+        </w:tabs>
+        <w:spacing w:after="60"/>
+        <w:ind w:left="432"/>
+      </w:pPr>
+      <w:r>
+        <w:rPr>
+          <w:rFonts w:ascii="Arial" w:hAnsi="Arial"/>
+          <w:b w:val="0"/>
+          <w:color w:val="333333"/>
+          <w:sz w:val="21"/>
+        </w:rPr>
+        <w:t>Lab 18 — Skills</w:t>
+        <w:tab/>
+        <w:t>25</w:t>
+      </w:r>
+    </w:p>
+    <w:p>
+      <w:pPr>
+        <w:tabs>
+          <w:tab w:pos="9072" w:val="right" w:leader="dot"/>
+        </w:tabs>
+        <w:spacing w:after="60"/>
+        <w:ind w:left="432"/>
+      </w:pPr>
+      <w:r>
+        <w:rPr>
+          <w:rFonts w:ascii="Arial" w:hAnsi="Arial"/>
+          <w:b w:val="0"/>
+          <w:color w:val="333333"/>
+          <w:sz w:val="21"/>
+        </w:rPr>
+        <w:t>Lab 19 — Tools &amp; Integrations</w:t>
+        <w:tab/>
+        <w:t>26</w:t>
+      </w:r>
+    </w:p>
+    <w:p>
+      <w:pPr>
+        <w:tabs>
+          <w:tab w:pos="9072" w:val="right" w:leader="dot"/>
+        </w:tabs>
+        <w:spacing w:after="60"/>
+        <w:ind w:left="432"/>
+      </w:pPr>
+      <w:r>
+        <w:rPr>
+          <w:rFonts w:ascii="Arial" w:hAnsi="Arial"/>
+          <w:b w:val="0"/>
+          <w:color w:val="333333"/>
+          <w:sz w:val="21"/>
+        </w:rPr>
+        <w:t>Lab 20 — Commands</w:t>
+        <w:tab/>
+        <w:t>28</w:t>
+      </w:r>
+    </w:p>
+    <w:p>
+      <w:pPr>
+        <w:tabs>
+          <w:tab w:pos="9072" w:val="right" w:leader="dot"/>
+        </w:tabs>
+        <w:spacing w:after="60"/>
+        <w:ind w:left="432"/>
+      </w:pPr>
+      <w:r>
+        <w:rPr>
+          <w:rFonts w:ascii="Arial" w:hAnsi="Arial"/>
+          <w:b w:val="0"/>
+          <w:color w:val="333333"/>
+          <w:sz w:val="21"/>
+        </w:rPr>
+        <w:t>Lab 21 — Cron Jobs &amp; Heartbeat</w:t>
+        <w:tab/>
+        <w:t>30</w:t>
+      </w:r>
+    </w:p>
+    <w:p>
+      <w:pPr>
+        <w:tabs>
+          <w:tab w:pos="9072" w:val="right" w:leader="dot"/>
+        </w:tabs>
+        <w:spacing w:after="60"/>
+        <w:ind w:left="432"/>
+      </w:pPr>
+      <w:r>
+        <w:rPr>
+          <w:rFonts w:ascii="Arial" w:hAnsi="Arial"/>
+          <w:b w:val="0"/>
+          <w:color w:val="333333"/>
+          <w:sz w:val="21"/>
+        </w:rPr>
+        <w:t>Lab 22 — Memory &amp; Context</w:t>
+        <w:tab/>
+        <w:t>32</w:t>
+      </w:r>
+    </w:p>
+    <w:p>
+      <w:pPr>
+        <w:tabs>
+          <w:tab w:pos="9072" w:val="right" w:leader="dot"/>
+        </w:tabs>
+        <w:spacing w:after="60"/>
+        <w:ind w:left="432"/>
+      </w:pPr>
+      <w:r>
+        <w:rPr>
+          <w:rFonts w:ascii="Arial" w:hAnsi="Arial"/>
+          <w:b w:val="0"/>
+          <w:color w:val="333333"/>
+          <w:sz w:val="21"/>
+        </w:rPr>
+        <w:t>Lab 23 — Security</w:t>
+        <w:tab/>
+        <w:t>33</w:t>
+      </w:r>
+    </w:p>
+    <w:p>
+      <w:pPr>
+        <w:tabs>
+          <w:tab w:pos="9072" w:val="right" w:leader="dot"/>
+        </w:tabs>
+        <w:spacing w:after="60"/>
+        <w:ind w:left="432"/>
+      </w:pPr>
+      <w:r>
+        <w:rPr>
+          <w:rFonts w:ascii="Arial" w:hAnsi="Arial"/>
+          <w:b w:val="0"/>
+          <w:color w:val="333333"/>
+          <w:sz w:val="21"/>
+        </w:rPr>
+        <w:t>Lab 24 — Multi-Agent Workforce</w:t>
+        <w:tab/>
+        <w:t>35</w:t>
+      </w:r>
+    </w:p>
+    <w:p>
+      <w:pPr>
+        <w:tabs>
+          <w:tab w:pos="9072" w:val="right" w:leader="dot"/>
+        </w:tabs>
+        <w:spacing w:after="60"/>
+        <w:ind w:left="432"/>
+      </w:pPr>
+      <w:r>
+        <w:rPr>
+          <w:rFonts w:ascii="Arial" w:hAnsi="Arial"/>
+          <w:b w:val="0"/>
+          <w:color w:val="333333"/>
+          <w:sz w:val="21"/>
+        </w:rPr>
+        <w:t>Lab 25 — Dreaming — Idle Reflection &amp; Self-Improvement</w:t>
+        <w:tab/>
+        <w:t>37</w:t>
+      </w:r>
+    </w:p>
+    <w:p>
+      <w:pPr>
+        <w:tabs>
+          <w:tab w:pos="9072" w:val="right" w:leader="dot"/>
+        </w:tabs>
+        <w:spacing w:after="60"/>
+        <w:ind w:left="432"/>
+      </w:pPr>
+      <w:r>
+        <w:rPr>
+          <w:rFonts w:ascii="Arial" w:hAnsi="Arial"/>
+          <w:b w:val="0"/>
+          <w:color w:val="333333"/>
+          <w:sz w:val="21"/>
+        </w:rPr>
+        <w:t>Lab 26 — Use Cases &amp; Key Functions</w:t>
+        <w:tab/>
+        <w:t>38</w:t>
+      </w:r>
+    </w:p>
+    <w:p>
+      <w:pPr>
+        <w:tabs>
+          <w:tab w:pos="9072" w:val="right" w:leader="dot"/>
+        </w:tabs>
+        <w:spacing w:after="60"/>
+      </w:pPr>
+      <w:r>
+        <w:rPr>
+          <w:rFonts w:ascii="Arial" w:hAnsi="Arial"/>
+          <w:b/>
+          <w:color w:val="333333"/>
+          <w:sz w:val="22"/>
+        </w:rPr>
+        <w:t>Topic 03 — Paperclip — Running &amp; Governing a Company of AI Agents  (34%)</w:t>
+        <w:tab/>
+        <w:t>39</w:t>
+      </w:r>
+    </w:p>
+    <w:p>
+      <w:pPr>
+        <w:tabs>
+          <w:tab w:pos="9072" w:val="right" w:leader="dot"/>
+        </w:tabs>
+        <w:spacing w:after="60"/>
+        <w:ind w:left="432"/>
+      </w:pPr>
+      <w:r>
+        <w:rPr>
+          <w:rFonts w:ascii="Arial" w:hAnsi="Arial"/>
+          <w:b w:val="0"/>
+          <w:color w:val="333333"/>
+          <w:sz w:val="21"/>
+        </w:rPr>
+        <w:t>Lab 27 — Setup Paperclip</w:t>
+        <w:tab/>
+        <w:t>40</w:t>
+      </w:r>
+    </w:p>
+    <w:p>
+      <w:pPr>
+        <w:tabs>
+          <w:tab w:pos="9072" w:val="right" w:leader="dot"/>
+        </w:tabs>
+        <w:spacing w:after="60"/>
+        <w:ind w:left="432"/>
+      </w:pPr>
+      <w:r>
+        <w:rPr>
+          <w:rFonts w:ascii="Arial" w:hAnsi="Arial"/>
+          <w:b w:val="0"/>
+          <w:color w:val="333333"/>
+          <w:sz w:val="21"/>
+        </w:rPr>
+        <w:t>Lab 28 — Connect OpenAI Codex to Paperclip</w:t>
+        <w:tab/>
+        <w:t>41</w:t>
+      </w:r>
+    </w:p>
+    <w:p>
+      <w:pPr>
+        <w:tabs>
+          <w:tab w:pos="9072" w:val="right" w:leader="dot"/>
+        </w:tabs>
+        <w:spacing w:after="60"/>
+        <w:ind w:left="432"/>
+      </w:pPr>
+      <w:r>
+        <w:rPr>
+          <w:rFonts w:ascii="Arial" w:hAnsi="Arial"/>
+          <w:b w:val="0"/>
+          <w:color w:val="333333"/>
+          <w:sz w:val="21"/>
+        </w:rPr>
+        <w:t>Lab 29 — Configure Paperclip</w:t>
+        <w:tab/>
+        <w:t>42</w:t>
+      </w:r>
+    </w:p>
+    <w:p>
+      <w:pPr>
+        <w:tabs>
+          <w:tab w:pos="9072" w:val="right" w:leader="dot"/>
+        </w:tabs>
+        <w:spacing w:after="60"/>
+        <w:ind w:left="432"/>
+      </w:pPr>
+      <w:r>
+        <w:rPr>
+          <w:rFonts w:ascii="Arial" w:hAnsi="Arial"/>
+          <w:b w:val="0"/>
+          <w:color w:val="333333"/>
+          <w:sz w:val="21"/>
+        </w:rPr>
+        <w:t>Lab 30 — Track AI Tasks</w:t>
+        <w:tab/>
+        <w:t>42</w:t>
+      </w:r>
+    </w:p>
+    <w:p>
+      <w:pPr>
+        <w:tabs>
+          <w:tab w:pos="9072" w:val="right" w:leader="dot"/>
+        </w:tabs>
+        <w:spacing w:after="60"/>
+        <w:ind w:left="432"/>
+      </w:pPr>
+      <w:r>
+        <w:rPr>
+          <w:rFonts w:ascii="Arial" w:hAnsi="Arial"/>
+          <w:b w:val="0"/>
+          <w:color w:val="333333"/>
+          <w:sz w:val="21"/>
+        </w:rPr>
+        <w:t>Lab 31 — Automate AI Hiring</w:t>
+        <w:tab/>
+        <w:t>43</w:t>
+      </w:r>
+    </w:p>
+    <w:p>
+      <w:pPr>
+        <w:tabs>
+          <w:tab w:pos="9072" w:val="right" w:leader="dot"/>
+        </w:tabs>
+        <w:spacing w:after="60"/>
+        <w:ind w:left="432"/>
+      </w:pPr>
+      <w:r>
+        <w:rPr>
+          <w:rFonts w:ascii="Arial" w:hAnsi="Arial"/>
+          <w:b w:val="0"/>
+          <w:color w:val="333333"/>
+          <w:sz w:val="21"/>
+        </w:rPr>
+        <w:t>Lab 32 — Setup AI Agents</w:t>
+        <w:tab/>
+        <w:t>44</w:t>
+      </w:r>
+    </w:p>
+    <w:p>
+      <w:pPr>
+        <w:tabs>
+          <w:tab w:pos="9072" w:val="right" w:leader="dot"/>
+        </w:tabs>
+        <w:spacing w:after="60"/>
+        <w:ind w:left="432"/>
+      </w:pPr>
+      <w:r>
+        <w:rPr>
+          <w:rFonts w:ascii="Arial" w:hAnsi="Arial"/>
+          <w:b w:val="0"/>
+          <w:color w:val="333333"/>
+          <w:sz w:val="21"/>
+        </w:rPr>
+        <w:t>Lab 33 — Security</w:t>
+        <w:tab/>
+        <w:t>45</w:t>
+      </w:r>
+    </w:p>
+    <w:p>
+      <w:pPr>
+        <w:tabs>
+          <w:tab w:pos="9072" w:val="right" w:leader="dot"/>
+        </w:tabs>
+        <w:spacing w:after="60"/>
+        <w:ind w:left="432"/>
+      </w:pPr>
+      <w:r>
+        <w:rPr>
+          <w:rFonts w:ascii="Arial" w:hAnsi="Arial"/>
+          <w:b w:val="0"/>
+          <w:color w:val="333333"/>
+          <w:sz w:val="21"/>
+        </w:rPr>
+        <w:t>Lab 34 — Assign Task</w:t>
+        <w:tab/>
+        <w:t>46</w:t>
+      </w:r>
+    </w:p>
+    <w:p>
+      <w:pPr>
+        <w:tabs>
+          <w:tab w:pos="9072" w:val="right" w:leader="dot"/>
+        </w:tabs>
+        <w:spacing w:after="60"/>
+      </w:pPr>
+      <w:r>
+        <w:rPr>
+          <w:rFonts w:ascii="Arial" w:hAnsi="Arial"/>
+          <w:b/>
+          <w:color w:val="333333"/>
+          <w:sz w:val="22"/>
+        </w:rPr>
+        <w:t>Wrap-Up — The Agent Build Arc and Governance</w:t>
+        <w:tab/>
+        <w:t>47</w:t>
+      </w:r>
+    </w:p>
+    <w:p>
+      <w:pPr>
+        <w:tabs>
+          <w:tab w:pos="9072" w:val="right" w:leader="dot"/>
+        </w:tabs>
+        <w:spacing w:after="60"/>
+      </w:pPr>
+      <w:r>
+        <w:rPr>
+          <w:rFonts w:ascii="Arial" w:hAnsi="Arial"/>
+          <w:b/>
+          <w:color w:val="333333"/>
+          <w:sz w:val="22"/>
+        </w:rPr>
+        <w:t>Next Steps</w:t>
+        <w:tab/>
+        <w:t>48</w:t>
+      </w:r>
+    </w:p>
+    <w:p>
+      <w:pPr>
+        <w:tabs>
+          <w:tab w:pos="9072" w:val="right" w:leader="dot"/>
+        </w:tabs>
+        <w:spacing w:after="60"/>
+      </w:pPr>
+      <w:r>
+        <w:rPr>
+          <w:rFonts w:ascii="Arial" w:hAnsi="Arial"/>
+          <w:b/>
+          <w:color w:val="333333"/>
+          <w:sz w:val="22"/>
+        </w:rPr>
+        <w:t>Glossary</w:t>
+        <w:tab/>
+        <w:t>48</w:t>
       </w:r>
     </w:p>
     <w:p>

</xml_diff>

<commit_message>
feat: OpenClaw topic slides, Paperclip subtitle, kanban orchestration slides, detailed Labs 11-14, video-team Lab 13, fade transitions
- OpenClaw section: Topic-2 subtitle + Evolution/Linux-of-Agents/deployments/SKILL.md+ClawHub warning/heartbeat/context-compaction/exec-problem/sessions_spawn (mined from the Mastering OpenClaw deck)
- Paperclip Topic-3 subtitle page
- Lab 9: Share-a-Whole-Agent + Fork-to-Team; Lab 13 rebuilt as Build a Multi-Agent Video Team (profiles + kanban) with detailed guide
- Labs 11-14: 8 detailed steps each (LG + PPT)
- Fade slide transition on all 319 slides (source deck's aesthetic)

Co-Authored-By: Claude Opus 4.8 (1M context) <noreply@anthropic.com>
</commit_message>
<xml_diff>
--- a/courseware/LG-Human-AI Workforce with Autonomous AI Agents.docx
+++ b/courseware/LG-Human-AI Workforce with Autonomous AI Agents.docx
@@ -496,7 +496,7 @@
               <w:rPr>
                 <w:sz w:val="19"/>
               </w:rPr>
-              <w:t>Deck restyled in the dark masterclass theme end-to-end; added the Hermes masterclass slides (What is Hermes; The Bet: Compounding Value; platform matrix; Top-10 slash commands; Telegram setup; memory L1-vs-L2 and session-search; what-is-a-tool, built-in tool catalog, tools-in-action, cron scheduling and delegation) and the live Achievements dashboard screenshot.</w:t>
+              <w:t>Deck restyled in the dark masterclass theme end-to-end; added the Hermes masterclass slides (What is Hermes; The Bet: Compounding Value; platform matrix; Top-10 slash commands; Telegram setup; memory L1-vs-L2 and session-search; what-is-a-tool, built-in tool catalog, tools-in-action, cron scheduling, delegation, kanban orchestration and OpenClaw topic slides); Lab 13 rebuilt as the multi-agent video team (profiles + kanban) with detailed Labs 11-14 guides; fade slide transitions and the live Achievements dashboard screenshot.</w:t>
             </w:r>
           </w:p>
         </w:tc>
@@ -865,9 +865,9 @@
           <w:color w:val="333333"/>
           <w:sz w:val="21"/>
         </w:rPr>
-        <w:t>Lab 13 — Build a Multi-Agent Workflow</w:t>
+        <w:t>Lab 13 — Build a Multi-Agent Video Team (Profiles + Kanban)</w:t>
         <w:tab/>
-        <w:t>18</w:t>
+        <w:t>19</w:t>
       </w:r>
     </w:p>
     <w:p>
@@ -887,7 +887,7 @@
         </w:rPr>
         <w:t>Lab 14 — Webhook</w:t>
         <w:tab/>
-        <w:t>18</w:t>
+        <w:t>21</w:t>
       </w:r>
     </w:p>
     <w:p>
@@ -906,7 +906,7 @@
         </w:rPr>
         <w:t>Topic 02 — OpenClaw — Automating a Business Back-Office  (33%)</w:t>
         <w:tab/>
-        <w:t>20</w:t>
+        <w:t>22</w:t>
       </w:r>
     </w:p>
     <w:p>
@@ -926,7 +926,7 @@
         </w:rPr>
         <w:t>Lab 15 — Install OpenClaw</w:t>
         <w:tab/>
-        <w:t>20</w:t>
+        <w:t>23</w:t>
       </w:r>
     </w:p>
     <w:p>
@@ -946,7 +946,7 @@
         </w:rPr>
         <w:t>Lab 16 — Models &amp; Providers</w:t>
         <w:tab/>
-        <w:t>22</w:t>
+        <w:t>24</w:t>
       </w:r>
     </w:p>
     <w:p>
@@ -966,7 +966,7 @@
         </w:rPr>
         <w:t>Lab 17 — Channels</w:t>
         <w:tab/>
-        <w:t>24</w:t>
+        <w:t>26</w:t>
       </w:r>
     </w:p>
     <w:p>
@@ -986,7 +986,7 @@
         </w:rPr>
         <w:t>Lab 18 — Skills</w:t>
         <w:tab/>
-        <w:t>25</w:t>
+        <w:t>28</w:t>
       </w:r>
     </w:p>
     <w:p>
@@ -1006,7 +1006,7 @@
         </w:rPr>
         <w:t>Lab 19 — Tools &amp; Integrations</w:t>
         <w:tab/>
-        <w:t>26</w:t>
+        <w:t>29</w:t>
       </w:r>
     </w:p>
     <w:p>
@@ -1026,7 +1026,7 @@
         </w:rPr>
         <w:t>Lab 20 — Commands</w:t>
         <w:tab/>
-        <w:t>28</w:t>
+        <w:t>30</w:t>
       </w:r>
     </w:p>
     <w:p>
@@ -1046,7 +1046,7 @@
         </w:rPr>
         <w:t>Lab 21 — Cron Jobs &amp; Heartbeat</w:t>
         <w:tab/>
-        <w:t>30</w:t>
+        <w:t>32</w:t>
       </w:r>
     </w:p>
     <w:p>
@@ -1066,7 +1066,7 @@
         </w:rPr>
         <w:t>Lab 22 — Memory &amp; Context</w:t>
         <w:tab/>
-        <w:t>32</w:t>
+        <w:t>34</w:t>
       </w:r>
     </w:p>
     <w:p>
@@ -1086,7 +1086,7 @@
         </w:rPr>
         <w:t>Lab 23 — Security</w:t>
         <w:tab/>
-        <w:t>33</w:t>
+        <w:t>36</w:t>
       </w:r>
     </w:p>
     <w:p>
@@ -1106,7 +1106,7 @@
         </w:rPr>
         <w:t>Lab 24 — Multi-Agent Workforce</w:t>
         <w:tab/>
-        <w:t>35</w:t>
+        <w:t>38</w:t>
       </w:r>
     </w:p>
     <w:p>
@@ -1126,7 +1126,7 @@
         </w:rPr>
         <w:t>Lab 25 — Dreaming — Idle Reflection &amp; Self-Improvement</w:t>
         <w:tab/>
-        <w:t>37</w:t>
+        <w:t>40</w:t>
       </w:r>
     </w:p>
     <w:p>
@@ -1146,7 +1146,7 @@
         </w:rPr>
         <w:t>Lab 26 — Use Cases &amp; Key Functions</w:t>
         <w:tab/>
-        <w:t>38</w:t>
+        <w:t>41</w:t>
       </w:r>
     </w:p>
     <w:p>
@@ -1165,7 +1165,7 @@
         </w:rPr>
         <w:t>Topic 03 — Paperclip — Running &amp; Governing a Company of AI Agents  (34%)</w:t>
         <w:tab/>
-        <w:t>39</w:t>
+        <w:t>42</w:t>
       </w:r>
     </w:p>
     <w:p>
@@ -1185,7 +1185,7 @@
         </w:rPr>
         <w:t>Lab 27 — Setup Paperclip</w:t>
         <w:tab/>
-        <w:t>40</w:t>
+        <w:t>43</w:t>
       </w:r>
     </w:p>
     <w:p>
@@ -1205,7 +1205,7 @@
         </w:rPr>
         <w:t>Lab 28 — Connect OpenAI Codex to Paperclip</w:t>
         <w:tab/>
-        <w:t>41</w:t>
+        <w:t>43</w:t>
       </w:r>
     </w:p>
     <w:p>
@@ -1225,7 +1225,7 @@
         </w:rPr>
         <w:t>Lab 29 — Configure Paperclip</w:t>
         <w:tab/>
-        <w:t>42</w:t>
+        <w:t>44</w:t>
       </w:r>
     </w:p>
     <w:p>
@@ -1245,7 +1245,7 @@
         </w:rPr>
         <w:t>Lab 30 — Track AI Tasks</w:t>
         <w:tab/>
-        <w:t>42</w:t>
+        <w:t>45</w:t>
       </w:r>
     </w:p>
     <w:p>
@@ -1265,7 +1265,7 @@
         </w:rPr>
         <w:t>Lab 31 — Automate AI Hiring</w:t>
         <w:tab/>
-        <w:t>43</w:t>
+        <w:t>46</w:t>
       </w:r>
     </w:p>
     <w:p>
@@ -1285,7 +1285,7 @@
         </w:rPr>
         <w:t>Lab 32 — Setup AI Agents</w:t>
         <w:tab/>
-        <w:t>44</w:t>
+        <w:t>47</w:t>
       </w:r>
     </w:p>
     <w:p>
@@ -1305,7 +1305,7 @@
         </w:rPr>
         <w:t>Lab 33 — Security</w:t>
         <w:tab/>
-        <w:t>45</w:t>
+        <w:t>48</w:t>
       </w:r>
     </w:p>
     <w:p>
@@ -1325,7 +1325,7 @@
         </w:rPr>
         <w:t>Lab 34 — Assign Task</w:t>
         <w:tab/>
-        <w:t>46</w:t>
+        <w:t>49</w:t>
       </w:r>
     </w:p>
     <w:p>
@@ -1344,7 +1344,7 @@
         </w:rPr>
         <w:t>Wrap-Up — The Agent Build Arc and Governance</w:t>
         <w:tab/>
-        <w:t>47</w:t>
+        <w:t>49</w:t>
       </w:r>
     </w:p>
     <w:p>
@@ -1363,7 +1363,7 @@
         </w:rPr>
         <w:t>Next Steps</w:t>
         <w:tab/>
-        <w:t>48</w:t>
+        <w:t>50</w:t>
       </w:r>
     </w:p>
     <w:p>
@@ -1382,7 +1382,7 @@
         </w:rPr>
         <w:t>Glossary</w:t>
         <w:tab/>
-        <w:t>48</w:t>
+        <w:t>51</w:t>
       </w:r>
     </w:p>
     <w:p>
@@ -3461,409 +3461,7 @@
         <w:t xml:space="preserve">1.  </w:t>
       </w:r>
       <w:r>
-        <w:t>Connect / set up the Hyperframe video tool for the agent Wire the Hyperframe tool into Athena so the agent can invoke it. &gt; This may be an MCP server, a skill, or a Tool Gateway integration depending on your build. Add Hyperframe the same way you added tools in Lab 6, supplying any required API key via hermes config set. Verify the exact integration path in the video / Hermes docs (https://hermes-agent.nousresearch.com/docs/).</w:t>
-      </w:r>
-    </w:p>
-    <w:p>
-      <w:pPr>
-        <w:spacing w:after="80"/>
-        <w:ind w:left="360"/>
-      </w:pPr>
-      <w:r>
-        <w:rPr>
-          <w:b/>
-        </w:rPr>
-        <w:t xml:space="preserve">2.  </w:t>
-      </w:r>
-      <w:r>
-        <w:t>Brief the agent with a short video concept Give Athena a clear, concise creative brief — topic, style, and length: &gt; Conversational step. For example: "Make a 30-second explainer video introducing 'Athena, my AI chief of staff'. Clean, modern style, upbeat tone, with on-screen captions." A tight brief yields a better first result.</w:t>
-      </w:r>
-    </w:p>
-    <w:p>
-      <w:pPr>
-        <w:spacing w:after="80"/>
-        <w:ind w:left="360"/>
-      </w:pPr>
-      <w:r>
-        <w:rPr>
-          <w:b/>
-        </w:rPr>
-        <w:t xml:space="preserve">3.  </w:t>
-      </w:r>
-      <w:r>
-        <w:t>Have the agent generate the video with Hyperframe Ask Athena to generate the video. The agent calls Hyperframe with your brief and waits for the render: &gt; Confirm the agent invokes Hyperframe and reports back with a link/file to the rendered video. Rendering may take a few minutes.</w:t>
-      </w:r>
-    </w:p>
-    <w:p>
-      <w:pPr>
-        <w:spacing w:after="80"/>
-        <w:ind w:left="360"/>
-      </w:pPr>
-      <w:r>
-        <w:rPr>
-          <w:b/>
-        </w:rPr>
-        <w:t xml:space="preserve">4.  </w:t>
-      </w:r>
-      <w:r>
-        <w:t>Review the output and refine the brief to regenerate if needed Play the video, then refine the brief (pacing, style, wording) and ask Athena to regenerate. Iterate until it meets your bar.</w:t>
-      </w:r>
-    </w:p>
-    <w:p>
-      <w:r>
-        <w:rPr>
-          <w:b/>
-          <w:color w:val="1F6FEB"/>
-          <w:sz w:val="22"/>
-        </w:rPr>
-        <w:t>Test it</w:t>
-      </w:r>
-    </w:p>
-    <w:p>
-      <w:r>
-        <w:t>The agent produces a playable video from your brief using Hyperframe.</w:t>
-      </w:r>
-    </w:p>
-    <w:p>
-      <w:r>
-        <w:rPr>
-          <w:b/>
-          <w:color w:val="1F6FEB"/>
-        </w:rPr>
-        <w:t xml:space="preserve">Note: </w:t>
-      </w:r>
-      <w:r>
-        <w:rPr>
-          <w:sz w:val="20"/>
-        </w:rPr>
-        <w:t>Full commands and screenshots are in labs/lab-11-*.md. Use only accounts, keys and hosts you own, and keep agents under human oversight.</w:t>
-      </w:r>
-    </w:p>
-    <w:p/>
-    <w:p>
-      <w:pPr>
-        <w:pStyle w:val="Heading2"/>
-      </w:pPr>
-      <w:r>
-        <w:t>Lab 12 — Visualization</w:t>
-      </w:r>
-    </w:p>
-    <w:p>
-      <w:r>
-        <w:t>Learning outcome: LO5: Visualize agent activity and workflow data..</w:t>
-      </w:r>
-    </w:p>
-    <w:p>
-      <w:r>
-        <w:t>Goal: Use Hermes' visualization capability to see the agent's workflow, task flow and data at a glance, making the agent's behaviour transparent and easier to supervise.</w:t>
-      </w:r>
-    </w:p>
-    <w:p>
-      <w:r>
-        <w:rPr>
-          <w:b/>
-          <w:color w:val="1F6FEB"/>
-          <w:sz w:val="22"/>
-        </w:rPr>
-        <w:t>What you'll build</w:t>
-      </w:r>
-    </w:p>
-    <w:p>
-      <w:r>
-        <w:t>A visualization of the agent's workflow / activity you can read and interpret.   (Tools: Hermes Agent, visualization.)</w:t>
-      </w:r>
-    </w:p>
-    <w:p>
-      <w:r>
-        <w:rPr>
-          <w:b/>
-          <w:color w:val="1F6FEB"/>
-          <w:sz w:val="22"/>
-        </w:rPr>
-        <w:t>Step-by-step</w:t>
-      </w:r>
-    </w:p>
-    <w:p>
-      <w:pPr>
-        <w:spacing w:after="80"/>
-        <w:ind w:left="360"/>
-      </w:pPr>
-      <w:r>
-        <w:rPr>
-          <w:b/>
-        </w:rPr>
-        <w:t xml:space="preserve">1.  </w:t>
-      </w:r>
-      <w:r>
-        <w:t>Open the visualization view for the agent's activity Open the visualization panel that shows Athena's activity. &gt; In the Desktop app, open the Visualization / Activity view. It surfaces the agent's task flow, tool calls, and data. Verify the exact location in the video / Hermes docs (https://hermes-agent.nousresearch.com/docs/).</w:t>
-      </w:r>
-    </w:p>
-    <w:p>
-      <w:pPr>
-        <w:spacing w:after="80"/>
-        <w:ind w:left="360"/>
-      </w:pPr>
-      <w:r>
-        <w:rPr>
-          <w:b/>
-        </w:rPr>
-        <w:t xml:space="preserve">2.  </w:t>
-      </w:r>
-      <w:r>
-        <w:t>Generate a visualization of a workflow or dataset Ask Athena to produce a visualization of a workflow or a dataset: &gt; Conversational step. For example: "Visualize the steps you took to produce this morning's briefing," or "Chart my task completion over the last week." The agent generates a diagram/chart of the workflow or data.</w:t>
-      </w:r>
-    </w:p>
-    <w:p>
-      <w:pPr>
-        <w:spacing w:after="80"/>
-        <w:ind w:left="360"/>
-      </w:pPr>
-      <w:r>
-        <w:rPr>
-          <w:b/>
-        </w:rPr>
-        <w:t xml:space="preserve">3.  </w:t>
-      </w:r>
-      <w:r>
-        <w:t>Interpret the visualization to understand what the agent did Read the visualization: which steps ran, in what order, which tools/subagents were involved, and where time was spent. Use it to confirm the agent did what you expected.</w:t>
-      </w:r>
-    </w:p>
-    <w:p>
-      <w:r>
-        <w:rPr>
-          <w:b/>
-          <w:color w:val="1F6FEB"/>
-          <w:sz w:val="22"/>
-        </w:rPr>
-        <w:t>Test it</w:t>
-      </w:r>
-    </w:p>
-    <w:p>
-      <w:r>
-        <w:t>A visualization of the agent's workflow/data renders and communicates the agent's activity.</w:t>
-      </w:r>
-    </w:p>
-    <w:p>
-      <w:r>
-        <w:rPr>
-          <w:b/>
-          <w:color w:val="1F6FEB"/>
-        </w:rPr>
-        <w:t xml:space="preserve">Note: </w:t>
-      </w:r>
-      <w:r>
-        <w:rPr>
-          <w:sz w:val="20"/>
-        </w:rPr>
-        <w:t>Full commands and screenshots are in labs/lab-12-*.md. Use only accounts, keys and hosts you own, and keep agents under human oversight.</w:t>
-      </w:r>
-    </w:p>
-    <w:p/>
-    <w:p>
-      <w:pPr>
-        <w:pStyle w:val="Heading2"/>
-      </w:pPr>
-      <w:r>
-        <w:t>Lab 13 — Build a Multi-Agent Workflow</w:t>
-      </w:r>
-    </w:p>
-    <w:p>
-      <w:r>
-        <w:t>Learning outcome: LO5: Compose multiple agents into a coordinated workflow..</w:t>
-      </w:r>
-    </w:p>
-    <w:p>
-      <w:r>
-        <w:t>Goal: Design a multi-agent workflow in which several agents take on distinct roles and hand off tasks to one another to complete a larger goal, building on the subagents and delegation concepts from earlier labs.</w:t>
-      </w:r>
-    </w:p>
-    <w:p>
-      <w:r>
-        <w:rPr>
-          <w:b/>
-          <w:color w:val="1F6FEB"/>
-          <w:sz w:val="22"/>
-        </w:rPr>
-        <w:t>What you'll build</w:t>
-      </w:r>
-    </w:p>
-    <w:p>
-      <w:r>
-        <w:t>A working multi-agent workflow where agents hand off tasks to complete a goal.   (Tools: Hermes Agent, subagents, workflow.)</w:t>
-      </w:r>
-    </w:p>
-    <w:p>
-      <w:r>
-        <w:rPr>
-          <w:b/>
-          <w:color w:val="1F6FEB"/>
-          <w:sz w:val="22"/>
-        </w:rPr>
-        <w:t>Step-by-step</w:t>
-      </w:r>
-    </w:p>
-    <w:p>
-      <w:pPr>
-        <w:spacing w:after="80"/>
-        <w:ind w:left="360"/>
-      </w:pPr>
-      <w:r>
-        <w:rPr>
-          <w:b/>
-        </w:rPr>
-        <w:t xml:space="preserve">1.  </w:t>
-      </w:r>
-      <w:r>
-        <w:t>Define the agents and their roles in the workflow Design the workflow by naming each agent and its distinct responsibility. &gt; Conversational/design step. For a chief-of-staff use case, define roles such as: Researcher (gathers facts), Writer (drafts content), Reviewer (checks quality), with Athena as coordinator. Write the roles down before wiring anything.</w:t>
-      </w:r>
-    </w:p>
-    <w:p>
-      <w:pPr>
-        <w:spacing w:after="80"/>
-        <w:ind w:left="360"/>
-      </w:pPr>
-      <w:r>
-        <w:rPr>
-          <w:b/>
-        </w:rPr>
-        <w:t xml:space="preserve">2.  </w:t>
-      </w:r>
-      <w:r>
-        <w:t>Connect the agents so outputs hand off between them Wire the agents so each one's output becomes the next one's input (Researcher → Writer → Reviewer). &gt; Use the subagent/delegation mechanism from Lab 8. Instruct Athena that the Researcher's findings feed the Writer, and the Writer's draft feeds the Reviewer. Verify the exact multi-agent wiring in the video / Hermes docs (https://hermes-agent.nousresearch.com/docs/).</w:t>
-      </w:r>
-    </w:p>
-    <w:p>
-      <w:pPr>
-        <w:spacing w:after="80"/>
-        <w:ind w:left="360"/>
-      </w:pPr>
-      <w:r>
-        <w:rPr>
-          <w:b/>
-        </w:rPr>
-        <w:t xml:space="preserve">3.  </w:t>
-      </w:r>
-      <w:r>
-        <w:t>Run the workflow end-to-end on a sample goal Give the workflow a real goal and run it start to finish: &gt; For example: "Produce a one-page competitor brief on the top 3 AI agent platforms." Watch Researcher → Writer → Reviewer hand off in sequence and produce the final brief.</w:t>
-      </w:r>
-    </w:p>
-    <w:p>
-      <w:pPr>
-        <w:spacing w:after="80"/>
-        <w:ind w:left="360"/>
-      </w:pPr>
-      <w:r>
-        <w:rPr>
-          <w:b/>
-        </w:rPr>
-        <w:t xml:space="preserve">4.  </w:t>
-      </w:r>
-      <w:r>
-        <w:t>Verify each stage completed and the final result is correct Check that every stage ran, each hand-off delivered usable input to the next, and the final output is coherent and correct.</w:t>
-      </w:r>
-    </w:p>
-    <w:p>
-      <w:r>
-        <w:rPr>
-          <w:b/>
-          <w:color w:val="1F6FEB"/>
-          <w:sz w:val="22"/>
-        </w:rPr>
-        <w:t>Test it</w:t>
-      </w:r>
-    </w:p>
-    <w:p>
-      <w:r>
-        <w:t>The multi-agent workflow runs end-to-end with each agent handing off to the next and producing the final result.</w:t>
-      </w:r>
-    </w:p>
-    <w:p>
-      <w:r>
-        <w:rPr>
-          <w:b/>
-          <w:color w:val="1F6FEB"/>
-        </w:rPr>
-        <w:t xml:space="preserve">Note: </w:t>
-      </w:r>
-      <w:r>
-        <w:rPr>
-          <w:sz w:val="20"/>
-        </w:rPr>
-        <w:t>Full commands and screenshots are in labs/lab-13-*.md. Use only accounts, keys and hosts you own, and keep agents under human oversight.</w:t>
-      </w:r>
-    </w:p>
-    <w:p/>
-    <w:p>
-      <w:pPr>
-        <w:pStyle w:val="Heading2"/>
-      </w:pPr>
-      <w:r>
-        <w:t>Lab 14 — Webhook</w:t>
-      </w:r>
-    </w:p>
-    <w:p>
-      <w:r>
-        <w:t>Learning outcome: LO3: Integrate the agent with external systems via webhooks..</w:t>
-      </w:r>
-    </w:p>
-    <w:p>
-      <w:r>
-        <w:t>Goal: Wire the agent to the outside world with webhooks: trigger the agent from an incoming webhook payload and/or have it call an outgoing webhook, then secure the endpoint.</w:t>
-      </w:r>
-    </w:p>
-    <w:p>
-      <w:r>
-        <w:rPr>
-          <w:b/>
-          <w:color w:val="1F6FEB"/>
-          <w:sz w:val="22"/>
-        </w:rPr>
-        <w:t>What you'll build</w:t>
-      </w:r>
-    </w:p>
-    <w:p>
-      <w:r>
-        <w:t>A webhook that triggers the agent (or that the agent calls), verified end-to-end.   (Tools: Hermes Agent, webhooks.)</w:t>
-      </w:r>
-    </w:p>
-    <w:p>
-      <w:r>
-        <w:rPr>
-          <w:b/>
-          <w:color w:val="1F6FEB"/>
-          <w:sz w:val="22"/>
-        </w:rPr>
-        <w:t>Step-by-step</w:t>
-      </w:r>
-    </w:p>
-    <w:p>
-      <w:pPr>
-        <w:spacing w:after="80"/>
-        <w:ind w:left="360"/>
-      </w:pPr>
-      <w:r>
-        <w:rPr>
-          <w:b/>
-        </w:rPr>
-        <w:t xml:space="preserve">1.  </w:t>
-      </w:r>
-      <w:r>
-        <w:t>Configure a webhook trigger/endpoint for the agent Set up a webhook endpoint that Athena listens on. &gt; Configure the webhook in the Hermes automation/integration settings (Desktop app or the webhook section of ~/.hermes/config.yaml), mapping an incoming URL to an agent action. The exact config keys and the endpoint URL are version-specific — verify in the video / Hermes docs (https://hermes-agent.nousresearch.com/docs/). Note the endpoint URL served by your local gateway (from hermes gateway status).</w:t>
-      </w:r>
-    </w:p>
-    <w:p>
-      <w:pPr>
-        <w:spacing w:after="80"/>
-        <w:ind w:left="360"/>
-      </w:pPr>
-      <w:r>
-        <w:rPr>
-          <w:b/>
-        </w:rPr>
-        <w:t xml:space="preserve">2.  </w:t>
-      </w:r>
-      <w:r>
-        <w:t>Send a test payload to the webhook Send a test HTTP POST to the endpoint to simulate an external event:</w:t>
+        <w:t>Install / verify the Hyperframe video skill Wire Hyperframe into Athena the same way you added skills in Lab 4. In a terminal, search the skills hub for the Hyperframe (video) skill and install the match; if your build integrates Hyperframe as an MCP server or Tool Gateway tool instead, add it the way you added tools in Lab 6.</w:t>
       </w:r>
     </w:p>
     <w:p>
@@ -3873,7 +3471,7 @@
           <w:color w:val="0B3060"/>
           <w:sz w:val="19"/>
         </w:rPr>
-        <w:t>curl -X POST &lt;your-webhook-endpoint-url&gt; \</w:t>
+        <w:t>hermes skills search hyperframe</w:t>
       </w:r>
     </w:p>
     <w:p>
@@ -3883,7 +3481,22 @@
           <w:color w:val="0B3060"/>
           <w:sz w:val="19"/>
         </w:rPr>
-        <w:t xml:space="preserve">  -H "Content-Type: application/json" \</w:t>
+        <w:t>hermes skills install &lt;owner/skills/hyperframe&gt;</w:t>
+      </w:r>
+    </w:p>
+    <w:p>
+      <w:pPr>
+        <w:spacing w:after="80"/>
+        <w:ind w:left="360"/>
+      </w:pPr>
+      <w:r>
+        <w:rPr>
+          <w:b/>
+        </w:rPr>
+        <w:t xml:space="preserve">2.  </w:t>
+      </w:r>
+      <w:r>
+        <w:t>Set the Hyperframe credential via config If Hyperframe needs an API key or account token, store it through Hermes config so it never sits in plain text. Get the key from your Hyperframe account page, then set it and confirm no error is printed.</w:t>
       </w:r>
     </w:p>
     <w:p>
@@ -3893,7 +3506,7 @@
           <w:color w:val="0B3060"/>
           <w:sz w:val="19"/>
         </w:rPr>
-        <w:t xml:space="preserve">  -d '{"event":"test","message":"Trigger Athena briefing"}'</w:t>
+        <w:t>hermes config set HYPERFRAME_API_KEY &lt;your-key&gt;</w:t>
       </w:r>
     </w:p>
     <w:p>
@@ -3908,7 +3521,27 @@
         <w:t xml:space="preserve">3.  </w:t>
       </w:r>
       <w:r>
-        <w:t>Confirm the agent receives the event and responds/acts Check that the incoming payload triggered Athena — e.g. it ran the mapped action (a briefing, a reply, a message to a channel). Confirm the action's output where you expect it (chat, channel, or logs).</w:t>
+        <w:t>Confirm the tool is loaded, then start a session Run the health check and confirm it reports green with the new skill/tool listed. Then open a chat session (TUI or Desktop app) and ask Athena "What video tools do you have?" — it should name Hyperframe in its reply. If it doesn't, restart Hermes so the new tool is picked up.</w:t>
+      </w:r>
+    </w:p>
+    <w:p>
+      <w:r>
+        <w:rPr>
+          <w:rFonts w:ascii="Consolas" w:hAnsi="Consolas"/>
+          <w:color w:val="0B3060"/>
+          <w:sz w:val="19"/>
+        </w:rPr>
+        <w:t>hermes doctor</w:t>
+      </w:r>
+    </w:p>
+    <w:p>
+      <w:r>
+        <w:rPr>
+          <w:rFonts w:ascii="Consolas" w:hAnsi="Consolas"/>
+          <w:color w:val="0B3060"/>
+          <w:sz w:val="19"/>
+        </w:rPr>
+        <w:t>hermes --tui</w:t>
       </w:r>
     </w:p>
     <w:p>
@@ -3923,7 +3556,62 @@
         <w:t xml:space="preserve">4.  </w:t>
       </w:r>
       <w:r>
-        <w:t>Secure the webhook (secret/token, allowlist) Lock the endpoint down so only authorized callers can trigger the agent: &gt; Add a shared secret/token that callers must include (e.g. an Authorization header or a signing secret), and/or an IP allowlist. Re-send the test with and without the secret to confirm unauthorized calls are rejected. Verify the exact security options in the video / docs link above.</w:t>
+        <w:t>Brief the agent with a concrete 3-sentence brief Type a tight, three-sentence creative brief covering topic, style/tone, and length + extras. A concrete brief is the single biggest lever on output quality — vague briefs produce generic videos. For example: &gt; "Make a 30-second explainer video introducing 'Athena, my AI chief of staff'. Clean, modern visual style with an upbeat tone. Keep it to 30 seconds and add on-screen captions."</w:t>
+      </w:r>
+    </w:p>
+    <w:p>
+      <w:pPr>
+        <w:spacing w:after="80"/>
+        <w:ind w:left="360"/>
+      </w:pPr>
+      <w:r>
+        <w:rPr>
+          <w:b/>
+        </w:rPr>
+        <w:t xml:space="preserve">5.  </w:t>
+      </w:r>
+      <w:r>
+        <w:t>Have the agent generate the video and wait for the render Ask Athena to generate the video now. You should see the agent invoke the Hyperframe tool in the session transcript (a tool-call entry), then wait — rendering typically takes a few minutes for a 30-second clip. When it finishes, Athena reports back with a link or file path to the rendered video; if the tool call errors, check the credential from step 3.</w:t>
+      </w:r>
+    </w:p>
+    <w:p>
+      <w:pPr>
+        <w:spacing w:after="80"/>
+        <w:ind w:left="360"/>
+      </w:pPr>
+      <w:r>
+        <w:rPr>
+          <w:b/>
+        </w:rPr>
+        <w:t xml:space="preserve">6.  </w:t>
+      </w:r>
+      <w:r>
+        <w:t>Play the result, give one round of feedback, and regenerate Open and play the video end-to-end. Then give Athena one specific round of feedback — change exactly the things that bothered you, e.g. "Slow the pacing, make the captions larger, and warm up the colour palette" — and ask it to regenerate. Compare the two versions; you should see your feedback reflected in version 2.</w:t>
+      </w:r>
+    </w:p>
+    <w:p>
+      <w:pPr>
+        <w:spacing w:after="80"/>
+        <w:ind w:left="360"/>
+      </w:pPr>
+      <w:r>
+        <w:rPr>
+          <w:b/>
+        </w:rPr>
+        <w:t xml:space="preserve">7.  </w:t>
+      </w:r>
+      <w:r>
+        <w:t>Export / save the final video and note where the file lands Ask Athena to save/export the final cut and tell you the exact file path. Outputs typically land in the session's workspace under your Hermes home directory — open it and confirm the file plays from disk:</w:t>
+      </w:r>
+    </w:p>
+    <w:p>
+      <w:r>
+        <w:rPr>
+          <w:rFonts w:ascii="Consolas" w:hAnsi="Consolas"/>
+          <w:color w:val="0B3060"/>
+          <w:sz w:val="19"/>
+        </w:rPr>
+        <w:t>open ~/.hermes/</w:t>
       </w:r>
     </w:p>
     <w:p>
@@ -3938,7 +3626,744 @@
     </w:p>
     <w:p>
       <w:r>
-        <w:t>A test payload to the webhook triggers the agent and produces the expected action, with the endpoint secured.</w:t>
+        <w:t>The agent produces a playable video from your brief using Hyperframe, and you can locate the saved file.</w:t>
+      </w:r>
+    </w:p>
+    <w:p>
+      <w:r>
+        <w:rPr>
+          <w:b/>
+          <w:color w:val="1F6FEB"/>
+        </w:rPr>
+        <w:t xml:space="preserve">Note: </w:t>
+      </w:r>
+      <w:r>
+        <w:rPr>
+          <w:sz w:val="20"/>
+        </w:rPr>
+        <w:t>Full commands and screenshots are in labs/lab-11-*.md. Use only accounts, keys and hosts you own, and keep agents under human oversight.</w:t>
+      </w:r>
+    </w:p>
+    <w:p/>
+    <w:p>
+      <w:pPr>
+        <w:pStyle w:val="Heading2"/>
+      </w:pPr>
+      <w:r>
+        <w:t>Lab 12 — Visualization</w:t>
+      </w:r>
+    </w:p>
+    <w:p>
+      <w:r>
+        <w:t>Learning outcome: LO5: Visualize agent activity and workflow data..</w:t>
+      </w:r>
+    </w:p>
+    <w:p>
+      <w:r>
+        <w:t>Goal: Use Hermes' visualization capability to see the agent's workflow, task flow and data at a glance, making the agent's behaviour transparent and easier to supervise.</w:t>
+      </w:r>
+    </w:p>
+    <w:p>
+      <w:r>
+        <w:rPr>
+          <w:b/>
+          <w:color w:val="1F6FEB"/>
+          <w:sz w:val="22"/>
+        </w:rPr>
+        <w:t>What you'll build</w:t>
+      </w:r>
+    </w:p>
+    <w:p>
+      <w:r>
+        <w:t>A visualization of the agent's workflow / activity you can read and interpret.   (Tools: Hermes Agent, visualization.)</w:t>
+      </w:r>
+    </w:p>
+    <w:p>
+      <w:r>
+        <w:rPr>
+          <w:b/>
+          <w:color w:val="1F6FEB"/>
+          <w:sz w:val="22"/>
+        </w:rPr>
+        <w:t>Step-by-step</w:t>
+      </w:r>
+    </w:p>
+    <w:p>
+      <w:pPr>
+        <w:spacing w:after="80"/>
+        <w:ind w:left="360"/>
+      </w:pPr>
+      <w:r>
+        <w:rPr>
+          <w:b/>
+        </w:rPr>
+        <w:t xml:space="preserve">1.  </w:t>
+      </w:r>
+      <w:r>
+        <w:t>Run a real multi-step session so there is something to visualize A visualization of an empty agent is empty. Start a fresh session and give Athena a task that forces several tool calls in sequence — for example: &gt; "Research the top 3 AI agent platforms, compare their pricing, and summarize in a table." Let it run to completion; the web searches, reads, and summarization steps it performs become the nodes of your graph.</w:t>
+      </w:r>
+    </w:p>
+    <w:p>
+      <w:pPr>
+        <w:spacing w:after="80"/>
+        <w:ind w:left="360"/>
+      </w:pPr>
+      <w:r>
+        <w:rPr>
+          <w:b/>
+        </w:rPr>
+        <w:t xml:space="preserve">2.  </w:t>
+      </w:r>
+      <w:r>
+        <w:t>List sessions and note the ID of the one to visualize In a terminal, list your recent sessions and copy the ID (or title/timestamp) of the session you just ran. You will visualize this specific session rather than "everything", which keeps the diagram readable.</w:t>
+      </w:r>
+    </w:p>
+    <w:p>
+      <w:r>
+        <w:rPr>
+          <w:rFonts w:ascii="Consolas" w:hAnsi="Consolas"/>
+          <w:color w:val="0B3060"/>
+          <w:sz w:val="19"/>
+        </w:rPr>
+        <w:t>hermes sessions list</w:t>
+      </w:r>
+    </w:p>
+    <w:p>
+      <w:pPr>
+        <w:spacing w:after="80"/>
+        <w:ind w:left="360"/>
+      </w:pPr>
+      <w:r>
+        <w:rPr>
+          <w:b/>
+        </w:rPr>
+        <w:t xml:space="preserve">3.  </w:t>
+      </w:r>
+      <w:r>
+        <w:t>Open the visualization view In the Desktop app, open the Visualization / Activity view from the sidebar and select the session from step 3. You should see the session's activity surface — task flow, tool calls, and timing. &gt; The exact menu location and view name are version-specific — verify in the video / Hermes docs (https://hermes-agent.nousresearch.com/docs/).</w:t>
+      </w:r>
+    </w:p>
+    <w:p>
+      <w:pPr>
+        <w:spacing w:after="80"/>
+        <w:ind w:left="360"/>
+      </w:pPr>
+      <w:r>
+        <w:rPr>
+          <w:b/>
+        </w:rPr>
+        <w:t xml:space="preserve">4.  </w:t>
+      </w:r>
+      <w:r>
+        <w:t>Generate a workflow graph of the session Ask Athena (or use the view's generate button) to render the session as a workflow diagram: &gt; "Visualize the steps you took in this session as a workflow diagram." A graph should render in which each node is a tool call (web search, file read, summarize…) and edges show the order the calls ran in. If nothing renders, confirm you selected a session that actually used tools.</w:t>
+      </w:r>
+    </w:p>
+    <w:p>
+      <w:pPr>
+        <w:spacing w:after="80"/>
+        <w:ind w:left="360"/>
+      </w:pPr>
+      <w:r>
+        <w:rPr>
+          <w:b/>
+        </w:rPr>
+        <w:t xml:space="preserve">5.  </w:t>
+      </w:r>
+      <w:r>
+        <w:t>Read the graph — nodes, sequence, and time Walk the diagram from start to finish and name what each node did: which tool, with what input, producing what output. Check the sequence matches what you asked for, and look for where time was spent (long-running nodes) or where the agent looped/retried. This is the supervision skill: confirming from the graph that the agent did what you expected — nothing more, nothing less.</w:t>
+      </w:r>
+    </w:p>
+    <w:p>
+      <w:pPr>
+        <w:spacing w:after="80"/>
+        <w:ind w:left="360"/>
+      </w:pPr>
+      <w:r>
+        <w:rPr>
+          <w:b/>
+        </w:rPr>
+        <w:t xml:space="preserve">6.  </w:t>
+      </w:r>
+      <w:r>
+        <w:t>Export or screenshot the visualization Save the diagram for your records — use the view's export button if your build has one, otherwise take a screenshot. Keep it with the lab evidence; you will reuse this technique whenever you need to audit an agent run.</w:t>
+      </w:r>
+    </w:p>
+    <w:p>
+      <w:pPr>
+        <w:spacing w:after="80"/>
+        <w:ind w:left="360"/>
+      </w:pPr>
+      <w:r>
+        <w:rPr>
+          <w:b/>
+        </w:rPr>
+        <w:t xml:space="preserve">7.  </w:t>
+      </w:r>
+      <w:r>
+        <w:t>Use the graph to explain what the agent did Turn to a classmate (or write three sentences) and explain the run using only the graph: what the goal was, which tools ran in what order, and where the result came from. If you can narrate the run from the diagram alone, the visualization has done its job of making Athena's behaviour transparent.</w:t>
+      </w:r>
+    </w:p>
+    <w:p>
+      <w:r>
+        <w:rPr>
+          <w:b/>
+          <w:color w:val="1F6FEB"/>
+          <w:sz w:val="22"/>
+        </w:rPr>
+        <w:t>Test it</w:t>
+      </w:r>
+    </w:p>
+    <w:p>
+      <w:r>
+        <w:t>A workflow visualization of a real session renders; you can name each node (tool call) and explain what the agent did.</w:t>
+      </w:r>
+    </w:p>
+    <w:p>
+      <w:r>
+        <w:rPr>
+          <w:b/>
+          <w:color w:val="1F6FEB"/>
+        </w:rPr>
+        <w:t xml:space="preserve">Note: </w:t>
+      </w:r>
+      <w:r>
+        <w:rPr>
+          <w:sz w:val="20"/>
+        </w:rPr>
+        <w:t>Full commands and screenshots are in labs/lab-12-*.md. Use only accounts, keys and hosts you own, and keep agents under human oversight.</w:t>
+      </w:r>
+    </w:p>
+    <w:p/>
+    <w:p>
+      <w:pPr>
+        <w:pStyle w:val="Heading2"/>
+      </w:pPr>
+      <w:r>
+        <w:t>Lab 13 — Build a Multi-Agent Video Team (Profiles + Kanban)</w:t>
+      </w:r>
+    </w:p>
+    <w:p>
+      <w:r>
+        <w:t>Learning outcome: LO3: Orchestrate a team of profiles through the Kanban board to produce a video..</w:t>
+      </w:r>
+    </w:p>
+    <w:p>
+      <w:r>
+        <w:t>Goal: Build a team of three Hermes profiles — a researcher (long-context model) that reads sources and writes the video brief, a scriptwriter (cheap model) that turns the brief into a narrated script, and a video_producer (code/tool model) that renders the video with TTS and slides — then create a Kanban board task, decompose it into child tasks, and let the orchestrator route each child task to the right profile by its description. The board is a durable SQLite database (~/.hermes/kanban.db) and each task gets its own workspace.</w:t>
+      </w:r>
+    </w:p>
+    <w:p>
+      <w:r>
+        <w:rPr>
+          <w:b/>
+          <w:color w:val="1F6FEB"/>
+          <w:sz w:val="22"/>
+        </w:rPr>
+        <w:t>What you'll build</w:t>
+      </w:r>
+    </w:p>
+    <w:p>
+      <w:r>
+        <w:t>A three-profile video team whose Kanban tasks flow triage -&gt; todo -&gt; ready -&gt; running -&gt; done and deliver a rendered video.   (Tools: Hermes Agent, profiles, Kanban board, dashboard.)</w:t>
+      </w:r>
+    </w:p>
+    <w:p>
+      <w:r>
+        <w:rPr>
+          <w:b/>
+          <w:color w:val="1F6FEB"/>
+          <w:sz w:val="22"/>
+        </w:rPr>
+        <w:t>Step-by-step</w:t>
+      </w:r>
+    </w:p>
+    <w:p>
+      <w:pPr>
+        <w:spacing w:after="80"/>
+        <w:ind w:left="360"/>
+      </w:pPr>
+      <w:r>
+        <w:rPr>
+          <w:b/>
+        </w:rPr>
+        <w:t xml:space="preserve">1.  </w:t>
+      </w:r>
+      <w:r>
+        <w:t>Design the team on paper first Before creating anything, write down the three roles, the kind of model each needs, and — most importantly — the one-line description the orchestrator will route by. The description is the routing contract: it must say exactly what the profile takes in and hands off. Note the pipeline shape: brief → script → video. Each profile's output is the next profile's input.</w:t>
+      </w:r>
+    </w:p>
+    <w:p>
+      <w:pPr>
+        <w:spacing w:after="80"/>
+        <w:ind w:left="360"/>
+      </w:pPr>
+      <w:r>
+        <w:rPr>
+          <w:b/>
+        </w:rPr>
+        <w:t xml:space="preserve">2.  </w:t>
+      </w:r>
+      <w:r>
+        <w:t>Create the researcher profile Create the first profile on a long-context model (it will read sources whole). The --description text is what the orchestrator matches child tasks against, so type it exactly as designed:</w:t>
+      </w:r>
+    </w:p>
+    <w:p>
+      <w:r>
+        <w:rPr>
+          <w:rFonts w:ascii="Consolas" w:hAnsi="Consolas"/>
+          <w:color w:val="0B3060"/>
+          <w:sz w:val="19"/>
+        </w:rPr>
+        <w:t>hermes profile create researcher --description "Reads sources, writes the video brief + key points"</w:t>
+      </w:r>
+    </w:p>
+    <w:p>
+      <w:pPr>
+        <w:spacing w:after="80"/>
+        <w:ind w:left="360"/>
+      </w:pPr>
+      <w:r>
+        <w:rPr>
+          <w:b/>
+        </w:rPr>
+        <w:t xml:space="preserve">3.  </w:t>
+      </w:r>
+      <w:r>
+        <w:t>Create the scriptwriter profile Create the second profile on a cheap model — turning a brief into a script is high-volume, low-difficulty work, so this is where you save money:</w:t>
+      </w:r>
+    </w:p>
+    <w:p>
+      <w:r>
+        <w:rPr>
+          <w:rFonts w:ascii="Consolas" w:hAnsi="Consolas"/>
+          <w:color w:val="0B3060"/>
+          <w:sz w:val="19"/>
+        </w:rPr>
+        <w:t>hermes profile create scriptwriter --description "Turns the brief into a narrated script + scene list"</w:t>
+      </w:r>
+    </w:p>
+    <w:p>
+      <w:pPr>
+        <w:spacing w:after="80"/>
+        <w:ind w:left="360"/>
+      </w:pPr>
+      <w:r>
+        <w:rPr>
+          <w:b/>
+        </w:rPr>
+        <w:t xml:space="preserve">4.  </w:t>
+      </w:r>
+      <w:r>
+        <w:t>Create the video_producer profile Create the third profile on a code/tool-capable model — it must drive TTS and slide-rendering tools reliably:</w:t>
+      </w:r>
+    </w:p>
+    <w:p>
+      <w:r>
+        <w:rPr>
+          <w:rFonts w:ascii="Consolas" w:hAnsi="Consolas"/>
+          <w:color w:val="0B3060"/>
+          <w:sz w:val="19"/>
+        </w:rPr>
+        <w:t>hermes profile create video_producer --description "Turns the script into a rendered video with TTS + slides"</w:t>
+      </w:r>
+    </w:p>
+    <w:p>
+      <w:pPr>
+        <w:spacing w:after="80"/>
+        <w:ind w:left="360"/>
+      </w:pPr>
+      <w:r>
+        <w:rPr>
+          <w:b/>
+        </w:rPr>
+        <w:t xml:space="preserve">5.  </w:t>
+      </w:r>
+      <w:r>
+        <w:t>Verify the team on the Profiles page Open the dashboard and go to the /profiles page in the sidebar. You should see all three profiles listed, each showing its model and its description. Read each description back critically — a vague description here causes wrong routing later. Fix any typos now (edit the profile or recreate it).</w:t>
+      </w:r>
+    </w:p>
+    <w:p>
+      <w:pPr>
+        <w:spacing w:after="80"/>
+        <w:ind w:left="360"/>
+      </w:pPr>
+      <w:r>
+        <w:rPr>
+          <w:b/>
+        </w:rPr>
+        <w:t xml:space="preserve">6.  </w:t>
+      </w:r>
+      <w:r>
+        <w:t>Create the Kanban board task Create the top-level task on the board and assign the first stage to the researcher. Pick a real topic you care about and keep the deliverable measurable ("60-second explainer video"):</w:t>
+      </w:r>
+    </w:p>
+    <w:p>
+      <w:r>
+        <w:rPr>
+          <w:rFonts w:ascii="Consolas" w:hAnsi="Consolas"/>
+          <w:color w:val="0B3060"/>
+          <w:sz w:val="19"/>
+        </w:rPr>
+        <w:t>hermes kanban create "Produce a 60-second explainer video on &lt;topic&gt;" --assignee researcher</w:t>
+      </w:r>
+    </w:p>
+    <w:p>
+      <w:pPr>
+        <w:spacing w:after="80"/>
+        <w:ind w:left="360"/>
+      </w:pPr>
+      <w:r>
+        <w:rPr>
+          <w:b/>
+        </w:rPr>
+        <w:t xml:space="preserve">7.  </w:t>
+      </w:r>
+      <w:r>
+        <w:t>Decompose the task into child tasks Ask Hermes to break the top-level task into child tasks:</w:t>
+      </w:r>
+    </w:p>
+    <w:p>
+      <w:r>
+        <w:rPr>
+          <w:rFonts w:ascii="Consolas" w:hAnsi="Consolas"/>
+          <w:color w:val="0B3060"/>
+          <w:sz w:val="19"/>
+        </w:rPr>
+        <w:t>hermes kanban decompose &lt;id&gt;</w:t>
+      </w:r>
+    </w:p>
+    <w:p>
+      <w:pPr>
+        <w:spacing w:after="80"/>
+        <w:ind w:left="360"/>
+      </w:pPr>
+      <w:r>
+        <w:rPr>
+          <w:b/>
+        </w:rPr>
+        <w:t xml:space="preserve">8.  </w:t>
+      </w:r>
+      <w:r>
+        <w:t>Watch the lanes as the team works Open the dashboard /kanban page and watch the board dispatch. Every task moves through the lifecycle triage → todo → ready → running → blocked → done → archived. The research child should enter running first (it runs on the researcher profile's model), then hand off so the script task becomes ready, and so on down the pipeline. A task sitting in blocked is asking for a human — open it and read why.</w:t>
+      </w:r>
+    </w:p>
+    <w:p>
+      <w:pPr>
+        <w:spacing w:after="80"/>
+        <w:ind w:left="360"/>
+      </w:pPr>
+      <w:r>
+        <w:rPr>
+          <w:b/>
+        </w:rPr>
+        <w:t xml:space="preserve">9.  </w:t>
+      </w:r>
+      <w:r>
+        <w:t>Review each task's workspace deliverables Click into each completed child task. Every task gets its own workspace (a scratch directory / dedicated dir / git worktree, depending on configuration) where its outputs live. Open the researcher task's workspace and read the brief; open the scriptwriter's and read the script + scene list; open the video_producer's and play the rendered video. Confirm each stage's output actually fed the next — the script should quote the brief's key points, and the video should follow the scene list.</w:t>
+      </w:r>
+    </w:p>
+    <w:p>
+      <w:pPr>
+        <w:spacing w:after="80"/>
+        <w:ind w:left="360"/>
+      </w:pPr>
+      <w:r>
+        <w:rPr>
+          <w:b/>
+        </w:rPr>
+        <w:t xml:space="preserve">10.  </w:t>
+      </w:r>
+      <w:r>
+        <w:t>Accept the final video to done If the video meets the brief, accept the top-level task so it moves to done (and later archived). If it doesn't, add a comment on the relevant child task with concrete feedback (e.g. "narration too fast in scene 2") and send that task back through the board rather than redoing everything — that is the point of decomposed work.</w:t>
+      </w:r>
+    </w:p>
+    <w:p>
+      <w:pPr>
+        <w:spacing w:after="80"/>
+        <w:ind w:left="360"/>
+      </w:pPr>
+      <w:r>
+        <w:rPr>
+          <w:b/>
+        </w:rPr>
+        <w:t xml:space="preserve">11.  </w:t>
+      </w:r>
+      <w:r>
+        <w:t>Reflect: why this beats one big agent Look back at the run: the expensive long-context model only did research, the cheap model wrote the script, and the tool model rendered. One prompt to a single agent would have used the expensive model for everything. Note one sentence on cost and one on reviewability (you could inspect and reject per stage).</w:t>
+      </w:r>
+    </w:p>
+    <w:p>
+      <w:r>
+        <w:rPr>
+          <w:b/>
+          <w:color w:val="1F6FEB"/>
+          <w:sz w:val="22"/>
+        </w:rPr>
+        <w:t>Test it</w:t>
+      </w:r>
+    </w:p>
+    <w:p>
+      <w:r>
+        <w:t>Three profiles exist, the decomposed Kanban tasks route to the right profile by description, and the accepted board delivers a rendered video.</w:t>
+      </w:r>
+    </w:p>
+    <w:p>
+      <w:r>
+        <w:rPr>
+          <w:b/>
+          <w:color w:val="1F6FEB"/>
+        </w:rPr>
+        <w:t xml:space="preserve">Note: </w:t>
+      </w:r>
+      <w:r>
+        <w:rPr>
+          <w:sz w:val="20"/>
+        </w:rPr>
+        <w:t>Full commands and screenshots are in labs/lab-13-*.md. Use only accounts, keys and hosts you own, and keep agents under human oversight.</w:t>
+      </w:r>
+    </w:p>
+    <w:p/>
+    <w:p>
+      <w:pPr>
+        <w:pStyle w:val="Heading2"/>
+      </w:pPr>
+      <w:r>
+        <w:t>Lab 14 — Webhook</w:t>
+      </w:r>
+    </w:p>
+    <w:p>
+      <w:r>
+        <w:t>Learning outcome: LO3: Integrate the agent with external systems via webhooks..</w:t>
+      </w:r>
+    </w:p>
+    <w:p>
+      <w:r>
+        <w:t>Goal: Wire the agent to the outside world with webhooks: trigger the agent from an incoming webhook payload and/or have it call an outgoing webhook, then secure the endpoint.</w:t>
+      </w:r>
+    </w:p>
+    <w:p>
+      <w:r>
+        <w:rPr>
+          <w:b/>
+          <w:color w:val="1F6FEB"/>
+          <w:sz w:val="22"/>
+        </w:rPr>
+        <w:t>What you'll build</w:t>
+      </w:r>
+    </w:p>
+    <w:p>
+      <w:r>
+        <w:t>A webhook that triggers the agent (or that the agent calls), verified end-to-end.   (Tools: Hermes Agent, webhooks.)</w:t>
+      </w:r>
+    </w:p>
+    <w:p>
+      <w:r>
+        <w:rPr>
+          <w:b/>
+          <w:color w:val="1F6FEB"/>
+          <w:sz w:val="22"/>
+        </w:rPr>
+        <w:t>Step-by-step</w:t>
+      </w:r>
+    </w:p>
+    <w:p>
+      <w:pPr>
+        <w:spacing w:after="80"/>
+        <w:ind w:left="360"/>
+      </w:pPr>
+      <w:r>
+        <w:rPr>
+          <w:b/>
+        </w:rPr>
+        <w:t xml:space="preserve">1.  </w:t>
+      </w:r>
+      <w:r>
+        <w:t>Confirm the local gateway is serving Webhooks ride on the local gateway — if it isn't up, nothing can receive a request. Check its status and note the host/port it reports (typically localhost plus a port); that host/port is the base of your webhook URL.</w:t>
+      </w:r>
+    </w:p>
+    <w:p>
+      <w:r>
+        <w:rPr>
+          <w:rFonts w:ascii="Consolas" w:hAnsi="Consolas"/>
+          <w:color w:val="0B3060"/>
+          <w:sz w:val="19"/>
+        </w:rPr>
+        <w:t>hermes gateway status</w:t>
+      </w:r>
+    </w:p>
+    <w:p>
+      <w:pPr>
+        <w:spacing w:after="80"/>
+        <w:ind w:left="360"/>
+      </w:pPr>
+      <w:r>
+        <w:rPr>
+          <w:b/>
+        </w:rPr>
+        <w:t xml:space="preserve">2.  </w:t>
+      </w:r>
+      <w:r>
+        <w:t>Create / enable a webhook endpoint on the dashboard Open the dashboard and click Webhooks (/webhooks) in the sidebar. Click New webhook (or the enable toggle), give it a recognizable name like briefing-trigger, and save. The dashboard generates a unique endpoint URL for it. &gt; The exact page layout and creation flow are version-specific — verify in the video / Hermes docs (https://hermes-agent.nousresearch.com/docs/).</w:t>
+      </w:r>
+    </w:p>
+    <w:p>
+      <w:pPr>
+        <w:spacing w:after="80"/>
+        <w:ind w:left="360"/>
+      </w:pPr>
+      <w:r>
+        <w:rPr>
+          <w:b/>
+        </w:rPr>
+        <w:t xml:space="preserve">3.  </w:t>
+      </w:r>
+      <w:r>
+        <w:t>Copy the endpoint URL and map it to an agent action Use the copy button next to the new webhook to copy its full URL, and paste it somewhere handy. Then set what the webhook does: map incoming payloads to an agent action — for this lab, have it run a short briefing (e.g. instruction: "When this webhook fires, read the payload's message field and act on it"). Without a mapping, a payload is accepted but nothing happens.</w:t>
+      </w:r>
+    </w:p>
+    <w:p>
+      <w:pPr>
+        <w:spacing w:after="80"/>
+        <w:ind w:left="360"/>
+      </w:pPr>
+      <w:r>
+        <w:rPr>
+          <w:b/>
+        </w:rPr>
+        <w:t xml:space="preserve">4.  </w:t>
+      </w:r>
+      <w:r>
+        <w:t>Send a test payload with curl From a terminal, simulate an external system by POSTing a JSON payload to the endpoint. Replace &lt;endpoint-url&gt; with the URL you copied in step 4:</w:t>
+      </w:r>
+    </w:p>
+    <w:p>
+      <w:r>
+        <w:rPr>
+          <w:rFonts w:ascii="Consolas" w:hAnsi="Consolas"/>
+          <w:color w:val="0B3060"/>
+          <w:sz w:val="19"/>
+        </w:rPr>
+        <w:t>curl -X POST &lt;endpoint-url&gt; \</w:t>
+      </w:r>
+    </w:p>
+    <w:p>
+      <w:r>
+        <w:rPr>
+          <w:rFonts w:ascii="Consolas" w:hAnsi="Consolas"/>
+          <w:color w:val="0B3060"/>
+          <w:sz w:val="19"/>
+        </w:rPr>
+        <w:t xml:space="preserve">  -H "Content-Type: application/json" \</w:t>
+      </w:r>
+    </w:p>
+    <w:p>
+      <w:r>
+        <w:rPr>
+          <w:rFonts w:ascii="Consolas" w:hAnsi="Consolas"/>
+          <w:color w:val="0B3060"/>
+          <w:sz w:val="19"/>
+        </w:rPr>
+        <w:t xml:space="preserve">  -d '{"event":"test","message":"Trigger Athena briefing"}'</w:t>
+      </w:r>
+    </w:p>
+    <w:p>
+      <w:pPr>
+        <w:spacing w:after="80"/>
+        <w:ind w:left="360"/>
+      </w:pPr>
+      <w:r>
+        <w:rPr>
+          <w:b/>
+        </w:rPr>
+        <w:t xml:space="preserve">5.  </w:t>
+      </w:r>
+      <w:r>
+        <w:t>Watch the agent react Switch to the chat/session view (or the logs) and confirm the payload actually triggered Athena: the mapped action runs and its output appears — e.g. a briefing message referencing "Trigger Athena briefing" from your payload. Also check the webhook's row on the /webhooks page; most builds show a delivery/last-triggered indicator. Accepted-but-no-action means the mapping in step 4 isn't wired — fix it and re-send.</w:t>
+      </w:r>
+    </w:p>
+    <w:p>
+      <w:pPr>
+        <w:spacing w:after="80"/>
+        <w:ind w:left="360"/>
+      </w:pPr>
+      <w:r>
+        <w:rPr>
+          <w:b/>
+        </w:rPr>
+        <w:t xml:space="preserve">6.  </w:t>
+      </w:r>
+      <w:r>
+        <w:t>Secure the endpoint, then re-send with the secret An open webhook lets anyone on the network drive your agent, so lock it down. On the webhook's settings, add a shared secret/token (and an IP allowlist if your build offers one), save, and re-send the test including the secret header — it should still return 2xx and trigger the agent:</w:t>
+      </w:r>
+    </w:p>
+    <w:p>
+      <w:r>
+        <w:rPr>
+          <w:rFonts w:ascii="Consolas" w:hAnsi="Consolas"/>
+          <w:color w:val="0B3060"/>
+          <w:sz w:val="19"/>
+        </w:rPr>
+        <w:t>curl -X POST &lt;endpoint-url&gt; \</w:t>
+      </w:r>
+    </w:p>
+    <w:p>
+      <w:r>
+        <w:rPr>
+          <w:rFonts w:ascii="Consolas" w:hAnsi="Consolas"/>
+          <w:color w:val="0B3060"/>
+          <w:sz w:val="19"/>
+        </w:rPr>
+        <w:t xml:space="preserve">  -H "Authorization: Bearer &lt;secret&gt;" \</w:t>
+      </w:r>
+    </w:p>
+    <w:p>
+      <w:r>
+        <w:rPr>
+          <w:rFonts w:ascii="Consolas" w:hAnsi="Consolas"/>
+          <w:color w:val="0B3060"/>
+          <w:sz w:val="19"/>
+        </w:rPr>
+        <w:t xml:space="preserve">  -H "Content-Type: application/json" \</w:t>
+      </w:r>
+    </w:p>
+    <w:p>
+      <w:r>
+        <w:rPr>
+          <w:rFonts w:ascii="Consolas" w:hAnsi="Consolas"/>
+          <w:color w:val="0B3060"/>
+          <w:sz w:val="19"/>
+        </w:rPr>
+        <w:t xml:space="preserve">  -d '{"event":"test","message":"Trigger Athena briefing"}'</w:t>
+      </w:r>
+    </w:p>
+    <w:p>
+      <w:pPr>
+        <w:spacing w:after="80"/>
+        <w:ind w:left="360"/>
+      </w:pPr>
+      <w:r>
+        <w:rPr>
+          <w:b/>
+        </w:rPr>
+        <w:t xml:space="preserve">7.  </w:t>
+      </w:r>
+      <w:r>
+        <w:t>Confirm unauthorized calls are rejected Re-run the step 5 curl (the one without the secret header). It must now be rejected with 401/403, and Athena must not act. If it still returns 2xx, the secret isn't enforced — re-check the webhook's security settings and save again. You now have a working, secured inbound integration.</w:t>
+      </w:r>
+    </w:p>
+    <w:p>
+      <w:r>
+        <w:rPr>
+          <w:b/>
+          <w:color w:val="1F6FEB"/>
+          <w:sz w:val="22"/>
+        </w:rPr>
+        <w:t>Test it</w:t>
+      </w:r>
+    </w:p>
+    <w:p>
+      <w:r>
+        <w:t>A test payload to the webhook triggers the agent's mapped action, and calls without the secret are rejected.</w:t>
       </w:r>
     </w:p>
     <w:p>

</xml_diff>

<commit_message>
feat: Lab 10 security masterclass slides, LMS portal screenshot, Practice Exam slide (v1.4)
- 8 dark masterclass security slides for Lab 10: defense-in-depth layers, six-check
  default-deny gateway trust chain, channel lockdown dials, three approval modes +
  Tirith scanner, live Dangerous-Command approval, YOLO mode, unrecoverable
  blocklist floor, prompt-injection scanning of context files
- Lab 10 steps expanded (channel allowlist + approvals.mode manual) in the
  README/LG/LP; dark_rows warn chip now auto-widens so badges never clip
- Download Course Material is now a live lms-tms portal screenshot; Practice Exam
  slide (exams.tertiaryinfotech.com) added before the end Assessment block
- v1.3 archived; v1.4 with Document Version Control Record entries

Co-Authored-By: Claude Fable 5 <noreply@anthropic.com>
</commit_message>
<xml_diff>
--- a/courseware/LG-Human-AI Workforce with Autonomous AI Agents.docx
+++ b/courseware/LG-Human-AI Workforce with Autonomous AI Agents.docx
@@ -179,7 +179,7 @@
           <w:color w:val="1F6FEB"/>
           <w:sz w:val="24"/>
         </w:rPr>
-        <w:t>Version 1.3</w:t>
+        <w:t>Version 1.4</w:t>
       </w:r>
     </w:p>
     <w:p>
@@ -515,6 +515,64 @@
           </w:p>
         </w:tc>
       </w:tr>
+      <w:tr>
+        <w:tc>
+          <w:tcPr>
+            <w:tcW w:type="dxa" w:w="2160"/>
+          </w:tcPr>
+          <w:p>
+            <w:r/>
+            <w:r>
+              <w:rPr>
+                <w:sz w:val="19"/>
+              </w:rPr>
+              <w:t>1.4</w:t>
+            </w:r>
+          </w:p>
+        </w:tc>
+        <w:tc>
+          <w:tcPr>
+            <w:tcW w:type="dxa" w:w="2160"/>
+          </w:tcPr>
+          <w:p>
+            <w:r/>
+            <w:r>
+              <w:rPr>
+                <w:sz w:val="19"/>
+              </w:rPr>
+              <w:t>15 July 2026</w:t>
+            </w:r>
+          </w:p>
+        </w:tc>
+        <w:tc>
+          <w:tcPr>
+            <w:tcW w:type="dxa" w:w="2160"/>
+          </w:tcPr>
+          <w:p>
+            <w:r/>
+            <w:r>
+              <w:rPr>
+                <w:sz w:val="19"/>
+              </w:rPr>
+              <w:t>Security masterclass slides added to the Hermes Security lab (defense-in-depth layers; the gateway's six-check default-deny trust chain; channel lockdown dials; the three approval modes + the Tirith scanner; a live Dangerous-Command approval; YOLO mode; the unrecoverable-command blocklist floor; prompt-injection scanning of context files). Security lab steps expanded with the channel allowlist and approvals.mode.</w:t>
+            </w:r>
+          </w:p>
+        </w:tc>
+        <w:tc>
+          <w:tcPr>
+            <w:tcW w:type="dxa" w:w="2160"/>
+          </w:tcPr>
+          <w:p>
+            <w:r/>
+            <w:r>
+              <w:rPr>
+                <w:sz w:val="19"/>
+              </w:rPr>
+              <w:t>Dr. Alfred Ang</w:t>
+            </w:r>
+          </w:p>
+        </w:tc>
+      </w:tr>
     </w:tbl>
     <w:p>
       <w:r>
@@ -550,7 +608,7 @@
         </w:rPr>
         <w:t>Introduction</w:t>
         <w:tab/>
-        <w:t>5</w:t>
+        <w:t>6</w:t>
       </w:r>
     </w:p>
     <w:p>
@@ -569,7 +627,7 @@
         </w:rPr>
         <w:t>Course Learning Outcomes</w:t>
         <w:tab/>
-        <w:t>5</w:t>
+        <w:t>6</w:t>
       </w:r>
     </w:p>
     <w:p>
@@ -588,7 +646,7 @@
         </w:rPr>
         <w:t>Before You Start — Environment Setup</w:t>
         <w:tab/>
-        <w:t>5</w:t>
+        <w:t>6</w:t>
       </w:r>
     </w:p>
     <w:p>
@@ -607,7 +665,7 @@
         </w:rPr>
         <w:t>Topic 01 — Hermes Agent — Your Autonomous Personal Chief-of-Staff  (33%)</w:t>
         <w:tab/>
-        <w:t>6</w:t>
+        <w:t>7</w:t>
       </w:r>
     </w:p>
     <w:p>
@@ -627,7 +685,7 @@
         </w:rPr>
         <w:t>Lab 1 — Install and Setup Hermes</w:t>
         <w:tab/>
-        <w:t>7</w:t>
+        <w:t>8</w:t>
       </w:r>
     </w:p>
     <w:p>
@@ -647,7 +705,7 @@
         </w:rPr>
         <w:t>Lab 2 — Deployment — Local Install &amp; Hermes Desktop App</w:t>
         <w:tab/>
-        <w:t>8</w:t>
+        <w:t>9</w:t>
       </w:r>
     </w:p>
     <w:p>
@@ -667,7 +725,7 @@
         </w:rPr>
         <w:t>Lab 3 — Memory and Plugins</w:t>
         <w:tab/>
-        <w:t>9</w:t>
+        <w:t>10</w:t>
       </w:r>
     </w:p>
     <w:p>
@@ -687,7 +745,7 @@
         </w:rPr>
         <w:t>Lab 4 — Skills</w:t>
         <w:tab/>
-        <w:t>10</w:t>
+        <w:t>11</w:t>
       </w:r>
     </w:p>
     <w:p>
@@ -707,7 +765,7 @@
         </w:rPr>
         <w:t>Lab 5 — Providers &amp; Model</w:t>
         <w:tab/>
-        <w:t>11</w:t>
+        <w:t>12</w:t>
       </w:r>
     </w:p>
     <w:p>
@@ -727,7 +785,7 @@
         </w:rPr>
         <w:t>Lab 6 — MCP and Tools</w:t>
         <w:tab/>
-        <w:t>11</w:t>
+        <w:t>12</w:t>
       </w:r>
     </w:p>
     <w:p>
@@ -747,7 +805,7 @@
         </w:rPr>
         <w:t>Lab 7 — Cron Jobs &amp; Automation</w:t>
         <w:tab/>
-        <w:t>12</w:t>
+        <w:t>13</w:t>
       </w:r>
     </w:p>
     <w:p>
@@ -767,7 +825,7 @@
         </w:rPr>
         <w:t>Lab 8 — Subagents &amp; Delegation</w:t>
         <w:tab/>
-        <w:t>13</w:t>
+        <w:t>14</w:t>
       </w:r>
     </w:p>
     <w:p>
@@ -787,7 +845,7 @@
         </w:rPr>
         <w:t>Lab 9 — Profile and Kanban</w:t>
         <w:tab/>
-        <w:t>14</w:t>
+        <w:t>15</w:t>
       </w:r>
     </w:p>
     <w:p>
@@ -807,7 +865,7 @@
         </w:rPr>
         <w:t>Lab 10 — Security</w:t>
         <w:tab/>
-        <w:t>15</w:t>
+        <w:t>16</w:t>
       </w:r>
     </w:p>
     <w:p>
@@ -827,7 +885,7 @@
         </w:rPr>
         <w:t>Lab 11 — Use Case — Make a Video with Hyperframe</w:t>
         <w:tab/>
-        <w:t>16</w:t>
+        <w:t>17</w:t>
       </w:r>
     </w:p>
     <w:p>
@@ -847,7 +905,7 @@
         </w:rPr>
         <w:t>Lab 12 — Visualization</w:t>
         <w:tab/>
-        <w:t>17</w:t>
+        <w:t>19</w:t>
       </w:r>
     </w:p>
     <w:p>
@@ -867,7 +925,7 @@
         </w:rPr>
         <w:t>Lab 13 — Build a Multi-Agent Video Team (Profiles + Kanban)</w:t>
         <w:tab/>
-        <w:t>19</w:t>
+        <w:t>20</w:t>
       </w:r>
     </w:p>
     <w:p>
@@ -887,7 +945,7 @@
         </w:rPr>
         <w:t>Lab 14 — Webhook</w:t>
         <w:tab/>
-        <w:t>21</w:t>
+        <w:t>22</w:t>
       </w:r>
     </w:p>
     <w:p>
@@ -906,7 +964,7 @@
         </w:rPr>
         <w:t>Topic 02 — OpenClaw — Automating a Business Back-Office  (33%)</w:t>
         <w:tab/>
-        <w:t>22</w:t>
+        <w:t>24</w:t>
       </w:r>
     </w:p>
     <w:p>
@@ -926,7 +984,7 @@
         </w:rPr>
         <w:t>Lab 15 — Install OpenClaw</w:t>
         <w:tab/>
-        <w:t>23</w:t>
+        <w:t>24</w:t>
       </w:r>
     </w:p>
     <w:p>
@@ -946,7 +1004,7 @@
         </w:rPr>
         <w:t>Lab 16 — Models &amp; Providers</w:t>
         <w:tab/>
-        <w:t>24</w:t>
+        <w:t>26</w:t>
       </w:r>
     </w:p>
     <w:p>
@@ -966,7 +1024,7 @@
         </w:rPr>
         <w:t>Lab 17 — Channels</w:t>
         <w:tab/>
-        <w:t>26</w:t>
+        <w:t>28</w:t>
       </w:r>
     </w:p>
     <w:p>
@@ -986,7 +1044,7 @@
         </w:rPr>
         <w:t>Lab 18 — Skills</w:t>
         <w:tab/>
-        <w:t>28</w:t>
+        <w:t>29</w:t>
       </w:r>
     </w:p>
     <w:p>
@@ -1006,7 +1064,7 @@
         </w:rPr>
         <w:t>Lab 19 — Tools &amp; Integrations</w:t>
         <w:tab/>
-        <w:t>29</w:t>
+        <w:t>30</w:t>
       </w:r>
     </w:p>
     <w:p>
@@ -1026,7 +1084,7 @@
         </w:rPr>
         <w:t>Lab 20 — Commands</w:t>
         <w:tab/>
-        <w:t>30</w:t>
+        <w:t>32</w:t>
       </w:r>
     </w:p>
     <w:p>
@@ -1046,7 +1104,7 @@
         </w:rPr>
         <w:t>Lab 21 — Cron Jobs &amp; Heartbeat</w:t>
         <w:tab/>
-        <w:t>32</w:t>
+        <w:t>34</w:t>
       </w:r>
     </w:p>
     <w:p>
@@ -1066,7 +1124,7 @@
         </w:rPr>
         <w:t>Lab 22 — Memory &amp; Context</w:t>
         <w:tab/>
-        <w:t>34</w:t>
+        <w:t>36</w:t>
       </w:r>
     </w:p>
     <w:p>
@@ -1086,7 +1144,7 @@
         </w:rPr>
         <w:t>Lab 23 — Security</w:t>
         <w:tab/>
-        <w:t>36</w:t>
+        <w:t>37</w:t>
       </w:r>
     </w:p>
     <w:p>
@@ -1106,7 +1164,7 @@
         </w:rPr>
         <w:t>Lab 24 — Multi-Agent Workforce</w:t>
         <w:tab/>
-        <w:t>38</w:t>
+        <w:t>39</w:t>
       </w:r>
     </w:p>
     <w:p>
@@ -1126,7 +1184,7 @@
         </w:rPr>
         <w:t>Lab 25 — Dreaming — Idle Reflection &amp; Self-Improvement</w:t>
         <w:tab/>
-        <w:t>40</w:t>
+        <w:t>41</w:t>
       </w:r>
     </w:p>
     <w:p>
@@ -1146,7 +1204,7 @@
         </w:rPr>
         <w:t>Lab 26 — Use Cases &amp; Key Functions</w:t>
         <w:tab/>
-        <w:t>41</w:t>
+        <w:t>42</w:t>
       </w:r>
     </w:p>
     <w:p>
@@ -1165,7 +1223,7 @@
         </w:rPr>
         <w:t>Topic 03 — Paperclip — Running &amp; Governing a Company of AI Agents  (34%)</w:t>
         <w:tab/>
-        <w:t>42</w:t>
+        <w:t>43</w:t>
       </w:r>
     </w:p>
     <w:p>
@@ -1185,7 +1243,7 @@
         </w:rPr>
         <w:t>Lab 27 — Setup Paperclip</w:t>
         <w:tab/>
-        <w:t>43</w:t>
+        <w:t>44</w:t>
       </w:r>
     </w:p>
     <w:p>
@@ -1205,7 +1263,7 @@
         </w:rPr>
         <w:t>Lab 28 — Connect OpenAI Codex to Paperclip</w:t>
         <w:tab/>
-        <w:t>43</w:t>
+        <w:t>45</w:t>
       </w:r>
     </w:p>
     <w:p>
@@ -1225,7 +1283,7 @@
         </w:rPr>
         <w:t>Lab 29 — Configure Paperclip</w:t>
         <w:tab/>
-        <w:t>44</w:t>
+        <w:t>46</w:t>
       </w:r>
     </w:p>
     <w:p>
@@ -1245,7 +1303,7 @@
         </w:rPr>
         <w:t>Lab 30 — Track AI Tasks</w:t>
         <w:tab/>
-        <w:t>45</w:t>
+        <w:t>46</w:t>
       </w:r>
     </w:p>
     <w:p>
@@ -1265,7 +1323,7 @@
         </w:rPr>
         <w:t>Lab 31 — Automate AI Hiring</w:t>
         <w:tab/>
-        <w:t>46</w:t>
+        <w:t>47</w:t>
       </w:r>
     </w:p>
     <w:p>
@@ -1285,7 +1343,7 @@
         </w:rPr>
         <w:t>Lab 32 — Setup AI Agents</w:t>
         <w:tab/>
-        <w:t>47</w:t>
+        <w:t>48</w:t>
       </w:r>
     </w:p>
     <w:p>
@@ -1305,7 +1363,7 @@
         </w:rPr>
         <w:t>Lab 33 — Security</w:t>
         <w:tab/>
-        <w:t>48</w:t>
+        <w:t>49</w:t>
       </w:r>
     </w:p>
     <w:p>
@@ -1325,7 +1383,7 @@
         </w:rPr>
         <w:t>Lab 34 — Assign Task</w:t>
         <w:tab/>
-        <w:t>49</w:t>
+        <w:t>50</w:t>
       </w:r>
     </w:p>
     <w:p>
@@ -1344,7 +1402,7 @@
         </w:rPr>
         <w:t>Wrap-Up — The Agent Build Arc and Governance</w:t>
         <w:tab/>
-        <w:t>49</w:t>
+        <w:t>51</w:t>
       </w:r>
     </w:p>
     <w:p>
@@ -1363,7 +1421,7 @@
         </w:rPr>
         <w:t>Next Steps</w:t>
         <w:tab/>
-        <w:t>50</w:t>
+        <w:t>52</w:t>
       </w:r>
     </w:p>
     <w:p>
@@ -1382,7 +1440,7 @@
         </w:rPr>
         <w:t>Glossary</w:t>
         <w:tab/>
-        <w:t>51</w:t>
+        <w:t>52</w:t>
       </w:r>
     </w:p>
     <w:p>
@@ -3267,7 +3325,7 @@
     </w:p>
     <w:p>
       <w:r>
-        <w:t>Goal: Harden Athena: run risky work in an isolated terminal backend, manage secrets safely, and require approval before sensitive actions — applying least privilege throughout.</w:t>
+        <w:t>Goal: Harden Athena with defense in depth: restrict who can message the agent (default deny), run risky work in an isolated terminal backend, manage secrets safely, and require approval before sensitive actions — applying least privilege throughout.</w:t>
       </w:r>
     </w:p>
     <w:p>
@@ -3282,7 +3340,7 @@
     </w:p>
     <w:p>
       <w:r>
-        <w:t>A hardened agent that sandboxes execution, protects secrets and prompts for approval on risky actions.   (Tools: Hermes Agent, terminal backends, secrets management.)</w:t>
+        <w:t>A hardened agent that allowlists its users, sandboxes execution, protects secrets and prompts for approval on risky actions.   (Tools: Hermes Agent, gateway allowlists, terminal backends, secrets management.)</w:t>
       </w:r>
     </w:p>
     <w:p>
@@ -3305,6 +3363,21 @@
           <w:b/>
         </w:rPr>
         <w:t xml:space="preserve">1.  </w:t>
+      </w:r>
+      <w:r>
+        <w:t>Restrict who can message the agent — set the channel allowlist (default deny) Decide who is allowed to talk to Athena. The gateway authorizes every inbound message with a six-check chain — per-platform allow-all, DM pairing, the platform allowlist, the global allowlist, global allow-all, then default deny. Nothing configured means everyone is denied (fails closed), with a startup warning telling you exactly that. In the dashboard open Channels → Configure for your channel (e.g. Telegram) and set the allowlist to your own user ID: - Allowed user IDs (TELEGRAM_ALLOWED_USERS) — comma-separated IDs that may use the bot (get yours from @userinfobot). - Allow all users (TELEGRAM_ALLOW_ALL_USERS) — leave off; it opens the bot to anyone (dev only). - Unknown DMs can also be admitted one-by-one via pairing codes you approve.</w:t>
+      </w:r>
+    </w:p>
+    <w:p>
+      <w:pPr>
+        <w:spacing w:after="80"/>
+        <w:ind w:left="360"/>
+      </w:pPr>
+      <w:r>
+        <w:rPr>
+          <w:b/>
+        </w:rPr>
+        <w:t xml:space="preserve">2.  </w:t>
       </w:r>
       <w:r>
         <w:t>Isolate execution in a sandboxed backend Set the terminal backend to a sandboxed container so risky commands never run directly on your host:</w:t>
@@ -3329,7 +3402,7 @@
         <w:rPr>
           <w:b/>
         </w:rPr>
-        <w:t xml:space="preserve">2.  </w:t>
+        <w:t xml:space="preserve">3.  </w:t>
       </w:r>
       <w:r>
         <w:t>Store provider/tool secrets via config rather than plain text Store API keys through the Hermes config mechanism instead of pasting them into prompts or scripts:</w:t>
@@ -3354,10 +3427,20 @@
         <w:rPr>
           <w:b/>
         </w:rPr>
-        <w:t xml:space="preserve">3.  </w:t>
-      </w:r>
-      <w:r>
-        <w:t>Require approval before the agent runs risky actions Enable approval prompts so the agent pauses and asks you before executing sensitive actions (shell commands, file deletions, external posts):</w:t>
+        <w:t xml:space="preserve">4.  </w:t>
+      </w:r>
+      <w:r>
+        <w:t>Require approval before the agent runs risky actions — set the approval mode Set the approval mode so the agent pauses and asks you before executing sensitive actions (shell commands, file deletions, external posts):</w:t>
+      </w:r>
+    </w:p>
+    <w:p>
+      <w:r>
+        <w:rPr>
+          <w:rFonts w:ascii="Consolas" w:hAnsi="Consolas"/>
+          <w:color w:val="0B3060"/>
+          <w:sz w:val="19"/>
+        </w:rPr>
+        <w:t>hermes config set approvals.mode manual</w:t>
       </w:r>
     </w:p>
     <w:p>
@@ -3369,7 +3452,7 @@
         <w:rPr>
           <w:b/>
         </w:rPr>
-        <w:t xml:space="preserve">4.  </w:t>
+        <w:t xml:space="preserve">5.  </w:t>
       </w:r>
       <w:r>
         <w:t>Apply least privilege — grant only the tools/skills the task needs Review the tools, skills, and MCP servers Athena has access to and disable anything not needed for the current work. &gt; Conversational/config step: trim the enabled skills (Lab 4) and MCP servers (Lab 6) to the minimum. Least privilege means the agent can only do what the task actually requires.</w:t>
@@ -3387,7 +3470,7 @@
     </w:p>
     <w:p>
       <w:r>
-        <w:t>Risky actions run only in the sandbox and only after approval; secrets are not stored in plain text.</w:t>
+        <w:t>Only allowlisted users reach the agent; risky actions run in the sandbox and only after approval; secrets are not stored in plain text.</w:t>
       </w:r>
     </w:p>
     <w:p>

</xml_diff>

<commit_message>
feat: import 16 OpenClaw masterclass diagrams into Topic 2 (v1.5)
- Framed figure slides from the original Mastering OpenClaw deck: OS control
  plane + deployment (Lab 15), hub-and-spoke gateway (17), tools-vs-skills +
  SKILL-on-demand (18), 6-phase execution loop + exec (19), HEARTBEAT +
  autonomic tick (21), workspace persistence + context assembly + compaction
  (22), defense methods + poisoned-skill anatomy (23), sessions_spawn +
  sub-agent routing (24)
- shot() now scales any image aspect and shrinks long captions so they never
  wrap onto the footer
- v1.4 archived; v1.5 with Document Version Control Record entries

Co-Authored-By: Claude Fable 5 <noreply@anthropic.com>
</commit_message>
<xml_diff>
--- a/courseware/LG-Human-AI Workforce with Autonomous AI Agents.docx
+++ b/courseware/LG-Human-AI Workforce with Autonomous AI Agents.docx
@@ -179,7 +179,7 @@
           <w:color w:val="1F6FEB"/>
           <w:sz w:val="24"/>
         </w:rPr>
-        <w:t>Version 1.4</w:t>
+        <w:t>Version 1.5</w:t>
       </w:r>
     </w:p>
     <w:p>
@@ -555,6 +555,64 @@
                 <w:sz w:val="19"/>
               </w:rPr>
               <w:t>Security masterclass slides added to the Hermes Security lab (defense-in-depth layers; the gateway's six-check default-deny trust chain; channel lockdown dials; the three approval modes + the Tirith scanner; a live Dangerous-Command approval; YOLO mode; the unrecoverable-command blocklist floor; prompt-injection scanning of context files). Security lab steps expanded with the channel allowlist and approvals.mode.</w:t>
+            </w:r>
+          </w:p>
+        </w:tc>
+        <w:tc>
+          <w:tcPr>
+            <w:tcW w:type="dxa" w:w="2160"/>
+          </w:tcPr>
+          <w:p>
+            <w:r/>
+            <w:r>
+              <w:rPr>
+                <w:sz w:val="19"/>
+              </w:rPr>
+              <w:t>Dr. Alfred Ang</w:t>
+            </w:r>
+          </w:p>
+        </w:tc>
+      </w:tr>
+      <w:tr>
+        <w:tc>
+          <w:tcPr>
+            <w:tcW w:type="dxa" w:w="2160"/>
+          </w:tcPr>
+          <w:p>
+            <w:r/>
+            <w:r>
+              <w:rPr>
+                <w:sz w:val="19"/>
+              </w:rPr>
+              <w:t>1.5</w:t>
+            </w:r>
+          </w:p>
+        </w:tc>
+        <w:tc>
+          <w:tcPr>
+            <w:tcW w:type="dxa" w:w="2160"/>
+          </w:tcPr>
+          <w:p>
+            <w:r/>
+            <w:r>
+              <w:rPr>
+                <w:sz w:val="19"/>
+              </w:rPr>
+              <w:t>15 July 2026</w:t>
+            </w:r>
+          </w:p>
+        </w:tc>
+        <w:tc>
+          <w:tcPr>
+            <w:tcW w:type="dxa" w:w="2160"/>
+          </w:tcPr>
+          <w:p>
+            <w:r/>
+            <w:r>
+              <w:rPr>
+                <w:sz w:val="19"/>
+              </w:rPr>
+              <w:t>Sixteen concept diagrams imported from the original Mastering OpenClaw masterclass deck into Topic 2 (OpenClaw OS control plane; deployment; hub-and-spoke gateway; tools vs skills; SKILL-on-demand; 6-phase execution loop; exec; HEARTBEAT + autonomic tick; workspace file persistence; context assembly; compaction; defense methods; poisoned-skill anatomy; sessions_spawn; sub-agent routing).</w:t>
             </w:r>
           </w:p>
         </w:tc>

</xml_diff>

<commit_message>
feat: Paperclip topic rebuilt as Tertiary AI News Research (Labs 27-32), NL prompt steps, platform logos (v1.6)
- Topic 3 now a 6-lab AI-news-research company: install on Windows & Mac;
  company, CEO & mission; model adaptors (Claude Code / Codex / Gemini CLI);
  detailed task backlog whose core task hires the team; Tavily Search API via
  Secrets + TAVILY_API_KEY env binding; hiring members behind Board approval
  gates — with 9 live dashboard screenshots (labs 33-34 retired; 32 labs total)
- Natural-language prompt steps added beside the CLI in Hermes labs 4/6/7/8/13
  and OpenClaw labs 18/19/21/24 (deck + LG + lab READMEs)
- Three platform logos on the Three Platforms page (Hermes, OpenClaw, Paperclip)
- Lab READMEs 27-32 rewritten and folders renamed; labs index updated
- LP Day-2 schedule reworked for the 6-lab topic; v1.5 archived

Co-Authored-By: Claude Fable 5 <noreply@anthropic.com>
</commit_message>
<xml_diff>
--- a/courseware/LG-Human-AI Workforce with Autonomous AI Agents.docx
+++ b/courseware/LG-Human-AI Workforce with Autonomous AI Agents.docx
@@ -179,7 +179,7 @@
           <w:color w:val="1F6FEB"/>
           <w:sz w:val="24"/>
         </w:rPr>
-        <w:t>Version 1.5</w:t>
+        <w:t>Version 1.6</w:t>
       </w:r>
     </w:p>
     <w:p>
@@ -631,6 +631,64 @@
           </w:p>
         </w:tc>
       </w:tr>
+      <w:tr>
+        <w:tc>
+          <w:tcPr>
+            <w:tcW w:type="dxa" w:w="2160"/>
+          </w:tcPr>
+          <w:p>
+            <w:r/>
+            <w:r>
+              <w:rPr>
+                <w:sz w:val="19"/>
+              </w:rPr>
+              <w:t>1.6</w:t>
+            </w:r>
+          </w:p>
+        </w:tc>
+        <w:tc>
+          <w:tcPr>
+            <w:tcW w:type="dxa" w:w="2160"/>
+          </w:tcPr>
+          <w:p>
+            <w:r/>
+            <w:r>
+              <w:rPr>
+                <w:sz w:val="19"/>
+              </w:rPr>
+              <w:t>15 July 2026</w:t>
+            </w:r>
+          </w:p>
+        </w:tc>
+        <w:tc>
+          <w:tcPr>
+            <w:tcW w:type="dxa" w:w="2160"/>
+          </w:tcPr>
+          <w:p>
+            <w:r/>
+            <w:r>
+              <w:rPr>
+                <w:sz w:val="19"/>
+              </w:rPr>
+              <w:t>Topic 3 (Paperclip) rebuilt as the 'Tertiary AI News Research' company across 6 labs (27-32): install on Windows &amp; Mac; company, CEO &amp; mission; model adaptors; a detailed task backlog whose core task hires the team; the Tavily Search API via Secrets; and hiring the members under the hiring task — with live dashboard screenshots. Natural-language prompt steps added to the Hermes and OpenClaw labs alongside the CLI. Platform logos added to the Three Platforms page. 32 labs total.</w:t>
+            </w:r>
+          </w:p>
+        </w:tc>
+        <w:tc>
+          <w:tcPr>
+            <w:tcW w:type="dxa" w:w="2160"/>
+          </w:tcPr>
+          <w:p>
+            <w:r/>
+            <w:r>
+              <w:rPr>
+                <w:sz w:val="19"/>
+              </w:rPr>
+              <w:t>Dr. Alfred Ang</w:t>
+            </w:r>
+          </w:p>
+        </w:tc>
+      </w:tr>
     </w:tbl>
     <w:p>
       <w:r>
@@ -863,7 +921,7 @@
         </w:rPr>
         <w:t>Lab 7 — Cron Jobs &amp; Automation</w:t>
         <w:tab/>
-        <w:t>13</w:t>
+        <w:t>14</w:t>
       </w:r>
     </w:p>
     <w:p>
@@ -1122,7 +1180,7 @@
         </w:rPr>
         <w:t>Lab 19 — Tools &amp; Integrations</w:t>
         <w:tab/>
-        <w:t>30</w:t>
+        <w:t>31</w:t>
       </w:r>
     </w:p>
     <w:p>
@@ -1202,7 +1260,7 @@
         </w:rPr>
         <w:t>Lab 23 — Security</w:t>
         <w:tab/>
-        <w:t>37</w:t>
+        <w:t>38</w:t>
       </w:r>
     </w:p>
     <w:p>
@@ -1242,7 +1300,7 @@
         </w:rPr>
         <w:t>Lab 25 — Dreaming — Idle Reflection &amp; Self-Improvement</w:t>
         <w:tab/>
-        <w:t>41</w:t>
+        <w:t>42</w:t>
       </w:r>
     </w:p>
     <w:p>
@@ -1262,7 +1320,7 @@
         </w:rPr>
         <w:t>Lab 26 — Use Cases &amp; Key Functions</w:t>
         <w:tab/>
-        <w:t>42</w:t>
+        <w:t>43</w:t>
       </w:r>
     </w:p>
     <w:p>
@@ -1281,7 +1339,7 @@
         </w:rPr>
         <w:t>Topic 03 — Paperclip — Running &amp; Governing a Company of AI Agents  (34%)</w:t>
         <w:tab/>
-        <w:t>43</w:t>
+        <w:t>44</w:t>
       </w:r>
     </w:p>
     <w:p>
@@ -1299,7 +1357,7 @@
           <w:color w:val="333333"/>
           <w:sz w:val="21"/>
         </w:rPr>
-        <w:t>Lab 27 — Setup Paperclip</w:t>
+        <w:t>Lab 27 — Install Paperclip on Windows &amp; Mac</w:t>
         <w:tab/>
         <w:t>44</w:t>
       </w:r>
@@ -1319,7 +1377,7 @@
           <w:color w:val="333333"/>
           <w:sz w:val="21"/>
         </w:rPr>
-        <w:t>Lab 28 — Connect OpenAI Codex to Paperclip</w:t>
+        <w:t>Lab 28 — Setup Company, CEO &amp; Mission</w:t>
         <w:tab/>
         <w:t>45</w:t>
       </w:r>
@@ -1339,7 +1397,7 @@
           <w:color w:val="333333"/>
           <w:sz w:val="21"/>
         </w:rPr>
-        <w:t>Lab 29 — Configure Paperclip</w:t>
+        <w:t>Lab 29 — Setup Adaptor</w:t>
         <w:tab/>
         <w:t>46</w:t>
       </w:r>
@@ -1359,9 +1417,9 @@
           <w:color w:val="333333"/>
           <w:sz w:val="21"/>
         </w:rPr>
-        <w:t>Lab 30 — Track AI Tasks</w:t>
+        <w:t>Lab 30 — Create the Task Backlog</w:t>
         <w:tab/>
-        <w:t>46</w:t>
+        <w:t>47</w:t>
       </w:r>
     </w:p>
     <w:p>
@@ -1379,9 +1437,9 @@
           <w:color w:val="333333"/>
           <w:sz w:val="21"/>
         </w:rPr>
-        <w:t>Lab 31 — Automate AI Hiring</w:t>
+        <w:t>Lab 31 — Add the Tavily Search API</w:t>
         <w:tab/>
-        <w:t>47</w:t>
+        <w:t>49</w:t>
       </w:r>
     </w:p>
     <w:p>
@@ -1399,9 +1457,9 @@
           <w:color w:val="333333"/>
           <w:sz w:val="21"/>
         </w:rPr>
-        <w:t>Lab 32 — Setup AI Agents</w:t>
+        <w:t>Lab 32 — Hire the Members Under the Hiring Task</w:t>
         <w:tab/>
-        <w:t>48</w:t>
+        <w:t>50</w:t>
       </w:r>
     </w:p>
     <w:p>
@@ -1410,18 +1468,17 @@
           <w:tab w:pos="9072" w:val="right" w:leader="dot"/>
         </w:tabs>
         <w:spacing w:after="60"/>
-        <w:ind w:left="432"/>
       </w:pPr>
       <w:r>
         <w:rPr>
           <w:rFonts w:ascii="Arial" w:hAnsi="Arial"/>
-          <w:b w:val="0"/>
+          <w:b/>
           <w:color w:val="333333"/>
-          <w:sz w:val="21"/>
-        </w:rPr>
-        <w:t>Lab 33 — Security</w:t>
+          <w:sz w:val="22"/>
+        </w:rPr>
+        <w:t>Wrap-Up — The Agent Build Arc and Governance</w:t>
         <w:tab/>
-        <w:t>49</w:t>
+        <w:t>51</w:t>
       </w:r>
     </w:p>
     <w:p>
@@ -1430,18 +1487,17 @@
           <w:tab w:pos="9072" w:val="right" w:leader="dot"/>
         </w:tabs>
         <w:spacing w:after="60"/>
-        <w:ind w:left="432"/>
       </w:pPr>
       <w:r>
         <w:rPr>
           <w:rFonts w:ascii="Arial" w:hAnsi="Arial"/>
-          <w:b w:val="0"/>
+          <w:b/>
           <w:color w:val="333333"/>
-          <w:sz w:val="21"/>
-        </w:rPr>
-        <w:t>Lab 34 — Assign Task</w:t>
+          <w:sz w:val="22"/>
+        </w:rPr>
+        <w:t>Next Steps</w:t>
         <w:tab/>
-        <w:t>50</w:t>
+        <w:t>52</w:t>
       </w:r>
     </w:p>
     <w:p>
@@ -1458,44 +1514,6 @@
           <w:color w:val="333333"/>
           <w:sz w:val="22"/>
         </w:rPr>
-        <w:t>Wrap-Up — The Agent Build Arc and Governance</w:t>
-        <w:tab/>
-        <w:t>51</w:t>
-      </w:r>
-    </w:p>
-    <w:p>
-      <w:pPr>
-        <w:tabs>
-          <w:tab w:pos="9072" w:val="right" w:leader="dot"/>
-        </w:tabs>
-        <w:spacing w:after="60"/>
-      </w:pPr>
-      <w:r>
-        <w:rPr>
-          <w:rFonts w:ascii="Arial" w:hAnsi="Arial"/>
-          <w:b/>
-          <w:color w:val="333333"/>
-          <w:sz w:val="22"/>
-        </w:rPr>
-        <w:t>Next Steps</w:t>
-        <w:tab/>
-        <w:t>52</w:t>
-      </w:r>
-    </w:p>
-    <w:p>
-      <w:pPr>
-        <w:tabs>
-          <w:tab w:pos="9072" w:val="right" w:leader="dot"/>
-        </w:tabs>
-        <w:spacing w:after="60"/>
-      </w:pPr>
-      <w:r>
-        <w:rPr>
-          <w:rFonts w:ascii="Arial" w:hAnsi="Arial"/>
-          <w:b/>
-          <w:color w:val="333333"/>
-          <w:sz w:val="22"/>
-        </w:rPr>
         <w:t>Glossary</w:t>
         <w:tab/>
         <w:t>52</w:t>
@@ -2538,6 +2556,21 @@
       </w:r>
     </w:p>
     <w:p>
+      <w:pPr>
+        <w:spacing w:after="80"/>
+        <w:ind w:left="360"/>
+      </w:pPr>
+      <w:r>
+        <w:rPr>
+          <w:b/>
+        </w:rPr>
+        <w:t xml:space="preserve">5.  </w:t>
+      </w:r>
+      <w:r>
+        <w:t>The natural-language way You can skip the CLI entirely and simply ask the agent: "Learn the slide-deck skill from agentskills.io and confirm it is installed".</w:t>
+      </w:r>
+    </w:p>
+    <w:p>
       <w:r>
         <w:rPr>
           <w:b/>
@@ -2916,6 +2949,21 @@
       </w:r>
     </w:p>
     <w:p>
+      <w:pPr>
+        <w:spacing w:after="80"/>
+        <w:ind w:left="360"/>
+      </w:pPr>
+      <w:r>
+        <w:rPr>
+          <w:b/>
+        </w:rPr>
+        <w:t xml:space="preserve">5.  </w:t>
+      </w:r>
+      <w:r>
+        <w:t>The natural-language way You can skip the CLI entirely and simply ask the agent: "Add the GitHub MCP server to your tools and list what it can do".</w:t>
+      </w:r>
+    </w:p>
+    <w:p>
       <w:r>
         <w:rPr>
           <w:b/>
@@ -3060,6 +3108,21 @@
       </w:r>
     </w:p>
     <w:p>
+      <w:pPr>
+        <w:spacing w:after="80"/>
+        <w:ind w:left="360"/>
+      </w:pPr>
+      <w:r>
+        <w:rPr>
+          <w:b/>
+        </w:rPr>
+        <w:t xml:space="preserve">5.  </w:t>
+      </w:r>
+      <w:r>
+        <w:t>The natural-language way You can skip the CLI entirely and simply ask the agent: "Every weekday at 8am, summarize the top AI news and send it to me on Telegram" — the agent schedules itself with its cronjob tool.</w:t>
+      </w:r>
+    </w:p>
+    <w:p>
       <w:r>
         <w:rPr>
           <w:b/>
@@ -3204,6 +3267,21 @@
       </w:r>
     </w:p>
     <w:p>
+      <w:pPr>
+        <w:spacing w:after="80"/>
+        <w:ind w:left="360"/>
+      </w:pPr>
+      <w:r>
+        <w:rPr>
+          <w:b/>
+        </w:rPr>
+        <w:t xml:space="preserve">5.  </w:t>
+      </w:r>
+      <w:r>
+        <w:t>The natural-language way You can skip the CLI entirely and simply ask the agent: "Delegate three subagents to research MiniMax, Kimi and DeepSeek in parallel, then merge the findings".</w:t>
+      </w:r>
+    </w:p>
+    <w:p>
       <w:r>
         <w:rPr>
           <w:b/>
@@ -4234,6 +4312,21 @@
       </w:r>
     </w:p>
     <w:p>
+      <w:pPr>
+        <w:spacing w:after="80"/>
+        <w:ind w:left="360"/>
+      </w:pPr>
+      <w:r>
+        <w:rPr>
+          <w:b/>
+        </w:rPr>
+        <w:t xml:space="preserve">12.  </w:t>
+      </w:r>
+      <w:r>
+        <w:t>The natural-language way You can skip the CLI entirely and simply ask the agent: "Create a crew of profiles — researcher, scriptwriter, video producer — then decompose this board task and route each piece to the right profile".</w:t>
+      </w:r>
+    </w:p>
+    <w:p>
       <w:r>
         <w:rPr>
           <w:b/>
@@ -5942,6 +6035,21 @@
       </w:r>
     </w:p>
     <w:p>
+      <w:pPr>
+        <w:spacing w:after="80"/>
+        <w:ind w:left="360"/>
+      </w:pPr>
+      <w:r>
+        <w:rPr>
+          <w:b/>
+        </w:rPr>
+        <w:t xml:space="preserve">8.  </w:t>
+      </w:r>
+      <w:r>
+        <w:t>The natural-language way You can skip the CLI entirely and simply ask the agent: "Install the github skill from ClawHub and show me what it can do".</w:t>
+      </w:r>
+    </w:p>
+    <w:p>
       <w:r>
         <w:rPr>
           <w:b/>
@@ -6276,6 +6384,21 @@
       </w:r>
     </w:p>
     <w:p>
+      <w:pPr>
+        <w:spacing w:after="80"/>
+        <w:ind w:left="360"/>
+      </w:pPr>
+      <w:r>
+        <w:rPr>
+          <w:b/>
+        </w:rPr>
+        <w:t xml:space="preserve">9.  </w:t>
+      </w:r>
+      <w:r>
+        <w:t>The natural-language way You can skip the CLI entirely and simply ask the agent: "Use the browser to pull today's top three AI headlines and save them to headlines.md".</w:t>
+      </w:r>
+    </w:p>
+    <w:p>
       <w:r>
         <w:rPr>
           <w:b/>
@@ -7253,6 +7376,21 @@
       </w:r>
     </w:p>
     <w:p>
+      <w:pPr>
+        <w:spacing w:after="80"/>
+        <w:ind w:left="360"/>
+      </w:pPr>
+      <w:r>
+        <w:rPr>
+          <w:b/>
+        </w:rPr>
+        <w:t xml:space="preserve">9.  </w:t>
+      </w:r>
+      <w:r>
+        <w:t>The natural-language way You can skip the CLI entirely and simply ask the agent: "Add a heartbeat task: every 30 minutes, check my inbox and flag anything urgent".</w:t>
+      </w:r>
+    </w:p>
+    <w:p>
       <w:r>
         <w:rPr>
           <w:b/>
@@ -8351,6 +8489,21 @@
       </w:r>
     </w:p>
     <w:p>
+      <w:pPr>
+        <w:spacing w:after="80"/>
+        <w:ind w:left="360"/>
+      </w:pPr>
+      <w:r>
+        <w:rPr>
+          <w:b/>
+        </w:rPr>
+        <w:t xml:space="preserve">8.  </w:t>
+      </w:r>
+      <w:r>
+        <w:t>The natural-language way You can skip the CLI entirely and simply ask the agent: "Spawn two sub-agents to research our top two competitors in parallel, then compare their pricing".</w:t>
+      </w:r>
+    </w:p>
+    <w:p>
       <w:r>
         <w:rPr>
           <w:b/>
@@ -8704,7 +8857,7 @@
     </w:p>
     <w:p>
       <w:r>
-        <w:t>Setup · Connect OpenAI Codex · Configure · Track Tasks · Automate Hiring · Setup Agents · Security · Assign Tasks</w:t>
+        <w:t>Install (Windows &amp; Mac) · Company, CEO &amp; Mission · Adaptors · Task Backlog · Tavily Search API · Hire the Team</w:t>
       </w:r>
     </w:p>
     <w:p>
@@ -8722,7 +8875,7 @@
         <w:pStyle w:val="ListBullet"/>
       </w:pPr>
       <w:r>
-        <w:t>Paperclip is an operating system for a company of AI agents, self-hosted with Docker Compose; you are the Board, a CEO agent reports to you, and specialists report to the CEO.</w:t>
+        <w:t>Paperclip is an operating system for a company of AI agents, self-hosted with Docker Compose on Windows (WSL2) or macOS; you are the Board, a CEO agent reports to you, and specialists report to the CEO.</w:t>
       </w:r>
     </w:p>
     <w:p>
@@ -8730,7 +8883,7 @@
         <w:pStyle w:val="ListBullet"/>
       </w:pPr>
       <w:r>
-        <w:t>You connect a coding model such as OpenAI Codex as the agents' engine, configure the company, and track AI tasks on a board: todo -&gt; in_progress -&gt; in_review -&gt; done.</w:t>
+        <w:t>Running use case: 'Tertiary AI News Research' — a zero-human news desk whose mission is a verified, cited daily AI-news briefing; the mission you write steers every agent the company hires.</w:t>
       </w:r>
     </w:p>
     <w:p>
@@ -8738,7 +8891,7 @@
         <w:pStyle w:val="ListBullet"/>
       </w:pPr>
       <w:r>
-        <w:t>Hiring is automated behind human approval gates; all durable state lives in an embedded PostgreSQL database whose activity_log (tagged by actor_type) and cost_events tables give a CFO-style audit trail.</w:t>
+        <w:t>Model adaptors (built-in Claude Code, Codex and Gemini CLI) are the agents' engine; the Tavily Search API — stored as a Secret and bound to a runtime env var — gives researchers live web results.</w:t>
       </w:r>
     </w:p>
     <w:p>
@@ -8746,7 +8899,7 @@
         <w:pStyle w:val="ListBullet"/>
       </w:pPr>
       <w:r>
-        <w:t>Security is enforced with budget caps (an 80% warning and a 100% pause rail) and approvals; you set up agents and assign tasks to deliver the company goal.</w:t>
+        <w:t>The company runs off a detailed task backlog (todo -&gt; in_progress -&gt; in_review -&gt; done) whose core task is hiring; the CEO proposes the team and every hire pauses at a Board approval gate.</w:t>
       </w:r>
     </w:p>
     <w:p>
@@ -8754,17 +8907,17 @@
         <w:pStyle w:val="Heading2"/>
       </w:pPr>
       <w:r>
-        <w:t>Lab 27 — Setup Paperclip</w:t>
-      </w:r>
-    </w:p>
-    <w:p>
-      <w:r>
-        <w:t>Learning outcome: LO1: Install and self-host Paperclip, then found your company..</w:t>
-      </w:r>
-    </w:p>
-    <w:p>
-      <w:r>
-        <w:t>Goal: Watch the Paperclip overview, then self-host Paperclip with Docker Compose and create the Nimbus Coffee company with a single goal and a monthly budget.</w:t>
+        <w:t>Lab 27 — Install Paperclip on Windows &amp; Mac</w:t>
+      </w:r>
+    </w:p>
+    <w:p>
+      <w:r>
+        <w:t>Learning outcome: LO1: Install and self-host Paperclip on Windows and macOS..</w:t>
+      </w:r>
+    </w:p>
+    <w:p>
+      <w:r>
+        <w:t>Goal: Watch the Paperclip overview, then self-host Paperclip with Docker Compose on your own machine — Docker Desktop on macOS, or Docker Desktop + WSL2 on Windows — and open the dashboard at http://localhost:3100.</w:t>
       </w:r>
     </w:p>
     <w:p>
@@ -8779,7 +8932,7 @@
     </w:p>
     <w:p>
       <w:r>
-        <w:t>A running Paperclip at http://localhost:3100 with a company (goal + budget).   (Tools: Paperclip, Docker Compose.)</w:t>
+        <w:t>A running Paperclip instance at http://localhost:3100 on Windows or Mac.   (Tools: Paperclip, Docker Desktop, Docker Compose.)</w:t>
       </w:r>
     </w:p>
     <w:p>
@@ -8804,7 +8957,7 @@
         <w:t xml:space="preserve">1.  </w:t>
       </w:r>
       <w:r>
-        <w:t>Clone the Paperclip repository. This pulls the source and the Docker Compose files you need to run it locally:</w:t>
+        <w:t>Install Docker Desktop — macOS: download from docker.com; Windows: enable WSL2 first, then install Docker Desktop with the WSL2 backend - macOS — download Docker Desktop from docker.com (https://www.docker.com/products/docker-desktop/), drag it into Applications, launch it and wait for the whale icon to settle. - Windows — enable WSL2 first (open PowerShell as Administrator), then install Docker Desktop and select the WSL2 backend during setup:</w:t>
       </w:r>
     </w:p>
     <w:p>
@@ -8814,7 +8967,22 @@
           <w:color w:val="0B3060"/>
           <w:sz w:val="19"/>
         </w:rPr>
-        <w:t>git clone https://github.com/paperclipai/paperclip.git</w:t>
+        <w:t>wsl --install</w:t>
+      </w:r>
+    </w:p>
+    <w:p>
+      <w:pPr>
+        <w:spacing w:after="80"/>
+        <w:ind w:left="360"/>
+      </w:pPr>
+      <w:r>
+        <w:rPr>
+          <w:b/>
+        </w:rPr>
+        <w:t xml:space="preserve">2.  </w:t>
+      </w:r>
+      <w:r>
+        <w:t>Clone the Paperclip repository</w:t>
       </w:r>
     </w:p>
     <w:p>
@@ -8824,7 +8992,7 @@
           <w:color w:val="0B3060"/>
           <w:sz w:val="19"/>
         </w:rPr>
-        <w:t xml:space="preserve">   cd paperclip</w:t>
+        <w:t>git clone https://github.com/paperclipai/paperclip.git</w:t>
       </w:r>
     </w:p>
     <w:p>
@@ -8836,10 +9004,10 @@
         <w:rPr>
           <w:b/>
         </w:rPr>
-        <w:t xml:space="preserve">2.  </w:t>
-      </w:r>
-      <w:r>
-        <w:t>Start Paperclip with the quickstart compose file. This builds the image and brings up the full stack (the app plus its embedded PostgreSQL):</w:t>
+        <w:t xml:space="preserve">3.  </w:t>
+      </w:r>
+      <w:r>
+        <w:t>Start Paperclip with the quickstart compose file (same command in the macOS Terminal or the Windows WSL2/PowerShell shell)</w:t>
       </w:r>
     </w:p>
     <w:p>
@@ -8861,10 +9029,84 @@
         <w:rPr>
           <w:b/>
         </w:rPr>
-        <w:t xml:space="preserve">3.  </w:t>
-      </w:r>
-      <w:r>
-        <w:t>Open the dashboard. In your browser, go to:</w:t>
+        <w:t xml:space="preserve">4.  </w:t>
+      </w:r>
+      <w:r>
+        <w:t>Open the dashboard in your browser at http://localhost:3100 and create your Board account Browse to http://localhost:3100 (http://localhost:3100). The first-run screen asks you to create your Board account — this identity is the human owner every agent ultimately answers to. Sign in and land on the empty dashboard.</w:t>
+      </w:r>
+    </w:p>
+    <w:p>
+      <w:r>
+        <w:rPr>
+          <w:b/>
+          <w:color w:val="1F6FEB"/>
+          <w:sz w:val="22"/>
+        </w:rPr>
+        <w:t>Test it</w:t>
+      </w:r>
+    </w:p>
+    <w:p>
+      <w:r>
+        <w:t>Docker shows the Paperclip containers running and the dashboard loads at http://localhost:3100 on your platform.</w:t>
+      </w:r>
+    </w:p>
+    <w:p>
+      <w:r>
+        <w:rPr>
+          <w:b/>
+          <w:color w:val="1F6FEB"/>
+        </w:rPr>
+        <w:t xml:space="preserve">Note: </w:t>
+      </w:r>
+      <w:r>
+        <w:rPr>
+          <w:sz w:val="20"/>
+        </w:rPr>
+        <w:t>Full commands and screenshots are in labs/lab-27-*.md. Use only accounts, keys and hosts you own, and keep agents under human oversight.</w:t>
+      </w:r>
+    </w:p>
+    <w:p/>
+    <w:p>
+      <w:pPr>
+        <w:pStyle w:val="Heading2"/>
+      </w:pPr>
+      <w:r>
+        <w:t>Lab 28 — Setup Company, CEO &amp; Mission</w:t>
+      </w:r>
+    </w:p>
+    <w:p>
+      <w:r>
+        <w:t>Learning outcome: LO2: Found the company — name, mission and the CEO agent..</w:t>
+      </w:r>
+    </w:p>
+    <w:p>
+      <w:r>
+        <w:t>Goal: Found 'Tertiary AI News Research': create the company, write its mission (research and publish a reliable daily AI-news briefing), set the monthly budget, then hire the CEO agent — the Chief Officer who will run the news desk and report to you, the Board.</w:t>
+      </w:r>
+    </w:p>
+    <w:p>
+      <w:r>
+        <w:rPr>
+          <w:b/>
+          <w:color w:val="1F6FEB"/>
+          <w:sz w:val="22"/>
+        </w:rPr>
+        <w:t>What you'll build</w:t>
+      </w:r>
+    </w:p>
+    <w:p>
+      <w:r>
+        <w:t>A company with a mission and budget, plus an approved CEO agent at the top of the org chart.   (Tools: Paperclip, company settings, org chart.)</w:t>
+      </w:r>
+    </w:p>
+    <w:p>
+      <w:r>
+        <w:rPr>
+          <w:b/>
+          <w:color w:val="1F6FEB"/>
+          <w:sz w:val="22"/>
+        </w:rPr>
+        <w:t>Step-by-step</w:t>
       </w:r>
     </w:p>
     <w:p>
@@ -8876,10 +9118,70 @@
         <w:rPr>
           <w:b/>
         </w:rPr>
+        <w:t xml:space="preserve">1.  </w:t>
+      </w:r>
+      <w:r>
+        <w:t>Create the company 'Tertiary AI News Research' from the company switcher In the dashboard open the company switcher (top of the sidebar) and choose New company. Name it exactly: &gt; Tertiary AI News Research This is the zero-human company you will govern for the rest of the topic.</w:t>
+      </w:r>
+    </w:p>
+    <w:p>
+      <w:pPr>
+        <w:spacing w:after="80"/>
+        <w:ind w:left="360"/>
+      </w:pPr>
+      <w:r>
+        <w:rPr>
+          <w:b/>
+        </w:rPr>
+        <w:t xml:space="preserve">2.  </w:t>
+      </w:r>
+      <w:r>
+        <w:t>Write the mission — it steers every agent the company hires In the company setup (or Company Settings → Mission), write the mission statement: &gt; Research the AI landscape daily and publish a verified, cited AI-news briefing The mission is not decoration: every agent the company hires reads it and aligns its work to it, so a vague mission produces a vague company.</w:t>
+      </w:r>
+    </w:p>
+    <w:p>
+      <w:pPr>
+        <w:spacing w:after="80"/>
+        <w:ind w:left="360"/>
+      </w:pPr>
+      <w:r>
+        <w:rPr>
+          <w:b/>
+        </w:rPr>
+        <w:t xml:space="preserve">3.  </w:t>
+      </w:r>
+      <w:r>
+        <w:t>Set the monthly budget cap in Company Settings Open Company Settings and set the monthly budget cap (e.g. $50/month to start). The budget is the hard ceiling on what the whole company may spend on model calls — agents cannot exceed it, which makes it your first governance lever as the Board.</w:t>
+      </w:r>
+    </w:p>
+    <w:p>
+      <w:pPr>
+        <w:spacing w:after="80"/>
+        <w:ind w:left="360"/>
+      </w:pPr>
+      <w:r>
+        <w:rPr>
+          <w:b/>
+        </w:rPr>
         <w:t xml:space="preserve">4.  </w:t>
       </w:r>
       <w:r>
-        <w:t>Create the company with a single goal and a monthly budget. In the dashboard, start a new company. Name it Nimbus Coffee, Inc., give it one clear goal (e.g. "Launch a direct-to-consumer specialty coffee brand and make the first sale"), and set a monthly budget cap (your spend ceiling). Save. This company is the entity the CEO and specialist agents will work inside for every remaining Paperclip lab. &gt; The exact wording of the "Create company" / goal / budget fields is version-specific — verify in the video / docs (&lt;https://docs.paperclip.ing&gt;).</w:t>
+        <w:t>Hire the CEO agent (Chief Officer) and approve the hire — you are the Board Hire the company's first agent: the CEO (Chief Officer). The hire pauses at an approval gate — as the Board, review the CEO's mandate and click Approve. The CEO is the only agent that reports directly to you; every later hire will report to the CEO.</w:t>
+      </w:r>
+    </w:p>
+    <w:p>
+      <w:pPr>
+        <w:spacing w:after="80"/>
+        <w:ind w:left="360"/>
+      </w:pPr>
+      <w:r>
+        <w:rPr>
+          <w:b/>
+        </w:rPr>
+        <w:t xml:space="preserve">5.  </w:t>
+      </w:r>
+      <w:r>
+        <w:t>Open the Org page and confirm the structure: Board above the CEO Open the Org page and check the org chart: Board (you) at the top, the CEO directly beneath. This two-node chart is the seed of the whole workforce you will grow in Labs 30–32.</w:t>
       </w:r>
     </w:p>
     <w:p>
@@ -8894,7 +9196,7 @@
     </w:p>
     <w:p>
       <w:r>
-        <w:t>The dashboard loads at http://localhost:3100 and a company exists with a goal and budget.</w:t>
+        <w:t>The company exists with a mission and budget, and an approved CEO agent sits under the Board on the org chart.</w:t>
       </w:r>
     </w:p>
     <w:p>
@@ -8909,7 +9211,7 @@
         <w:rPr>
           <w:sz w:val="20"/>
         </w:rPr>
-        <w:t>Full commands and screenshots are in labs/lab-27-*.md. Use only accounts, keys and hosts you own, and keep agents under human oversight.</w:t>
+        <w:t>Full commands and screenshots are in labs/lab-28-*.md. Use only accounts, keys and hosts you own, and keep agents under human oversight.</w:t>
       </w:r>
     </w:p>
     <w:p/>
@@ -8918,17 +9220,17 @@
         <w:pStyle w:val="Heading2"/>
       </w:pPr>
       <w:r>
-        <w:t>Lab 28 — Connect OpenAI Codex to Paperclip</w:t>
-      </w:r>
-    </w:p>
-    <w:p>
-      <w:r>
-        <w:t>Learning outcome: LO2: Connect a coding model (OpenAI Codex) as the agents' engine..</w:t>
-      </w:r>
-    </w:p>
-    <w:p>
-      <w:r>
-        <w:t>Goal: Give Paperclip's agents a brain by connecting the OpenAI Codex adapter, so the agents can reason and act. Confirm the adapter is detected and available.</w:t>
+        <w:t>Lab 29 — Setup Adaptor</w:t>
+      </w:r>
+    </w:p>
+    <w:p>
+      <w:r>
+        <w:t>Learning outcome: LO2: Connect a model adaptor as the agents' engine..</w:t>
+      </w:r>
+    </w:p>
+    <w:p>
+      <w:r>
+        <w:t>Goal: Give the company's agents a brain. Paperclip ships three built-in adaptors — Claude Code (claude_local), Codex (codex_local) and Gemini CLI (gemini_local) — and supports installable external adaptors (alpha). Confirm your adaptor is detected so every hired agent can reason and act with it.</w:t>
       </w:r>
     </w:p>
     <w:p>
@@ -8943,7 +9245,7 @@
     </w:p>
     <w:p>
       <w:r>
-        <w:t>Paperclip using the OpenAI Codex adapter as the agents' model.   (Tools: Paperclip, OpenAI Codex.)</w:t>
+        <w:t>A detected, enabled model adaptor (Claude Code, Codex or Gemini CLI) powering the agents.   (Tools: Paperclip, model adaptors (Claude Code / Codex / Gemini CLI).)</w:t>
       </w:r>
     </w:p>
     <w:p>
@@ -8968,7 +9270,7 @@
         <w:t xml:space="preserve">1.  </w:t>
       </w:r>
       <w:r>
-        <w:t>Install / log in to the OpenAI Codex CLI so Paperclip can detect it. Follow the video's instructions to install the Codex CLI and authenticate (log in or supply your API key). Paperclip detects the adapter by finding this working Codex CLI/credentials on the host — so getting the login right here is the whole ballgame. &gt; The exact install/login command is version-specific — verify in the video / docs (&lt;https://docs.paperclip.ing&gt;).</w:t>
+        <w:t>Install / log in to the adaptor CLI on the host so Paperclip can detect it Paperclip detects adaptor CLIs installed on the host machine. Install and authenticate at least one — e.g. Claude Code (claude and log in) or the OpenAI Codex CLI (codex and log in) — on the same machine that runs the Paperclip containers.</w:t>
       </w:r>
     </w:p>
     <w:p>
@@ -8983,7 +9285,7 @@
         <w:t xml:space="preserve">2.  </w:t>
       </w:r>
       <w:r>
-        <w:t>Open Settings → Agents / Adapters in the dashboard. In Paperclip at http://localhost:3100, go to Settings, then the Agents / Adapters section. This is where Paperclip lists every model engine it can use to power agents.</w:t>
+        <w:t>Open Settings → Instance settings → Adapters in the dashboard In the dashboard go to Settings → Instance settings → Adapters. This page is the registry of every engine the instance can run agents on.</w:t>
       </w:r>
     </w:p>
     <w:p>
@@ -8998,7 +9300,7 @@
         <w:t xml:space="preserve">3.  </w:t>
       </w:r>
       <w:r>
-        <w:t>Confirm the OpenAI Codex adapter shows as "available". Look for the OpenAI Codex entry and check its status reads available (not "not detected" / "unavailable"). Available means Paperclip successfully found and authenticated the Codex CLI and can route agent reasoning through it.</w:t>
+        <w:t>Confirm the built-in adaptors are listed and yours shows as available You should see the three built-ins with their model counts: - Claude Code (claude_local) — 9 models - Codex (codex_local) — 10 models - Gemini CLI (gemini_local) — 8 models The adaptor whose CLI you installed in step 2 should show as available/detected.</w:t>
       </w:r>
     </w:p>
     <w:p>
@@ -9013,7 +9315,22 @@
         <w:t xml:space="preserve">4.  </w:t>
       </w:r>
       <w:r>
-        <w:t>Restart Paperclip if the adapter is not detected. If Codex still shows unavailable after you have logged in, restart the stack so Paperclip re-scans for the adapter:</w:t>
+        <w:t>Use the power icon to hide adaptors; 'Install Adapter' adds external adaptor packages (alpha) Two controls on this page matter for governance: - The power icon on each adaptor toggles it — hide adaptors you don't want agents to pick, so hires can only run on engines you have vetted. - Install Adapter adds external adaptor packages beyond the three built-ins. This feature is alpha — expect rough edges.</w:t>
+      </w:r>
+    </w:p>
+    <w:p>
+      <w:pPr>
+        <w:spacing w:after="80"/>
+        <w:ind w:left="360"/>
+      </w:pPr>
+      <w:r>
+        <w:rPr>
+          <w:b/>
+        </w:rPr>
+        <w:t xml:space="preserve">5.  </w:t>
+      </w:r>
+      <w:r>
+        <w:t>Restart Paperclip if your adaptor is not detected Detection happens at startup, so a CLI installed after Paperclip came up may not show until a restart:</w:t>
       </w:r>
     </w:p>
     <w:p>
@@ -9038,7 +9355,7 @@
     </w:p>
     <w:p>
       <w:r>
-        <w:t>The OpenAI Codex adapter is detected and shows as available in Settings.</w:t>
+        <w:t>Settings → Adapters lists the built-in adaptors and your chosen adaptor is detected and enabled for agents.</w:t>
       </w:r>
     </w:p>
     <w:p>
@@ -9053,7 +9370,7 @@
         <w:rPr>
           <w:sz w:val="20"/>
         </w:rPr>
-        <w:t>Full commands and screenshots are in labs/lab-28-*.md. Use only accounts, keys and hosts you own, and keep agents under human oversight.</w:t>
+        <w:t>Full commands and screenshots are in labs/lab-29-*.md. Use only accounts, keys and hosts you own, and keep agents under human oversight.</w:t>
       </w:r>
     </w:p>
     <w:p/>
@@ -9062,17 +9379,17 @@
         <w:pStyle w:val="Heading2"/>
       </w:pPr>
       <w:r>
-        <w:t>Lab 29 — Configure Paperclip</w:t>
-      </w:r>
-    </w:p>
-    <w:p>
-      <w:r>
-        <w:t>Learning outcome: LO2: Configure the company — settings, budget and workspace..</w:t>
-      </w:r>
-    </w:p>
-    <w:p>
-      <w:r>
-        <w:t>Goal: Configure Nimbus Coffee: set the monthly budget, connect a workspace folder so agents write real files, and adjust company settings.</w:t>
+        <w:t>Lab 30 — Create the Task Backlog</w:t>
+      </w:r>
+    </w:p>
+    <w:p>
+      <w:r>
+        <w:t>Learning outcome: LO3: Create a detailed task backlog that drives the company..</w:t>
+      </w:r>
+    </w:p>
+    <w:p>
+      <w:r>
+        <w:t>Goal: Write the backlog that runs the news desk. Every task gets a precise title AND a detailed description — the description is the agent's brief, so vague tasks produce vague work. The core task is hiring the team; the rest build the news-research pipeline around it.</w:t>
       </w:r>
     </w:p>
     <w:p>
@@ -9087,7 +9404,7 @@
     </w:p>
     <w:p>
       <w:r>
-        <w:t>A configured company with a budget and a connected workspace folder.   (Tools: Paperclip, workspace.)</w:t>
+        <w:t>A Tasks board holding six well-specified tasks, with 'Hire the core team' as the core task.   (Tools: Paperclip, Tasks board.)</w:t>
       </w:r>
     </w:p>
     <w:p>
@@ -9112,7 +9429,7 @@
         <w:t xml:space="preserve">1.  </w:t>
       </w:r>
       <w:r>
-        <w:t>Open the company's settings in the dashboard. At http://localhost:3100, open Nimbus Coffee, Inc. and go to its Settings. This is the per-company control panel (distinct from the app-wide Settings you used for adapters in Lab 28).</w:t>
+        <w:t>Create the CORE task — 'Hire the core team and create a hiring plan' — and assign it to the CEO Title: &gt; Hire the core team and create a hiring plan Description: &gt; Based on the coverage strategy, propose which agents to hire (research analyst, news writer, fact-checker, editor/publisher) with roles, budgets and reporting lines. Assign it to the CEO. This is the core task of the whole topic — in Lab 32 the CEO works it to staff the company.</w:t>
       </w:r>
     </w:p>
     <w:p>
@@ -9127,7 +9444,7 @@
         <w:t xml:space="preserve">2.  </w:t>
       </w:r>
       <w:r>
-        <w:t>Set or adjust the monthly budget cap. Enter the maximum the company may spend per month. This cap is the governance rail you will exercise in Lab 33 (an 80% warning and a 100% pause). Set a deliberate figure you are comfortable letting agents spend against. &gt; Field name/units are version-specific — verify in the video / docs (&lt;https://docs.paperclip.ing&gt;).</w:t>
+        <w:t>Create 'Define the AI news coverage strategy and editorial plan' Title: &gt; Define the AI news coverage strategy and editorial plan Description: &gt; Pick the beats (models, chips, policy, funding), the daily cadence, the briefing format and the quality bar for every published story.</w:t>
       </w:r>
     </w:p>
     <w:p>
@@ -9142,17 +9459,7 @@
         <w:t xml:space="preserve">3.  </w:t>
       </w:r>
       <w:r>
-        <w:t>Connect a workspace folder so agents create real deliverables. First create the folder on your machine:</w:t>
-      </w:r>
-    </w:p>
-    <w:p>
-      <w:r>
-        <w:rPr>
-          <w:rFonts w:ascii="Consolas" w:hAnsi="Consolas"/>
-          <w:color w:val="0B3060"/>
-          <w:sz w:val="19"/>
-        </w:rPr>
-        <w:t>mkdir -p ~/paperclip-workspace/nimbus-coffee</w:t>
+        <w:t>Create 'Scaffold the news-desk workspace &amp; tooling foundation' Title: &gt; Scaffold the news-desk workspace &amp; tooling foundation Description: &gt; Set up the workspace folder structure, briefing templates, style guide and source register the whole team will use.</w:t>
       </w:r>
     </w:p>
     <w:p>
@@ -9167,7 +9474,37 @@
         <w:t xml:space="preserve">4.  </w:t>
       </w:r>
       <w:r>
-        <w:t>Save the configuration and confirm it persists. Save the settings, reload the page, and confirm the budget and the connected workspace path are still shown. Persistence matters — it proves the config was written to the database, not just held in the browser.</w:t>
+        <w:t>Create 'Build the AI news sources watchlist' Title: &gt; Build the AI news sources watchlist Description: &gt; Assemble the RSS feeds, publication sites, X accounts, arXiv categories and company blogs to monitor, with priority tiers and de-duplication rules.</w:t>
+      </w:r>
+    </w:p>
+    <w:p>
+      <w:pPr>
+        <w:spacing w:after="80"/>
+        <w:ind w:left="360"/>
+      </w:pPr>
+      <w:r>
+        <w:rPr>
+          <w:b/>
+        </w:rPr>
+        <w:t xml:space="preserve">5.  </w:t>
+      </w:r>
+      <w:r>
+        <w:t>Create 'Produce the first daily AI news briefing' Title: &gt; Produce the first daily AI news briefing Description: &gt; Pull the top stories from the watchlist, verify each against two independent sources, and draft a cited briefing for Board review.</w:t>
+      </w:r>
+    </w:p>
+    <w:p>
+      <w:pPr>
+        <w:spacing w:after="80"/>
+        <w:ind w:left="360"/>
+      </w:pPr>
+      <w:r>
+        <w:rPr>
+          <w:b/>
+        </w:rPr>
+        <w:t xml:space="preserve">6.  </w:t>
+      </w:r>
+      <w:r>
+        <w:t>Create 'Wire the research pipeline to live search' Title: &gt; Wire the research pipeline to live search Description: &gt; Integrate the Tavily Search API so researchers query the live web with fresh results (depends on the Tavily key from the next lab).</w:t>
       </w:r>
     </w:p>
     <w:p>
@@ -9182,7 +9519,7 @@
     </w:p>
     <w:p>
       <w:r>
-        <w:t>The company shows the configured budget and a connected workspace folder.</w:t>
+        <w:t>The Tasks board shows all six tasks, each with a detailed description, and the hiring task is assigned to the CEO.</w:t>
       </w:r>
     </w:p>
     <w:p>
@@ -9197,7 +9534,7 @@
         <w:rPr>
           <w:sz w:val="20"/>
         </w:rPr>
-        <w:t>Full commands and screenshots are in labs/lab-29-*.md. Use only accounts, keys and hosts you own, and keep agents under human oversight.</w:t>
+        <w:t>Full commands and screenshots are in labs/lab-30-*.md. Use only accounts, keys and hosts you own, and keep agents under human oversight.</w:t>
       </w:r>
     </w:p>
     <w:p/>
@@ -9206,17 +9543,17 @@
         <w:pStyle w:val="Heading2"/>
       </w:pPr>
       <w:r>
-        <w:t>Lab 30 — Track AI Tasks</w:t>
-      </w:r>
-    </w:p>
-    <w:p>
-      <w:r>
-        <w:t>Learning outcome: LO3: Track AI work on the task board..</w:t>
-      </w:r>
-    </w:p>
-    <w:p>
-      <w:r>
-        <w:t>Goal: Use Paperclip's task board to track work through its four states — todo, in_progress, in_review, done — giving you visibility and control over what the agents are doing.</w:t>
+        <w:t>Lab 31 — Add the Tavily Search API</w:t>
+      </w:r>
+    </w:p>
+    <w:p>
+      <w:r>
+        <w:t>Learning outcome: LO2: Wire live web search into the company via the Tavily Search API..</w:t>
+      </w:r>
+    </w:p>
+    <w:p>
+      <w:r>
+        <w:t>Goal: A news-research company needs fresh information. Create a Tavily API key, store it as a company Secret, and bind it to the TAVILY_API_KEY runtime environment variable — Paperclip resolves the secret server-side when a run starts, so the key never sits in a prompt or a repo.</w:t>
       </w:r>
     </w:p>
     <w:p>
@@ -9231,7 +9568,7 @@
     </w:p>
     <w:p>
       <w:r>
-        <w:t>A task board showing AI tasks moving across the four states.   (Tools: Paperclip, task board.)</w:t>
+        <w:t>A TAVILY_API_KEY secret bound to the agents' runtime environment, verified with a live search task.   (Tools: Paperclip, Secrets, Tavily Search API.)</w:t>
       </w:r>
     </w:p>
     <w:p>
@@ -9256,7 +9593,7 @@
         <w:t xml:space="preserve">1.  </w:t>
       </w:r>
       <w:r>
-        <w:t>Open the task board for the company. In the dashboard, open Nimbus Coffee, Inc. and go to its task board. You'll see four columns — todo, in_progress, in_review, done — the single source of truth for everything the company is working on.</w:t>
+        <w:t>Create a Tavily account and copy an API key from app.tavily.com Sign up at app.tavily.com (https://app.tavily.com), open the dashboard and copy an API key (it starts with tvly-). Keep it in your clipboard — you will paste it once, into a secret, and nowhere else.</w:t>
       </w:r>
     </w:p>
     <w:p>
@@ -9271,7 +9608,7 @@
         <w:t xml:space="preserve">2.  </w:t>
       </w:r>
       <w:r>
-        <w:t>Create or observe a task in the "todo" column. Either create a task yourself (e.g. "Draft the Nimbus Coffee brand tagline") or watch one the CEO/agents have already queued. A task in todo is committed work that has not started yet.</w:t>
+        <w:t>Open Settings → Company settings → Secrets and click 'New secret' In the Paperclip dashboard go to Settings → Company settings → Secrets and click New secret. Secrets are company-scoped: every agent the company hires can be granted them, but no agent ever reads them in plain text.</w:t>
       </w:r>
     </w:p>
     <w:p>
@@ -9286,7 +9623,7 @@
         <w:t xml:space="preserve">3.  </w:t>
       </w:r>
       <w:r>
-        <w:t>Watch a task move todo → in_progress → in_review. As an agent picks up the task, it moves to in_progress; when the agent finishes and produces a deliverable, it moves to in_review, waiting for your judgement. Observing this flow is how you supervise a company of agents without micromanaging each action.</w:t>
+        <w:t>Store the key as a secret (e.g. name it tavily) Name the secret (e.g. tavily), paste the API key as its value, and save. Secrets are injected at run start, never shown to agents in plain text — the value will not appear in prompts, task logs or the repo.</w:t>
       </w:r>
     </w:p>
     <w:p>
@@ -9301,17 +9638,22 @@
         <w:t xml:space="preserve">4.  </w:t>
       </w:r>
       <w:r>
-        <w:t>Open a shell to review the task activity log. For a deeper view than the UI, open a shell inside the running Paperclip container:</w:t>
-      </w:r>
-    </w:p>
-    <w:p>
-      <w:r>
-        <w:rPr>
-          <w:rFonts w:ascii="Consolas" w:hAnsi="Consolas"/>
-          <w:color w:val="0B3060"/>
-          <w:sz w:val="19"/>
-        </w:rPr>
-        <w:t>docker compose -f docker-compose.quickstart.yml exec paperclip sh</w:t>
+        <w:t>Bind it to TAVILY_API_KEY via an agent's Environment variables (or a project's Env field) Now map the secret to the environment variable the Tavily SDK/CLI expects: - Open an agent's Environment variables (or a project's Env field), - add the key TAVILY_API_KEY, - choose Secret as the value type, and - select the stored tavily secret. At run start Paperclip resolves the binding server-side and the agent's runtime sees TAVILY_API_KEY set — without the key ever passing through a prompt.</w:t>
+      </w:r>
+    </w:p>
+    <w:p>
+      <w:pPr>
+        <w:spacing w:after="80"/>
+        <w:ind w:left="360"/>
+      </w:pPr>
+      <w:r>
+        <w:rPr>
+          <w:b/>
+        </w:rPr>
+        <w:t xml:space="preserve">5.  </w:t>
+      </w:r>
+      <w:r>
+        <w:t>Verify with a live search task Create a task for an agent with the binding: &gt; Use Tavily to find today's three biggest AI announcements and list your sources The agent should return fresh, cited results — stories from today with source links, not stale training-data knowledge.</w:t>
       </w:r>
     </w:p>
     <w:p>
@@ -9326,7 +9668,7 @@
     </w:p>
     <w:p>
       <w:r>
-        <w:t>Tasks are visible on the board and move through todo -&gt; in_progress -&gt; in_review -&gt; done.</w:t>
+        <w:t>The secret exists, TAVILY_API_KEY is bound to the runtime env, and a live-search task returns fresh cited results.</w:t>
       </w:r>
     </w:p>
     <w:p>
@@ -9341,7 +9683,7 @@
         <w:rPr>
           <w:sz w:val="20"/>
         </w:rPr>
-        <w:t>Full commands and screenshots are in labs/lab-30-*.md. Use only accounts, keys and hosts you own, and keep agents under human oversight.</w:t>
+        <w:t>Full commands and screenshots are in labs/lab-31-*.md. Use only accounts, keys and hosts you own, and keep agents under human oversight.</w:t>
       </w:r>
     </w:p>
     <w:p/>
@@ -9350,17 +9692,17 @@
         <w:pStyle w:val="Heading2"/>
       </w:pPr>
       <w:r>
-        <w:t>Lab 31 — Automate AI Hiring</w:t>
-      </w:r>
-    </w:p>
-    <w:p>
-      <w:r>
-        <w:t>Learning outcome: LO3: Automate hiring of the CEO and specialist agents behind approval gates..</w:t>
-      </w:r>
-    </w:p>
-    <w:p>
-      <w:r>
-        <w:t>Goal: Hire your CEO agent and let it propose specialist hires, each passing a human approval gate. This is how the company staffs itself automatically while you stay in control.</w:t>
+        <w:t>Lab 32 — Hire the Members Under the Hiring Task</w:t>
+      </w:r>
+    </w:p>
+    <w:p>
+      <w:r>
+        <w:t>Learning outcome: LO3: Staff the company through the hiring task, behind approval gates..</w:t>
+      </w:r>
+    </w:p>
+    <w:p>
+      <w:r>
+        <w:t>Goal: Let the company staff itself. The CEO works the core hiring task — proposing the specialist roles for the news desk (research analyst, news writer, fact-checker, editor/publisher) with budgets and reporting lines — and every hire pauses at an approval gate for you, the Board, to approve.</w:t>
       </w:r>
     </w:p>
     <w:p>
@@ -9375,7 +9717,7 @@
     </w:p>
     <w:p>
       <w:r>
-        <w:t>An approved CEO agent and one or more approved specialist agents.   (Tools: Paperclip, approval gates.)</w:t>
+        <w:t>An approved core team under the CEO, visible in the Agents list and the org chart, ready to take the backlog.   (Tools: Paperclip, hiring task, approval gates, org chart.)</w:t>
       </w:r>
     </w:p>
     <w:p>
@@ -9400,7 +9742,7 @@
         <w:t xml:space="preserve">1.  </w:t>
       </w:r>
       <w:r>
-        <w:t>Hire the CEO agent from the company page. On the Nimbus Coffee, Inc. page, choose to hire the CEO. The CEO is the top agent that reads the company goal and works out what roles the company needs to achieve it.</w:t>
+        <w:t>Open the core hiring task and move it to in_progress — the CEO drafts the hiring plan in the task On the Tasks board open 'Hire the core team and create a hiring plan' and move it to in_progress. The CEO starts working the brief and drafts the hiring plan inside the task — watch the task's activity log as the plan takes shape.</w:t>
       </w:r>
     </w:p>
     <w:p>
@@ -9415,7 +9757,7 @@
         <w:t xml:space="preserve">2.  </w:t>
       </w:r>
       <w:r>
-        <w:t>Approve the CEO hire (you are the Board). The hire pauses at an approval gate. Review it and approve — as the Board, nothing joins the company without your sign-off. This is the core governance pattern: agents propose, humans approve.</w:t>
+        <w:t>Review the proposed roles, budgets and reporting lines in the task's hiring plan Read the CEO's plan as a Board member would. It should propose the news-desk specialists — research analyst, news writer, fact-checker, editor/publisher — and for each: the mandate, a per-agent budget, and the reporting line (everyone reports to the CEO).</w:t>
       </w:r>
     </w:p>
     <w:p>
@@ -9430,7 +9772,7 @@
         <w:t xml:space="preserve">3.  </w:t>
       </w:r>
       <w:r>
-        <w:t>Let the CEO propose specialist hires. Once active, the CEO analyses the goal and proposes specialists it needs (for a coffee brand, perhaps a Marketer, an Engineer for the storefront, and an Operations agent). Each proposal explains the role and why it helps reach the goal.</w:t>
+        <w:t>Approve each proposed hire at its approval gate (or reject and ask for a revised proposal) Each proposed hire pauses at an approval gate. For every one, either: - Approve — the agent is hired and comes online, or - Reject with a comment — the CEO revises the proposal (e.g. lower budget, sharper mandate) and resubmits. Nothing joins the company without an explicit Board decision — this gate is the human-in-the-loop control at the heart of Paperclip governance.</w:t>
       </w:r>
     </w:p>
     <w:p>
@@ -9445,7 +9787,22 @@
         <w:t xml:space="preserve">4.  </w:t>
       </w:r>
       <w:r>
-        <w:t>Review and approve each specialist at the approval gate. For every proposed hire, review the role and approve or reject it at the gate. Approve the ones that genuinely serve the Nimbus Coffee goal; reject any that don't. Each approval is recorded as a human decision — an actor_type=user entry in the audit trail you'll inspect in Lab 33.</w:t>
+        <w:t>Confirm the new members appear under Agents and on the Org chart beneath the CEO Open Agents and check every approved specialist is listed, then open the Org chart and confirm the structure: Board → CEO → the four specialists beneath the CEO.</w:t>
+      </w:r>
+    </w:p>
+    <w:p>
+      <w:pPr>
+        <w:spacing w:after="80"/>
+        <w:ind w:left="360"/>
+      </w:pPr>
+      <w:r>
+        <w:rPr>
+          <w:b/>
+        </w:rPr>
+        <w:t xml:space="preserve">5.  </w:t>
+      </w:r>
+      <w:r>
+        <w:t>Assign the rest of the backlog to the new team and watch tasks move todo → in_progress → in_review → done Assign the remaining Lab 30 tasks to the right specialists — the coverage strategy and watchlist to the research analyst, the workspace scaffold and briefing to the news writer / editor, verification to the fact-checker — and watch the board: tasks flow todo → in_progress → in_review → done, with the CEO coordinating and you approving anything that hits a gate.</w:t>
       </w:r>
     </w:p>
     <w:p>
@@ -9460,7 +9817,7 @@
     </w:p>
     <w:p>
       <w:r>
-        <w:t>The CEO and approved specialists are active; each hire is logged as an actor_type=user decision.</w:t>
+        <w:t>The hiring task reaches in_review/done, every hire was Board-approved, and the specialists appear on the org chart taking backlog tasks.</w:t>
       </w:r>
     </w:p>
     <w:p>
@@ -9475,439 +9832,7 @@
         <w:rPr>
           <w:sz w:val="20"/>
         </w:rPr>
-        <w:t>Full commands and screenshots are in labs/lab-31-*.md. Use only accounts, keys and hosts you own, and keep agents under human oversight.</w:t>
-      </w:r>
-    </w:p>
-    <w:p/>
-    <w:p>
-      <w:pPr>
-        <w:pStyle w:val="Heading2"/>
-      </w:pPr>
-      <w:r>
-        <w:t>Lab 32 — Setup AI Agents</w:t>
-      </w:r>
-    </w:p>
-    <w:p>
-      <w:r>
-        <w:t>Learning outcome: LO2: Set up and configure the AI agents and their capabilities..</w:t>
-      </w:r>
-    </w:p>
-    <w:p>
-      <w:r>
-        <w:t>Goal: Configure the hired agents — their mandate, tools and per-agent budget caps — so each specialist can carry out the delegated work for Nimbus Coffee.</w:t>
-      </w:r>
-    </w:p>
-    <w:p>
-      <w:r>
-        <w:rPr>
-          <w:b/>
-          <w:color w:val="1F6FEB"/>
-          <w:sz w:val="22"/>
-        </w:rPr>
-        <w:t>What you'll build</w:t>
-      </w:r>
-    </w:p>
-    <w:p>
-      <w:r>
-        <w:t>Configured agents with mandates, tools and per-agent budgets.   (Tools: Paperclip, agents.)</w:t>
-      </w:r>
-    </w:p>
-    <w:p>
-      <w:r>
-        <w:rPr>
-          <w:b/>
-          <w:color w:val="1F6FEB"/>
-          <w:sz w:val="22"/>
-        </w:rPr>
-        <w:t>Step-by-step</w:t>
-      </w:r>
-    </w:p>
-    <w:p>
-      <w:pPr>
-        <w:spacing w:after="80"/>
-        <w:ind w:left="360"/>
-      </w:pPr>
-      <w:r>
-        <w:rPr>
-          <w:b/>
-        </w:rPr>
-        <w:t xml:space="preserve">1.  </w:t>
-      </w:r>
-      <w:r>
-        <w:t>Open an agent's configuration. On the Nimbus Coffee page, pick one specialist (e.g. the Marketer) and open its configuration. This is where you turn a generic hire into a purpose-built role.</w:t>
-      </w:r>
-    </w:p>
-    <w:p>
-      <w:pPr>
-        <w:spacing w:after="80"/>
-        <w:ind w:left="360"/>
-      </w:pPr>
-      <w:r>
-        <w:rPr>
-          <w:b/>
-        </w:rPr>
-        <w:t xml:space="preserve">2.  </w:t>
-      </w:r>
-      <w:r>
-        <w:t>Set the agent's mandate and the tools it may use. Write a crisp mandate — one or two sentences on exactly what this agent is responsible for (e.g. "Own Nimbus Coffee's brand voice and launch marketing copy"). Then grant only the tools it needs (e.g. file-write to the workspace, web research) and withhold the rest. Least privilege here prevents an agent from straying outside its lane. &gt; Tool names and the mandate field are version-specific — verify in the video / docs (&lt;https://docs.paperclip.ing&gt;).</w:t>
-      </w:r>
-    </w:p>
-    <w:p>
-      <w:pPr>
-        <w:spacing w:after="80"/>
-        <w:ind w:left="360"/>
-      </w:pPr>
-      <w:r>
-        <w:rPr>
-          <w:b/>
-        </w:rPr>
-        <w:t xml:space="preserve">3.  </w:t>
-      </w:r>
-      <w:r>
-        <w:t>Set a per-agent budget cap. Give this agent its own spend ceiling, carved out of the company budget. Per-agent caps mean one runaway agent can't drain the whole company — a key safety rail you'll exercise in Lab 33.</w:t>
-      </w:r>
-    </w:p>
-    <w:p>
-      <w:pPr>
-        <w:spacing w:after="80"/>
-        <w:ind w:left="360"/>
-      </w:pPr>
-      <w:r>
-        <w:rPr>
-          <w:b/>
-        </w:rPr>
-        <w:t xml:space="preserve">4.  </w:t>
-      </w:r>
-      <w:r>
-        <w:t>Save and confirm the agent is ready to receive tasks. Save the configuration, reload, and confirm the mandate, tools, and budget persist and the agent's status shows it is ready for work. Repeat steps 2–5 for each specialist you approved.</w:t>
-      </w:r>
-    </w:p>
-    <w:p>
-      <w:r>
-        <w:rPr>
-          <w:b/>
-          <w:color w:val="1F6FEB"/>
-          <w:sz w:val="22"/>
-        </w:rPr>
-        <w:t>Test it</w:t>
-      </w:r>
-    </w:p>
-    <w:p>
-      <w:r>
-        <w:t>Each agent has a mandate, allowed tools and a budget cap, and is ready for tasks.</w:t>
-      </w:r>
-    </w:p>
-    <w:p>
-      <w:r>
-        <w:rPr>
-          <w:b/>
-          <w:color w:val="1F6FEB"/>
-        </w:rPr>
-        <w:t xml:space="preserve">Note: </w:t>
-      </w:r>
-      <w:r>
-        <w:rPr>
-          <w:sz w:val="20"/>
-        </w:rPr>
         <w:t>Full commands and screenshots are in labs/lab-32-*.md. Use only accounts, keys and hosts you own, and keep agents under human oversight.</w:t>
-      </w:r>
-    </w:p>
-    <w:p/>
-    <w:p>
-      <w:pPr>
-        <w:pStyle w:val="Heading2"/>
-      </w:pPr>
-      <w:r>
-        <w:t>Lab 33 — Security</w:t>
-      </w:r>
-    </w:p>
-    <w:p>
-      <w:r>
-        <w:t>Learning outcome: LO3: Secure the company with budgets, safety rails and approvals..</w:t>
-      </w:r>
-    </w:p>
-    <w:p>
-      <w:r>
-        <w:t>Goal: Apply Paperclip's governance: company-wide and per-agent budget caps trigger an 80% warning and a 100% pause; approvals gate risky decisions; the audit trail records everything.</w:t>
-      </w:r>
-    </w:p>
-    <w:p>
-      <w:r>
-        <w:rPr>
-          <w:b/>
-          <w:color w:val="1F6FEB"/>
-          <w:sz w:val="22"/>
-        </w:rPr>
-        <w:t>What you'll build</w:t>
-      </w:r>
-    </w:p>
-    <w:p>
-      <w:r>
-        <w:t>Budget caps with the 80% warning and 100% pause rails demonstrated, plus an audit review.   (Tools: Paperclip, budgets, PostgreSQL audit.)</w:t>
-      </w:r>
-    </w:p>
-    <w:p>
-      <w:r>
-        <w:rPr>
-          <w:b/>
-          <w:color w:val="1F6FEB"/>
-          <w:sz w:val="22"/>
-        </w:rPr>
-        <w:t>Step-by-step</w:t>
-      </w:r>
-    </w:p>
-    <w:p>
-      <w:pPr>
-        <w:spacing w:after="80"/>
-        <w:ind w:left="360"/>
-      </w:pPr>
-      <w:r>
-        <w:rPr>
-          <w:b/>
-        </w:rPr>
-        <w:t xml:space="preserve">1.  </w:t>
-      </w:r>
-      <w:r>
-        <w:t>Set a company and/or per-agent budget cap. In the company settings (Lab 29) and/or an agent's config (Lab 32), set a deliberately small cap so ongoing agent work will approach it during this lab. This is what lets you observe the safety rails fire instead of waiting days.</w:t>
-      </w:r>
-    </w:p>
-    <w:p>
-      <w:pPr>
-        <w:spacing w:after="80"/>
-        <w:ind w:left="360"/>
-      </w:pPr>
-      <w:r>
-        <w:rPr>
-          <w:b/>
-        </w:rPr>
-        <w:t xml:space="preserve">2.  </w:t>
-      </w:r>
-      <w:r>
-        <w:t>Trigger the 80% warning and 100% pause, then resume. Let the agents keep working (assign a task or two). As spend crosses 80% of the cap, Paperclip raises a warning; at 100% it pauses the company/agent so nothing can overspend. Review the pause, then resume (e.g. by raising the cap or explicitly resuming) and confirm work continues. You have now seen both the soft and hard money rails in action.</w:t>
-      </w:r>
-    </w:p>
-    <w:p>
-      <w:pPr>
-        <w:spacing w:after="80"/>
-        <w:ind w:left="360"/>
-      </w:pPr>
-      <w:r>
-        <w:rPr>
-          <w:b/>
-        </w:rPr>
-        <w:t xml:space="preserve">3.  </w:t>
-      </w:r>
-      <w:r>
-        <w:t>Audit actions and spend in the embedded PostgreSQL. Connect to Paperclip's database to inspect the ground-truth record:</w:t>
-      </w:r>
-    </w:p>
-    <w:p>
-      <w:r>
-        <w:rPr>
-          <w:rFonts w:ascii="Consolas" w:hAnsi="Consolas"/>
-          <w:color w:val="0B3060"/>
-          <w:sz w:val="19"/>
-        </w:rPr>
-        <w:t>psql "postgresql://postgres@localhost:5432/paperclip"</w:t>
-      </w:r>
-    </w:p>
-    <w:p>
-      <w:pPr>
-        <w:spacing w:after="80"/>
-        <w:ind w:left="360"/>
-      </w:pPr>
-      <w:r>
-        <w:rPr>
-          <w:b/>
-        </w:rPr>
-        <w:t xml:space="preserve">4.  </w:t>
-      </w:r>
-      <w:r>
-        <w:t>Separate human vs agent actions with actor_type. Run the audit query to see how much of the company's activity was human decisions versus agent actions:</w:t>
-      </w:r>
-    </w:p>
-    <w:p>
-      <w:r>
-        <w:rPr>
-          <w:rFonts w:ascii="Consolas" w:hAnsi="Consolas"/>
-          <w:color w:val="0B3060"/>
-          <w:sz w:val="19"/>
-        </w:rPr>
-        <w:t>SELECT actor_type, COUNT(*) FROM activity_log GROUP BY actor_type;</w:t>
-      </w:r>
-    </w:p>
-    <w:p>
-      <w:r>
-        <w:rPr>
-          <w:b/>
-          <w:color w:val="1F6FEB"/>
-          <w:sz w:val="22"/>
-        </w:rPr>
-        <w:t>Test it</w:t>
-      </w:r>
-    </w:p>
-    <w:p>
-      <w:r>
-        <w:t>The 80% warning and 100% pause fire, resume works, and the audit shows actions by actor_type and total spend.</w:t>
-      </w:r>
-    </w:p>
-    <w:p>
-      <w:r>
-        <w:rPr>
-          <w:b/>
-          <w:color w:val="1F6FEB"/>
-        </w:rPr>
-        <w:t xml:space="preserve">Note: </w:t>
-      </w:r>
-      <w:r>
-        <w:rPr>
-          <w:sz w:val="20"/>
-        </w:rPr>
-        <w:t>Full commands and screenshots are in labs/lab-33-*.md. Use only accounts, keys and hosts you own, and keep agents under human oversight.</w:t>
-      </w:r>
-    </w:p>
-    <w:p/>
-    <w:p>
-      <w:pPr>
-        <w:pStyle w:val="Heading2"/>
-      </w:pPr>
-      <w:r>
-        <w:t>Lab 34 — Assign Task</w:t>
-      </w:r>
-    </w:p>
-    <w:p>
-      <w:r>
-        <w:t>Learning outcome: LO3: Assign and delegate tasks to run the company end-to-end..</w:t>
-      </w:r>
-    </w:p>
-    <w:p>
-      <w:r>
-        <w:t>Goal: Delegate real work: assign tasks to specialists, watch them execute and produce deliverables in the workspace, and review and accept the results to complete the Nimbus Coffee goal.</w:t>
-      </w:r>
-    </w:p>
-    <w:p>
-      <w:r>
-        <w:rPr>
-          <w:b/>
-          <w:color w:val="1F6FEB"/>
-          <w:sz w:val="22"/>
-        </w:rPr>
-        <w:t>What you'll build</w:t>
-      </w:r>
-    </w:p>
-    <w:p>
-      <w:r>
-        <w:t>Assigned tasks executed by agents, producing real deliverables you review and accept.   (Tools: Paperclip, task board, workspace.)</w:t>
-      </w:r>
-    </w:p>
-    <w:p>
-      <w:r>
-        <w:rPr>
-          <w:b/>
-          <w:color w:val="1F6FEB"/>
-          <w:sz w:val="22"/>
-        </w:rPr>
-        <w:t>Step-by-step</w:t>
-      </w:r>
-    </w:p>
-    <w:p>
-      <w:pPr>
-        <w:spacing w:after="80"/>
-        <w:ind w:left="360"/>
-      </w:pPr>
-      <w:r>
-        <w:rPr>
-          <w:b/>
-        </w:rPr>
-        <w:t xml:space="preserve">1.  </w:t>
-      </w:r>
-      <w:r>
-        <w:t>Assign a task to a specialist agent. On the task board (Lab 30), create a concrete task and assign it to the right specialist — e.g. give the Engineer "Build a one-page Nimbus Coffee landing page in the workspace", or the Marketer "Write the launch tagline and hero copy". Match the task to the mandate you set in Lab 32.</w:t>
-      </w:r>
-    </w:p>
-    <w:p>
-      <w:pPr>
-        <w:spacing w:after="80"/>
-        <w:ind w:left="360"/>
-      </w:pPr>
-      <w:r>
-        <w:rPr>
-          <w:b/>
-        </w:rPr>
-        <w:t xml:space="preserve">2.  </w:t>
-      </w:r>
-      <w:r>
-        <w:t>Watch the agent execute and write output to the workspace. The task moves todo → in_progress as the agent works. When it finishes, check that a real file appeared in your workspace:</w:t>
-      </w:r>
-    </w:p>
-    <w:p>
-      <w:r>
-        <w:rPr>
-          <w:rFonts w:ascii="Consolas" w:hAnsi="Consolas"/>
-          <w:color w:val="0B3060"/>
-          <w:sz w:val="19"/>
-        </w:rPr>
-        <w:t>ls -R ~/paperclip-workspace/nimbus-coffee</w:t>
-      </w:r>
-    </w:p>
-    <w:p>
-      <w:pPr>
-        <w:spacing w:after="80"/>
-        <w:ind w:left="360"/>
-      </w:pPr>
-      <w:r>
-        <w:rPr>
-          <w:b/>
-        </w:rPr>
-        <w:t xml:space="preserve">3.  </w:t>
-      </w:r>
-      <w:r>
-        <w:t>Review the deliverable in the in_review state. The task is now in in_review, waiting on you. Open the produced file and judge it against the task and the company goal. As the Board, you are the quality gate.</w:t>
-      </w:r>
-    </w:p>
-    <w:p>
-      <w:pPr>
-        <w:spacing w:after="80"/>
-        <w:ind w:left="360"/>
-      </w:pPr>
-      <w:r>
-        <w:rPr>
-          <w:b/>
-        </w:rPr>
-        <w:t xml:space="preserve">4.  </w:t>
-      </w:r>
-      <w:r>
-        <w:t>Approve to move it to done, or send it back for revision. If the deliverable is good, approve it — the task moves to done and that slice of the Nimbus Coffee goal is complete. If it falls short, send it back for revision with feedback, and the agent iterates. Either way, you stayed in control end-to-end.</w:t>
-      </w:r>
-    </w:p>
-    <w:p>
-      <w:r>
-        <w:rPr>
-          <w:b/>
-          <w:color w:val="1F6FEB"/>
-          <w:sz w:val="22"/>
-        </w:rPr>
-        <w:t>Test it</w:t>
-      </w:r>
-    </w:p>
-    <w:p>
-      <w:r>
-        <w:t>An assigned task is executed by an agent, produces a real file, and is reviewed and accepted to done.</w:t>
-      </w:r>
-    </w:p>
-    <w:p>
-      <w:r>
-        <w:rPr>
-          <w:b/>
-          <w:color w:val="1F6FEB"/>
-        </w:rPr>
-        <w:t xml:space="preserve">Note: </w:t>
-      </w:r>
-      <w:r>
-        <w:rPr>
-          <w:sz w:val="20"/>
-        </w:rPr>
-        <w:t>Full commands and screenshots are in labs/lab-34-*.md. Use only accounts, keys and hosts you own, and keep agents under human oversight.</w:t>
       </w:r>
     </w:p>
     <w:p/>

</xml_diff>

<commit_message>
feat: migrate 68 content slides from the original Mastering OpenClaw deck into Topic 2 (v1.7)
- Framed figure imports routed to their labs: agent evolution + Agent = Model
  + Harness + harness anatomy (Lab 15), OpenClaw Wikipedia history and OpenAI
  acquisition, deployment options/services, ecosystem story slides; model
  stacks + Mission Control + MiniMax/OpenAI/Ollama setup (16); channels (17);
  skills + ClawHub + malicious-skill data (18); tools incl. AgentMail, Agent
  Browser, Firecrawl and tool-use stories (19); slash commands (20); cron
  decision guide (21); system prompt / workspace / context / compaction /
  memory (22); security lockdown (23); use cases incl. NFT certificates,
  dashboard, cost saving, Google integration (26)
- v1.6 archived; v1.7 (425 slides) with Document Version Control Record rows

Co-Authored-By: Claude Fable 5 <noreply@anthropic.com>
</commit_message>
<xml_diff>
--- a/courseware/LG-Human-AI Workforce with Autonomous AI Agents.docx
+++ b/courseware/LG-Human-AI Workforce with Autonomous AI Agents.docx
@@ -179,7 +179,7 @@
           <w:color w:val="1F6FEB"/>
           <w:sz w:val="24"/>
         </w:rPr>
-        <w:t>Version 1.6</w:t>
+        <w:t>Version 1.7</w:t>
       </w:r>
     </w:p>
     <w:p>
@@ -671,6 +671,64 @@
                 <w:sz w:val="19"/>
               </w:rPr>
               <w:t>Topic 3 (Paperclip) rebuilt as the 'Tertiary AI News Research' company across 6 labs (27-32): install on Windows &amp; Mac; company, CEO &amp; mission; model adaptors; a detailed task backlog whose core task hires the team; the Tavily Search API via Secrets; and hiring the members under the hiring task — with live dashboard screenshots. Natural-language prompt steps added to the Hermes and OpenClaw labs alongside the CLI. Platform logos added to the Three Platforms page. 32 labs total.</w:t>
+            </w:r>
+          </w:p>
+        </w:tc>
+        <w:tc>
+          <w:tcPr>
+            <w:tcW w:type="dxa" w:w="2160"/>
+          </w:tcPr>
+          <w:p>
+            <w:r/>
+            <w:r>
+              <w:rPr>
+                <w:sz w:val="19"/>
+              </w:rPr>
+              <w:t>Dr. Alfred Ang</w:t>
+            </w:r>
+          </w:p>
+        </w:tc>
+      </w:tr>
+      <w:tr>
+        <w:tc>
+          <w:tcPr>
+            <w:tcW w:type="dxa" w:w="2160"/>
+          </w:tcPr>
+          <w:p>
+            <w:r/>
+            <w:r>
+              <w:rPr>
+                <w:sz w:val="19"/>
+              </w:rPr>
+              <w:t>1.7</w:t>
+            </w:r>
+          </w:p>
+        </w:tc>
+        <w:tc>
+          <w:tcPr>
+            <w:tcW w:type="dxa" w:w="2160"/>
+          </w:tcPr>
+          <w:p>
+            <w:r/>
+            <w:r>
+              <w:rPr>
+                <w:sz w:val="19"/>
+              </w:rPr>
+              <w:t>15 July 2026</w:t>
+            </w:r>
+          </w:p>
+        </w:tc>
+        <w:tc>
+          <w:tcPr>
+            <w:tcW w:type="dxa" w:w="2160"/>
+          </w:tcPr>
+          <w:p>
+            <w:r/>
+            <w:r>
+              <w:rPr>
+                <w:sz w:val="19"/>
+              </w:rPr>
+              <w:t>Sixty-eight content slides migrated from the original 'Mastering OpenClaw' masterclass deck into Topic 2 as framed figures in their matching labs — agent evolution and Agent = Model + Harness, the OpenClaw Wikipedia history and OpenAI acquisition, deployment options and services, model stacks and Mission Control, channels, skills and ClawHub risks, tools (AgentMail, Agent Browser, Firecrawl), system prompt / workspace / context and memory, security lockdown, slash commands, crons, and use cases (NFT certificates, dashboard, cost saving, Google integration).</w:t>
             </w:r>
           </w:p>
         </w:tc>

</xml_diff>

<commit_message>
feat: blend the 68 imported masterclass figures into the dark theme (v1.8)
- Original title strips and copyright footers cropped; white canvases
  flood-filled to the deck background with grayscale text smoothly inverted
  to ivory (embedded screenshots and tiles untouched); frameless rendering
- Full-bleed white screenshots (Wikipedia, ClawHub, Firecrawl, deleted-email
  incident) intentionally keep the framed screenshot look
- ~16 slide titles reworded so no in-image title is duplicated
- Per-page crop overrides fix baked-in overlaps (Google-integration title,
  memory-search bubble, Hostinger/docs copyright strips)
- v1.7 archived; v1.8 (425 slides) with Document Version Control Record rows

Co-Authored-By: Claude Fable 5 <noreply@anthropic.com>
</commit_message>
<xml_diff>
--- a/courseware/LG-Human-AI Workforce with Autonomous AI Agents.docx
+++ b/courseware/LG-Human-AI Workforce with Autonomous AI Agents.docx
@@ -179,7 +179,7 @@
           <w:color w:val="1F6FEB"/>
           <w:sz w:val="24"/>
         </w:rPr>
-        <w:t>Version 1.7</w:t>
+        <w:t>Version 1.8</w:t>
       </w:r>
     </w:p>
     <w:p>
@@ -729,6 +729,64 @@
                 <w:sz w:val="19"/>
               </w:rPr>
               <w:t>Sixty-eight content slides migrated from the original 'Mastering OpenClaw' masterclass deck into Topic 2 as framed figures in their matching labs — agent evolution and Agent = Model + Harness, the OpenClaw Wikipedia history and OpenAI acquisition, deployment options and services, model stacks and Mission Control, channels, skills and ClawHub risks, tools (AgentMail, Agent Browser, Firecrawl), system prompt / workspace / context and memory, security lockdown, slash commands, crons, and use cases (NFT certificates, dashboard, cost saving, Google integration).</w:t>
+            </w:r>
+          </w:p>
+        </w:tc>
+        <w:tc>
+          <w:tcPr>
+            <w:tcW w:type="dxa" w:w="2160"/>
+          </w:tcPr>
+          <w:p>
+            <w:r/>
+            <w:r>
+              <w:rPr>
+                <w:sz w:val="19"/>
+              </w:rPr>
+              <w:t>Dr. Alfred Ang</w:t>
+            </w:r>
+          </w:p>
+        </w:tc>
+      </w:tr>
+      <w:tr>
+        <w:tc>
+          <w:tcPr>
+            <w:tcW w:type="dxa" w:w="2160"/>
+          </w:tcPr>
+          <w:p>
+            <w:r/>
+            <w:r>
+              <w:rPr>
+                <w:sz w:val="19"/>
+              </w:rPr>
+              <w:t>1.8</w:t>
+            </w:r>
+          </w:p>
+        </w:tc>
+        <w:tc>
+          <w:tcPr>
+            <w:tcW w:type="dxa" w:w="2160"/>
+          </w:tcPr>
+          <w:p>
+            <w:r/>
+            <w:r>
+              <w:rPr>
+                <w:sz w:val="19"/>
+              </w:rPr>
+              <w:t>15 July 2026</w:t>
+            </w:r>
+          </w:p>
+        </w:tc>
+        <w:tc>
+          <w:tcPr>
+            <w:tcW w:type="dxa" w:w="2160"/>
+          </w:tcPr>
+          <w:p>
+            <w:r/>
+            <w:r>
+              <w:rPr>
+                <w:sz w:val="19"/>
+              </w:rPr>
+              <w:t>Imported masterclass figures re-blended into the dark deck theme: original title and copyright strips cropped, white canvases converted to the deck background with text inverted to ivory (embedded screenshots untouched), frameless rendering, and duplicated titles reworded.</w:t>
             </w:r>
           </w:p>
         </w:tc>

</xml_diff>

<commit_message>
feat: trainer-curated deck + natural-language prompts beside every command (v1.9)
- Deck pruned to the trainer's v1.8 hand-edit, now encoded in the generator:
  9 kept masterclass figures (re-exported at 300 dpi, source titles/copyright
  cropped), Topic 2 opening story reordered ahead of Key Concepts, 137 unused
  figure assets removed
- 68 step slides now pair the CLI command with a "💬 Or just ask:" natural-
  language prompt box (29 Hermes + 39 OpenClaw), mirrored in the lab READMEs
  and carried into the Learner Guide (LG parser now keeps post-fence prompt
  lines)
- v1.8 archived (incl. the trainer-edit copy); v1.9 with version-control rows

Co-Authored-By: Claude Fable 5 <noreply@anthropic.com>
</commit_message>
<xml_diff>
--- a/courseware/LG-Human-AI Workforce with Autonomous AI Agents.docx
+++ b/courseware/LG-Human-AI Workforce with Autonomous AI Agents.docx
@@ -179,7 +179,7 @@
           <w:color w:val="1F6FEB"/>
           <w:sz w:val="24"/>
         </w:rPr>
-        <w:t>Version 1.8</w:t>
+        <w:t>Version 1.9</w:t>
       </w:r>
     </w:p>
     <w:p>
@@ -805,6 +805,64 @@
           </w:p>
         </w:tc>
       </w:tr>
+      <w:tr>
+        <w:tc>
+          <w:tcPr>
+            <w:tcW w:type="dxa" w:w="2160"/>
+          </w:tcPr>
+          <w:p>
+            <w:r/>
+            <w:r>
+              <w:rPr>
+                <w:sz w:val="19"/>
+              </w:rPr>
+              <w:t>1.9</w:t>
+            </w:r>
+          </w:p>
+        </w:tc>
+        <w:tc>
+          <w:tcPr>
+            <w:tcW w:type="dxa" w:w="2160"/>
+          </w:tcPr>
+          <w:p>
+            <w:r/>
+            <w:r>
+              <w:rPr>
+                <w:sz w:val="19"/>
+              </w:rPr>
+              <w:t>16 July 2026</w:t>
+            </w:r>
+          </w:p>
+        </w:tc>
+        <w:tc>
+          <w:tcPr>
+            <w:tcW w:type="dxa" w:w="2160"/>
+          </w:tcPr>
+          <w:p>
+            <w:r/>
+            <w:r>
+              <w:rPr>
+                <w:sz w:val="19"/>
+              </w:rPr>
+              <w:t>Deck curated per trainer review: the bulk masterclass figure imports were removed, keeping nine key figures (Wikipedia history, Agent=Model+Harness, SKILL.md, ClawHub, AgentMail, 10-steps lockdown, HEARTBEAT, autonomic tick, workspace persistence) re-exported at high resolution, with the Topic 2 opening story reordered ahead of Key Concepts. Every CLI step now also shows the natural-language prompt alternative ('Or just ask') across the Hermes and OpenClaw labs, in the deck and Learner Guide.</w:t>
+            </w:r>
+          </w:p>
+        </w:tc>
+        <w:tc>
+          <w:tcPr>
+            <w:tcW w:type="dxa" w:w="2160"/>
+          </w:tcPr>
+          <w:p>
+            <w:r/>
+            <w:r>
+              <w:rPr>
+                <w:sz w:val="19"/>
+              </w:rPr>
+              <w:t>Dr. Alfred Ang</w:t>
+            </w:r>
+          </w:p>
+        </w:tc>
+      </w:tr>
     </w:tbl>
     <w:p>
       <w:r>
@@ -840,7 +898,7 @@
         </w:rPr>
         <w:t>Introduction</w:t>
         <w:tab/>
-        <w:t>6</w:t>
+        <w:t>7</w:t>
       </w:r>
     </w:p>
     <w:p>
@@ -859,7 +917,7 @@
         </w:rPr>
         <w:t>Course Learning Outcomes</w:t>
         <w:tab/>
-        <w:t>6</w:t>
+        <w:t>7</w:t>
       </w:r>
     </w:p>
     <w:p>
@@ -878,7 +936,7 @@
         </w:rPr>
         <w:t>Before You Start — Environment Setup</w:t>
         <w:tab/>
-        <w:t>6</w:t>
+        <w:t>7</w:t>
       </w:r>
     </w:p>
     <w:p>
@@ -897,7 +955,7 @@
         </w:rPr>
         <w:t>Topic 01 — Hermes Agent — Your Autonomous Personal Chief-of-Staff  (33%)</w:t>
         <w:tab/>
-        <w:t>7</w:t>
+        <w:t>8</w:t>
       </w:r>
     </w:p>
     <w:p>
@@ -917,7 +975,7 @@
         </w:rPr>
         <w:t>Lab 1 — Install and Setup Hermes</w:t>
         <w:tab/>
-        <w:t>8</w:t>
+        <w:t>9</w:t>
       </w:r>
     </w:p>
     <w:p>
@@ -937,7 +995,7 @@
         </w:rPr>
         <w:t>Lab 2 — Deployment — Local Install &amp; Hermes Desktop App</w:t>
         <w:tab/>
-        <w:t>9</w:t>
+        <w:t>10</w:t>
       </w:r>
     </w:p>
     <w:p>
@@ -957,7 +1015,7 @@
         </w:rPr>
         <w:t>Lab 3 — Memory and Plugins</w:t>
         <w:tab/>
-        <w:t>10</w:t>
+        <w:t>11</w:t>
       </w:r>
     </w:p>
     <w:p>
@@ -977,7 +1035,7 @@
         </w:rPr>
         <w:t>Lab 4 — Skills</w:t>
         <w:tab/>
-        <w:t>11</w:t>
+        <w:t>12</w:t>
       </w:r>
     </w:p>
     <w:p>
@@ -997,7 +1055,7 @@
         </w:rPr>
         <w:t>Lab 5 — Providers &amp; Model</w:t>
         <w:tab/>
-        <w:t>12</w:t>
+        <w:t>13</w:t>
       </w:r>
     </w:p>
     <w:p>
@@ -1017,7 +1075,7 @@
         </w:rPr>
         <w:t>Lab 6 — MCP and Tools</w:t>
         <w:tab/>
-        <w:t>12</w:t>
+        <w:t>14</w:t>
       </w:r>
     </w:p>
     <w:p>
@@ -1037,7 +1095,7 @@
         </w:rPr>
         <w:t>Lab 7 — Cron Jobs &amp; Automation</w:t>
         <w:tab/>
-        <w:t>14</w:t>
+        <w:t>15</w:t>
       </w:r>
     </w:p>
     <w:p>
@@ -1057,7 +1115,7 @@
         </w:rPr>
         <w:t>Lab 8 — Subagents &amp; Delegation</w:t>
         <w:tab/>
-        <w:t>14</w:t>
+        <w:t>16</w:t>
       </w:r>
     </w:p>
     <w:p>
@@ -1077,7 +1135,7 @@
         </w:rPr>
         <w:t>Lab 9 — Profile and Kanban</w:t>
         <w:tab/>
-        <w:t>15</w:t>
+        <w:t>17</w:t>
       </w:r>
     </w:p>
     <w:p>
@@ -1097,7 +1155,7 @@
         </w:rPr>
         <w:t>Lab 10 — Security</w:t>
         <w:tab/>
-        <w:t>16</w:t>
+        <w:t>17</w:t>
       </w:r>
     </w:p>
     <w:p>
@@ -1117,7 +1175,7 @@
         </w:rPr>
         <w:t>Lab 11 — Use Case — Make a Video with Hyperframe</w:t>
         <w:tab/>
-        <w:t>17</w:t>
+        <w:t>19</w:t>
       </w:r>
     </w:p>
     <w:p>
@@ -1137,7 +1195,7 @@
         </w:rPr>
         <w:t>Lab 12 — Visualization</w:t>
         <w:tab/>
-        <w:t>19</w:t>
+        <w:t>20</w:t>
       </w:r>
     </w:p>
     <w:p>
@@ -1157,7 +1215,7 @@
         </w:rPr>
         <w:t>Lab 13 — Build a Multi-Agent Video Team (Profiles + Kanban)</w:t>
         <w:tab/>
-        <w:t>20</w:t>
+        <w:t>22</w:t>
       </w:r>
     </w:p>
     <w:p>
@@ -1177,7 +1235,7 @@
         </w:rPr>
         <w:t>Lab 14 — Webhook</w:t>
         <w:tab/>
-        <w:t>22</w:t>
+        <w:t>24</w:t>
       </w:r>
     </w:p>
     <w:p>
@@ -1196,7 +1254,7 @@
         </w:rPr>
         <w:t>Topic 02 — OpenClaw — Automating a Business Back-Office  (33%)</w:t>
         <w:tab/>
-        <w:t>24</w:t>
+        <w:t>26</w:t>
       </w:r>
     </w:p>
     <w:p>
@@ -1216,7 +1274,7 @@
         </w:rPr>
         <w:t>Lab 15 — Install OpenClaw</w:t>
         <w:tab/>
-        <w:t>24</w:t>
+        <w:t>26</w:t>
       </w:r>
     </w:p>
     <w:p>
@@ -1236,7 +1294,7 @@
         </w:rPr>
         <w:t>Lab 16 — Models &amp; Providers</w:t>
         <w:tab/>
-        <w:t>26</w:t>
+        <w:t>28</w:t>
       </w:r>
     </w:p>
     <w:p>
@@ -1256,7 +1314,7 @@
         </w:rPr>
         <w:t>Lab 17 — Channels</w:t>
         <w:tab/>
-        <w:t>28</w:t>
+        <w:t>30</w:t>
       </w:r>
     </w:p>
     <w:p>
@@ -1276,7 +1334,7 @@
         </w:rPr>
         <w:t>Lab 18 — Skills</w:t>
         <w:tab/>
-        <w:t>29</w:t>
+        <w:t>31</w:t>
       </w:r>
     </w:p>
     <w:p>
@@ -1296,7 +1354,7 @@
         </w:rPr>
         <w:t>Lab 19 — Tools &amp; Integrations</w:t>
         <w:tab/>
-        <w:t>31</w:t>
+        <w:t>33</w:t>
       </w:r>
     </w:p>
     <w:p>
@@ -1316,7 +1374,7 @@
         </w:rPr>
         <w:t>Lab 20 — Commands</w:t>
         <w:tab/>
-        <w:t>32</w:t>
+        <w:t>34</w:t>
       </w:r>
     </w:p>
     <w:p>
@@ -1336,7 +1394,7 @@
         </w:rPr>
         <w:t>Lab 21 — Cron Jobs &amp; Heartbeat</w:t>
         <w:tab/>
-        <w:t>34</w:t>
+        <w:t>36</w:t>
       </w:r>
     </w:p>
     <w:p>
@@ -1356,7 +1414,7 @@
         </w:rPr>
         <w:t>Lab 22 — Memory &amp; Context</w:t>
         <w:tab/>
-        <w:t>36</w:t>
+        <w:t>39</w:t>
       </w:r>
     </w:p>
     <w:p>
@@ -1376,7 +1434,7 @@
         </w:rPr>
         <w:t>Lab 23 — Security</w:t>
         <w:tab/>
-        <w:t>38</w:t>
+        <w:t>40</w:t>
       </w:r>
     </w:p>
     <w:p>
@@ -1396,7 +1454,7 @@
         </w:rPr>
         <w:t>Lab 24 — Multi-Agent Workforce</w:t>
         <w:tab/>
-        <w:t>39</w:t>
+        <w:t>42</w:t>
       </w:r>
     </w:p>
     <w:p>
@@ -1416,7 +1474,7 @@
         </w:rPr>
         <w:t>Lab 25 — Dreaming — Idle Reflection &amp; Self-Improvement</w:t>
         <w:tab/>
-        <w:t>42</w:t>
+        <w:t>45</w:t>
       </w:r>
     </w:p>
     <w:p>
@@ -1436,7 +1494,7 @@
         </w:rPr>
         <w:t>Lab 26 — Use Cases &amp; Key Functions</w:t>
         <w:tab/>
-        <w:t>43</w:t>
+        <w:t>46</w:t>
       </w:r>
     </w:p>
     <w:p>
@@ -1455,7 +1513,7 @@
         </w:rPr>
         <w:t>Topic 03 — Paperclip — Running &amp; Governing a Company of AI Agents  (34%)</w:t>
         <w:tab/>
-        <w:t>44</w:t>
+        <w:t>47</w:t>
       </w:r>
     </w:p>
     <w:p>
@@ -1475,7 +1533,7 @@
         </w:rPr>
         <w:t>Lab 27 — Install Paperclip on Windows &amp; Mac</w:t>
         <w:tab/>
-        <w:t>44</w:t>
+        <w:t>47</w:t>
       </w:r>
     </w:p>
     <w:p>
@@ -1495,7 +1553,7 @@
         </w:rPr>
         <w:t>Lab 28 — Setup Company, CEO &amp; Mission</w:t>
         <w:tab/>
-        <w:t>45</w:t>
+        <w:t>48</w:t>
       </w:r>
     </w:p>
     <w:p>
@@ -1515,7 +1573,7 @@
         </w:rPr>
         <w:t>Lab 29 — Setup Adaptor</w:t>
         <w:tab/>
-        <w:t>46</w:t>
+        <w:t>49</w:t>
       </w:r>
     </w:p>
     <w:p>
@@ -1535,7 +1593,7 @@
         </w:rPr>
         <w:t>Lab 30 — Create the Task Backlog</w:t>
         <w:tab/>
-        <w:t>47</w:t>
+        <w:t>50</w:t>
       </w:r>
     </w:p>
     <w:p>
@@ -1555,7 +1613,7 @@
         </w:rPr>
         <w:t>Lab 31 — Add the Tavily Search API</w:t>
         <w:tab/>
-        <w:t>49</w:t>
+        <w:t>51</w:t>
       </w:r>
     </w:p>
     <w:p>
@@ -1575,7 +1633,7 @@
         </w:rPr>
         <w:t>Lab 32 — Hire the Members Under the Hiring Task</w:t>
         <w:tab/>
-        <w:t>50</w:t>
+        <w:t>52</w:t>
       </w:r>
     </w:p>
     <w:p>
@@ -1594,7 +1652,7 @@
         </w:rPr>
         <w:t>Wrap-Up — The Agent Build Arc and Governance</w:t>
         <w:tab/>
-        <w:t>51</w:t>
+        <w:t>53</w:t>
       </w:r>
     </w:p>
     <w:p>
@@ -1613,7 +1671,7 @@
         </w:rPr>
         <w:t>Next Steps</w:t>
         <w:tab/>
-        <w:t>52</w:t>
+        <w:t>54</w:t>
       </w:r>
     </w:p>
     <w:p>
@@ -1632,7 +1690,7 @@
         </w:rPr>
         <w:t>Glossary</w:t>
         <w:tab/>
-        <w:t>52</w:t>
+        <w:t>55</w:t>
       </w:r>
     </w:p>
     <w:p>
@@ -2305,7 +2363,7 @@
         <w:t xml:space="preserve">5.  </w:t>
       </w:r>
       <w:r>
-        <w:t>Verify the local gateway is serving The gateway is the local service that both the CLI and Desktop app connect to. Confirm it is up and healthy:</w:t>
+        <w:t>Verify the local gateway is serving The gateway is the local service that both the CLI and Desktop app connect to. Confirm it is up and healthy: Or just ask the agent: "Check that your local gateway is up and serving"</w:t>
       </w:r>
     </w:p>
     <w:p>
@@ -2454,7 +2512,7 @@
         <w:t xml:space="preserve">2.  </w:t>
       </w:r>
       <w:r>
-        <w:t>Start a new session and confirm the preference is recalled Resume the conversation in a fresh session. The --continue flag brings back prior context so you can test cross-session recall:</w:t>
+        <w:t>Start a new session and confirm the preference is recalled Resume the conversation in a fresh session. The --continue flag brings back prior context so you can test cross-session recall: Or just ask the agent: "What summary style did I ask you to remember?"</w:t>
       </w:r>
     </w:p>
     <w:p>
@@ -2479,7 +2537,7 @@
         <w:t xml:space="preserve">3.  </w:t>
       </w:r>
       <w:r>
-        <w:t>Inspect stored memory / sessions List the stored sessions so you can see the memory Hermes is persisting behind the scenes:</w:t>
+        <w:t>Inspect stored memory / sessions List the stored sessions so you can see the memory Hermes is persisting behind the scenes: Or just ask the agent: "List my recent sessions and what each was about"</w:t>
       </w:r>
     </w:p>
     <w:p>
@@ -2593,7 +2651,7 @@
         <w:t xml:space="preserve">1.  </w:t>
       </w:r>
       <w:r>
-        <w:t>Browse the skills hub Open the skills catalogue to see what's available to install:</w:t>
+        <w:t>Browse the skills hub Open the skills catalogue to see what's available to install: Or just ask the agent: "Show me what skills are available on the skills hub"</w:t>
       </w:r>
     </w:p>
     <w:p>
@@ -2618,7 +2676,7 @@
         <w:t xml:space="preserve">2.  </w:t>
       </w:r>
       <w:r>
-        <w:t>Search for a skill by keyword Narrow the catalogue to something useful for a chief-of-staff agent — for example calendar, email, research, or pdf:</w:t>
+        <w:t>Search for a skill by keyword Narrow the catalogue to something useful for a chief-of-staff agent — for example calendar, email, research, or pdf: Or just ask the agent: "Search the skills hub for &lt;keyword&gt; skills"</w:t>
       </w:r>
     </w:p>
     <w:p>
@@ -2643,7 +2701,7 @@
         <w:t xml:space="preserve">3.  </w:t>
       </w:r>
       <w:r>
-        <w:t>Install a skill Install a skill by its full identifier (copy it from the search results). The pattern is owner/skills/name:</w:t>
+        <w:t>Install a skill Install a skill by its full identifier (copy it from the search results). The pattern is owner/skills/name: Or just ask the agent: "Install the &lt;name&gt; skill from the skills hub and confirm it loaded"</w:t>
       </w:r>
     </w:p>
     <w:p>
@@ -2772,7 +2830,7 @@
         <w:t xml:space="preserve">1.  </w:t>
       </w:r>
       <w:r>
-        <w:t>Open the interactive provider/model picker Launch the interactive picker to see available providers and models and select one:</w:t>
+        <w:t>Open the interactive provider/model picker Launch the interactive picker to see available providers and models and select one: Or just ask the agent: "Show me the available providers and models, and which one you're on"</w:t>
       </w:r>
     </w:p>
     <w:p>
@@ -2797,7 +2855,7 @@
         <w:t xml:space="preserve">2.  </w:t>
       </w:r>
       <w:r>
-        <w:t>Set a model explicitly Instead of (or in addition to) the picker, set the active model directly in config:</w:t>
+        <w:t>Set a model explicitly Instead of (or in addition to) the picker, set the active model directly in config: Or just ask the agent: "Switch yourself to Claude Opus 4.6"</w:t>
       </w:r>
     </w:p>
     <w:p>
@@ -2822,7 +2880,7 @@
         <w:t xml:space="preserve">3.  </w:t>
       </w:r>
       <w:r>
-        <w:t>Add a provider key if using a cloud endpoint If your chosen model runs on a cloud endpoint (e.g. OpenRouter), store the API key in config so Hermes can authenticate:</w:t>
+        <w:t>Add a provider key if using a cloud endpoint If your chosen model runs on a cloud endpoint (e.g. OpenRouter), store the API key in config so Hermes can authenticate: Or just ask the agent: "Add my OpenRouter API key to your provider config"</w:t>
       </w:r>
     </w:p>
     <w:p>
@@ -2847,7 +2905,7 @@
         <w:t xml:space="preserve">4.  </w:t>
       </w:r>
       <w:r>
-        <w:t>Confirm the active model meets the ≥64k context rule Reopen the picker to confirm the active model and its context window:</w:t>
+        <w:t>Confirm the active model meets the ≥64k context rule Reopen the picker to confirm the active model and its context window: Or just ask the agent: "Confirm your active model has at least a 64k context window"</w:t>
       </w:r>
     </w:p>
     <w:p>
@@ -2961,7 +3019,7 @@
         <w:t xml:space="preserve">2.  </w:t>
       </w:r>
       <w:r>
-        <w:t>Add a GitHub MCP server entry Add an entry that launches the official GitHub MCP server via npx. A typical block looks like this:</w:t>
+        <w:t>Add a GitHub MCP server entry Add an entry that launches the official GitHub MCP server via npx. A typical block looks like this: Or just ask the agent: "Add the GitHub MCP server to your tool config"</w:t>
       </w:r>
     </w:p>
     <w:p>
@@ -3036,7 +3094,7 @@
         <w:t xml:space="preserve">3.  </w:t>
       </w:r>
       <w:r>
-        <w:t>Restart so the MCP server is picked up, then verify Restart Hermes (close and reopen the TUI, or restart the gateway) so it reads the new config, then run the diagnostic:</w:t>
+        <w:t>Restart so the MCP server is picked up, then verify Restart Hermes (close and reopen the TUI, or restart the gateway) so it reads the new config, then run the diagnostic: Or just ask the agent: "Run a health check and confirm the GitHub MCP tools are loaded"</w:t>
       </w:r>
     </w:p>
     <w:p>
@@ -3180,7 +3238,7 @@
         <w:t xml:space="preserve">2.  </w:t>
       </w:r>
       <w:r>
-        <w:t>Confirm the automation is registered Run the diagnostic to confirm Hermes has picked up the new scheduled job:</w:t>
+        <w:t>Confirm the automation is registered Run the diagnostic to confirm Hermes has picked up the new scheduled job: Or just ask the agent: "Check that my daily 8am briefing automation is registered"</w:t>
       </w:r>
     </w:p>
     <w:p>
@@ -3324,7 +3382,7 @@
         <w:t xml:space="preserve">1.  </w:t>
       </w:r>
       <w:r>
-        <w:t>Choose an isolated backend for worker agents Set the terminal backend that worker subagents will run on. docker gives each worker an isolated container:</w:t>
+        <w:t>Choose an isolated backend for worker agents Set the terminal backend that worker subagents will run on. docker gives each worker an isolated container: Or just ask the agent: "Run your worker subagents in the docker sandbox from now on"</w:t>
       </w:r>
     </w:p>
     <w:p>
@@ -3632,7 +3690,7 @@
         <w:t xml:space="preserve">2.  </w:t>
       </w:r>
       <w:r>
-        <w:t>Isolate execution in a sandboxed backend Set the terminal backend to a sandboxed container so risky commands never run directly on your host:</w:t>
+        <w:t>Isolate execution in a sandboxed backend Set the terminal backend to a sandboxed container so risky commands never run directly on your host: Or just ask the agent: "Run your risky work in the docker sandbox from now on"</w:t>
       </w:r>
     </w:p>
     <w:p>
@@ -3657,7 +3715,7 @@
         <w:t xml:space="preserve">3.  </w:t>
       </w:r>
       <w:r>
-        <w:t>Store provider/tool secrets via config rather than plain text Store API keys through the Hermes config mechanism instead of pasting them into prompts or scripts:</w:t>
+        <w:t>Store provider/tool secrets via config rather than plain text Store API keys through the Hermes config mechanism instead of pasting them into prompts or scripts: Or just ask the agent: "Store this &lt;PROVIDER&gt; API key securely in your config"</w:t>
       </w:r>
     </w:p>
     <w:p>
@@ -3682,7 +3740,7 @@
         <w:t xml:space="preserve">4.  </w:t>
       </w:r>
       <w:r>
-        <w:t>Require approval before the agent runs risky actions — set the approval mode Set the approval mode so the agent pauses and asks you before executing sensitive actions (shell commands, file deletions, external posts):</w:t>
+        <w:t>Require approval before the agent runs risky actions — set the approval mode Set the approval mode so the agent pauses and asks you before executing sensitive actions (shell commands, file deletions, external posts): Or just ask the agent: "Ask me for approval before running any risky action"</w:t>
       </w:r>
     </w:p>
     <w:p>
@@ -3796,7 +3854,7 @@
         <w:t xml:space="preserve">1.  </w:t>
       </w:r>
       <w:r>
-        <w:t>Install / verify the Hyperframe video skill Wire Hyperframe into Athena the same way you added skills in Lab 4. In a terminal, search the skills hub for the Hyperframe (video) skill and install the match; if your build integrates Hyperframe as an MCP server or Tool Gateway tool instead, add it the way you added tools in Lab 6.</w:t>
+        <w:t>Install / verify the Hyperframe video skill Wire Hyperframe into Athena the same way you added skills in Lab 4. In a terminal, search the skills hub for the Hyperframe (video) skill and install the match; if your build integrates Hyperframe as an MCP server or Tool Gateway tool instead, add it the way you added tools in Lab 6. Or just ask the agent: "Find the Hyperframe video skill on the skills hub and install it"</w:t>
       </w:r>
     </w:p>
     <w:p>
@@ -3831,7 +3889,7 @@
         <w:t xml:space="preserve">2.  </w:t>
       </w:r>
       <w:r>
-        <w:t>Set the Hyperframe credential via config If Hyperframe needs an API key or account token, store it through Hermes config so it never sits in plain text. Get the key from your Hyperframe account page, then set it and confirm no error is printed.</w:t>
+        <w:t>Set the Hyperframe credential via config If Hyperframe needs an API key or account token, store it through Hermes config so it never sits in plain text. Get the key from your Hyperframe account page, then set it and confirm no error is printed. Or just ask the agent: "Save my Hyperframe API key securely in your config"</w:t>
       </w:r>
     </w:p>
     <w:p>
@@ -3856,7 +3914,7 @@
         <w:t xml:space="preserve">3.  </w:t>
       </w:r>
       <w:r>
-        <w:t>Confirm the tool is loaded, then start a session Run the health check and confirm it reports green with the new skill/tool listed. Then open a chat session (TUI or Desktop app) and ask Athena "What video tools do you have?" — it should name Hyperframe in its reply. If it doesn't, restart Hermes so the new tool is picked up.</w:t>
+        <w:t>Confirm the tool is loaded, then start a session Run the health check and confirm it reports green with the new skill/tool listed. Then open a chat session (TUI or Desktop app) and ask Athena "What video tools do you have?" — it should name Hyperframe in its reply. If it doesn't, restart Hermes so the new tool is picked up. Or just ask the agent: "Run a health check and confirm the Hyperframe skill is loaded"</w:t>
       </w:r>
     </w:p>
     <w:p>
@@ -3936,7 +3994,7 @@
         <w:t xml:space="preserve">7.  </w:t>
       </w:r>
       <w:r>
-        <w:t>Export / save the final video and note where the file lands Ask Athena to save/export the final cut and tell you the exact file path. Outputs typically land in the session's workspace under your Hermes home directory — open it and confirm the file plays from disk:</w:t>
+        <w:t>Export / save the final video and note where the file lands Ask Athena to save/export the final cut and tell you the exact file path. Outputs typically land in the session's workspace under your Hermes home directory — open it and confirm the file plays from disk: Or just ask the agent: "Where did you save the final video? Give me the file path"</w:t>
       </w:r>
     </w:p>
     <w:p>
@@ -4050,7 +4108,7 @@
         <w:t xml:space="preserve">2.  </w:t>
       </w:r>
       <w:r>
-        <w:t>List sessions and note the ID of the one to visualize In a terminal, list your recent sessions and copy the ID (or title/timestamp) of the session you just ran. You will visualize this specific session rather than "everything", which keeps the diagram readable.</w:t>
+        <w:t>List sessions and note the ID of the one to visualize In a terminal, list your recent sessions and copy the ID (or title/timestamp) of the session you just ran. You will visualize this specific session rather than "everything", which keeps the diagram readable. Or just ask the agent: "List my recent sessions so I can pick one to visualize"</w:t>
       </w:r>
     </w:p>
     <w:p>
@@ -4239,7 +4297,7 @@
         <w:t xml:space="preserve">2.  </w:t>
       </w:r>
       <w:r>
-        <w:t>Create the researcher profile Create the first profile on a long-context model (it will read sources whole). The --description text is what the orchestrator matches child tasks against, so type it exactly as designed:</w:t>
+        <w:t>Create the researcher profile Create the first profile on a long-context model (it will read sources whole). The --description text is what the orchestrator matches child tasks against, so type it exactly as designed: Or just ask the agent: "Create a researcher profile on a long-context model that writes video briefs"</w:t>
       </w:r>
     </w:p>
     <w:p>
@@ -4264,7 +4322,7 @@
         <w:t xml:space="preserve">3.  </w:t>
       </w:r>
       <w:r>
-        <w:t>Create the scriptwriter profile Create the second profile on a cheap model — turning a brief into a script is high-volume, low-difficulty work, so this is where you save money:</w:t>
+        <w:t>Create the scriptwriter profile Create the second profile on a cheap model — turning a brief into a script is high-volume, low-difficulty work, so this is where you save money: Or just ask the agent: "Create scriptwriter and video_producer profiles for the script and the render"</w:t>
       </w:r>
     </w:p>
     <w:p>
@@ -4329,7 +4387,7 @@
         <w:t xml:space="preserve">6.  </w:t>
       </w:r>
       <w:r>
-        <w:t>Create the Kanban board task Create the top-level task on the board and assign the first stage to the researcher. Pick a real topic you care about and keep the deliverable measurable ("60-second explainer video"):</w:t>
+        <w:t>Create the Kanban board task Create the top-level task on the board and assign the first stage to the researcher. Pick a real topic you care about and keep the deliverable measurable ("60-second explainer video"): Or just ask the agent: "Add a Kanban task: produce a 60-second explainer on &lt;topic&gt;, assign it to the researcher"</w:t>
       </w:r>
     </w:p>
     <w:p>
@@ -4354,7 +4412,7 @@
         <w:t xml:space="preserve">7.  </w:t>
       </w:r>
       <w:r>
-        <w:t>Decompose the task into child tasks Ask Hermes to break the top-level task into child tasks:</w:t>
+        <w:t>Decompose the task into child tasks Ask Hermes to break the top-level task into child tasks: Or just ask the agent: "Decompose that board task into child tasks and route each to the right profile"</w:t>
       </w:r>
     </w:p>
     <w:p>
@@ -4528,7 +4586,7 @@
         <w:t xml:space="preserve">1.  </w:t>
       </w:r>
       <w:r>
-        <w:t>Confirm the local gateway is serving Webhooks ride on the local gateway — if it isn't up, nothing can receive a request. Check its status and note the host/port it reports (typically localhost plus a port); that host/port is the base of your webhook URL.</w:t>
+        <w:t>Confirm the local gateway is serving Webhooks ride on the local gateway — if it isn't up, nothing can receive a request. Check its status and note the host/port it reports (typically localhost plus a port); that host/port is the base of your webhook URL. Or just ask the agent: "Check the gateway is up so webhooks can reach you"</w:t>
       </w:r>
     </w:p>
     <w:p>
@@ -4583,7 +4641,7 @@
         <w:t xml:space="preserve">4.  </w:t>
       </w:r>
       <w:r>
-        <w:t>Send a test payload with curl From a terminal, simulate an external system by POSTing a JSON payload to the endpoint. Replace &lt;endpoint-url&gt; with the URL you copied in step 4:</w:t>
+        <w:t>Send a test payload with curl From a terminal, simulate an external system by POSTing a JSON payload to the endpoint. Replace &lt;endpoint-url&gt; with the URL you copied in step 4: Or just ask the agent: "POST a test payload to the webhook endpoint and confirm a 2xx response"</w:t>
       </w:r>
     </w:p>
     <w:p>
@@ -4643,7 +4701,7 @@
         <w:t xml:space="preserve">6.  </w:t>
       </w:r>
       <w:r>
-        <w:t>Secure the endpoint, then re-send with the secret An open webhook lets anyone on the network drive your agent, so lock it down. On the webhook's settings, add a shared secret/token (and an IP allowlist if your build offers one), save, and re-send the test including the secret header — it should still return 2xx and trigger the agent:</w:t>
+        <w:t>Secure the endpoint, then re-send with the secret An open webhook lets anyone on the network drive your agent, so lock it down. On the webhook's settings, add a shared secret/token (and an IP allowlist if your build offers one), save, and re-send the test including the secret header — it should still return 2xx and trigger the agent: Or just ask the agent: "Re-send the test payload with the Bearer secret header and confirm it's accepted"</w:t>
       </w:r>
     </w:p>
     <w:p>
@@ -5269,7 +5327,7 @@
         <w:t xml:space="preserve">1.  </w:t>
       </w:r>
       <w:r>
-        <w:t>See what is available and what is currently selected.</w:t>
+        <w:t>See what is available and what is currently selected. Or just ask the agent: "Which models can you use, and which one is active right now?"</w:t>
       </w:r>
     </w:p>
     <w:p>
@@ -5374,7 +5432,7 @@
         <w:t xml:space="preserve">4.  </w:t>
       </w:r>
       <w:r>
-        <w:t>Option C — Anthropic (API key, Claude Opus 4.7). Get a key from &lt;https://console.anthropic.com/settings/keys&gt;:</w:t>
+        <w:t>Option C — Anthropic (API key, Claude Opus 4.7). Get a key from &lt;https://console.anthropic.com/settings/keys&gt;: Or just ask the agent: "Switch your model to Anthropic's Claude Opus 4.7" Or just ask the agent: "Say hello so I can confirm your model connection works"</w:t>
       </w:r>
     </w:p>
     <w:p>
@@ -5574,7 +5632,7 @@
         <w:t xml:space="preserve">8.  </w:t>
       </w:r>
       <w:r>
-        <w:t>Switch models and confirm the active one. You can hot-swap the global default at any time:</w:t>
+        <w:t>Switch models and confirm the active one. You can hot-swap the global default at any time: Or just ask the agent: "Make DeepSeek v4 your default model from now on"</w:t>
       </w:r>
     </w:p>
     <w:p>
@@ -5619,7 +5677,7 @@
         <w:t xml:space="preserve">9.  </w:t>
       </w:r>
       <w:r>
-        <w:t>Give the agent a Nimbus Supplies smoke test. With any model active, from the CLI chat (openclaw) ask: &gt; You are the back-office assistant for Nimbus Supplies, a small office-supplies reseller. In two sentences, introduce yourself to a customer. A sensible reply confirms the model is wired up.</w:t>
+        <w:t>Give the agent a Nimbus Supplies smoke test. With any model active, from the CLI chat (openclaw) ask: &gt; You are the back-office assistant for Nimbus Supplies, a small office-supplies reseller. In two sentences, introduce yourself to a customer. A sensible reply confirms the model is wired up. Or just ask the agent: "Introduce yourself in two sentences as the Nimbus Supplies back-office assistant"</w:t>
       </w:r>
     </w:p>
     <w:p>
@@ -5723,7 +5781,7 @@
         <w:t xml:space="preserve">2.  </w:t>
       </w:r>
       <w:r>
-        <w:t>Register and start the Telegram channel.</w:t>
+        <w:t>Register and start the Telegram channel. Or just ask the agent: "Connect Telegram using the bot token I got from BotFather" Or just ask the agent: "Start the Telegram channel and confirm it is live"</w:t>
       </w:r>
     </w:p>
     <w:p>
@@ -5773,7 +5831,7 @@
         <w:t xml:space="preserve">4.  </w:t>
       </w:r>
       <w:r>
-        <w:t>Add and start the WhatsApp channel.</w:t>
+        <w:t>Add and start the WhatsApp channel. Or just ask the agent: "Add WhatsApp as a channel and show me the pairing QR code" Or just ask the agent: "Start the WhatsApp channel so I can scan the QR code"</w:t>
       </w:r>
     </w:p>
     <w:p>
@@ -5823,7 +5881,7 @@
         <w:t xml:space="preserve">6.  </w:t>
       </w:r>
       <w:r>
-        <w:t>Confirm both channels are running at the same time. One gateway hosts many channels — the same Nimbus Supplies agent now answers on both.</w:t>
+        <w:t>Confirm both channels are running at the same time. One gateway hosts many channels — the same Nimbus Supplies agent now answers on both. Or just ask the agent: "Which channels are you listening on right now?"</w:t>
       </w:r>
     </w:p>
     <w:p>
@@ -5967,7 +6025,7 @@
         <w:t xml:space="preserve">1.  </w:t>
       </w:r>
       <w:r>
-        <w:t>List the skills currently installed.</w:t>
+        <w:t>List the skills currently installed. Or just ask the agent: "What skills do you have installed?"</w:t>
       </w:r>
     </w:p>
     <w:p>
@@ -5992,7 +6050,7 @@
         <w:t xml:space="preserve">2.  </w:t>
       </w:r>
       <w:r>
-        <w:t>Install a few useful skills from the registry. Skills come from &lt;https://skills.sh/&gt;:</w:t>
+        <w:t>Install a few useful skills from the registry. Skills come from &lt;https://skills.sh/&gt;: Or just ask the agent: "Install the web-research skill from the skills.sh registry"</w:t>
       </w:r>
     </w:p>
     <w:p>
@@ -6102,7 +6160,7 @@
         <w:t xml:space="preserve">6.  </w:t>
       </w:r>
       <w:r>
-        <w:t>Build a custom Nimbus Supplies skill. Skills live under ~/.openclaw/skills/. Create a folder and a skill definition. (File layout is shown here as a documented example — confirm the exact schema for your version at &lt;https://docs.openclaw.ai/&gt; before relying on advanced fields.)</w:t>
+        <w:t>Build a custom Nimbus Supplies skill. Skills live under ~/.openclaw/skills/. Create a folder and a skill definition. (File layout is shown here as a documented example — confirm the exact schema for your version at &lt;https://docs.openclaw.ai/&gt; before relying on advanced fields.) Or just ask the agent: "Create a new custom skill called nimbus-quote for drafting itemised customer quotes"</w:t>
       </w:r>
     </w:p>
     <w:p>
@@ -6127,7 +6185,7 @@
         <w:t xml:space="preserve">7.  </w:t>
       </w:r>
       <w:r>
-        <w:t>Register and test the custom skill.</w:t>
+        <w:t>Register and test the custom skill. Or just ask the agent: "Reload your skills so the new nimbus-quote skill is picked up"</w:t>
       </w:r>
     </w:p>
     <w:p>
@@ -6251,7 +6309,7 @@
         <w:t xml:space="preserve">1.  </w:t>
       </w:r>
       <w:r>
-        <w:t>Inspect the built-in tools first.</w:t>
+        <w:t>Inspect the built-in tools first. Or just ask the agent: "What tools do you have, grouped by category?"</w:t>
       </w:r>
     </w:p>
     <w:p>
@@ -6276,7 +6334,7 @@
         <w:t xml:space="preserve">2.  </w:t>
       </w:r>
       <w:r>
-        <w:t>Enable Firecrawl. Sign up at &lt;https://www.firecrawl.dev/&gt;, then Dashboard → API Keys → copy the fc-... key:</w:t>
+        <w:t>Enable Firecrawl. Sign up at &lt;https://www.firecrawl.dev/&gt;, then Dashboard → API Keys → copy the fc-... key: Or just ask the agent: "Enable the Firecrawl scraping tool with my API key"</w:t>
       </w:r>
     </w:p>
     <w:p>
@@ -6336,7 +6394,7 @@
         <w:t xml:space="preserve">4.  </w:t>
       </w:r>
       <w:r>
-        <w:t>Enable AgentMail. Create an inbox at &lt;https://agentmail.to/&gt;, copy the API key and inbox address:</w:t>
+        <w:t>Enable AgentMail. Create an inbox at &lt;https://agentmail.to/&gt;, copy the API key and inbox address: Or just ask the agent: "Set up AgentMail with my API key so you have your own inbox"</w:t>
       </w:r>
     </w:p>
     <w:p>
@@ -6431,7 +6489,7 @@
         <w:t xml:space="preserve">7.  </w:t>
       </w:r>
       <w:r>
-        <w:t>Scope tools per channel with profiles and allow/deny lists. Public channels should not run shell exec. Apply the safe messaging preset and lock down a public channel:</w:t>
+        <w:t>Scope tools per channel with profiles and allow/deny lists. Public channels should not run shell exec. Apply the safe messaging preset and lock down a public channel: Or just ask the agent: "On the Telegram channel, block shell command execution" Or just ask the agent: "On Telegram, allow only the web tool group"</w:t>
       </w:r>
     </w:p>
     <w:p>
@@ -6600,7 +6658,7 @@
         <w:t xml:space="preserve">1.  </w:t>
       </w:r>
       <w:r>
-        <w:t>openclaw config — read and change settings.</w:t>
+        <w:t>openclaw config — read and change settings. Or just ask the agent: "Show me your current configuration settings"</w:t>
       </w:r>
     </w:p>
     <w:p>
@@ -7093,7 +7151,7 @@
         <w:t xml:space="preserve">1.  </w:t>
       </w:r>
       <w:r>
-        <w:t>Create the nightly sales-report cron. Cron syntax is &lt;min&gt; &lt;hour&gt; &lt;day&gt; &lt;month&gt; &lt;weekday&gt;.</w:t>
+        <w:t>Create the nightly sales-report cron. Cron syntax is &lt;min&gt; &lt;hour&gt; &lt;day&gt; &lt;month&gt; &lt;weekday&gt;. Or just ask the agent: "Every night at 9pm, summarise today's customer chats and quotes and post it to Telegram"</w:t>
       </w:r>
     </w:p>
     <w:p>
@@ -7243,7 +7301,7 @@
         <w:t xml:space="preserve">3.  </w:t>
       </w:r>
       <w:r>
-        <w:t>List and inspect your crons.</w:t>
+        <w:t>List and inspect your crons. Or just ask the agent: "What cron jobs do you have scheduled?"</w:t>
       </w:r>
     </w:p>
     <w:p>
@@ -7288,7 +7346,7 @@
         <w:t xml:space="preserve">4.  </w:t>
       </w:r>
       <w:r>
-        <w:t>Fire a cron on demand to test it now (ignores the schedule):</w:t>
+        <w:t>Fire a cron on demand to test it now (ignores the schedule): Or just ask the agent: "Run the nightly sales report right now so I can check it works"</w:t>
       </w:r>
     </w:p>
     <w:p>
@@ -7358,7 +7416,7 @@
         <w:t xml:space="preserve">6.  </w:t>
       </w:r>
       <w:r>
-        <w:t>Enable the heartbeat. The heartbeat is a periodic self-check that verifies the gateway is alive, the model responds, and channels are connected; on failure the daemon attempts auto-restart and logs the incident.</w:t>
+        <w:t>Enable the heartbeat. The heartbeat is a periodic self-check that verifies the gateway is alive, the model responds, and channels are connected; on failure the daemon attempts auto-restart and logs the incident. Or just ask the agent: "Turn on your heartbeat self-check every 60 seconds" Or just ask the agent: "Is your heartbeat healthy? Give me the status"</w:t>
       </w:r>
     </w:p>
     <w:p>
@@ -7448,7 +7506,7 @@
         <w:t xml:space="preserve">8.  </w:t>
       </w:r>
       <w:r>
-        <w:t>Confirm auto-restart works. Ensure the daemon is installed to auto-start, then simulate a crash:</w:t>
+        <w:t>Confirm auto-restart works. Ensure the daemon is installed to auto-start, then simulate a crash: Or just ask the agent: "Shut down your gateway - I want to check the heartbeat restarts you"</w:t>
       </w:r>
     </w:p>
     <w:p>
@@ -7592,7 +7650,7 @@
         <w:t xml:space="preserve">1.  </w:t>
       </w:r>
       <w:r>
-        <w:t>See what OpenClaw stores on disk.</w:t>
+        <w:t>See what OpenClaw stores on disk. Or just ask the agent: "Show me what you store in your ~/.openclaw state folder"</w:t>
       </w:r>
     </w:p>
     <w:p>
@@ -7732,7 +7790,7 @@
         <w:t xml:space="preserve">7.  </w:t>
       </w:r>
       <w:r>
-        <w:t>Back up memory before major changes (memory lives under ~/.openclaw/, so the Lab 15 backup habit applies):</w:t>
+        <w:t>Back up memory before major changes (memory lives under ~/.openclaw/, so the Lab 15 backup habit applies): Or just ask the agent: "Back up all your memory and state to a dated folder in my home directory"</w:t>
       </w:r>
     </w:p>
     <w:p>
@@ -7886,7 +7944,7 @@
         <w:t xml:space="preserve">2.  </w:t>
       </w:r>
       <w:r>
-        <w:t>Restrict who can DM the bot (allowlists). By default anyone who finds your Telegram bot can message it. Lock it to known users:</w:t>
+        <w:t>Restrict who can DM the bot (allowlists). By default anyone who finds your Telegram bot can message it. Lock it to known users: Or just ask the agent: "Only allow Telegram users 12345678 and 87654321 to message you; block everyone else"</w:t>
       </w:r>
     </w:p>
     <w:p>
@@ -7931,7 +7989,7 @@
         <w:t xml:space="preserve">3.  </w:t>
       </w:r>
       <w:r>
-        <w:t>Apply tool deny lists (least privilege per channel). A customer-facing channel has no business running shell commands or deleting files:</w:t>
+        <w:t>Apply tool deny lists (least privilege per channel). A customer-facing channel has no business running shell commands or deleting files: Or just ask the agent: "On Telegram, deny shell exec and any file writes or deletes"</w:t>
       </w:r>
     </w:p>
     <w:p>
@@ -7986,7 +8044,7 @@
         <w:t xml:space="preserve">4.  </w:t>
       </w:r>
       <w:r>
-        <w:t>Tighten the code-execution sandbox. The exec / Python tools run sandboxed — cap time, memory, and network:</w:t>
+        <w:t>Tighten the code-execution sandbox. The exec / Python tools run sandboxed — cap time, memory, and network: Or just ask the agent: "Cap your exec sandbox at 10 seconds, 256MB memory and no network access"</w:t>
       </w:r>
     </w:p>
     <w:p>
@@ -8234,7 +8292,7 @@
         <w:t xml:space="preserve">1.  </w:t>
       </w:r>
       <w:r>
-        <w:t>Create three named agents. Attempt the native multi-agent path first (confirm exact syntax in the docs):</w:t>
+        <w:t>Create three named agents. Attempt the native multi-agent path first (confirm exact syntax in the docs): Or just ask the agent: "Create a new agent named Sales to handle customer-facing chats"</w:t>
       </w:r>
     </w:p>
     <w:p>
@@ -8289,7 +8347,7 @@
         <w:t xml:space="preserve">2.  </w:t>
       </w:r>
       <w:r>
-        <w:t>Give each agent least-privilege tools (mirrors Lab 19/23 allow-deny, applied per agent):</w:t>
+        <w:t>Give each agent least-privilege tools (mirrors Lab 19/23 allow-deny, applied per agent): Or just ask the agent: "Give the Sales agent web and quoting tools only, with no shell or file writes" Or just ask the agent: "Restrict the Research agent to Firecrawl, web search and browser only"</w:t>
       </w:r>
     </w:p>
     <w:p>
@@ -8382,7 +8440,7 @@
         <w:t xml:space="preserve">3.  </w:t>
       </w:r>
       <w:r>
-        <w:t>Attach channels to the right agents.</w:t>
+        <w:t>Attach channels to the right agents. Or just ask the agent: "Route the Telegram channel to the Sales agent"</w:t>
       </w:r>
     </w:p>
     <w:p>
@@ -8491,7 +8549,7 @@
         <w:t xml:space="preserve">5.  </w:t>
       </w:r>
       <w:r>
-        <w:t>Wire cooperation between agents. The simplest, robust hand-off uses the tools you already have: - Sales → Ops: when Sales captures an order, it asks Ops (via a shared note file or an AgentMail message) to produce and send the quote. - Ops → Research: when a price is unknown ("TBC"), Ops asks Research to look it up with Firecrawl. - Research → Ops: Research replies with the price; Ops finalises the quote email.</w:t>
+        <w:t>Wire cooperation between agents. The simplest, robust hand-off uses the tools you already have: - Sales → Ops: when Sales captures an order, it asks Ops (via a shared note file or an AgentMail message) to produce and send the quote. - Ops → Research: when a price is unknown ("TBC"), Ops asks Research to look it up with Firecrawl. - Research → Ops: Research replies with the price; Ops finalises the quote email. Or just ask the agent: "Every night at 9pm, compile today's orders and quotes and post them to Telegram"</w:t>
       </w:r>
     </w:p>
     <w:p>
@@ -8705,7 +8763,7 @@
         <w:t xml:space="preserve">1.  </w:t>
       </w:r>
       <w:r>
-        <w:t>Enable the dreaming feature in OpenClaw config. This flips the setting that lets the gateway schedule reflection cycles when the agent is idle:</w:t>
+        <w:t>Enable the dreaming feature in OpenClaw config. This flips the setting that lets the gateway schedule reflection cycles when the agent is idle: Or just ask the agent: "Turn on dreaming so you reflect and consolidate memory when idle"</w:t>
       </w:r>
     </w:p>
     <w:p>
@@ -8730,7 +8788,7 @@
         <w:t xml:space="preserve">2.  </w:t>
       </w:r>
       <w:r>
-        <w:t>Let the agent sit idle so a dream cycle runs — or trigger one manually. Rather than wait for a natural idle window, force a cycle now so you can observe it immediately:</w:t>
+        <w:t>Let the agent sit idle so a dream cycle runs — or trigger one manually. Rather than wait for a natural idle window, force a cycle now so you can observe it immediately: Or just ask the agent: "Run a dream cycle now instead of waiting for idle time"</w:t>
       </w:r>
     </w:p>
     <w:p>
@@ -8755,7 +8813,7 @@
         <w:t xml:space="preserve">3.  </w:t>
       </w:r>
       <w:r>
-        <w:t>Review what the dream produced. List the insights, follow-ups, and skill suggestions the cycle generated:</w:t>
+        <w:t>Review what the dream produced. List the insights, follow-ups, and skill suggestions the cycle generated: Or just ask the agent: "Show me the insights and follow-ups from your last dream"</w:t>
       </w:r>
     </w:p>
     <w:p>

</xml_diff>

<commit_message>
feat: RAG concept slide, PP v4 evidence, LG alignment fixes (v1.10)
- New "RAG vs a Standard LLM Assistant" two-column concept slide in Core
  Concepts, grounding WA Q2 (K2) in the deck
- PP assessment bumped to v4 (Drive-only, never in git): Task 1 evidence is a
  Hermes-on-Telegram or multi-agent-Kanban screenshot; Task 2 OpenClaw on
  Telegram or the TUI; Task 3 the Paperclip setup (mission, CEO, hired
  agents); Topic 3 lab references refreshed
- LG: lab count corrected to 32; lab note paths now labs/labNN-*/README.md
- Full final alignment audit passed (deck 350 slides · LP · LG · 32 labs ·
  WA v3 · PP v4); v1.9 archived

Co-Authored-By: Claude Fable 5 <noreply@anthropic.com>
</commit_message>
<xml_diff>
--- a/courseware/LG-Human-AI Workforce with Autonomous AI Agents.docx
+++ b/courseware/LG-Human-AI Workforce with Autonomous AI Agents.docx
@@ -179,7 +179,7 @@
           <w:color w:val="1F6FEB"/>
           <w:sz w:val="24"/>
         </w:rPr>
-        <w:t>Version 1.9</w:t>
+        <w:t>Version 1.10</w:t>
       </w:r>
     </w:p>
     <w:p>
@@ -863,6 +863,64 @@
           </w:p>
         </w:tc>
       </w:tr>
+      <w:tr>
+        <w:tc>
+          <w:tcPr>
+            <w:tcW w:type="dxa" w:w="2160"/>
+          </w:tcPr>
+          <w:p>
+            <w:r/>
+            <w:r>
+              <w:rPr>
+                <w:sz w:val="19"/>
+              </w:rPr>
+              <w:t>1.10</w:t>
+            </w:r>
+          </w:p>
+        </w:tc>
+        <w:tc>
+          <w:tcPr>
+            <w:tcW w:type="dxa" w:w="2160"/>
+          </w:tcPr>
+          <w:p>
+            <w:r/>
+            <w:r>
+              <w:rPr>
+                <w:sz w:val="19"/>
+              </w:rPr>
+              <w:t>16 July 2026</w:t>
+            </w:r>
+          </w:p>
+        </w:tc>
+        <w:tc>
+          <w:tcPr>
+            <w:tcW w:type="dxa" w:w="2160"/>
+          </w:tcPr>
+          <w:p>
+            <w:r/>
+            <w:r>
+              <w:rPr>
+                <w:sz w:val="19"/>
+              </w:rPr>
+              <w:t>PP assessment updated to v4 — evidence screenshots changed to: Task 1 Hermes interacting on Telegram or the multi-agent Kanban board; Task 2 OpenClaw on Telegram or the TUI; Task 3 the Paperclip setup (company, mission, CEO, hired agents) — with Topic 3 lab references refreshed. A 'RAG vs a Standard LLM Assistant' concept slide added to Core Concepts to ground WA Q2. Final PPT/LP/LG/labs/assessment alignment review.</w:t>
+            </w:r>
+          </w:p>
+        </w:tc>
+        <w:tc>
+          <w:tcPr>
+            <w:tcW w:type="dxa" w:w="2160"/>
+          </w:tcPr>
+          <w:p>
+            <w:r/>
+            <w:r>
+              <w:rPr>
+                <w:sz w:val="19"/>
+              </w:rPr>
+              <w:t>Dr. Alfred Ang</w:t>
+            </w:r>
+          </w:p>
+        </w:tc>
+      </w:tr>
     </w:tbl>
     <w:p>
       <w:r>
@@ -1708,7 +1766,7 @@
     </w:p>
     <w:p>
       <w:r>
-        <w:t>This Learner Guide accompanies the WSQ course Build a Human-AI Workforce with Autonomous AI Agents (TGS-2024043854), conducted by Tertiary Infotech Academy Pte Ltd. It provides step-by-step instructions for all 34 hands-on labs across three autonomous-AI-agent platforms — Hermes Agent, OpenClaw and Paperclip — organised into three topics. Each platform builds on the same skillset: install the runtime, connect models and channels, give the agent memory, extend it with skills and tools, automate it with schedules, secure it with governance, and finally orchestrate multiple agents to deliver a realistic business outcome.</w:t>
+        <w:t>This Learner Guide accompanies the WSQ course Build a Human-AI Workforce with Autonomous AI Agents (TGS-2024043854), conducted by Tertiary Infotech Academy Pte Ltd. It provides step-by-step instructions for all 32 hands-on labs across three autonomous-AI-agent platforms — Hermes Agent, OpenClaw and Paperclip — organised into three topics. Each platform builds on the same skillset: install the runtime, connect models and channels, give the agent memory, extend it with skills and tools, automate it with schedules, secure it with governance, and finally orchestrate multiple agents to deliver a realistic business outcome.</w:t>
       </w:r>
     </w:p>
     <w:p>
@@ -2234,7 +2292,7 @@
         <w:rPr>
           <w:sz w:val="20"/>
         </w:rPr>
-        <w:t>Full commands and screenshots are in labs/lab-01-*.md. Use only accounts, keys and hosts you own, and keep agents under human oversight.</w:t>
+        <w:t>Full commands and screenshots are in labs/lab01-*/README.md. Use only accounts, keys and hosts you own, and keep agents under human oversight.</w:t>
       </w:r>
     </w:p>
     <w:p/>
@@ -2428,7 +2486,7 @@
         <w:rPr>
           <w:sz w:val="20"/>
         </w:rPr>
-        <w:t>Full commands and screenshots are in labs/lab-02-*.md. Use only accounts, keys and hosts you own, and keep agents under human oversight.</w:t>
+        <w:t>Full commands and screenshots are in labs/lab02-*/README.md. Use only accounts, keys and hosts you own, and keep agents under human oversight.</w:t>
       </w:r>
     </w:p>
     <w:p/>
@@ -2592,7 +2650,7 @@
         <w:rPr>
           <w:sz w:val="20"/>
         </w:rPr>
-        <w:t>Full commands and screenshots are in labs/lab-03-*.md. Use only accounts, keys and hosts you own, and keep agents under human oversight.</w:t>
+        <w:t>Full commands and screenshots are in labs/lab03-*/README.md. Use only accounts, keys and hosts you own, and keep agents under human oversight.</w:t>
       </w:r>
     </w:p>
     <w:p/>
@@ -2771,7 +2829,7 @@
         <w:rPr>
           <w:sz w:val="20"/>
         </w:rPr>
-        <w:t>Full commands and screenshots are in labs/lab-04-*.md. Use only accounts, keys and hosts you own, and keep agents under human oversight.</w:t>
+        <w:t>Full commands and screenshots are in labs/lab04-*/README.md. Use only accounts, keys and hosts you own, and keep agents under human oversight.</w:t>
       </w:r>
     </w:p>
     <w:p/>
@@ -2945,7 +3003,7 @@
         <w:rPr>
           <w:sz w:val="20"/>
         </w:rPr>
-        <w:t>Full commands and screenshots are in labs/lab-05-*.md. Use only accounts, keys and hosts you own, and keep agents under human oversight.</w:t>
+        <w:t>Full commands and screenshots are in labs/lab05-*/README.md. Use only accounts, keys and hosts you own, and keep agents under human oversight.</w:t>
       </w:r>
     </w:p>
     <w:p/>
@@ -3164,7 +3222,7 @@
         <w:rPr>
           <w:sz w:val="20"/>
         </w:rPr>
-        <w:t>Full commands and screenshots are in labs/lab-06-*.md. Use only accounts, keys and hosts you own, and keep agents under human oversight.</w:t>
+        <w:t>Full commands and screenshots are in labs/lab06-*/README.md. Use only accounts, keys and hosts you own, and keep agents under human oversight.</w:t>
       </w:r>
     </w:p>
     <w:p/>
@@ -3323,7 +3381,7 @@
         <w:rPr>
           <w:sz w:val="20"/>
         </w:rPr>
-        <w:t>Full commands and screenshots are in labs/lab-07-*.md. Use only accounts, keys and hosts you own, and keep agents under human oversight.</w:t>
+        <w:t>Full commands and screenshots are in labs/lab07-*/README.md. Use only accounts, keys and hosts you own, and keep agents under human oversight.</w:t>
       </w:r>
     </w:p>
     <w:p/>
@@ -3482,7 +3540,7 @@
         <w:rPr>
           <w:sz w:val="20"/>
         </w:rPr>
-        <w:t>Full commands and screenshots are in labs/lab-08-*.md. Use only accounts, keys and hosts you own, and keep agents under human oversight.</w:t>
+        <w:t>Full commands and screenshots are in labs/lab08-*/README.md. Use only accounts, keys and hosts you own, and keep agents under human oversight.</w:t>
       </w:r>
     </w:p>
     <w:p/>
@@ -3616,7 +3674,7 @@
         <w:rPr>
           <w:sz w:val="20"/>
         </w:rPr>
-        <w:t>Full commands and screenshots are in labs/lab-09-*.md. Use only accounts, keys and hosts you own, and keep agents under human oversight.</w:t>
+        <w:t>Full commands and screenshots are in labs/lab09-*/README.md. Use only accounts, keys and hosts you own, and keep agents under human oversight.</w:t>
       </w:r>
     </w:p>
     <w:p/>
@@ -3795,7 +3853,7 @@
         <w:rPr>
           <w:sz w:val="20"/>
         </w:rPr>
-        <w:t>Full commands and screenshots are in labs/lab-10-*.md. Use only accounts, keys and hosts you own, and keep agents under human oversight.</w:t>
+        <w:t>Full commands and screenshots are in labs/lab10-*/README.md. Use only accounts, keys and hosts you own, and keep agents under human oversight.</w:t>
       </w:r>
     </w:p>
     <w:p/>
@@ -4034,7 +4092,7 @@
         <w:rPr>
           <w:sz w:val="20"/>
         </w:rPr>
-        <w:t>Full commands and screenshots are in labs/lab-11-*.md. Use only accounts, keys and hosts you own, and keep agents under human oversight.</w:t>
+        <w:t>Full commands and screenshots are in labs/lab11-*/README.md. Use only accounts, keys and hosts you own, and keep agents under human oversight.</w:t>
       </w:r>
     </w:p>
     <w:p/>
@@ -4223,7 +4281,7 @@
         <w:rPr>
           <w:sz w:val="20"/>
         </w:rPr>
-        <w:t>Full commands and screenshots are in labs/lab-12-*.md. Use only accounts, keys and hosts you own, and keep agents under human oversight.</w:t>
+        <w:t>Full commands and screenshots are in labs/lab12-*/README.md. Use only accounts, keys and hosts you own, and keep agents under human oversight.</w:t>
       </w:r>
     </w:p>
     <w:p/>
@@ -4527,7 +4585,7 @@
         <w:rPr>
           <w:sz w:val="20"/>
         </w:rPr>
-        <w:t>Full commands and screenshots are in labs/lab-13-*.md. Use only accounts, keys and hosts you own, and keep agents under human oversight.</w:t>
+        <w:t>Full commands and screenshots are in labs/lab13-*/README.md. Use only accounts, keys and hosts you own, and keep agents under human oversight.</w:t>
       </w:r>
     </w:p>
     <w:p/>
@@ -4786,7 +4844,7 @@
         <w:rPr>
           <w:sz w:val="20"/>
         </w:rPr>
-        <w:t>Full commands and screenshots are in labs/lab-14-*.md. Use only accounts, keys and hosts you own, and keep agents under human oversight.</w:t>
+        <w:t>Full commands and screenshots are in labs/lab14-*/README.md. Use only accounts, keys and hosts you own, and keep agents under human oversight.</w:t>
       </w:r>
     </w:p>
     <w:p/>
@@ -5268,7 +5326,7 @@
         <w:rPr>
           <w:sz w:val="20"/>
         </w:rPr>
-        <w:t>Full commands and screenshots are in labs/lab-15-*.md. Use only accounts, keys and hosts you own, and keep agents under human oversight.</w:t>
+        <w:t>Full commands and screenshots are in labs/lab15-*/README.md. Use only accounts, keys and hosts you own, and keep agents under human oversight.</w:t>
       </w:r>
     </w:p>
     <w:p/>
@@ -5707,7 +5765,7 @@
         <w:rPr>
           <w:sz w:val="20"/>
         </w:rPr>
-        <w:t>Full commands and screenshots are in labs/lab-16-*.md. Use only accounts, keys and hosts you own, and keep agents under human oversight.</w:t>
+        <w:t>Full commands and screenshots are in labs/lab16-*/README.md. Use only accounts, keys and hosts you own, and keep agents under human oversight.</w:t>
       </w:r>
     </w:p>
     <w:p/>
@@ -5966,7 +6024,7 @@
         <w:rPr>
           <w:sz w:val="20"/>
         </w:rPr>
-        <w:t>Full commands and screenshots are in labs/lab-17-*.md. Use only accounts, keys and hosts you own, and keep agents under human oversight.</w:t>
+        <w:t>Full commands and screenshots are in labs/lab17-*/README.md. Use only accounts, keys and hosts you own, and keep agents under human oversight.</w:t>
       </w:r>
     </w:p>
     <w:p/>
@@ -6250,7 +6308,7 @@
         <w:rPr>
           <w:sz w:val="20"/>
         </w:rPr>
-        <w:t>Full commands and screenshots are in labs/lab-18-*.md. Use only accounts, keys and hosts you own, and keep agents under human oversight.</w:t>
+        <w:t>Full commands and screenshots are in labs/lab18-*/README.md. Use only accounts, keys and hosts you own, and keep agents under human oversight.</w:t>
       </w:r>
     </w:p>
     <w:p/>
@@ -6599,7 +6657,7 @@
         <w:rPr>
           <w:sz w:val="20"/>
         </w:rPr>
-        <w:t>Full commands and screenshots are in labs/lab-19-*.md. Use only accounts, keys and hosts you own, and keep agents under human oversight.</w:t>
+        <w:t>Full commands and screenshots are in labs/lab19-*/README.md. Use only accounts, keys and hosts you own, and keep agents under human oversight.</w:t>
       </w:r>
     </w:p>
     <w:p/>
@@ -7092,7 +7150,7 @@
         <w:rPr>
           <w:sz w:val="20"/>
         </w:rPr>
-        <w:t>Full commands and screenshots are in labs/lab-20-*.md. Use only accounts, keys and hosts you own, and keep agents under human oversight.</w:t>
+        <w:t>Full commands and screenshots are in labs/lab20-*/README.md. Use only accounts, keys and hosts you own, and keep agents under human oversight.</w:t>
       </w:r>
     </w:p>
     <w:p/>
@@ -7591,7 +7649,7 @@
         <w:rPr>
           <w:sz w:val="20"/>
         </w:rPr>
-        <w:t>Full commands and screenshots are in labs/lab-21-*.md. Use only accounts, keys and hosts you own, and keep agents under human oversight.</w:t>
+        <w:t>Full commands and screenshots are in labs/lab21-*/README.md. Use only accounts, keys and hosts you own, and keep agents under human oversight.</w:t>
       </w:r>
     </w:p>
     <w:p/>
@@ -7840,7 +7898,7 @@
         <w:rPr>
           <w:sz w:val="20"/>
         </w:rPr>
-        <w:t>Full commands and screenshots are in labs/lab-22-*.md. Use only accounts, keys and hosts you own, and keep agents under human oversight.</w:t>
+        <w:t>Full commands and screenshots are in labs/lab22-*/README.md. Use only accounts, keys and hosts you own, and keep agents under human oversight.</w:t>
       </w:r>
     </w:p>
     <w:p/>
@@ -8233,7 +8291,7 @@
         <w:rPr>
           <w:sz w:val="20"/>
         </w:rPr>
-        <w:t>Full commands and screenshots are in labs/lab-23-*.md. Use only accounts, keys and hosts you own, and keep agents under human oversight.</w:t>
+        <w:t>Full commands and screenshots are in labs/lab23-*/README.md. Use only accounts, keys and hosts you own, and keep agents under human oversight.</w:t>
       </w:r>
     </w:p>
     <w:p/>
@@ -8704,7 +8762,7 @@
         <w:rPr>
           <w:sz w:val="20"/>
         </w:rPr>
-        <w:t>Full commands and screenshots are in labs/lab-24-*.md. Use only accounts, keys and hosts you own, and keep agents under human oversight.</w:t>
+        <w:t>Full commands and screenshots are in labs/lab24-*/README.md. Use only accounts, keys and hosts you own, and keep agents under human oversight.</w:t>
       </w:r>
     </w:p>
     <w:p/>
@@ -8868,7 +8926,7 @@
         <w:rPr>
           <w:sz w:val="20"/>
         </w:rPr>
-        <w:t>Full commands and screenshots are in labs/lab-25-*.md. Use only accounts, keys and hosts you own, and keep agents under human oversight.</w:t>
+        <w:t>Full commands and screenshots are in labs/lab25-*/README.md. Use only accounts, keys and hosts you own, and keep agents under human oversight.</w:t>
       </w:r>
     </w:p>
     <w:p/>
@@ -9017,7 +9075,7 @@
         <w:rPr>
           <w:sz w:val="20"/>
         </w:rPr>
-        <w:t>Full commands and screenshots are in labs/lab-26-*.md. Use only accounts, keys and hosts you own, and keep agents under human oversight.</w:t>
+        <w:t>Full commands and screenshots are in labs/lab26-*/README.md. Use only accounts, keys and hosts you own, and keep agents under human oversight.</w:t>
       </w:r>
     </w:p>
     <w:p/>
@@ -9236,7 +9294,7 @@
         <w:rPr>
           <w:sz w:val="20"/>
         </w:rPr>
-        <w:t>Full commands and screenshots are in labs/lab-27-*.md. Use only accounts, keys and hosts you own, and keep agents under human oversight.</w:t>
+        <w:t>Full commands and screenshots are in labs/lab27-*/README.md. Use only accounts, keys and hosts you own, and keep agents under human oversight.</w:t>
       </w:r>
     </w:p>
     <w:p/>
@@ -9385,7 +9443,7 @@
         <w:rPr>
           <w:sz w:val="20"/>
         </w:rPr>
-        <w:t>Full commands and screenshots are in labs/lab-28-*.md. Use only accounts, keys and hosts you own, and keep agents under human oversight.</w:t>
+        <w:t>Full commands and screenshots are in labs/lab28-*/README.md. Use only accounts, keys and hosts you own, and keep agents under human oversight.</w:t>
       </w:r>
     </w:p>
     <w:p/>
@@ -9544,7 +9602,7 @@
         <w:rPr>
           <w:sz w:val="20"/>
         </w:rPr>
-        <w:t>Full commands and screenshots are in labs/lab-29-*.md. Use only accounts, keys and hosts you own, and keep agents under human oversight.</w:t>
+        <w:t>Full commands and screenshots are in labs/lab29-*/README.md. Use only accounts, keys and hosts you own, and keep agents under human oversight.</w:t>
       </w:r>
     </w:p>
     <w:p/>
@@ -9708,7 +9766,7 @@
         <w:rPr>
           <w:sz w:val="20"/>
         </w:rPr>
-        <w:t>Full commands and screenshots are in labs/lab-30-*.md. Use only accounts, keys and hosts you own, and keep agents under human oversight.</w:t>
+        <w:t>Full commands and screenshots are in labs/lab30-*/README.md. Use only accounts, keys and hosts you own, and keep agents under human oversight.</w:t>
       </w:r>
     </w:p>
     <w:p/>
@@ -9857,7 +9915,7 @@
         <w:rPr>
           <w:sz w:val="20"/>
         </w:rPr>
-        <w:t>Full commands and screenshots are in labs/lab-31-*.md. Use only accounts, keys and hosts you own, and keep agents under human oversight.</w:t>
+        <w:t>Full commands and screenshots are in labs/lab31-*/README.md. Use only accounts, keys and hosts you own, and keep agents under human oversight.</w:t>
       </w:r>
     </w:p>
     <w:p/>
@@ -10006,7 +10064,7 @@
         <w:rPr>
           <w:sz w:val="20"/>
         </w:rPr>
-        <w:t>Full commands and screenshots are in labs/lab-32-*.md. Use only accounts, keys and hosts you own, and keep agents under human oversight.</w:t>
+        <w:t>Full commands and screenshots are in labs/lab32-*/README.md. Use only accounts, keys and hosts you own, and keep agents under human oversight.</w:t>
       </w:r>
     </w:p>
     <w:p/>

</xml_diff>

<commit_message>
feat: Altera AI Blogs use case, expanded Labs 29/32, new Lab 33 daily routine (v1.11)
- Topic 3 company renamed to Altera AI Blogs; mission re-pointed at publishing
  AI-related blogs end to end; core backlog task is now "Hire the agents to
  publish the AI-related blogs end to end", with Lab 32's hiring happening
  explicitly under it (research analyst, blog writer, editor/publisher,
  SEO/marketer)
- Lab 29 (Setup Adaptor) and Lab 32 descriptions written out in full on the
  overview slides and LG; activity_overview now auto-fits long descriptions
- NEW Lab 33 "Routine & Trigger — Publish Daily at 3pm" (33 labs total),
  verified with a live "Run now" pipeline test on the trainer's Paperclip
  (routine fired; stage tasks executed live) — two live screenshots on slides
- LG/LP regenerated in lockstep; v1.10 archived

Co-Authored-By: Claude Fable 5 <noreply@anthropic.com>
</commit_message>
<xml_diff>
--- a/courseware/LG-Human-AI Workforce with Autonomous AI Agents.docx
+++ b/courseware/LG-Human-AI Workforce with Autonomous AI Agents.docx
@@ -179,7 +179,7 @@
           <w:color w:val="1F6FEB"/>
           <w:sz w:val="24"/>
         </w:rPr>
-        <w:t>Version 1.10</w:t>
+        <w:t>Version 1.11</w:t>
       </w:r>
     </w:p>
     <w:p>
@@ -921,6 +921,64 @@
           </w:p>
         </w:tc>
       </w:tr>
+      <w:tr>
+        <w:tc>
+          <w:tcPr>
+            <w:tcW w:type="dxa" w:w="2160"/>
+          </w:tcPr>
+          <w:p>
+            <w:r/>
+            <w:r>
+              <w:rPr>
+                <w:sz w:val="19"/>
+              </w:rPr>
+              <w:t>1.11</w:t>
+            </w:r>
+          </w:p>
+        </w:tc>
+        <w:tc>
+          <w:tcPr>
+            <w:tcW w:type="dxa" w:w="2160"/>
+          </w:tcPr>
+          <w:p>
+            <w:r/>
+            <w:r>
+              <w:rPr>
+                <w:sz w:val="19"/>
+              </w:rPr>
+              <w:t>16 July 2026</w:t>
+            </w:r>
+          </w:p>
+        </w:tc>
+        <w:tc>
+          <w:tcPr>
+            <w:tcW w:type="dxa" w:w="2160"/>
+          </w:tcPr>
+          <w:p>
+            <w:r/>
+            <w:r>
+              <w:rPr>
+                <w:sz w:val="19"/>
+              </w:rPr>
+              <w:t>Topic 3 company renamed to 'Altera AI Blogs' with the mission re-pointed at publishing AI-related blogs end to end; the core backlog task is now 'Hire the agents to publish the AI-related blogs end to end' and Lab 32's hiring happens explicitly under it; Lab 29 (Adaptor) and Lab 32 descriptions expanded in full; NEW Lab 33 'Routine &amp; Trigger — Publish Daily at 3pm' (33 labs total), verified with a live 'Run now' pipeline test and two live screenshots.</w:t>
+            </w:r>
+          </w:p>
+        </w:tc>
+        <w:tc>
+          <w:tcPr>
+            <w:tcW w:type="dxa" w:w="2160"/>
+          </w:tcPr>
+          <w:p>
+            <w:r/>
+            <w:r>
+              <w:rPr>
+                <w:sz w:val="19"/>
+              </w:rPr>
+              <w:t>Dr. Alfred Ang</w:t>
+            </w:r>
+          </w:p>
+        </w:tc>
+      </w:tr>
     </w:tbl>
     <w:p>
       <w:r>
@@ -956,7 +1014,7 @@
         </w:rPr>
         <w:t>Introduction</w:t>
         <w:tab/>
-        <w:t>7</w:t>
+        <w:t>8</w:t>
       </w:r>
     </w:p>
     <w:p>
@@ -975,7 +1033,7 @@
         </w:rPr>
         <w:t>Course Learning Outcomes</w:t>
         <w:tab/>
-        <w:t>7</w:t>
+        <w:t>8</w:t>
       </w:r>
     </w:p>
     <w:p>
@@ -994,7 +1052,7 @@
         </w:rPr>
         <w:t>Before You Start — Environment Setup</w:t>
         <w:tab/>
-        <w:t>7</w:t>
+        <w:t>8</w:t>
       </w:r>
     </w:p>
     <w:p>
@@ -1013,7 +1071,7 @@
         </w:rPr>
         <w:t>Topic 01 — Hermes Agent — Your Autonomous Personal Chief-of-Staff  (33%)</w:t>
         <w:tab/>
-        <w:t>8</w:t>
+        <w:t>9</w:t>
       </w:r>
     </w:p>
     <w:p>
@@ -1033,7 +1091,7 @@
         </w:rPr>
         <w:t>Lab 1 — Install and Setup Hermes</w:t>
         <w:tab/>
-        <w:t>9</w:t>
+        <w:t>10</w:t>
       </w:r>
     </w:p>
     <w:p>
@@ -1053,7 +1111,7 @@
         </w:rPr>
         <w:t>Lab 2 — Deployment — Local Install &amp; Hermes Desktop App</w:t>
         <w:tab/>
-        <w:t>10</w:t>
+        <w:t>11</w:t>
       </w:r>
     </w:p>
     <w:p>
@@ -1073,7 +1131,7 @@
         </w:rPr>
         <w:t>Lab 3 — Memory and Plugins</w:t>
         <w:tab/>
-        <w:t>11</w:t>
+        <w:t>12</w:t>
       </w:r>
     </w:p>
     <w:p>
@@ -1093,7 +1151,7 @@
         </w:rPr>
         <w:t>Lab 4 — Skills</w:t>
         <w:tab/>
-        <w:t>12</w:t>
+        <w:t>13</w:t>
       </w:r>
     </w:p>
     <w:p>
@@ -1113,7 +1171,7 @@
         </w:rPr>
         <w:t>Lab 5 — Providers &amp; Model</w:t>
         <w:tab/>
-        <w:t>13</w:t>
+        <w:t>14</w:t>
       </w:r>
     </w:p>
     <w:p>
@@ -1133,7 +1191,7 @@
         </w:rPr>
         <w:t>Lab 6 — MCP and Tools</w:t>
         <w:tab/>
-        <w:t>14</w:t>
+        <w:t>15</w:t>
       </w:r>
     </w:p>
     <w:p>
@@ -1153,7 +1211,7 @@
         </w:rPr>
         <w:t>Lab 7 — Cron Jobs &amp; Automation</w:t>
         <w:tab/>
-        <w:t>15</w:t>
+        <w:t>16</w:t>
       </w:r>
     </w:p>
     <w:p>
@@ -1173,7 +1231,7 @@
         </w:rPr>
         <w:t>Lab 8 — Subagents &amp; Delegation</w:t>
         <w:tab/>
-        <w:t>16</w:t>
+        <w:t>17</w:t>
       </w:r>
     </w:p>
     <w:p>
@@ -1193,7 +1251,7 @@
         </w:rPr>
         <w:t>Lab 9 — Profile and Kanban</w:t>
         <w:tab/>
-        <w:t>17</w:t>
+        <w:t>18</w:t>
       </w:r>
     </w:p>
     <w:p>
@@ -1213,7 +1271,7 @@
         </w:rPr>
         <w:t>Lab 10 — Security</w:t>
         <w:tab/>
-        <w:t>17</w:t>
+        <w:t>18</w:t>
       </w:r>
     </w:p>
     <w:p>
@@ -1233,7 +1291,7 @@
         </w:rPr>
         <w:t>Lab 11 — Use Case — Make a Video with Hyperframe</w:t>
         <w:tab/>
-        <w:t>19</w:t>
+        <w:t>20</w:t>
       </w:r>
     </w:p>
     <w:p>
@@ -1253,7 +1311,7 @@
         </w:rPr>
         <w:t>Lab 12 — Visualization</w:t>
         <w:tab/>
-        <w:t>20</w:t>
+        <w:t>21</w:t>
       </w:r>
     </w:p>
     <w:p>
@@ -1273,7 +1331,7 @@
         </w:rPr>
         <w:t>Lab 13 — Build a Multi-Agent Video Team (Profiles + Kanban)</w:t>
         <w:tab/>
-        <w:t>22</w:t>
+        <w:t>23</w:t>
       </w:r>
     </w:p>
     <w:p>
@@ -1293,7 +1351,7 @@
         </w:rPr>
         <w:t>Lab 14 — Webhook</w:t>
         <w:tab/>
-        <w:t>24</w:t>
+        <w:t>25</w:t>
       </w:r>
     </w:p>
     <w:p>
@@ -1312,7 +1370,7 @@
         </w:rPr>
         <w:t>Topic 02 — OpenClaw — Automating a Business Back-Office  (33%)</w:t>
         <w:tab/>
-        <w:t>26</w:t>
+        <w:t>27</w:t>
       </w:r>
     </w:p>
     <w:p>
@@ -1332,7 +1390,7 @@
         </w:rPr>
         <w:t>Lab 15 — Install OpenClaw</w:t>
         <w:tab/>
-        <w:t>26</w:t>
+        <w:t>27</w:t>
       </w:r>
     </w:p>
     <w:p>
@@ -1352,7 +1410,7 @@
         </w:rPr>
         <w:t>Lab 16 — Models &amp; Providers</w:t>
         <w:tab/>
-        <w:t>28</w:t>
+        <w:t>29</w:t>
       </w:r>
     </w:p>
     <w:p>
@@ -1372,7 +1430,7 @@
         </w:rPr>
         <w:t>Lab 17 — Channels</w:t>
         <w:tab/>
-        <w:t>30</w:t>
+        <w:t>31</w:t>
       </w:r>
     </w:p>
     <w:p>
@@ -1392,7 +1450,7 @@
         </w:rPr>
         <w:t>Lab 18 — Skills</w:t>
         <w:tab/>
-        <w:t>31</w:t>
+        <w:t>32</w:t>
       </w:r>
     </w:p>
     <w:p>
@@ -1412,7 +1470,7 @@
         </w:rPr>
         <w:t>Lab 19 — Tools &amp; Integrations</w:t>
         <w:tab/>
-        <w:t>33</w:t>
+        <w:t>34</w:t>
       </w:r>
     </w:p>
     <w:p>
@@ -1432,7 +1490,7 @@
         </w:rPr>
         <w:t>Lab 20 — Commands</w:t>
         <w:tab/>
-        <w:t>34</w:t>
+        <w:t>35</w:t>
       </w:r>
     </w:p>
     <w:p>
@@ -1452,7 +1510,7 @@
         </w:rPr>
         <w:t>Lab 21 — Cron Jobs &amp; Heartbeat</w:t>
         <w:tab/>
-        <w:t>36</w:t>
+        <w:t>37</w:t>
       </w:r>
     </w:p>
     <w:p>
@@ -1472,7 +1530,7 @@
         </w:rPr>
         <w:t>Lab 22 — Memory &amp; Context</w:t>
         <w:tab/>
-        <w:t>39</w:t>
+        <w:t>40</w:t>
       </w:r>
     </w:p>
     <w:p>
@@ -1492,7 +1550,7 @@
         </w:rPr>
         <w:t>Lab 23 — Security</w:t>
         <w:tab/>
-        <w:t>40</w:t>
+        <w:t>41</w:t>
       </w:r>
     </w:p>
     <w:p>
@@ -1512,7 +1570,7 @@
         </w:rPr>
         <w:t>Lab 24 — Multi-Agent Workforce</w:t>
         <w:tab/>
-        <w:t>42</w:t>
+        <w:t>43</w:t>
       </w:r>
     </w:p>
     <w:p>
@@ -1532,7 +1590,7 @@
         </w:rPr>
         <w:t>Lab 25 — Dreaming — Idle Reflection &amp; Self-Improvement</w:t>
         <w:tab/>
-        <w:t>45</w:t>
+        <w:t>46</w:t>
       </w:r>
     </w:p>
     <w:p>
@@ -1552,7 +1610,7 @@
         </w:rPr>
         <w:t>Lab 26 — Use Cases &amp; Key Functions</w:t>
         <w:tab/>
-        <w:t>46</w:t>
+        <w:t>47</w:t>
       </w:r>
     </w:p>
     <w:p>
@@ -1571,7 +1629,7 @@
         </w:rPr>
         <w:t>Topic 03 — Paperclip — Running &amp; Governing a Company of AI Agents  (34%)</w:t>
         <w:tab/>
-        <w:t>47</w:t>
+        <w:t>48</w:t>
       </w:r>
     </w:p>
     <w:p>
@@ -1591,7 +1649,7 @@
         </w:rPr>
         <w:t>Lab 27 — Install Paperclip on Windows &amp; Mac</w:t>
         <w:tab/>
-        <w:t>47</w:t>
+        <w:t>48</w:t>
       </w:r>
     </w:p>
     <w:p>
@@ -1611,7 +1669,7 @@
         </w:rPr>
         <w:t>Lab 28 — Setup Company, CEO &amp; Mission</w:t>
         <w:tab/>
-        <w:t>48</w:t>
+        <w:t>49</w:t>
       </w:r>
     </w:p>
     <w:p>
@@ -1631,7 +1689,7 @@
         </w:rPr>
         <w:t>Lab 29 — Setup Adaptor</w:t>
         <w:tab/>
-        <w:t>49</w:t>
+        <w:t>50</w:t>
       </w:r>
     </w:p>
     <w:p>
@@ -1651,7 +1709,7 @@
         </w:rPr>
         <w:t>Lab 30 — Create the Task Backlog</w:t>
         <w:tab/>
-        <w:t>50</w:t>
+        <w:t>51</w:t>
       </w:r>
     </w:p>
     <w:p>
@@ -1671,7 +1729,7 @@
         </w:rPr>
         <w:t>Lab 31 — Add the Tavily Search API</w:t>
         <w:tab/>
-        <w:t>51</w:t>
+        <w:t>52</w:t>
       </w:r>
     </w:p>
     <w:p>
@@ -1691,7 +1749,7 @@
         </w:rPr>
         <w:t>Lab 32 — Hire the Members Under the Hiring Task</w:t>
         <w:tab/>
-        <w:t>52</w:t>
+        <w:t>53</w:t>
       </w:r>
     </w:p>
     <w:p>
@@ -1700,17 +1758,18 @@
           <w:tab w:pos="9072" w:val="right" w:leader="dot"/>
         </w:tabs>
         <w:spacing w:after="60"/>
+        <w:ind w:left="432"/>
       </w:pPr>
       <w:r>
         <w:rPr>
           <w:rFonts w:ascii="Arial" w:hAnsi="Arial"/>
-          <w:b/>
+          <w:b w:val="0"/>
           <w:color w:val="333333"/>
-          <w:sz w:val="22"/>
-        </w:rPr>
-        <w:t>Wrap-Up — The Agent Build Arc and Governance</w:t>
+          <w:sz w:val="21"/>
+        </w:rPr>
+        <w:t>Lab 33 — Routine &amp; Trigger — Publish Daily at 3pm</w:t>
         <w:tab/>
-        <w:t>53</w:t>
+        <w:t>55</w:t>
       </w:r>
     </w:p>
     <w:p>
@@ -1727,9 +1786,9 @@
           <w:color w:val="333333"/>
           <w:sz w:val="22"/>
         </w:rPr>
-        <w:t>Next Steps</w:t>
+        <w:t>Wrap-Up — The Agent Build Arc and Governance</w:t>
         <w:tab/>
-        <w:t>54</w:t>
+        <w:t>56</w:t>
       </w:r>
     </w:p>
     <w:p>
@@ -1746,9 +1805,28 @@
           <w:color w:val="333333"/>
           <w:sz w:val="22"/>
         </w:rPr>
+        <w:t>Next Steps</w:t>
+        <w:tab/>
+        <w:t>57</w:t>
+      </w:r>
+    </w:p>
+    <w:p>
+      <w:pPr>
+        <w:tabs>
+          <w:tab w:pos="9072" w:val="right" w:leader="dot"/>
+        </w:tabs>
+        <w:spacing w:after="60"/>
+      </w:pPr>
+      <w:r>
+        <w:rPr>
+          <w:rFonts w:ascii="Arial" w:hAnsi="Arial"/>
+          <w:b/>
+          <w:color w:val="333333"/>
+          <w:sz w:val="22"/>
+        </w:rPr>
         <w:t>Glossary</w:t>
         <w:tab/>
-        <w:t>55</w:t>
+        <w:t>57</w:t>
       </w:r>
     </w:p>
     <w:p>
@@ -1766,7 +1844,7 @@
     </w:p>
     <w:p>
       <w:r>
-        <w:t>This Learner Guide accompanies the WSQ course Build a Human-AI Workforce with Autonomous AI Agents (TGS-2024043854), conducted by Tertiary Infotech Academy Pte Ltd. It provides step-by-step instructions for all 32 hands-on labs across three autonomous-AI-agent platforms — Hermes Agent, OpenClaw and Paperclip — organised into three topics. Each platform builds on the same skillset: install the runtime, connect models and channels, give the agent memory, extend it with skills and tools, automate it with schedules, secure it with governance, and finally orchestrate multiple agents to deliver a realistic business outcome.</w:t>
+        <w:t>This Learner Guide accompanies the WSQ course Build a Human-AI Workforce with Autonomous AI Agents (TGS-2024043854), conducted by Tertiary Infotech Academy Pte Ltd. It provides step-by-step instructions for all 33 hands-on labs across three autonomous-AI-agent platforms — Hermes Agent, OpenClaw and Paperclip — organised into three topics. Each platform builds on the same skillset: install the runtime, connect models and channels, give the agent memory, extend it with skills and tools, automate it with schedules, secure it with governance, and finally orchestrate multiple agents to deliver a realistic business outcome.</w:t>
       </w:r>
     </w:p>
     <w:p>
@@ -9089,7 +9167,7 @@
     </w:p>
     <w:p>
       <w:r>
-        <w:t>Install (Windows &amp; Mac) · Company, CEO &amp; Mission · Adaptors · Task Backlog · Tavily Search API · Hire the Team</w:t>
+        <w:t>Install (Windows &amp; Mac) · Company, CEO &amp; Mission · Adaptors · Task Backlog · Tavily Search API · Hire the Team · Daily Routine</w:t>
       </w:r>
     </w:p>
     <w:p>
@@ -9115,7 +9193,7 @@
         <w:pStyle w:val="ListBullet"/>
       </w:pPr>
       <w:r>
-        <w:t>Running use case: 'Tertiary AI News Research' — a zero-human news desk whose mission is a verified, cited daily AI-news briefing; the mission you write steers every agent the company hires.</w:t>
+        <w:t>Running use case: 'Altera AI Blogs' — a zero-human company whose mission is to research the AI landscape and publish AI-related blogs end to end; the mission you write steers every agent it hires.</w:t>
       </w:r>
     </w:p>
     <w:p>
@@ -9131,7 +9209,7 @@
         <w:pStyle w:val="ListBullet"/>
       </w:pPr>
       <w:r>
-        <w:t>The company runs off a detailed task backlog (todo -&gt; in_progress -&gt; in_review -&gt; done) whose core task is hiring; the CEO proposes the team and every hire pauses at a Board approval gate.</w:t>
+        <w:t>The company runs off a detailed task backlog (todo -&gt; in_progress -&gt; in_review -&gt; done) whose core task hires the agents to publish the blogs end to end — every hire pauses at a Board approval gate — and a daily 3pm routine generates and runs the publish task automatically.</w:t>
       </w:r>
     </w:p>
     <w:p>
@@ -9313,7 +9391,7 @@
     </w:p>
     <w:p>
       <w:r>
-        <w:t>Goal: Found 'Tertiary AI News Research': create the company, write its mission (research and publish a reliable daily AI-news briefing), set the monthly budget, then hire the CEO agent — the Chief Officer who will run the news desk and report to you, the Board.</w:t>
+        <w:t>Goal: Found 'Altera AI Blogs': create the company, write its mission (research the AI landscape daily and publish AI-related blogs end to end), set the monthly budget, then hire the CEO agent — the Chief Officer who will run the blog operation and report to you, the Board.</w:t>
       </w:r>
     </w:p>
     <w:p>
@@ -9353,7 +9431,7 @@
         <w:t xml:space="preserve">1.  </w:t>
       </w:r>
       <w:r>
-        <w:t>Create the company 'Tertiary AI News Research' from the company switcher In the dashboard open the company switcher (top of the sidebar) and choose New company. Name it exactly: &gt; Tertiary AI News Research This is the zero-human company you will govern for the rest of the topic.</w:t>
+        <w:t>Create the company 'Altera AI Blogs' from the company switcher In the dashboard open the company switcher (top of the sidebar) and choose New company. Name it exactly: &gt; Altera AI Blogs This is the zero-human company you will govern for the rest of the topic.</w:t>
       </w:r>
     </w:p>
     <w:p>
@@ -9368,7 +9446,7 @@
         <w:t xml:space="preserve">2.  </w:t>
       </w:r>
       <w:r>
-        <w:t>Write the mission — it steers every agent the company hires In the company setup (or Company Settings → Mission), write the mission statement: &gt; Research the AI landscape daily and publish a verified, cited AI-news briefing The mission is not decoration: every agent the company hires reads it and aligns its work to it, so a vague mission produces a vague company.</w:t>
+        <w:t>Write the mission — it steers every agent the company hires In the company setup (or Company Settings → Mission), write the mission statement: &gt; Research the AI landscape daily and publish AI-related blogs end to end The mission is not decoration: every agent the company hires reads it and aligns its work to it, so a vague mission produces a vague company.</w:t>
       </w:r>
     </w:p>
     <w:p>
@@ -9413,7 +9491,7 @@
         <w:t xml:space="preserve">5.  </w:t>
       </w:r>
       <w:r>
-        <w:t>Open the Org page and confirm the structure: Board above the CEO Open the Org page and check the org chart: Board (you) at the top, the CEO directly beneath. This two-node chart is the seed of the whole workforce you will grow in Labs 30–32.</w:t>
+        <w:t>Open the Org page and confirm the structure: Board above the CEO Open the Org page and check the org chart: Board (you) at the top, the CEO directly beneath. This two-node chart is the seed of the whole workforce you will grow in Labs 30–33.</w:t>
       </w:r>
     </w:p>
     <w:p>
@@ -9462,7 +9540,7 @@
     </w:p>
     <w:p>
       <w:r>
-        <w:t>Goal: Give the company's agents a brain. Paperclip ships three built-in adaptors — Claude Code (claude_local), Codex (codex_local) and Gemini CLI (gemini_local) — and supports installable external adaptors (alpha). Confirm your adaptor is detected so every hired agent can reason and act with it.</w:t>
+        <w:t>Goal: Give every Altera AI Blogs agent a brain. An adaptor is the bridge between Paperclip and the language model that does the reasoning: when any agent (the CEO or a specialist) picks up a task, Paperclip hands the work to the adaptor, which runs it on the underlying model and streams the result back to the task. Paperclip ships three BUILT-IN adaptors that piggyback on locally installed CLIs — Claude Code (claude_local, 9 models), Codex (codex_local, 10 models) and Gemini CLI (gemini_local, 8 models) — and supports installable EXTERNAL adaptor packages (alpha). You install/log in to the CLI on the host so Paperclip can detect it, confirm it shows as available under Settings → Instance settings → Adapters, use the power icon to hide adaptors you don't want agents to pick, and restart Paperclip if detection fails. Whatever adaptor you enable here powers every hire in Labs 30-33.</w:t>
       </w:r>
     </w:p>
     <w:p>
@@ -9477,7 +9555,7 @@
     </w:p>
     <w:p>
       <w:r>
-        <w:t>A detected, enabled model adaptor (Claude Code, Codex or Gemini CLI) powering the agents.   (Tools: Paperclip, model adaptors (Claude Code / Codex / Gemini CLI).)</w:t>
+        <w:t>A detected, enabled model adaptor (Claude Code, Codex or Gemini CLI) powering every Altera AI Blogs agent.   (Tools: Paperclip, model adaptors (Claude Code / Codex / Gemini CLI).)</w:t>
       </w:r>
     </w:p>
     <w:p>
@@ -9621,7 +9699,7 @@
     </w:p>
     <w:p>
       <w:r>
-        <w:t>Goal: Write the backlog that runs the news desk. Every task gets a precise title AND a detailed description — the description is the agent's brief, so vague tasks produce vague work. The core task is hiring the team; the rest build the news-research pipeline around it.</w:t>
+        <w:t>Goal: Write the backlog that runs Altera AI Blogs. Every task gets a precise title AND a detailed description — the description is the agent's brief, so vague tasks produce vague work. The CORE task is 'Hire the agents to publish the AI-related blogs end to end'; the rest build the blog pipeline around it.</w:t>
       </w:r>
     </w:p>
     <w:p>
@@ -9636,7 +9714,7 @@
     </w:p>
     <w:p>
       <w:r>
-        <w:t>A Tasks board holding six well-specified tasks, with 'Hire the core team' as the core task.   (Tools: Paperclip, Tasks board.)</w:t>
+        <w:t>A Tasks board holding six well-specified tasks, with the end-to-end blog-publishing hire as the core task.   (Tools: Paperclip, Tasks board.)</w:t>
       </w:r>
     </w:p>
     <w:p>
@@ -9661,7 +9739,7 @@
         <w:t xml:space="preserve">1.  </w:t>
       </w:r>
       <w:r>
-        <w:t>Create the CORE task — 'Hire the core team and create a hiring plan' — and assign it to the CEO Title: &gt; Hire the core team and create a hiring plan Description: &gt; Based on the coverage strategy, propose which agents to hire (research analyst, news writer, fact-checker, editor/publisher) with roles, budgets and reporting lines. Assign it to the CEO. This is the core task of the whole topic — in Lab 32 the CEO works it to staff the company.</w:t>
+        <w:t>Create the CORE task — 'Hire the agents to publish the AI-related blogs end to end' — and assign it to the CEO Title: &gt; Hire the agents to publish the AI-related blogs end to end Description: &gt; Based on the content strategy, propose which agents to hire (research analyst, blog writer, editor/publisher, SEO/marketer) with roles, budgets and reporting lines, so the company can research, write, edit and publish AI blogs without human writers. Assign it to the CEO. This is the core task of the whole topic — in Lab 32 the CEO works it to staff the company.</w:t>
       </w:r>
     </w:p>
     <w:p>
@@ -9676,7 +9754,7 @@
         <w:t xml:space="preserve">2.  </w:t>
       </w:r>
       <w:r>
-        <w:t>Create 'Define the AI news coverage strategy and editorial plan' Title: &gt; Define the AI news coverage strategy and editorial plan Description: &gt; Pick the beats (models, chips, policy, funding), the daily cadence, the briefing format and the quality bar for every published story.</w:t>
+        <w:t>Create 'Define the AI blog content strategy and editorial plan' Title: &gt; Define the AI blog content strategy and editorial plan Description: &gt; Pick the beats (models, chips, policy, funding), the publishing cadence, the blog format and the quality bar for every published post.</w:t>
       </w:r>
     </w:p>
     <w:p>
@@ -9691,7 +9769,7 @@
         <w:t xml:space="preserve">3.  </w:t>
       </w:r>
       <w:r>
-        <w:t>Create 'Scaffold the news-desk workspace &amp; tooling foundation' Title: &gt; Scaffold the news-desk workspace &amp; tooling foundation Description: &gt; Set up the workspace folder structure, briefing templates, style guide and source register the whole team will use.</w:t>
+        <w:t>Create 'Scaffold the blog workspace &amp; tooling foundation' Title: &gt; Scaffold the blog workspace &amp; tooling foundation Description: &gt; Set up the workspace folder structure, post templates, style guide and source register the whole team will use.</w:t>
       </w:r>
     </w:p>
     <w:p>
@@ -9721,7 +9799,7 @@
         <w:t xml:space="preserve">5.  </w:t>
       </w:r>
       <w:r>
-        <w:t>Create 'Produce the first daily AI news briefing' Title: &gt; Produce the first daily AI news briefing Description: &gt; Pull the top stories from the watchlist, verify each against two independent sources, and draft a cited briefing for Board review.</w:t>
+        <w:t>Create 'Produce and publish the first AI blog post' Title: &gt; Produce and publish the first AI blog post Description: &gt; Pull the top stories from the watchlist, verify each against two independent sources, draft a cited post and publish it for Board review.</w:t>
       </w:r>
     </w:p>
     <w:p>
@@ -9751,7 +9829,7 @@
     </w:p>
     <w:p>
       <w:r>
-        <w:t>The Tasks board shows all six tasks, each with a detailed description, and the hiring task is assigned to the CEO.</w:t>
+        <w:t>The Tasks board shows all six tasks, each with a detailed description, and the core hiring task is assigned to the CEO.</w:t>
       </w:r>
     </w:p>
     <w:p>
@@ -9785,7 +9863,7 @@
     </w:p>
     <w:p>
       <w:r>
-        <w:t>Goal: A news-research company needs fresh information. Create a Tavily API key, store it as a company Secret, and bind it to the TAVILY_API_KEY runtime environment variable — Paperclip resolves the secret server-side when a run starts, so the key never sits in a prompt or a repo.</w:t>
+        <w:t>Goal: A blog company needs fresh information. Create a Tavily API key, store it as a company Secret, and bind it to the TAVILY_API_KEY runtime environment variable — Paperclip resolves the secret server-side when a run starts, so the key never sits in a prompt or a repo.</w:t>
       </w:r>
     </w:p>
     <w:p>
@@ -9934,7 +10012,7 @@
     </w:p>
     <w:p>
       <w:r>
-        <w:t>Goal: Let the company staff itself. The CEO works the core hiring task — proposing the specialist roles for the news desk (research analyst, news writer, fact-checker, editor/publisher) with budgets and reporting lines — and every hire pauses at an approval gate for you, the Board, to approve.</w:t>
+        <w:t>Goal: Let Altera AI Blogs staff itself — all of it happening UNDER the core task from Lab 30, 'Hire the agents to publish the AI-related blogs end to end'. You move that task to in_progress and the CEO works it: inside the task it drafts a hiring plan proposing each specialist the blog pipeline needs — a research analyst (scans the watchlist and verifies stories), a blog writer (drafts cited posts), an editor/publisher (reviews, formats and publishes) and an SEO/marketer (titles, tags and distribution) — each with a mandate, a budget cap and a reporting line to the CEO. Every proposed hire pauses at an approval gate for you, the Board: approve it and the agent is created; reject it and the CEO revises the plan. When the gates clear, the new members appear in the Agents sidebar and on the Org chart beneath the CEO, and you assign them the rest of the backlog so the pipeline runs end to end — research → draft → edit → publish.</w:t>
       </w:r>
     </w:p>
     <w:p>
@@ -9949,7 +10027,7 @@
     </w:p>
     <w:p>
       <w:r>
-        <w:t>An approved core team under the CEO, visible in the Agents list and the org chart, ready to take the backlog.   (Tools: Paperclip, hiring task, approval gates, org chart.)</w:t>
+        <w:t>A Board-approved blog team (research analyst, blog writer, editor/publisher, SEO/marketer) hired under the core task, visible on the org chart and taking the backlog.   (Tools: Paperclip, hiring task, approval gates, org chart.)</w:t>
       </w:r>
     </w:p>
     <w:p>
@@ -9974,7 +10052,7 @@
         <w:t xml:space="preserve">1.  </w:t>
       </w:r>
       <w:r>
-        <w:t>Open the core hiring task and move it to in_progress — the CEO drafts the hiring plan in the task On the Tasks board open 'Hire the core team and create a hiring plan' and move it to in_progress. The CEO starts working the brief and drafts the hiring plan inside the task — watch the task's activity log as the plan takes shape.</w:t>
+        <w:t>Open the CORE task 'Hire the agents to publish the AI-related blogs end to end' and move it to in_progress On the Tasks board open the CORE task 'Hire the agents to publish the AI-related blogs end to end' and move it to in_progress. The CEO starts working the brief and drafts the hiring plan inside this task — watch the task's activity log as the plan takes shape.</w:t>
       </w:r>
     </w:p>
     <w:p>
@@ -9989,7 +10067,7 @@
         <w:t xml:space="preserve">2.  </w:t>
       </w:r>
       <w:r>
-        <w:t>Review the proposed roles, budgets and reporting lines in the task's hiring plan Read the CEO's plan as a Board member would. It should propose the news-desk specialists — research analyst, news writer, fact-checker, editor/publisher — and for each: the mandate, a per-agent budget, and the reporting line (everyone reports to the CEO).</w:t>
+        <w:t>Review the proposed roles in the task's hiring plan — research analyst, blog writer, editor/publisher, SEO/marketer Read the CEO's plan as a Board member would. It should propose the blog-pipeline specialists — research analyst, blog writer, editor/publisher, SEO/marketer — and for each: the mandate, a per-agent budget, and the reporting line (everyone reports to the CEO).</w:t>
       </w:r>
     </w:p>
     <w:p>
@@ -10004,7 +10082,7 @@
         <w:t xml:space="preserve">3.  </w:t>
       </w:r>
       <w:r>
-        <w:t>Approve each proposed hire at its approval gate (or reject and ask for a revised proposal) Each proposed hire pauses at an approval gate. For every one, either: - Approve — the agent is hired and comes online, or - Reject with a comment — the CEO revises the proposal (e.g. lower budget, sharper mandate) and resubmits. Nothing joins the company without an explicit Board decision — this gate is the human-in-the-loop control at the heart of Paperclip governance.</w:t>
+        <w:t>Approve each proposed hire at its approval gate (or reject and ask for a revised proposal) — you are the Board Each proposed hire pauses at an approval gate. For every one, either: - Approve — the agent is hired and comes online, or - Reject with a comment — the CEO revises the proposal (e.g. lower budget, sharper mandate) and resubmits. Nothing joins the company without an explicit Board decision — this gate is the human-in-the-loop control at the heart of Paperclip governance.</w:t>
       </w:r>
     </w:p>
     <w:p>
@@ -10034,7 +10112,7 @@
         <w:t xml:space="preserve">5.  </w:t>
       </w:r>
       <w:r>
-        <w:t>Assign the rest of the backlog to the new team and watch tasks move todo → in_progress → in_review → done Assign the remaining Lab 30 tasks to the right specialists — the coverage strategy and watchlist to the research analyst, the workspace scaffold and briefing to the news writer / editor, verification to the fact-checker — and watch the board: tasks flow todo → in_progress → in_review → done, with the CEO coordinating and you approving anything that hits a gate.</w:t>
+        <w:t>Assign the rest of the backlog to the new team and watch the pipeline run: research → draft → edit → publish Assign the remaining Lab 30 tasks to the right specialists — the content strategy and watchlist to the research analyst, the workspace scaffold and the first post to the blog writer, review and publication to the editor/publisher, titles/tags/distribution to the SEO/marketer — and watch the board: the pipeline runs research → draft → edit → publish, with tasks flowing todo → in_progress → in_review → done, the CEO coordinating and you approving anything that hits a gate.</w:t>
       </w:r>
     </w:p>
     <w:p>
@@ -10049,7 +10127,7 @@
     </w:p>
     <w:p>
       <w:r>
-        <w:t>The hiring task reaches in_review/done, every hire was Board-approved, and the specialists appear on the org chart taking backlog tasks.</w:t>
+        <w:t>The core hiring task reaches in_review/done, every hire was Board-approved under that task, and the specialists appear on the org chart publishing the first posts.</w:t>
       </w:r>
     </w:p>
     <w:p>
@@ -10065,6 +10143,170 @@
           <w:sz w:val="20"/>
         </w:rPr>
         <w:t>Full commands and screenshots are in labs/lab32-*/README.md. Use only accounts, keys and hosts you own, and keep agents under human oversight.</w:t>
+      </w:r>
+    </w:p>
+    <w:p/>
+    <w:p>
+      <w:pPr>
+        <w:pStyle w:val="Heading2"/>
+      </w:pPr>
+      <w:r>
+        <w:t>Lab 33 — Routine &amp; Trigger — Publish Daily at 3pm</w:t>
+      </w:r>
+    </w:p>
+    <w:p>
+      <w:r>
+        <w:t>Learning outcome: LO3: Automate the company with a scheduled routine and trigger..</w:t>
+      </w:r>
+    </w:p>
+    <w:p>
+      <w:r>
+        <w:t>Goal: Put Altera AI Blogs on autopilot. Create a Routine with a daily 3:00pm trigger that generates and runs the blog-publishing task automatically — the routine fires, creates the day's 'Produce and publish today's AI blog post' task, the team executes the pipeline (research → draft → edit → publish), and the finished post lands in in_review for the Board. No human kicks it off.</w:t>
+      </w:r>
+    </w:p>
+    <w:p>
+      <w:r>
+        <w:rPr>
+          <w:b/>
+          <w:color w:val="1F6FEB"/>
+          <w:sz w:val="22"/>
+        </w:rPr>
+        <w:t>What you'll build</w:t>
+      </w:r>
+    </w:p>
+    <w:p>
+      <w:r>
+        <w:t>A daily 3:00pm routine that generates and runs the blog-publishing task automatically.   (Tools: Paperclip, Routines, triggers, Tasks board.)</w:t>
+      </w:r>
+    </w:p>
+    <w:p>
+      <w:r>
+        <w:rPr>
+          <w:b/>
+          <w:color w:val="1F6FEB"/>
+          <w:sz w:val="22"/>
+        </w:rPr>
+        <w:t>Step-by-step</w:t>
+      </w:r>
+    </w:p>
+    <w:p>
+      <w:pPr>
+        <w:spacing w:after="80"/>
+        <w:ind w:left="360"/>
+      </w:pPr>
+      <w:r>
+        <w:rPr>
+          <w:b/>
+        </w:rPr>
+        <w:t xml:space="preserve">1.  </w:t>
+      </w:r>
+      <w:r>
+        <w:t>Open the Routines page from the sidebar (Work → Routines) In the dashboard sidebar open Work → Routines. This page holds every scheduled automation the company runs — it is the equivalent of a cron board for your agent workforce.</w:t>
+      </w:r>
+    </w:p>
+    <w:p>
+      <w:pPr>
+        <w:spacing w:after="80"/>
+        <w:ind w:left="360"/>
+      </w:pPr>
+      <w:r>
+        <w:rPr>
+          <w:b/>
+        </w:rPr>
+        <w:t xml:space="preserve">2.  </w:t>
+      </w:r>
+      <w:r>
+        <w:t>Create a new routine: 'Daily AI blog publish' Click New routine and name it: &gt; Daily AI blog publish</w:t>
+      </w:r>
+    </w:p>
+    <w:p>
+      <w:pPr>
+        <w:spacing w:after="80"/>
+        <w:ind w:left="360"/>
+      </w:pPr>
+      <w:r>
+        <w:rPr>
+          <w:b/>
+        </w:rPr>
+        <w:t xml:space="preserve">3.  </w:t>
+      </w:r>
+      <w:r>
+        <w:t>Set the trigger: schedule, daily at 3:00pm (15:00) In the routine's trigger section choose schedule and set it to daily at 3:00pm (15:00). The trigger is what fires the routine — from now on the clock, not a human, starts the day's publishing run.</w:t>
+      </w:r>
+    </w:p>
+    <w:p>
+      <w:pPr>
+        <w:spacing w:after="80"/>
+        <w:ind w:left="360"/>
+      </w:pPr>
+      <w:r>
+        <w:rPr>
+          <w:b/>
+        </w:rPr>
+        <w:t xml:space="preserve">4.  </w:t>
+      </w:r>
+      <w:r>
+        <w:t>Define what the routine generates: the task 'Produce and publish today's AI blog post' Configure the routine to generate the task: &gt; Produce and publish today's AI blog post Description: &gt; Pull the top stories from the watchlist, verify against two sources, draft a cited post, publish for Board review — assigned to the team. Every time the trigger fires, a fresh copy of this task lands on the board and the team executes it end to end.</w:t>
+      </w:r>
+    </w:p>
+    <w:p>
+      <w:pPr>
+        <w:spacing w:after="80"/>
+        <w:ind w:left="360"/>
+      </w:pPr>
+      <w:r>
+        <w:rPr>
+          <w:b/>
+        </w:rPr>
+        <w:t xml:space="preserve">5.  </w:t>
+      </w:r>
+      <w:r>
+        <w:t>Save and enable the routine, then trigger it once manually to confirm it creates and runs the task Save the routine and switch it to enabled, then use the manual run/trigger now control to fire it once. Confirm on the Tasks board that the task was created and the team started the pipeline: research → draft → edit → publish.</w:t>
+      </w:r>
+    </w:p>
+    <w:p>
+      <w:pPr>
+        <w:spacing w:after="80"/>
+        <w:ind w:left="360"/>
+      </w:pPr>
+      <w:r>
+        <w:rPr>
+          <w:b/>
+        </w:rPr>
+        <w:t xml:space="preserve">6.  </w:t>
+      </w:r>
+      <w:r>
+        <w:t>At the next 3:00pm, confirm the task was generated and executed automatically Wait for the next 3:00pm tick and check: the task 'Produce and publish today's AI blog post' was generated and executed with no human action, and the finished post is sitting in in_review for you, the Board.</w:t>
+      </w:r>
+    </w:p>
+    <w:p>
+      <w:r>
+        <w:rPr>
+          <w:b/>
+          <w:color w:val="1F6FEB"/>
+          <w:sz w:val="22"/>
+        </w:rPr>
+        <w:t>Test it</w:t>
+      </w:r>
+    </w:p>
+    <w:p>
+      <w:r>
+        <w:t>The routine is enabled with a daily 15:00 trigger, a manual run creates and executes the publish task, and the next 3pm run happens without human action.</w:t>
+      </w:r>
+    </w:p>
+    <w:p>
+      <w:r>
+        <w:rPr>
+          <w:b/>
+          <w:color w:val="1F6FEB"/>
+        </w:rPr>
+        <w:t xml:space="preserve">Note: </w:t>
+      </w:r>
+      <w:r>
+        <w:rPr>
+          <w:sz w:val="20"/>
+        </w:rPr>
+        <w:t>Full commands and screenshots are in labs/lab33-*/README.md. Use only accounts, keys and hosts you own, and keep agents under human oversight.</w:t>
       </w:r>
     </w:p>
     <w:p/>

</xml_diff>